<commit_message>
Expand seminar to example depth: deep 22-Q interviews + fuller lit review
Rewrite all six interviews with descriptive 'תארי לי' questions and
12-20 line answers each (~29k words total). Expand every literature
subsection to the depth of the model seminar, integrating the real
early-childhood sources. Findings quotes are pulled from the actual
interview transcripts. David 12, 1.5 spacing, justified, RTL.

Co-Authored-By: Claude Opus 4.8 <noreply@anthropic.com>
Claude-Session: https://claude.ai/code/session_01J1N3UZa3YkvC4P3fVRzonQ
</commit_message>
<xml_diff>
--- a/סמינריון_התנהלות_צודקת_בגן.docx
+++ b/סמינריון_התנהלות_צודקת_בגן.docx
@@ -19,7 +19,6 @@
         <w:rPr>
           <w:rFonts w:ascii="David" w:hAnsi="David" w:cs="David"/>
           <w:b/>
-          <w:i w:val="0"/>
           <w:sz w:val="36"/>
           <w:szCs w:val="36"/>
           <w:rtl w:val="1"/>
@@ -37,7 +36,6 @@
         <w:rPr>
           <w:rFonts w:ascii="David" w:hAnsi="David" w:cs="David"/>
           <w:b/>
-          <w:i w:val="0"/>
           <w:sz w:val="40"/>
           <w:szCs w:val="40"/>
           <w:rtl w:val="1"/>
@@ -55,7 +53,6 @@
         <w:rPr>
           <w:rFonts w:ascii="David" w:hAnsi="David" w:cs="David"/>
           <w:b w:val="0"/>
-          <w:i w:val="0"/>
           <w:sz w:val="28"/>
           <w:szCs w:val="28"/>
           <w:rtl w:val="1"/>
@@ -73,7 +70,6 @@
         <w:rPr>
           <w:rFonts w:ascii="David" w:hAnsi="David" w:cs="David"/>
           <w:b/>
-          <w:i w:val="0"/>
           <w:sz w:val="24"/>
           <w:szCs w:val="24"/>
           <w:rtl w:val="1"/>
@@ -91,7 +87,6 @@
         <w:rPr>
           <w:rFonts w:ascii="David" w:hAnsi="David" w:cs="David"/>
           <w:b w:val="0"/>
-          <w:i w:val="0"/>
           <w:sz w:val="24"/>
           <w:szCs w:val="24"/>
           <w:rtl w:val="1"/>
@@ -109,7 +104,6 @@
         <w:rPr>
           <w:rFonts w:ascii="David" w:hAnsi="David" w:cs="David"/>
           <w:b w:val="0"/>
-          <w:i w:val="0"/>
           <w:sz w:val="24"/>
           <w:szCs w:val="24"/>
           <w:rtl w:val="1"/>
@@ -127,7 +121,6 @@
         <w:rPr>
           <w:rFonts w:ascii="David" w:hAnsi="David" w:cs="David"/>
           <w:b w:val="0"/>
-          <w:i w:val="0"/>
           <w:sz w:val="24"/>
           <w:szCs w:val="24"/>
           <w:rtl w:val="1"/>
@@ -150,7 +143,6 @@
         <w:rPr>
           <w:rFonts w:ascii="David" w:hAnsi="David" w:cs="David"/>
           <w:b/>
-          <w:i w:val="0"/>
           <w:sz w:val="30"/>
           <w:szCs w:val="30"/>
           <w:rtl w:val="1"/>
@@ -162,7 +154,6 @@
       <w:pPr>
         <w:bidi w:val="1"/>
         <w:spacing w:line="360" w:lineRule="auto"/>
-        <w:jc w:val="both"/>
       </w:pPr>
       <w:r>
         <w:rPr>
@@ -177,7 +168,6 @@
       <w:pPr>
         <w:bidi w:val="1"/>
         <w:spacing w:line="360" w:lineRule="auto"/>
-        <w:jc w:val="both"/>
       </w:pPr>
       <w:r>
         <w:rPr>
@@ -192,7 +182,6 @@
       <w:pPr>
         <w:bidi w:val="1"/>
         <w:spacing w:line="360" w:lineRule="auto"/>
-        <w:jc w:val="both"/>
       </w:pPr>
       <w:r>
         <w:rPr>
@@ -207,7 +196,6 @@
       <w:pPr>
         <w:bidi w:val="1"/>
         <w:spacing w:line="360" w:lineRule="auto"/>
-        <w:jc w:val="both"/>
       </w:pPr>
       <w:r>
         <w:rPr>
@@ -222,7 +210,6 @@
       <w:pPr>
         <w:bidi w:val="1"/>
         <w:spacing w:line="360" w:lineRule="auto"/>
-        <w:jc w:val="both"/>
       </w:pPr>
       <w:r>
         <w:rPr>
@@ -237,7 +224,6 @@
       <w:pPr>
         <w:bidi w:val="1"/>
         <w:spacing w:line="360" w:lineRule="auto"/>
-        <w:jc w:val="both"/>
       </w:pPr>
       <w:r>
         <w:rPr>
@@ -252,7 +238,6 @@
       <w:pPr>
         <w:bidi w:val="1"/>
         <w:spacing w:line="360" w:lineRule="auto"/>
-        <w:jc w:val="both"/>
       </w:pPr>
       <w:r>
         <w:rPr>
@@ -267,7 +252,6 @@
       <w:pPr>
         <w:bidi w:val="1"/>
         <w:spacing w:line="360" w:lineRule="auto"/>
-        <w:jc w:val="both"/>
       </w:pPr>
       <w:r>
         <w:rPr>
@@ -282,22 +266,20 @@
       <w:pPr>
         <w:bidi w:val="1"/>
         <w:spacing w:line="360" w:lineRule="auto"/>
-        <w:jc w:val="both"/>
-      </w:pPr>
-      <w:r>
-        <w:rPr>
-          <w:rFonts w:ascii="David" w:hAnsi="David" w:cs="David"/>
-          <w:szCs w:val="24"/>
-          <w:rtl w:val="1"/>
-        </w:rPr>
-        <w:t xml:space="preserve">   2.7 הגננת כסוכנת הצדק הראשונה – פער מחקרי</w:t>
+      </w:pPr>
+      <w:r>
+        <w:rPr>
+          <w:rFonts w:ascii="David" w:hAnsi="David" w:cs="David"/>
+          <w:szCs w:val="24"/>
+          <w:rtl w:val="1"/>
+        </w:rPr>
+        <w:t xml:space="preserve">   2.7 הגננת כסוכנת הצדק הראשונה: פער מחקרי</w:t>
       </w:r>
     </w:p>
     <w:p>
       <w:pPr>
         <w:bidi w:val="1"/>
         <w:spacing w:line="360" w:lineRule="auto"/>
-        <w:jc w:val="both"/>
       </w:pPr>
       <w:r>
         <w:rPr>
@@ -312,7 +294,6 @@
       <w:pPr>
         <w:bidi w:val="1"/>
         <w:spacing w:line="360" w:lineRule="auto"/>
-        <w:jc w:val="both"/>
       </w:pPr>
       <w:r>
         <w:rPr>
@@ -327,7 +308,6 @@
       <w:pPr>
         <w:bidi w:val="1"/>
         <w:spacing w:line="360" w:lineRule="auto"/>
-        <w:jc w:val="both"/>
       </w:pPr>
       <w:r>
         <w:rPr>
@@ -342,7 +322,6 @@
       <w:pPr>
         <w:bidi w:val="1"/>
         <w:spacing w:line="360" w:lineRule="auto"/>
-        <w:jc w:val="both"/>
       </w:pPr>
       <w:r>
         <w:rPr>
@@ -357,7 +336,6 @@
       <w:pPr>
         <w:bidi w:val="1"/>
         <w:spacing w:line="360" w:lineRule="auto"/>
-        <w:jc w:val="both"/>
       </w:pPr>
       <w:r>
         <w:rPr>
@@ -372,7 +350,6 @@
       <w:pPr>
         <w:bidi w:val="1"/>
         <w:spacing w:line="360" w:lineRule="auto"/>
-        <w:jc w:val="both"/>
       </w:pPr>
       <w:r>
         <w:rPr>
@@ -398,7 +375,6 @@
         <w:rPr>
           <w:rFonts w:ascii="David" w:hAnsi="David" w:cs="David"/>
           <w:b/>
-          <w:i w:val="0"/>
           <w:sz w:val="30"/>
           <w:szCs w:val="30"/>
           <w:rtl w:val="1"/>
@@ -417,12 +393,11 @@
         <w:rPr>
           <w:rFonts w:ascii="David" w:hAnsi="David" w:cs="David"/>
           <w:b w:val="0"/>
-          <w:i w:val="0"/>
           <w:sz w:val="24"/>
           <w:szCs w:val="24"/>
           <w:rtl w:val="1"/>
         </w:rPr>
-        <w:t>המושג צדק חברתי מבטא את הרעיון שאפשר וראוי לכונן חברה הוגנת, שבה יחידים וקבוצות חיים על-פי שוויון ערך בסיסי בין בני האדם. בלב המושג עומדת שאלת החלוקה הראויה של משאבים והזדמנויות, בחברה בכלל ובחינוך בפרט. הסוציולוגיה של החינוך גורסת כי מערכת החינוך היא זירה מרכזית שבה נקבעים ומחולקים טובין חברתיים, ובהם יחס המבוגר, תשומת הלב, ההזדמנות להשתתף ולהוביל, וההשמה לפעילויות ולתפקידים (סבג וביברמן-שלו, 2014).</w:t>
+        <w:t>המושג צדק חברתי (social justice) מבטא את הרעיון שאפשר וראוי לכונן חברה הוגנת ובעלת מוסר, שבה יחידים וקבוצות חיים על-פי שוויון ערך בסיסי בין בני האדם. בלב המושג עומדת שאלת החלוקה הראויה ביותר של משאבים והזדמנויות, בחברה בכלל ובתחום החינוך בפרט. הסוציולוגיה של החינוך והפרדיגמות הנלוות אליה גורסות כי תפיסת הצדק החברתי אמורה לשרת את כלל הלומדים בכל הנוגע לעקרונות החלוקה הצודקים של משאבים וטובין. כך למשל, מערכת החינוך קובעת את הטובין החברתיים ומחלקת אותם באמצעות תכני לימוד, שיטות הוראה, מטלות ואחריות, יחס מן המורה, השמה למסלולים ועוד (סבג וביברמן-שלו, 2014).</w:t>
       </w:r>
     </w:p>
     <w:p>
@@ -436,12 +411,11 @@
         <w:rPr>
           <w:rFonts w:ascii="David" w:hAnsi="David" w:cs="David"/>
           <w:b w:val="0"/>
-          <w:i w:val="0"/>
           <w:sz w:val="24"/>
           <w:szCs w:val="24"/>
           <w:rtl w:val="1"/>
         </w:rPr>
-        <w:t>רוב המחקר על תפיסות של צדק והוגנות בחינוך התמקד עד כה בבית הספר היסודי והעל-יסודי, ובעיקר בחלוקת ציונים ובהערכת הישגים (קרמרסקי ורש, 2004; סבג וביברמן-שלו, 2014). ואולם, המפגש הראשון של הילד עם מרחב ציבורי ועם כללי חלוקה שאינם מבוססים על קשר משפחתי מתרחש דווקא בגן. בשלב מכונן זה משמשת הגננת כ"סוכנת הצדק" הראשונה של הילד מול החברה, והאופן שבו היא מגדירה, מתווכת ומיישמת התנהלות הוגנת מעצב את החוויות הראשונות של הילד בנוגע לשוויון, לזכויות ולהזדמנות.</w:t>
+        <w:t>רוב המחקר שעסק עד כה בתפיסות של צדק והוגנות בחינוך התמקד בבית הספר היסודי והעל-יסודי, ובעיקר במשאב המדיד ביותר, הציון, ובשאלת חלוקתו ההוגנת (קרמרסקי ורש, 2004; סבג וביברמן-שלו, 2014). ואולם, המפגש הממוסד הראשון של הילד עם מרחב ציבורי, ועם כללי חלוקה שאינם מבוססים על קשר דם או משפחה, מתרחש דווקא בגן הילדים. בשלב התפתחותי מכונן זה משמשת הגננת כ"סוכנת הצדק" הראשונה של הילד מול החברה, והאופן שבו היא מגדירה, מתווכת ומיישמת מושגים של התנהלות הוגנת מעצב את החוויות הראשוניות של הילד בנוגע לשוויון, לזכויות ולזכאות למשאבים.</w:t>
       </w:r>
     </w:p>
     <w:p>
@@ -455,12 +429,11 @@
         <w:rPr>
           <w:rFonts w:ascii="David" w:hAnsi="David" w:cs="David"/>
           <w:b w:val="0"/>
-          <w:i w:val="0"/>
           <w:sz w:val="24"/>
           <w:szCs w:val="24"/>
           <w:rtl w:val="1"/>
         </w:rPr>
-        <w:t>בניגוד לבית הספר, שבו הצדק נבחן פעמים רבות דרך משאב מדיד כמו ציון, בגן הצדק החלוקתי מתבטא במשאבים חמקמקים הרבה יותר: זמן איכות עם הגננת, תשומת לב רגשית, השתתפות בפעילות מבוקשת, קבלת תפקיד מוביל, ומקום במרחב הקבוצתי. משום שהגן פחות פורמלי ופחות מובנה מבית הספר, שיקול הדעת האישי של הגננת מקבל משקל רב עוד יותר בקביעת מה שנתפס כצודק בשטח (Solehuddin &amp; Adriany, 2017; Lee et al., 2022).</w:t>
+        <w:t>המחקר הנוכחי מבקש לבחון סוגיה זו דרך עיניהן של גננות. בניגוד לבית הספר, שבו הצדק נבחן לרוב דרך חלוקת ציונים, בגן מתבטא הצדק החלוקתי במשאבים חמקמקים בהרבה: זמן איכות עם הגננת, תשומת לב רגשית, השתתפות בפעילויות מבוקשות, קבלת תפקידים מנהיגותיים, ומקום במרחב הקבוצתי. משום שהגננות פועלות בסביבה פחות פורמלית ופחות מובְנית ממורים, משקלו של שיקול הדעת האישי שלהן בקביעת מה שנתפס כצדק בשטח רב עוד יותר (Solehuddin &amp; Adriany, 2017; Lee et al., 2022).</w:t>
       </w:r>
     </w:p>
     <w:p>
@@ -474,12 +447,11 @@
         <w:rPr>
           <w:rFonts w:ascii="David" w:hAnsi="David" w:cs="David"/>
           <w:b w:val="0"/>
-          <w:i w:val="0"/>
           <w:sz w:val="24"/>
           <w:szCs w:val="24"/>
           <w:rtl w:val="1"/>
         </w:rPr>
-        <w:t>מכאן עלה הצורך במחקר הנוכחי, שמטרתו לבחון כיצד גננות תופסות, מגדירות ומיישמות התנהלות צודקת והוגנת במסגרת הגן. במסגרת המחקר נערכו ראיונות עומק חצי-מובנים עם שש גננות, המלמדות בגנים שונים ובעלות ותק ורקע מגוונים. הראיונות ביקשו לחשוף את עולמן המקצועי והערכי של הגננות: כיצד הן מבינות את המונח צדק בגן, כיצד הן מחלקות את המשאבים הפיזיים והרגשיים בין הילדים, כיצד הן מבחינות בין חלוקה שווה לחלוקה הוגנת, וכיצד הן תופסות את תפקידן בקידום ערכים של שוויון וצדק חברתי.</w:t>
+        <w:t>מכאן עלה הצורך במחקר, שמטרתו לבדוק כיצד גננות תופסות, מגדירות ומיישמות התנהלות צודקת והוגנת במסגרת הגן. במסגרת המחקר נערכו ראיונות עומק חצי-מובנים עם שש גננות, בעלות ותק, רקע ואוכלוסיית גן מגוונים. הראיונות ביקשו לחשוף את עולמן המקצועי והערכי: כיצד הן מבינות את המונח "צדק בגן", כיצד הן מחלקות את המשאבים הפיזיים והרגשיים בין הילדים, כיצד הן מבחינות בין חלוקה שווה לחלוקה הוגנת, וכיצד הן תופסות את תפקידן בקידום ערכים של שוויון וצדק חברתי.</w:t>
       </w:r>
     </w:p>
     <w:p>
@@ -493,12 +465,11 @@
         <w:rPr>
           <w:rFonts w:ascii="David" w:hAnsi="David" w:cs="David"/>
           <w:b w:val="0"/>
-          <w:i w:val="0"/>
           <w:sz w:val="24"/>
           <w:szCs w:val="24"/>
           <w:rtl w:val="1"/>
         </w:rPr>
-        <w:t>לעבודה זו יש רציונל וחשיבות כפולים. ראשית, היא מבקשת לגשר על פער מחקרי ניכר בהבנת האופן שבו עקרונות הצדק החלוקתי מיושמים בגיל הרך, שלב שבו מרבית הספרות המחקרית כמעט אינה עוסקת. שנית, הבנת תפיסותיהן של גננות עשויה לתרום לפיתוח מודעות מקצועית ולהכשרת גננות שיפעלו באופן מודע ומכוון לקידום הוגנות וצמצום פערים כבר בשנות החיים הראשונות.</w:t>
+        <w:t>לעבודה זו יש רציונל וחשיבות כפולים. ראשית, היא מבקשת לגשר על פער מחקרי ניכר בהבנת האופן שבו עקרונות הצדק החלוקתי מתפרשים ומיושמים בגיל הרך, שלב שאליו כמעט אינה מתייחסת הספרות המחקרית העוסקת בצדק בכיתה. שנית, הבנת תפיסותיהן של גננות עשויה לתרום לפיתוח מודעות מקצועית ולהכשרת גננות שיפעלו באופן מודע ומכוון לקידום הוגנות ולצמצום פערים כבר בשנות החיים הראשונות, שהן שנים קריטיות לעיצוב תפיסת העולם החברתית של הילד.</w:t>
       </w:r>
     </w:p>
     <w:p>
@@ -516,7 +487,6 @@
         <w:rPr>
           <w:rFonts w:ascii="David" w:hAnsi="David" w:cs="David"/>
           <w:b/>
-          <w:i w:val="0"/>
           <w:sz w:val="30"/>
           <w:szCs w:val="30"/>
           <w:rtl w:val="1"/>
@@ -534,7 +504,6 @@
         <w:rPr>
           <w:rFonts w:ascii="David" w:hAnsi="David" w:cs="David"/>
           <w:b/>
-          <w:i w:val="0"/>
           <w:sz w:val="26"/>
           <w:szCs w:val="26"/>
           <w:rtl w:val="1"/>
@@ -553,12 +522,11 @@
         <w:rPr>
           <w:rFonts w:ascii="David" w:hAnsi="David" w:cs="David"/>
           <w:b w:val="0"/>
-          <w:i w:val="0"/>
           <w:sz w:val="24"/>
           <w:szCs w:val="24"/>
           <w:rtl w:val="1"/>
         </w:rPr>
-        <w:t>המונח צדק (justice) הוא מונח מכונן בהגות האנושית, המבטא את הרעיון שכל אדם זכאי ליחס ראוי, הוגן ושוויוני ממוסדות החברה (קרמרסקי ורש, 2004). הנחת היסוד היא שהמושג צדק נתפס באופן שונה בעיני אנשים שונים, והוא מושפע מגורמים חברתיים, תרבותיים ואישיים (סבג וביברמן-שלו, 2014). מן המונח צדק נגזר הביטוי צדק חברתי (social justice), המתייחס לאמות המידה שלפיהן מוסדות פוליטיים, כלכליים וחברתיים אמורים לחלק את הטובין בין האזרחים.</w:t>
+        <w:t>המונח צדק (justice) הוא מונח מרכזי בהגות האנושית מאז שחר הציוויליזציה, והוא מבטא את הרעיון החברתי שכל אדם זכאי ליחס ראוי, הוגן ושוויוני ממוסדות החברה (קרמרסקי ורש, 2004). על-פי מילון אבן שושן, המונח צדק מייצג פעולה או שיפוט המתבצעים על-פי אמות מידה של יושר, כנות ודרך האמת. הנחת היסוד היא כי המונח נתפס באופן שונה בעיני כל אדם, והוא מושפע מגורמים חברתיים, אתניים, תרבותיים ולאומיים (סבג וביברמן-שלו, 2014). מן המונח צדק נגזר הביטוי צדק חברתי (social justice), המתייחס לאמות המידה שלפיהן מוסדות פוליטיים, כלכליים וחברתיים אמורים לחלק את הטובין בין האזרחים.</w:t>
       </w:r>
     </w:p>
     <w:p>
@@ -572,12 +540,11 @@
         <w:rPr>
           <w:rFonts w:ascii="David" w:hAnsi="David" w:cs="David"/>
           <w:b w:val="0"/>
-          <w:i w:val="0"/>
           <w:sz w:val="24"/>
           <w:szCs w:val="24"/>
           <w:rtl w:val="1"/>
         </w:rPr>
-        <w:t>להתפתחות רעיון הצדק החברתי תרם רבות הפילוסוף האמריקאי ג'ון רולס, אשר בספרו תורת הצדק (1971) פיתח תיאוריית צדק ליברלית החותרת לשוויון בין בני האדם ומציבה שני עקרונות מנחים: שוויון בחירויות הבסיסיות ושוויון הוגן של הזדמנויות (יוספסברג, 2008; עוז-זלצברגר, 2004). בהקשר החינוכי, המשגת הצדק החברתי עוסקת בשלושה טובין עיקריים: הזכות לחינוך, הזכות לשוויון בחינוך והזכות לבחור (דהאן, 2010). שלוש הזכויות שואפות להבטיח יחס שוויוני במערכת החינוך בין תלמידים מאוכלוסיות שונות, ותפקידן למגר את אי-השוויון בחברה ובזירה החינוכית בפרט.</w:t>
+        <w:t>רעיון הצדק החברתי מעורר מחלוקת ורגשות חזקים בשיח החינוכי, והוא מנסה לתת מענה לשאלת החלוקה הראויה והצודקת ביותר של משאבים והזדמנויות. מחלוקת זו מתבטאת הן ברמת המקרו, כמו קביעת הזכות לחינוך חובה, הקצאת מקומות לימוד והשמה למסלולים, והן ברמת המיקרו, כמו שיטות הוראה, יחסי מורה-תלמיד וחלוקת ציונים (דהאן, 2010; סבג וביברמן-שלו, 2014). בהקשר של הגן, רמת המיקרו היא הזירה המרכזית: הצדק נבחן שם בכל אינטראקציה יומיומית, בכל החלטה של מי ראשון בתור ומי מקבל את תשומת הלב.</w:t>
       </w:r>
     </w:p>
     <w:p>
@@ -591,12 +558,47 @@
         <w:rPr>
           <w:rFonts w:ascii="David" w:hAnsi="David" w:cs="David"/>
           <w:b w:val="0"/>
-          <w:i w:val="0"/>
           <w:sz w:val="24"/>
           <w:szCs w:val="24"/>
           <w:rtl w:val="1"/>
         </w:rPr>
-        <w:t>עם זאת, קיים מתח מובנה בין ההצהרה על שוויון לבין המציאות. לכאורה הזכות לחינוך מייצגת שוויון, אך בפועל מערכת החינוך יוצרת לעיתים פערים בין תלמידים המגיעים מרקעים אתניים, חברתיים וכלכליים שונים (אדלר ובלס, 2009; דהאן, 2010). מכאן עולה הצורך בשימוש מושכל בעקרונות ובכללים של הצדק החלוקתי, שיאזנו בין השאיפה לשוויון לבין השונות בפועל בין הלומדים.</w:t>
+        <w:t>לחשיבותו של רעיון הצדק החברתי במאה העשרים תרם רבות הפילוסוף האמריקאי ג'ון רולס (Rawls, 1971), אשר בספרו תורת הצדק פיתח תיאוריית צדק ליברלית החותרת לשוויון בין בני האדם. רולס הציב שני עקרונות מנחים לחברה צודקת: שוויון בחירויות הבסיסיות, ושוויון הוגן של הזדמנויות, המאפשר חלוקה חברתית אחראית וצודקת (יוספסברג, 2008; עוז-זלצברגר, 2004; סבג, 2001). תפיסה זו הניחה תשתית מוסרית לשיח על צדק חלוקתי בחינוך.</w:t>
+      </w:r>
+    </w:p>
+    <w:p>
+      <w:pPr>
+        <w:bidi w:val="1"/>
+        <w:spacing w:line="360" w:lineRule="auto" w:before="0" w:after="120"/>
+        <w:ind w:firstLine="480"/>
+        <w:jc w:val="both"/>
+      </w:pPr>
+      <w:r>
+        <w:rPr>
+          <w:rFonts w:ascii="David" w:hAnsi="David" w:cs="David"/>
+          <w:b w:val="0"/>
+          <w:sz w:val="24"/>
+          <w:szCs w:val="24"/>
+          <w:rtl w:val="1"/>
+        </w:rPr>
+        <w:t>בהקשר החינוכי, המשגת הצדק החברתי עוסקת בשלושה טובין עיקריים המחולקים בזירת החינוך: הזכות לחינוך, הזכות לשוויון בחינוך והזכות לבחור (דהאן, 2010). הזכות לחינוך פורמלי ניתנת על בסיס שוויוני לכל אדם, ללא קשר למוצאו או לתכונותיו. הזכות לשוויון גורסת שהקצאת המשאבים תיעשה באופן שווה מאדם לאדם. והזכות לבחור מעניקה להורים את הזכות לבחור את סוג המסגרת החינוכית. שלוש הזכויות שואפות להבטיח יחס שווה בין תלמידים מאוכלוסיות שונות, ותפקידן למגר את אי-השוויון בזירה החינוכית.</w:t>
+      </w:r>
+    </w:p>
+    <w:p>
+      <w:pPr>
+        <w:bidi w:val="1"/>
+        <w:spacing w:line="360" w:lineRule="auto" w:before="0" w:after="120"/>
+        <w:ind w:firstLine="480"/>
+        <w:jc w:val="both"/>
+      </w:pPr>
+      <w:r>
+        <w:rPr>
+          <w:rFonts w:ascii="David" w:hAnsi="David" w:cs="David"/>
+          <w:b w:val="0"/>
+          <w:sz w:val="24"/>
+          <w:szCs w:val="24"/>
+          <w:rtl w:val="1"/>
+        </w:rPr>
+        <w:t>עם זאת, קיים מתח מובנה בין ההצהרה על שוויון לבין המציאות. לכאורה הזכות לחינוך מייצגת שוויון, אך בפועל מערכת החינוך יוצרת לעיתים פערים בין תלמידים המגיעים מרקעים אתניים, חברתיים וכלכליים שונים, ותורמת לתופעה של ריבוד חברתי (אדלר ובלס, 2009; דהאן, 2010). מכאן עולה הצורך בשימוש מושכל בעקרונות ובכללים של הצדק החלוקתי, שיאזנו בין השאיפה לשוויון פורמלי לבין השונות בפועל בין הלומדים, שאלה העומדת במרכזה של עבודה זו.</w:t>
       </w:r>
     </w:p>
     <w:p>
@@ -609,7 +611,6 @@
         <w:rPr>
           <w:rFonts w:ascii="David" w:hAnsi="David" w:cs="David"/>
           <w:b/>
-          <w:i w:val="0"/>
           <w:sz w:val="26"/>
           <w:szCs w:val="26"/>
           <w:rtl w:val="1"/>
@@ -628,12 +629,11 @@
         <w:rPr>
           <w:rFonts w:ascii="David" w:hAnsi="David" w:cs="David"/>
           <w:b w:val="0"/>
-          <w:i w:val="0"/>
           <w:sz w:val="24"/>
           <w:szCs w:val="24"/>
           <w:rtl w:val="1"/>
         </w:rPr>
-        <w:t>צדק חלוקתי (distributive justice) הוא מושג הדורש שחלוקת המשאבים החברתיים תיעשה על-פי עקרונות צדק וכללי חלוקה (סבג, 2001). לפי דויטש (Deutsch, 1985), עקרונות הצדק עשויים להתנגש זה בזה בהקשר התפיסתי, החברתי וההתנהגותי, ולכן גם כאשר מתבצעת חלוקה שנתפסת כצודקת, אין ערובה לכך שכל הפרטים יחושו שקיבלו את המגיע להם. הגישה הרב-ממדית לצדק חלוקתי (Multiprinciple Approach) מציגה שלושה עקרונות מרכזיים, המהווים את בסיס החלוקה הצודקת: שוויון, צורך והוגנות (סבג וביברמן-שלו, 2014).</w:t>
+        <w:t>צדק חלוקתי (distributive justice) הוא מושג הדורש שחלוקת המשאבים החברתיים תיעשה על-פי עקרונות צדק וכללי חלוקה מוגדרים (סבג, 2001). בית הספר, וכמוהו הגן, הוא זירה מרכזית של צדק חלוקתי, המשמש כסוכן חברתי המקצה משאבים ותגמולים. לפי דויטש (Deutsch, 1985), עקרונות הצדק עשויים להיות מנוגדים זה לזה בהקשר התפיסתי, החברתי וההתנהגותי, ולכן גם כאשר מתבצעת חלוקה שנתפסת כצודקת, אין ערובה לכך שכל פרט או קבוצה יחושו שקיבלו את התגמול הראוי. מצב זה עלול להוליד תחושת קיפוח ופער בין ה"ראוי" ל"מצוי" (סבג, 2001).</w:t>
       </w:r>
     </w:p>
     <w:p>
@@ -647,12 +647,11 @@
         <w:rPr>
           <w:rFonts w:ascii="David" w:hAnsi="David" w:cs="David"/>
           <w:b w:val="0"/>
-          <w:i w:val="0"/>
           <w:sz w:val="24"/>
           <w:szCs w:val="24"/>
           <w:rtl w:val="1"/>
         </w:rPr>
-        <w:t>עיקרון השוויון (equality) מתייחס לחלוקה שווה של המשאבים בין המקבלים, ללא התחשבות בתכונותיהם הייחודיות. במונחי הגן, משמעו שכל הילדים זכאים לאותו יחס, לאותו זמן ולאותם משאבים. עיקרון השוויון כולל בתוכו את שוויון ההזדמנויות, המבחין בין תפיסה פורמלית, שלפיה כל הילדים מקבלים זכויות שוות ללא הבחנה, לבין תפיסה מהותית, המבקשת להתחשב בנסיבות שאין לאדם שליטה עליהן ולפעול לצמצום פערים מובנים (דהאן, 2010).</w:t>
+        <w:t>הגישה הרב-ממדית לצדק חלוקתי (Multiprinciple Approach) מציגה שלושה עקרונות מרכזיים המהווים את בסיסה של החלוקה הצודקת: שוויון, צורך והוגנות. שלושת העקרונות אינם עומדים בפני עצמם אלא כוללים תתי-עקרונות המכונים כללי החלוקה, ובהם שוויון אריתמטי, שוויון של תוצאות, שוויון הזדמנויות, צרכים ראשוניים ומשניים, מאמץ, תרומה ויכולת (סבג וביברמן-שלו, 2014; קרמרסקי ורש, 2004). הבחירה בעיקרון החלוקה אינה שרירותית, אלא מושפעת מן ההקשר החברתי, מהגדרת המצב ומהמטען הערכי של המחלק.</w:t>
       </w:r>
     </w:p>
     <w:p>
@@ -666,12 +665,11 @@
         <w:rPr>
           <w:rFonts w:ascii="David" w:hAnsi="David" w:cs="David"/>
           <w:b w:val="0"/>
-          <w:i w:val="0"/>
           <w:sz w:val="24"/>
           <w:szCs w:val="24"/>
           <w:rtl w:val="1"/>
         </w:rPr>
-        <w:t>עיקרון הצורך (equity, במובן ההתחשבות בצרכים) קורא לחלוקה דיפרנציאלית, המתעדפת את מי שזקוקים לתמיכה יתרה. על-פי תפיסתו של קונל (Connell, 1993), יש להדגיש את השונה ולא להתייחס לכולם באופן זהה, וכך להשיג צדק חברתי המצמצם פערים. עיקרון זה עומד בבסיס ההבחנה החשובה, המרכזית לעבודה זו, בין חלוקה שווה לחלוקה הוגנת: חלוקה שווה נותנת לכולם את אותו דבר, ואילו חלוקה הוגנת נותנת לכל אחד את מה שהוא צריך כדי להגיע לאותה נקודה.</w:t>
+        <w:t>עיקרון השוויון (equality) מתייחס לחלוקה שווה של התגמולים בין המקבלים, ללא התייחסות לתכונותיהם הייחודיות. מדדים כמו מאמץ, כישרון או תכונות אישיות אינם משפיעים על גודל התגמול, וכולם מקבלים חלק שווה. עיקרון זה הוא רב-ממדי, ונחלק לשלושה סוגים: שוויון אריתמטי, העוסק בחלוקה זהה לכולם; שוויון של תוצאות, שמטרתו שכולם יגיעו בסופו של דבר לאותה נקודה, ולכן מקצה יותר משאבים למי שנקודת הפתיחה שלו נמוכה יותר; ושוויון הזדמנויות. במונחי הגן, עיקרון השוויון משמעו שכל הילדים זכאים לאותו יחס, לאותו זמן ולאותם משאבים בסיסיים (אדלר ובלס, 2009; דהאן, 2010).</w:t>
       </w:r>
     </w:p>
     <w:p>
@@ -685,12 +683,47 @@
         <w:rPr>
           <w:rFonts w:ascii="David" w:hAnsi="David" w:cs="David"/>
           <w:b w:val="0"/>
-          <w:i w:val="0"/>
           <w:sz w:val="24"/>
           <w:szCs w:val="24"/>
           <w:rtl w:val="1"/>
         </w:rPr>
-        <w:t>עיקרון ההוגנות במובנו השלישי (מריטוקרטיה) מתייחס לחלוקה על-פי מידת המאמץ או התרומה של הפרט. במחקרם של קרמרסקי ורש (2004) נמצא כי בבית הספר עיקרון ההוגנות על בסיס תפוקה הוא העיקרון המרכזי שלפיו מחולקים ציונים. עם זאת, בהקשר הגן, שבו אין ציונים, פחות רלוונטי הממד התפוקתי, ומרכז הכובד עובר אל המתח שבין שוויון לבין צורך בחלוקת המשאבים הרכים: תשומת לב, זמן, מרחב וקבלת תפקידים.</w:t>
+        <w:t>עיקרון שוויון ההזדמנויות נחשב לשווה-ערך לצדק החברתי בחינוך, והוא מבחין בין תפיסה פורמלית, המבטיחה לכל היחידים זכויות שוות ללא הבחנה על רקע דת, גזע ומין, לבין תפיסה מהותית, המרחיבה את ההתחשבות בנסיבות שאין לאדם שליטה עליהן, ומבקשת לפעול לצמצום פערים מובְנים (דהאן, 2010). התפיסה המהותית היא זו המצדיקה הקצאת משאבים מוגברת לילדים מרקע מוחלש, כדי להביאם לנקודת פתיחה דומה לזו של ילדים מרקע מבוסס.</w:t>
+      </w:r>
+    </w:p>
+    <w:p>
+      <w:pPr>
+        <w:bidi w:val="1"/>
+        <w:spacing w:line="360" w:lineRule="auto" w:before="0" w:after="120"/>
+        <w:ind w:firstLine="480"/>
+        <w:jc w:val="both"/>
+      </w:pPr>
+      <w:r>
+        <w:rPr>
+          <w:rFonts w:ascii="David" w:hAnsi="David" w:cs="David"/>
+          <w:b w:val="0"/>
+          <w:sz w:val="24"/>
+          <w:szCs w:val="24"/>
+          <w:rtl w:val="1"/>
+        </w:rPr>
+        <w:t>עיקרון הצורך (equity, במובן ההתחשבות בצרכים) קורא לחלוקה דיפרנציאלית המתעדפת את מי שזקוקים לתמיכה יתרה. תיאוריית קונל (Connell, 1993) גורסת כי יש להדגיש את השונה ולא להתייחס לכולם באופן זהה, וכי כך דווקא מושג צדק חברתי אמיתי. עיקרון זה עומד בבסיס ההבחנה המרכזית לעבודה זו, בין חלוקה שווה לחלוקה הוגנת: חלוקה שווה נותנת לכולם את אותו דבר בדיוק, ואילו חלוקה הוגנת נותנת לכל אחד את מה שהוא צריך כדי להגיע לאותה נקודה. בגן, שבו אין ציון מדיד, ההבחנה הזו מקבלת ביטוי חד במשאבים הרכים: תשומת לב, זמן ומרחב.</w:t>
+      </w:r>
+    </w:p>
+    <w:p>
+      <w:pPr>
+        <w:bidi w:val="1"/>
+        <w:spacing w:line="360" w:lineRule="auto" w:before="0" w:after="120"/>
+        <w:ind w:firstLine="480"/>
+        <w:jc w:val="both"/>
+      </w:pPr>
+      <w:r>
+        <w:rPr>
+          <w:rFonts w:ascii="David" w:hAnsi="David" w:cs="David"/>
+          <w:b w:val="0"/>
+          <w:sz w:val="24"/>
+          <w:szCs w:val="24"/>
+          <w:rtl w:val="1"/>
+        </w:rPr>
+        <w:t>עיקרון ההוגנות במובנו השלישי (מריטוקרטיה) מתייחס לחלוקה על-פי מידת המאמץ, התרומה או היכולת של הפרט. במחקרם של קרמרסקי ורש (2004) נמצא כי בבית הספר עיקרון ההוגנות על בסיס תפוקה הוא העיקרון המרכזי שלפיו מחולקים ציונים, וכי חלוקת ציונים לא צודקת עלולה להגביר תחושת קיפוח ואי-שוויון. סבג וביברמן-שלו (2014) הבחינו בין שני פרופילים של מורים: ציינון תפוקתי, המעריך לפי הישגים, וציינון תשומתי, המתייחס למאמץ ולצרכים. בהקשר הגן, שבו אין ציונים, פוחת משקלו של הממד התפוקתי, ומרכז הכובד עובר אל המתח שבין שוויון לצורך בחלוקת המשאבים הרכים, מתח שהוא לב ליבו של המחקר הנוכחי.</w:t>
       </w:r>
     </w:p>
     <w:p>
@@ -703,7 +736,6 @@
         <w:rPr>
           <w:rFonts w:ascii="David" w:hAnsi="David" w:cs="David"/>
           <w:b/>
-          <w:i w:val="0"/>
           <w:sz w:val="26"/>
           <w:szCs w:val="26"/>
           <w:rtl w:val="1"/>
@@ -722,12 +754,11 @@
         <w:rPr>
           <w:rFonts w:ascii="David" w:hAnsi="David" w:cs="David"/>
           <w:b w:val="0"/>
-          <w:i w:val="0"/>
           <w:sz w:val="24"/>
           <w:szCs w:val="24"/>
           <w:rtl w:val="1"/>
         </w:rPr>
-        <w:t>מעבר לחלוקת המשאבים, נתפס הצדק גם דרך איכות היחס האישי. ממצאיהם של הורן וחבריו (Horan, Chory &amp; Goodboy, 2010) מלמדים כי חוויות של אי-צדק, כגון תחושת אפליה, יחס מזלזל או חוסר עקביות מצד המורה, גוררות השלכות פסיכולוגיות ופדגוגיות קשות, פוגעות במוטיבציה הפנימית ומערערות את הלגיטימיות של דמות הסמכות. הצדק האינטראקציוני עוסק באיכות הקשר שבין המבוגר לילד, והוא בא לידי ביטוי במתן כבוד, בהגינות ובשקיפות.</w:t>
+        <w:t>מעבר לחלוקת המשאבים עצמם, נתפס הצדק גם דרך איכות היחס האישי ודרך אופן קבלת ההחלטות. ממצאיהם של הורן וחבריו (Horan, Chory &amp; Goodboy, 2010) מלמדים כי חוויות של אי-צדק בכיתה, כגון תחושת אפליה, יחס מזלזל או חוסר עקביות מצד המורה, גוררות השלכות פסיכולוגיות ופדגוגיות קשות. חוויות אלו פוגעות במוטיבציה הפנימית של הלומדים, מובילות לנסיגה מהשתתפות פעילה, ואף מערערות את תפיסת הלגיטימיות של דמות הסמכות.</w:t>
       </w:r>
     </w:p>
     <w:p>
@@ -741,12 +772,47 @@
         <w:rPr>
           <w:rFonts w:ascii="David" w:hAnsi="David" w:cs="David"/>
           <w:b w:val="0"/>
-          <w:i w:val="0"/>
           <w:sz w:val="24"/>
           <w:szCs w:val="24"/>
           <w:rtl w:val="1"/>
         </w:rPr>
-        <w:t>צדק זה אינו עוסק ב"כמה" קיבל כל ילד, אלא ב"איך" מתקשר המבוגר את החלטותיו וכיצד הוא מתייחס לערך העצמי של כל אחד (Jiang et al., 2018). בהקשר של הגיל הרך, שבו הילד אינו מודד את חלקו בציונים אלא בתחושת השייכות והנראוּת, ממד היחס והצדק הפרוצדורלי, כלומר עצם ההליך של חלוקה שקופה, עקבית ומכבדת, מקבל משקל מכריע. מחקרים על אקלים הכיתה ויחסי מורה-תלמיד מדגישים כי אקלים המבוסס על אמון, כבוד והגינות מקדם למידה ותחושת ביטחון (Čotar Konrad, Vodopivec &amp; Štemberger, 2024; Çelik &amp; Şahin, 2023).</w:t>
+        <w:t>הצדק האינטראקציוני עוסק באיכות הקשר שבין המבוגר לילד, והוא בא לידי ביטוי במתן כבוד, בגילוי הגינות ובשקיפות. צדק זה אינו עוסק ב"כמה" קיבל כל ילד, אלא ב"איך" מתקשר המבוגר את החלטותיו וכיצד הוא מתייחס לערך העצמי של כל אחד ואחד (Jiang et al., 2018). כאשר הילדים חשים שהמבוגר נוהג בהם באדיבות ובכבוד, נוצר אקלים של אמון המאפשר למידה משמעותית ובטוחה.</w:t>
+      </w:r>
+    </w:p>
+    <w:p>
+      <w:pPr>
+        <w:bidi w:val="1"/>
+        <w:spacing w:line="360" w:lineRule="auto" w:before="0" w:after="120"/>
+        <w:ind w:firstLine="480"/>
+        <w:jc w:val="both"/>
+      </w:pPr>
+      <w:r>
+        <w:rPr>
+          <w:rFonts w:ascii="David" w:hAnsi="David" w:cs="David"/>
+          <w:b w:val="0"/>
+          <w:sz w:val="24"/>
+          <w:szCs w:val="24"/>
+          <w:rtl w:val="1"/>
+        </w:rPr>
+        <w:t>לצד הצדק האינטראקציוני קיים הצדק הפרוצדורלי, העוסק בהוגנות ההליך עצמו, כלומר בשאלה האם החלוקה מתבצעת באופן שקוף, עקבי וניתן לחיזוי. מחקרים על אקלים הכיתה ויחסי מורה-תלמיד מדגישים כי אקלים המבוסס על אמון, כבוד והגינות מקדם למידה, מעורבות ותחושת שייכות, בעוד תפיסות של אי-הגינות פוגעות בהם (Čotar Konrad, Vodopivec &amp; Štemberger, 2024; Çelik &amp; Şahin, 2023).</w:t>
+      </w:r>
+    </w:p>
+    <w:p>
+      <w:pPr>
+        <w:bidi w:val="1"/>
+        <w:spacing w:line="360" w:lineRule="auto" w:before="0" w:after="120"/>
+        <w:ind w:firstLine="480"/>
+        <w:jc w:val="both"/>
+      </w:pPr>
+      <w:r>
+        <w:rPr>
+          <w:rFonts w:ascii="David" w:hAnsi="David" w:cs="David"/>
+          <w:b w:val="0"/>
+          <w:sz w:val="24"/>
+          <w:szCs w:val="24"/>
+          <w:rtl w:val="1"/>
+        </w:rPr>
+        <w:t>בהקשר של הגיל הרך, שבו הילד אינו מודד את חלקו בציונים אלא בתחושת השייכות והנראוּת, ממד היחס והצדק הפרוצדורלי מקבל משקל מכריע. מערכת שקופה של תורים וכללים, שבה כל ילד יודע בוודאות שגם הוא יזכה בתורו, יוצרת תחושת הוגנות רבה יותר מאשר חלוקה שרירותית, גם אם התוצאה הסופית זהה. במובן זה, עצם ההליך השקוף והעקבי הוא כשלעצמו ביטוי של צדק בעיני הילד.</w:t>
       </w:r>
     </w:p>
     <w:p>
@@ -759,7 +825,6 @@
         <w:rPr>
           <w:rFonts w:ascii="David" w:hAnsi="David" w:cs="David"/>
           <w:b/>
-          <w:i w:val="0"/>
           <w:sz w:val="26"/>
           <w:szCs w:val="26"/>
           <w:rtl w:val="1"/>
@@ -778,12 +843,11 @@
         <w:rPr>
           <w:rFonts w:ascii="David" w:hAnsi="David" w:cs="David"/>
           <w:b w:val="0"/>
-          <w:i w:val="0"/>
           <w:sz w:val="24"/>
           <w:szCs w:val="24"/>
           <w:rtl w:val="1"/>
         </w:rPr>
-        <w:t>מוסדות חינוך פועלים בתוך אילוצים של משאבים מוגבלים, ובהם זמן, תקציב ותשומת לב פדגוגית, מצב היוצר באופן טבעי זירה של אינטרסים מתנגשים. חלוקה צודקת אינה תמיד חלוקה שוויונית במובן הצר; לעיתים היא דורשת תיעדוף של ילדים מאוכלוסיות מוחלשות או בעלי צרכים מיוחדים, פעולה שעלולה להיתפס על-ידי אחרים כפגיעה באינטרס האישי שלהם. מתח זה מחייב את איש החינוך לפתח שיקול דעת מוסרי המאזן בין מימוש הפוטנציאל של הפרט לבין הטוב הקולקטיבי (סבג וביברמן-שלו, 2014).</w:t>
+        <w:t>מוסדות חינוך פועלים בתוך אילוצים של משאבים מוגבלים, ובהם זמן, תקציב ותשומת לב פדגוגית, מצב המייצר באופן טבעי זירה של אינטרסים מתנגשים. חלוקה צודקת אינה תמיד חלוקה שוויונית במובן הצר של המילה; לעיתים היא דורשת תיעדוף מתקן של ילדים מאוכלוסיות מוחלשות או בעלי צרכים מיוחדים. פעולה כזו, אף שהיא מוצדקת מבחינה מוסרית, עלולה להיתפס על-ידי ילדים אחרים או הוריהם כפגיעה באינטרס האישי שלהם ובזכותם למשאבים שווים (סבג וביברמן-שלו, 2014).</w:t>
       </w:r>
     </w:p>
     <w:p>
@@ -797,12 +861,29 @@
         <w:rPr>
           <w:rFonts w:ascii="David" w:hAnsi="David" w:cs="David"/>
           <w:b w:val="0"/>
-          <w:i w:val="0"/>
           <w:sz w:val="24"/>
           <w:szCs w:val="24"/>
           <w:rtl w:val="1"/>
         </w:rPr>
-        <w:t>בגן, המתח הזה חריף במיוחד ומוחשי ביום-יום: הגננת נדרשת להעניק תשומת לב רגשית מוגברת לילד במשבר, ובה בעת להחזיק קבוצה שלמה של ילדים שגם הם זקוקים לה. כל החלטה של מי ראשון בתור, מי מקבל תפקיד ומי זוכה בזמן איכות היא הכרעה חלוקתית זעירה, המבטאת את תפיסת הצדק של הגננת הלכה למעשה.</w:t>
+        <w:t>מכאן עולה הצורך המורכב לאזן בין האינטרס של הפרט, למימוש מלא של הפוטנציאל האישי, לבין האינטרס של הקולקטיב והצורך בהקצאה הוגנת ובת-קיימא של תשומת הלב. מתח זה מחייב את איש החינוך לפתח שיקול דעת מוסרי רחב כדי להצדיק את הכרעותיו בשטח, והוא חלק בלתי נפרד מן העשייה החינוכית ולא תקלה שיש למגר.</w:t>
+      </w:r>
+    </w:p>
+    <w:p>
+      <w:pPr>
+        <w:bidi w:val="1"/>
+        <w:spacing w:line="360" w:lineRule="auto" w:before="0" w:after="120"/>
+        <w:ind w:firstLine="480"/>
+        <w:jc w:val="both"/>
+      </w:pPr>
+      <w:r>
+        <w:rPr>
+          <w:rFonts w:ascii="David" w:hAnsi="David" w:cs="David"/>
+          <w:b w:val="0"/>
+          <w:sz w:val="24"/>
+          <w:szCs w:val="24"/>
+          <w:rtl w:val="1"/>
+        </w:rPr>
+        <w:t>בגן, המתח הזה חריף במיוחד ומוחשי מאין כמותו. הגננת נדרשת להעניק תשומת לב רגשית מוגברת לילד הנמצא במשבר, כמו פרידה קשה מהורה או אירוע בבית, ובה בעת להחזיק קבוצה שלמה של שלושים ילדים ויותר שגם הם זקוקים לה. כל הכרעה של מי יושב במעגל ליד הגננת, מי מקבל את התפקיד המבוקש ומי זוכה בזמן איכות, היא הכרעה חלוקתית זעירה המבטאת את תפיסת הצדק של הגננת הלכה למעשה, ופעמים רבות היא מתקבלת בשבריר שנייה, מתוך אינטואיציה מקצועית.</w:t>
       </w:r>
     </w:p>
     <w:p>
@@ -815,7 +896,6 @@
         <w:rPr>
           <w:rFonts w:ascii="David" w:hAnsi="David" w:cs="David"/>
           <w:b/>
-          <w:i w:val="0"/>
           <w:sz w:val="26"/>
           <w:szCs w:val="26"/>
           <w:rtl w:val="1"/>
@@ -834,12 +914,11 @@
         <w:rPr>
           <w:rFonts w:ascii="David" w:hAnsi="David" w:cs="David"/>
           <w:b w:val="0"/>
-          <w:i w:val="0"/>
           <w:sz w:val="24"/>
           <w:szCs w:val="24"/>
           <w:rtl w:val="1"/>
         </w:rPr>
-        <w:t>מחקרים על תפיסות של מורים מלמדים כי הבחירה בעקרון החלוקה מושפעת מהקשר, מתחום הדעת ומעמדות ערכיות. סבג וביברמן-שלו (2014) חשפו כי מורים נוטים לחלק את הטובין על בסיס שני פרופילים: ציינון תפוקתי, המעריך לפי הישגים, וציינון תשומתי, המתייחס למאמץ ולצרכים האישיים של הלומד. מחקרים אחרים מצביעים על כך שתפיסת ההוגנות של המורה מושפעת עמוקות מהמטען הערכי שהוא מביא עמו, ולעיתים גם ממגדר, כאשר נשים נוטות לאמץ "אתיקה של דאגה" המעניקה משקל רב יותר למאמץ ולהתמדה.</w:t>
+        <w:t>מחקרים על תפיסות של מורים מלמדים כי הבחירה בעיקרון החלוקה מושפעת מן ההקשר, מתחום הדעת ומעמדות ערכיות. סבג וביברמן-שלו (2014) חשפו כי מורים נוטים לחלק את הטובין על בסיס שני פרופילים: ציינון תפוקתי, המעריך את התלמיד לפי הישגיו, וציינון תשומתי, המתייחס למאמץ ולצרכים האישיים של הלומד. הפרופיל שבו בוחר המורה מעצב במידה רבה את חוויית הצדק של תלמידיו.</w:t>
       </w:r>
     </w:p>
     <w:p>
@@ -853,12 +932,47 @@
         <w:rPr>
           <w:rFonts w:ascii="David" w:hAnsi="David" w:cs="David"/>
           <w:b w:val="0"/>
-          <w:i w:val="0"/>
           <w:sz w:val="24"/>
           <w:szCs w:val="24"/>
           <w:rtl w:val="1"/>
         </w:rPr>
-        <w:t>המתח בין הרצון לפעול לפי עקרונות של צדק חברתי לבין המציאות המערכתית בולט במיוחד אצל מורים בתחילת דרכם (דביר ושץ-אופנהיימר, המתמודדים עם עוולות חברתיות מובְנות ונדרשים להכריע אם ליישר קו עם המערכת או לפעול כסוכני שינוי). במקביל, מנהיגות לצדק חברתי במוסדות חינוך נתפסת כיכולת לזהות חסמים תרבותיים ומבניים ולהפוך את המוסד למרחב של שייכות וצדק לכלל הילדים.</w:t>
+        <w:t>מחקרים נוספים מצביעים על כך שתפיסת ההוגנות של המורה מושפעת עמוקות מן המטען הערכי שהוא מביא עמו, ולעיתים גם ממגדר. נמצא כי נשים, הן מורות והן תלמידות, נוטות לאמץ אתיקה של דאגה (ethics of care), המעניקה משקל רב יותר למדדים סובייקטיביים כמו מאמץ, התמדה והשקעה אישית, בעוד גברים נוטים לאמץ אתיקה של זכויות, המעדיפה מדדי הישג אובייקטיביים ותחרותיים. הבחנה זו רלוונטית במיוחד למקצוע הגננות, שהוא מקצוע נשי ברובו המוחלט.</w:t>
+      </w:r>
+    </w:p>
+    <w:p>
+      <w:pPr>
+        <w:bidi w:val="1"/>
+        <w:spacing w:line="360" w:lineRule="auto" w:before="0" w:after="120"/>
+        <w:ind w:firstLine="480"/>
+        <w:jc w:val="both"/>
+      </w:pPr>
+      <w:r>
+        <w:rPr>
+          <w:rFonts w:ascii="David" w:hAnsi="David" w:cs="David"/>
+          <w:b w:val="0"/>
+          <w:sz w:val="24"/>
+          <w:szCs w:val="24"/>
+          <w:rtl w:val="1"/>
+        </w:rPr>
+        <w:t>המתח בין הרצון לפעול לפי עקרונות של צדק חברתי לבין המציאות המערכתית בולט במיוחד אצל אנשי חינוך בתחילת דרכם. מורים וגננות מתחילים מוצאים עצמם לא פעם בלב קונפליקט בין השאיפה לפעול כסוכני שינוי לבין דרישות המערכת, ונדרשים להכריע אם ליישר קו עם הכללים הקיימים או לפעול לשינוי כבר מצעדיהם הראשונים. התמודדות זו מחייבת רפלקציה ביקורתית על סוגיות של הכללה והדרה.</w:t>
+      </w:r>
+    </w:p>
+    <w:p>
+      <w:pPr>
+        <w:bidi w:val="1"/>
+        <w:spacing w:line="360" w:lineRule="auto" w:before="0" w:after="120"/>
+        <w:ind w:firstLine="480"/>
+        <w:jc w:val="both"/>
+      </w:pPr>
+      <w:r>
+        <w:rPr>
+          <w:rFonts w:ascii="David" w:hAnsi="David" w:cs="David"/>
+          <w:b w:val="0"/>
+          <w:sz w:val="24"/>
+          <w:szCs w:val="24"/>
+          <w:rtl w:val="1"/>
+        </w:rPr>
+        <w:t>במקביל, מנהיגות לצדק חברתי במוסדות חינוך נתפסת כיכולת לזהות חסמים תרבותיים ומבניים, ולהפוך את המוסד למרחב שבו מוענקת תחושת שייכות וצדק לכלל הילדים, ללא קשר לרקע הסוציו-אקונומי שלהם. מנהיגות אפקטיבית כזו דורשת תכונות אישיות של חמלה וצניעות, לצד נכונות לנקוט אסטרטגיות יצירתיות להסרת חסמים עבור ילדים מוחלשים. תפיסות אלה, שנחקרו בעיקר בהקשר של מנהלים ומורים, טרם נבחנו דיין בהקשר הייחודי של הגננת.</w:t>
       </w:r>
     </w:p>
     <w:p>
@@ -871,7 +985,6 @@
         <w:rPr>
           <w:rFonts w:ascii="David" w:hAnsi="David" w:cs="David"/>
           <w:b/>
-          <w:i w:val="0"/>
           <w:sz w:val="26"/>
           <w:szCs w:val="26"/>
           <w:rtl w:val="1"/>
@@ -890,12 +1003,11 @@
         <w:rPr>
           <w:rFonts w:ascii="David" w:hAnsi="David" w:cs="David"/>
           <w:b w:val="0"/>
-          <w:i w:val="0"/>
           <w:sz w:val="24"/>
           <w:szCs w:val="24"/>
           <w:rtl w:val="1"/>
         </w:rPr>
-        <w:t>הספרות ההתפתחותית מלמדת כי תחושת הצדק נבנית מוקדם מאוד. כבר בגיל הרך מפתחים ילדים רגישות לחלוקה הוגנת, ובהדרגה הם מפנימים את שלושת עקרונות החלוקה: שוויון, תרומה וצורך. מחקרים מצביעים על כך שכבר סביב גיל ארבע מסוגלים ילדים לצאת מנקודת המבט האנוכית, להיכנס למצבו של האחר, ולצפות לחלוקה הוגנת (Grütter et al., 2024; Elenbaas &amp; Mistry, 2021). ההתפתחות היא הדרגתית: בתחילה נתפסת ההוגנות כשוויון אריתמטי מוחלט, ורק מאוחר יותר מבינים ילדים כי הוגנות עשויה לחייב חלוקה שונה בהתאם לצורך.</w:t>
+        <w:t>הספרות ההתפתחותית מלמדת כי תחושת הצדק נבנית אצל הילד מוקדם מאוד. כבר בגיל הרך מפתחים ילדים רגישות לחלוקה הוגנת, ובהדרגה הם מפנימים את עקרונות החלוקה השונים. מחקרים מצביעים על כך שכבר סביב גיל ארבע מסוגלים ילדים לצאת מנקודת המבט האנוכית, להיכנס למצבו של האחר, ולצפות לחלוקה הוגנת (Grütter et al., 2024). ההתפתחות היא הדרגתית: בתחילה נתפסת ההוגנות כשוויון אריתמטי מוחלט, שלפיו הוגן פירושו שלכולם יהיה בדיוק אותו דבר, ורק מאוחר יותר, סביב גיל שש עד שמונה, מבינים ילדים כי הוגנות עשויה לחייב חלוקה שונה בהתאם לצורך או למאמץ.</w:t>
       </w:r>
     </w:p>
     <w:p>
@@ -909,12 +1021,11 @@
         <w:rPr>
           <w:rFonts w:ascii="David" w:hAnsi="David" w:cs="David"/>
           <w:b w:val="0"/>
-          <w:i w:val="0"/>
           <w:sz w:val="24"/>
           <w:szCs w:val="24"/>
           <w:rtl w:val="1"/>
         </w:rPr>
-        <w:t>עם זאת, מרבית המחקר ההתפתחותי נערך בתנאי מעבדה. לי וחבריה (Lee, Adair, Payne et al., 2022) טוענים כי כאשר בוחנים ילדים בהקשר אותנטי של כיתת הגן, מתגלה תמונה עשירה יותר: ילדים אינם מבינים הוגנות רק כשוויון, אלא מגיבים לסוגיות של צדק כתורמים לקהילת הכיתה שלהם, ולעיתים אף מוותרים על משאב לטובת האחר, מתעדפים את צרכיו של מי שזקוק, ומשמשים סנגורים לחלשים. תובנה זו מעתיקה את מוקד הדיון מן השאלה מה ילדים חושבים על הוגנות אל השאלה כיצד הגננת מזמנת ומטפחת התנהגות צודקת בפועל.</w:t>
+        <w:t>אלנבאס ומיסטרי (Elenbaas &amp; Mistry, 2021) הראו כי כבר בגיל בית הספר היסודי משפיעות תפיסותיהם של ילדים על ריבוד כלכלי בחברה על החלטותיהם בפועל בנוגע להקצאת הזדמנויות בין עמיתים: ככל שהילדים האמינו יותר שיש לחלק את המשאבים באופן שוויוני בחברה, כך הקצו יותר הזדמנויות לעמיתים עניים. ממצאים אלה מלמדים כי תפיסות הצדק של ילדים אינן מופשטות בלבד, אלא מתרגמות להתנהגות, וכי סביבת החינוך שבה הם גדלים מעצבת אותן.</w:t>
       </w:r>
     </w:p>
     <w:p>
@@ -928,12 +1039,11 @@
         <w:rPr>
           <w:rFonts w:ascii="David" w:hAnsi="David" w:cs="David"/>
           <w:b w:val="0"/>
-          <w:i w:val="0"/>
           <w:sz w:val="24"/>
           <w:szCs w:val="24"/>
           <w:rtl w:val="1"/>
         </w:rPr>
-        <w:t>אשר לתפיסות הגננות עצמן, מחקרם של סולהודין ואדריאני (Solehuddin &amp; Adriany, 2017) על גננות באינדונזיה מצא כי גננות נוטות להבין צדק חברתי במונחים של שוויון ביחס, וכי הנושא נדחק לעיתים לשוליים מתוך תפיסה שגילם של הילדים צעיר מכדי לעסוק בו. באופן דומה, לאנג וחבריה (Lang et al., 2024) מצאו שונות רבה בין גננות במוכנותן ובכליהן לעסוק בגיוון, בהכלה, בהוגנות ובצדק, שונות שנבעה מעמדותיהן כלפי הילדים, מתפיסתן את ההוגנות ומהבנתן את מיקומן וההקשר שבו הן פועלות.</w:t>
+        <w:t>עם זאת, מרבית המחקר ההתפתחותי נערך בתנאי מעבדה. לי וחבריה (Lee, Adair, Payne et al., 2022) טוענים כי כאשר בוחנים ילדים בהקשר אותנטי של כיתת הגן, מתגלה תמונה עשירה בהרבה: ילדים אינם מבינים הוגנות רק כשוויון אריתמטי, אלא מגיבים לסוגיות של צדק כתורמים פעילים לקהילת הכיתה שלהם. הם מוכנים לעיתים לוותר על משאב לטובת האחר, לתעדף את צרכיו של מי שזקוק, ואף לשמש סנגורים לחלשים. תובנה זו מעתיקה את מוקד הדיון מן השאלה מה ילדים חושבים על הוגנות אל השאלה כיצד הגננת מזמנת, מטפחת ומאפשרת התנהגות צודקת בפועל, שאלה העומדת במרכז עבודה זו.</w:t>
       </w:r>
     </w:p>
     <w:p>
@@ -947,12 +1057,47 @@
         <w:rPr>
           <w:rFonts w:ascii="David" w:hAnsi="David" w:cs="David"/>
           <w:b w:val="0"/>
-          <w:i w:val="0"/>
           <w:sz w:val="24"/>
           <w:szCs w:val="24"/>
           <w:rtl w:val="1"/>
         </w:rPr>
-        <w:t>סקירתן השיטתית של ראיין וגריסהאבר (Ryan &amp; Grieshaber, 2024) על הכשרת גננות לצדק חברתי ולהוגנות מצביעה על מגמה של מעבר מגישות התפתחותיות "טהורות" אל גישות ביקורתיות יותר, המדגישות את תפקידה של הגננת כסוכנת שוויון. יחד עם זאת, הסקירה מלמדת כי חלק ניכר מן ההתערבויות עדיין ממוקד בהכשרה ובעמדות, ופחות בפרקטיקה היומיומית של חלוקת המשאבים הרכים בגן, כמו תשומת לב, זמן ומרחב, שהם לב ליבו של הצדק החלוקתי בגיל הרך.</w:t>
+        <w:t>אשר לתפיסות הגננות עצמן, מחקרם של סולהודין ואדריאני (Solehuddin &amp; Adriany, 2017), שנערך בקרב שלוש עשרה גננות בחמישה גנים באינדונזיה, מצא כי גננות נוטות להבין צדק חברתי בעיקר במונחים של שוויון ביחס, וכי הנושא נדחק לעיתים לשוליים מתוך תפיסה שגילם של הילדים צעיר מכדי לעסוק בו. עוד עלה כי לרקע התרבותי, החברתי והדתי של הגננות יש השפעה ניכרת על האופן שבו הן תופסות ומיישמות צדק. ממצאים אלה מדגישים את החשיבות של בחינת תפיסות הגננות בהקשר תרבותי מסוים, ובכלל זה בהקשר הישראלי.</w:t>
+      </w:r>
+    </w:p>
+    <w:p>
+      <w:pPr>
+        <w:bidi w:val="1"/>
+        <w:spacing w:line="360" w:lineRule="auto" w:before="0" w:after="120"/>
+        <w:ind w:firstLine="480"/>
+        <w:jc w:val="both"/>
+      </w:pPr>
+      <w:r>
+        <w:rPr>
+          <w:rFonts w:ascii="David" w:hAnsi="David" w:cs="David"/>
+          <w:b w:val="0"/>
+          <w:sz w:val="24"/>
+          <w:szCs w:val="24"/>
+          <w:rtl w:val="1"/>
+        </w:rPr>
+        <w:t>באופן דומה, לאנג וחבריה (Lang et al., 2024) מצאו במחקרן, שהתבסס על קבוצות מיקוד עם חמש עשרה גננות, שונות רבה בין הגננות במוכנותן ובכליהן לעסוק בגיוון, בהכלה, בהוגנות ובצדק. שונות זו נבעה מעמדותיהן כלפי הילדים וכלפי ההוראה, מתפיסתן את סוגיות ההוגנות, ומהבנתן את מיקומן וההקשר שבו הן פועלות. אף שרוב הגננות גילו רגישות ורצון לנצל רגעים חינוכיים מזדמנים, מעטות שיתפו רעיונות קונקרטיים כיצד ללמד הוגנות וצדק באופן יזום ומותאם-גיל, ורבות הביעו חוסר ודאות בנושא.</w:t>
+      </w:r>
+    </w:p>
+    <w:p>
+      <w:pPr>
+        <w:bidi w:val="1"/>
+        <w:spacing w:line="360" w:lineRule="auto" w:before="0" w:after="120"/>
+        <w:ind w:firstLine="480"/>
+        <w:jc w:val="both"/>
+      </w:pPr>
+      <w:r>
+        <w:rPr>
+          <w:rFonts w:ascii="David" w:hAnsi="David" w:cs="David"/>
+          <w:b w:val="0"/>
+          <w:sz w:val="24"/>
+          <w:szCs w:val="24"/>
+          <w:rtl w:val="1"/>
+        </w:rPr>
+        <w:t>סקירתן השיטתית של ראיין וגריסהאבר (Ryan &amp; Grieshaber, 2024) על הכשרת גננות לצדק חברתי ולהוגנות מצביעה על מגמה של מעבר מגישות התפתחותיות טהורות אל גישות ביקורתיות יותר, המדגישות את תפקידה של הגננת כסוכנת שוויון וכמי שאמונה על צמצום פערים. יחד עם זאת, הסקירה מלמדת כי חלק ניכר מן ההתערבויות עדיין ממוקד בעמדות ובהכשרה עיונית, ופחות בפרקטיקה היומיומית של חלוקת המשאבים הרכים בגן, כמו תשומת לב, זמן ומרחב, שהם לב ליבו של הצדק החלוקתי בגיל הרך. פער זה מחזק את הרלוונטיות של המחקר הנוכחי, המבקש לבחון דווקא את הפרקטיקה ואת התפיסות הנלוות אליה.</w:t>
       </w:r>
     </w:p>
     <w:p>
@@ -965,12 +1110,11 @@
         <w:rPr>
           <w:rFonts w:ascii="David" w:hAnsi="David" w:cs="David"/>
           <w:b/>
-          <w:i w:val="0"/>
           <w:sz w:val="26"/>
           <w:szCs w:val="26"/>
           <w:rtl w:val="1"/>
         </w:rPr>
-        <w:t>2.7 הגננת כסוכנת הצדק הראשונה – פער מחקרי</w:t>
+        <w:t>2.7 הגננת כסוכנת הצדק הראשונה: פער מחקרי</w:t>
       </w:r>
     </w:p>
     <w:p>
@@ -984,12 +1128,11 @@
         <w:rPr>
           <w:rFonts w:ascii="David" w:hAnsi="David" w:cs="David"/>
           <w:b w:val="0"/>
-          <w:i w:val="0"/>
           <w:sz w:val="24"/>
           <w:szCs w:val="24"/>
           <w:rtl w:val="1"/>
         </w:rPr>
-        <w:t>מן הסקירה עולה כי בעוד הספרות מציעה עושר תיאורטי ויישומי נרחב בנוגע לתפיסות צדק בבית הספר, ניכר פער משמעותי בהבנת האופן שבו עקרונות אלה מתפרשים ומיושמים בגיל הרך. הגן הוא המפגש הממוסד הראשון של הילד עם כללי חלוקה שאינם מבוססים על קשר משפחתי, והגננת היא סוכנת הצדק הראשונה של הילד מול החברה. בניגוד לבית הספר, שבו הצדק נבחן דרך חלוקת ציונים, בגן מתבטא הצדק החלוקתי במשאבים חמקמקים יותר: זמן איכות עם הגננת, השתתפות בפעילויות מבוקשות, מרחב במעגל וקבלת תפקידים.</w:t>
+        <w:t>מן הסקירה עולה כי בעוד הספרות המחקרית מציעה עושר תיאורטי ויישומי נרחב בנוגע לתפיסות צדק בבתי ספר יסודיים ותיכוניים, ניכר פער משמעותי בהבנת האופן שבו עקרונות אלה מתפרשים ומיושמים במסגרת הגיל הרך. הגן הוא המפגש הממוסד הראשון של הילד עם המרחב הציבורי ועם כללי חלוקה שאינם מבוססים על קשר משפחתי, והגננת משמשת בו כסוכנת הצדק הראשונה של הילד מול החברה.</w:t>
       </w:r>
     </w:p>
     <w:p>
@@ -1003,12 +1146,29 @@
         <w:rPr>
           <w:rFonts w:ascii="David" w:hAnsi="David" w:cs="David"/>
           <w:b w:val="0"/>
-          <w:i w:val="0"/>
           <w:sz w:val="24"/>
           <w:szCs w:val="24"/>
           <w:rtl w:val="1"/>
         </w:rPr>
-        <w:t>הפער בולט במיוחד לנוכח העובדה שגננות פועלות בסביבה פחות פורמלית ופחות מובְנית ממורים, ולכן משקלו של שיקול הדעת האישי שלהן בקביעת הצדק בשטח רב עוד יותר. המחקר הנוכחי מבקש לגשר על פער זה, ולבחון כיצד גננות בישראל מפרשות ומיישמות את עקרונות הצדק וההוגנות בתוך הדינמיקה הייחודית של הגן.</w:t>
+        <w:t>בניגוד לבית הספר, שבו הצדק נבחן לרוב דרך משאב מדיד כמו ציון, בגן מתבטא הצדק החלוקתי במשאבים חמקמקים בהרבה: זמן איכות עם הגננת, תשומת לב רגשית, השתתפות בפעילויות מבוקשות, מקום במעגל, וקבלת תפקידים מנהיגותיים. משאבים אלה קשים למדידה, וחלוקתם נעשית לרוב באופן אינטואיטיבי, מה שמעצים את משקלו של שיקול הדעת האישי של הגננת.</w:t>
+      </w:r>
+    </w:p>
+    <w:p>
+      <w:pPr>
+        <w:bidi w:val="1"/>
+        <w:spacing w:line="360" w:lineRule="auto" w:before="0" w:after="120"/>
+        <w:ind w:firstLine="480"/>
+        <w:jc w:val="both"/>
+      </w:pPr>
+      <w:r>
+        <w:rPr>
+          <w:rFonts w:ascii="David" w:hAnsi="David" w:cs="David"/>
+          <w:b w:val="0"/>
+          <w:sz w:val="24"/>
+          <w:szCs w:val="24"/>
+          <w:rtl w:val="1"/>
+        </w:rPr>
+        <w:t>הפער המחקרי בולט במיוחד לנוכח העובדה שגננות פועלות בסביבה פחות פורמלית ופחות מובְנית ממורים, כך שהאחריות המוסרית והמעשית על עיצוב חוויית הצדק של הילד מוטלת עליהן במידה רבה עוד יותר. המחקר הנוכחי מבקש לגשר על פער זה, ולבחון כיצד גננות בישראל מפרשות, מגדירות ומיישמות את עקרונות הצדק וההוגנות בתוך הדינמיקה הייחודית של הגן, ומהי תפיסתן את תפקידן כסוכנות של שוויון וצדק חברתי.</w:t>
       </w:r>
     </w:p>
     <w:p>
@@ -1026,7 +1186,6 @@
         <w:rPr>
           <w:rFonts w:ascii="David" w:hAnsi="David" w:cs="David"/>
           <w:b/>
-          <w:i w:val="0"/>
           <w:sz w:val="30"/>
           <w:szCs w:val="30"/>
           <w:rtl w:val="1"/>
@@ -1044,7 +1203,6 @@
         <w:rPr>
           <w:rFonts w:ascii="David" w:hAnsi="David" w:cs="David"/>
           <w:b/>
-          <w:i w:val="0"/>
           <w:sz w:val="24"/>
           <w:szCs w:val="24"/>
           <w:rtl w:val="1"/>
@@ -1062,7 +1220,6 @@
         <w:rPr>
           <w:rFonts w:ascii="David" w:hAnsi="David" w:cs="David"/>
           <w:b/>
-          <w:i w:val="0"/>
           <w:sz w:val="24"/>
           <w:szCs w:val="24"/>
           <w:rtl w:val="1"/>
@@ -1080,7 +1237,6 @@
         <w:rPr>
           <w:rFonts w:ascii="David" w:hAnsi="David" w:cs="David"/>
           <w:b w:val="0"/>
-          <w:i w:val="0"/>
           <w:sz w:val="24"/>
           <w:szCs w:val="24"/>
           <w:rtl w:val="1"/>
@@ -1098,7 +1254,6 @@
         <w:rPr>
           <w:rFonts w:ascii="David" w:hAnsi="David" w:cs="David"/>
           <w:b w:val="0"/>
-          <w:i w:val="0"/>
           <w:sz w:val="24"/>
           <w:szCs w:val="24"/>
           <w:rtl w:val="1"/>
@@ -1116,7 +1271,6 @@
         <w:rPr>
           <w:rFonts w:ascii="David" w:hAnsi="David" w:cs="David"/>
           <w:b w:val="0"/>
-          <w:i w:val="0"/>
           <w:sz w:val="24"/>
           <w:szCs w:val="24"/>
           <w:rtl w:val="1"/>
@@ -1139,7 +1293,6 @@
         <w:rPr>
           <w:rFonts w:ascii="David" w:hAnsi="David" w:cs="David"/>
           <w:b/>
-          <w:i w:val="0"/>
           <w:sz w:val="30"/>
           <w:szCs w:val="30"/>
           <w:rtl w:val="1"/>
@@ -1157,7 +1310,6 @@
         <w:rPr>
           <w:rFonts w:ascii="David" w:hAnsi="David" w:cs="David"/>
           <w:b/>
-          <w:i w:val="0"/>
           <w:sz w:val="26"/>
           <w:szCs w:val="26"/>
           <w:rtl w:val="1"/>
@@ -1176,7 +1328,6 @@
         <w:rPr>
           <w:rFonts w:ascii="David" w:hAnsi="David" w:cs="David"/>
           <w:b w:val="0"/>
-          <w:i w:val="0"/>
           <w:sz w:val="24"/>
           <w:szCs w:val="24"/>
           <w:rtl w:val="1"/>
@@ -1195,12 +1346,11 @@
         <w:rPr>
           <w:rFonts w:ascii="David" w:hAnsi="David" w:cs="David"/>
           <w:b w:val="0"/>
-          <w:i w:val="0"/>
           <w:sz w:val="24"/>
           <w:szCs w:val="24"/>
           <w:rtl w:val="1"/>
         </w:rPr>
-        <w:t>קיימת הלימה בין השיטה הפנומנולוגית לבין שאלת המחקר, שכן ביקשתי לבחון את המציאות הנחקרת על בסיס מגע פרשני עם שש הגננות המשתתפות, לתאר ולפרש את האופן שבו הן חוות ומבינות את סוגיית הצדק בגן.</w:t>
+        <w:t>קיימת הלימה בין השיטה הפנומנולוגית לבין שאלת המחקר, שכן ביקשתי לבחון את המציאות הנחקרת על בסיס מגע פרשני עם שש הגננות המשתתפות, לתאר ולפרש את האופן שבו הן חוות ומבינות את סוגיית הצדק בגן, כפי שהיא מתקיימת בעולמן המקצועי היומיומי.</w:t>
       </w:r>
     </w:p>
     <w:p>
@@ -1213,7 +1363,6 @@
         <w:rPr>
           <w:rFonts w:ascii="David" w:hAnsi="David" w:cs="David"/>
           <w:b/>
-          <w:i w:val="0"/>
           <w:sz w:val="26"/>
           <w:szCs w:val="26"/>
           <w:rtl w:val="1"/>
@@ -1232,7 +1381,6 @@
         <w:rPr>
           <w:rFonts w:ascii="David" w:hAnsi="David" w:cs="David"/>
           <w:b w:val="0"/>
-          <w:i w:val="0"/>
           <w:sz w:val="24"/>
           <w:szCs w:val="24"/>
           <w:rtl w:val="1"/>
@@ -1250,7 +1398,6 @@
         <w:rPr>
           <w:rFonts w:ascii="David" w:hAnsi="David" w:cs="David"/>
           <w:b/>
-          <w:i w:val="0"/>
           <w:sz w:val="26"/>
           <w:szCs w:val="26"/>
           <w:rtl w:val="1"/>
@@ -1269,7 +1416,6 @@
         <w:rPr>
           <w:rFonts w:ascii="David" w:hAnsi="David" w:cs="David"/>
           <w:b w:val="0"/>
-          <w:i w:val="0"/>
           <w:sz w:val="24"/>
           <w:szCs w:val="24"/>
           <w:rtl w:val="1"/>
@@ -1287,7 +1433,6 @@
         <w:rPr>
           <w:rFonts w:ascii="David" w:hAnsi="David" w:cs="David"/>
           <w:b/>
-          <w:i w:val="0"/>
           <w:sz w:val="24"/>
           <w:szCs w:val="24"/>
           <w:rtl w:val="1"/>
@@ -1732,7 +1877,7 @@
                 <w:szCs w:val="24"/>
                 <w:rtl w:val="1"/>
               </w:rPr>
-              <w:t>גננת מובילה / חונכת גננות מתחילות</w:t>
+              <w:t>חונכת גננות מתחילות</w:t>
             </w:r>
           </w:p>
         </w:tc>
@@ -2512,7 +2657,6 @@
         <w:rPr>
           <w:rFonts w:ascii="David" w:hAnsi="David" w:cs="David"/>
           <w:b/>
-          <w:i w:val="0"/>
           <w:sz w:val="26"/>
           <w:szCs w:val="26"/>
           <w:rtl w:val="1"/>
@@ -2531,7 +2675,6 @@
         <w:rPr>
           <w:rFonts w:ascii="David" w:hAnsi="David" w:cs="David"/>
           <w:b w:val="0"/>
-          <w:i w:val="0"/>
           <w:sz w:val="24"/>
           <w:szCs w:val="24"/>
           <w:rtl w:val="1"/>
@@ -2549,7 +2692,6 @@
         <w:rPr>
           <w:rFonts w:ascii="David" w:hAnsi="David" w:cs="David"/>
           <w:b/>
-          <w:i w:val="0"/>
           <w:sz w:val="26"/>
           <w:szCs w:val="26"/>
           <w:rtl w:val="1"/>
@@ -2568,7 +2710,6 @@
         <w:rPr>
           <w:rFonts w:ascii="David" w:hAnsi="David" w:cs="David"/>
           <w:b w:val="0"/>
-          <w:i w:val="0"/>
           <w:sz w:val="24"/>
           <w:szCs w:val="24"/>
           <w:rtl w:val="1"/>
@@ -2586,7 +2727,6 @@
         <w:rPr>
           <w:rFonts w:ascii="David" w:hAnsi="David" w:cs="David"/>
           <w:b/>
-          <w:i w:val="0"/>
           <w:sz w:val="26"/>
           <w:szCs w:val="26"/>
           <w:rtl w:val="1"/>
@@ -2605,7 +2745,6 @@
         <w:rPr>
           <w:rFonts w:ascii="David" w:hAnsi="David" w:cs="David"/>
           <w:b w:val="0"/>
-          <w:i w:val="0"/>
           <w:sz w:val="24"/>
           <w:szCs w:val="24"/>
           <w:rtl w:val="1"/>
@@ -2623,7 +2762,6 @@
         <w:rPr>
           <w:rFonts w:ascii="David" w:hAnsi="David" w:cs="David"/>
           <w:b/>
-          <w:i w:val="0"/>
           <w:sz w:val="26"/>
           <w:szCs w:val="26"/>
           <w:rtl w:val="1"/>
@@ -2642,7 +2780,6 @@
         <w:rPr>
           <w:rFonts w:ascii="David" w:hAnsi="David" w:cs="David"/>
           <w:b w:val="0"/>
-          <w:i w:val="0"/>
           <w:sz w:val="24"/>
           <w:szCs w:val="24"/>
           <w:rtl w:val="1"/>
@@ -2661,7 +2798,6 @@
         <w:rPr>
           <w:rFonts w:ascii="David" w:hAnsi="David" w:cs="David"/>
           <w:b w:val="0"/>
-          <w:i w:val="0"/>
           <w:sz w:val="24"/>
           <w:szCs w:val="24"/>
           <w:rtl w:val="1"/>
@@ -2679,7 +2815,6 @@
         <w:rPr>
           <w:rFonts w:ascii="David" w:hAnsi="David" w:cs="David"/>
           <w:b/>
-          <w:i w:val="0"/>
           <w:sz w:val="26"/>
           <w:szCs w:val="26"/>
           <w:rtl w:val="1"/>
@@ -2698,7 +2833,6 @@
         <w:rPr>
           <w:rFonts w:ascii="David" w:hAnsi="David" w:cs="David"/>
           <w:b w:val="0"/>
-          <w:i w:val="0"/>
           <w:sz w:val="24"/>
           <w:szCs w:val="24"/>
           <w:rtl w:val="1"/>
@@ -2716,7 +2850,6 @@
         <w:rPr>
           <w:rFonts w:ascii="David" w:hAnsi="David" w:cs="David"/>
           <w:b/>
-          <w:i w:val="0"/>
           <w:sz w:val="26"/>
           <w:szCs w:val="26"/>
           <w:rtl w:val="1"/>
@@ -2735,7 +2868,6 @@
         <w:rPr>
           <w:rFonts w:ascii="David" w:hAnsi="David" w:cs="David"/>
           <w:b w:val="0"/>
-          <w:i w:val="0"/>
           <w:sz w:val="24"/>
           <w:szCs w:val="24"/>
           <w:rtl w:val="1"/>
@@ -2753,7 +2885,6 @@
         <w:rPr>
           <w:rFonts w:ascii="David" w:hAnsi="David" w:cs="David"/>
           <w:b/>
-          <w:i w:val="0"/>
           <w:sz w:val="26"/>
           <w:szCs w:val="26"/>
           <w:rtl w:val="1"/>
@@ -2772,7 +2903,6 @@
         <w:rPr>
           <w:rFonts w:ascii="David" w:hAnsi="David" w:cs="David"/>
           <w:b w:val="0"/>
-          <w:i w:val="0"/>
           <w:sz w:val="24"/>
           <w:szCs w:val="24"/>
           <w:rtl w:val="1"/>
@@ -2795,7 +2925,6 @@
         <w:rPr>
           <w:rFonts w:ascii="David" w:hAnsi="David" w:cs="David"/>
           <w:b/>
-          <w:i w:val="0"/>
           <w:sz w:val="30"/>
           <w:szCs w:val="30"/>
           <w:rtl w:val="1"/>
@@ -2814,12 +2943,11 @@
         <w:rPr>
           <w:rFonts w:ascii="David" w:hAnsi="David" w:cs="David"/>
           <w:b w:val="0"/>
-          <w:i w:val="0"/>
           <w:sz w:val="24"/>
           <w:szCs w:val="24"/>
           <w:rtl w:val="1"/>
         </w:rPr>
-        <w:t>במסגרת המחקר רואיינו שש גננות בנוגע לתפיסתן את ההתנהלות הצודקת וההוגנת בגן. מניתוח הראיונות עלו שש קטגוריות גרעין מרכזיות, המספקות מענה לשאלת המחקר: (1) תפיסת המונח "צדק בגן"; (2) חלוקת משאב תשומת הלב הרגשית; (3) ההבחנה בין חלוקה שווה לחלוקה הוגנת; (4) חלוקת המשאבים הפיזיים והמרחב הקבוצתי; (5) צדק חברתי-כלכלי ומניעת בושה; (6) הגננת כסוכנת צדק וכמחנכת ערכים. להלן יפורטו הקטגוריות, בליווי ציטוטים מדגימים ועיגון בספרות המחקרית.</w:t>
+        <w:t>במסגרת המחקר רואיינו שש גננות בנוגע לתפיסתן את ההתנהלות הצודקת וההוגנת בגן. מניתוח הראיונות עלו שש קטגוריות גרעין מרכזיות, המספקות מענה לשאלת המחקר: (1) תפיסת המונח "צדק בגן"; (2) חלוקת משאב תשומת הלב הרגשית; (3) ההבחנה בין חלוקה שווה לחלוקה הוגנת; (4) חלוקת המשאבים הפיזיים והמרחב הקבוצתי; (5) צדק חברתי-כלכלי ומניעת בושה; (6) הגננת כסוכנת צדק וכמחנכת ערכים. להלן יפורטו הקטגוריות, בליווי ציטוטים מדגימים מדברי המרואיינות ועיגון בספרות המחקרית.</w:t>
       </w:r>
     </w:p>
     <w:p>
@@ -2832,7 +2960,6 @@
         <w:rPr>
           <w:rFonts w:ascii="David" w:hAnsi="David" w:cs="David"/>
           <w:b/>
-          <w:i w:val="0"/>
           <w:sz w:val="26"/>
           <w:szCs w:val="26"/>
           <w:rtl w:val="1"/>
@@ -2851,12 +2978,11 @@
         <w:rPr>
           <w:rFonts w:ascii="David" w:hAnsi="David" w:cs="David"/>
           <w:b w:val="0"/>
-          <w:i w:val="0"/>
           <w:sz w:val="24"/>
           <w:szCs w:val="24"/>
           <w:rtl w:val="1"/>
         </w:rPr>
-        <w:t>כל שש המרואיינות נתבקשו לתאר מה עולה בדעתן כשהן שומעות את המונח "צדק בגן". מן התשובות עלו שלוש תפיסות משנה: צדק כראיית הילד הבודד וכערך מנחה, צדק כשוויון הזדמנויות, וצדק כהקשבה וניהול מתחים.</w:t>
+        <w:t>כל שש המרואיינות נתבקשו לתאר מה עולה בדעתן כשהן שומעות את המונח "צדק בגן". מן התשובות עלו שלוש תפיסות משנה, המשקפות דגשים שונים: צדק כראיית הילד הבודד וכערך מנחה, צדק כשוויון הזדמנויות, וצדק כהקשבה וכניהול מתחים בין צרכים.</w:t>
       </w:r>
     </w:p>
     <w:p>
@@ -2869,7 +2995,6 @@
         <w:rPr>
           <w:rFonts w:ascii="David" w:hAnsi="David" w:cs="David"/>
           <w:b/>
-          <w:i w:val="0"/>
           <w:sz w:val="24"/>
           <w:szCs w:val="24"/>
           <w:rtl w:val="1"/>
@@ -2888,12 +3013,11 @@
         <w:rPr>
           <w:rFonts w:ascii="David" w:hAnsi="David" w:cs="David"/>
           <w:b w:val="0"/>
-          <w:i w:val="0"/>
           <w:sz w:val="24"/>
           <w:szCs w:val="24"/>
           <w:rtl w:val="1"/>
         </w:rPr>
-        <w:t>ארבע מן המרואיינות תיארו את הצדק בגן כערך מנחה שעניינו ראיית הילד הספציפי ומתן מענה למה שהוא צריך, גם כאשר משמעות הדבר חלוקה שאינה זהה. שירה תיארה זאת כך:</w:t>
+        <w:t>מרואיינות אחדות תיארו את הצדק בגן כערך מנחה שעניינו ראיית הילד הספציפי ומתן מענה למה שהוא צריך, גם כאשר משמעות הדבר חלוקה שאינה זהה. שירה, שהגיעה מעולם העבודה הסוציאלית, ניסחה זאת:</w:t>
       </w:r>
     </w:p>
     <w:p>
@@ -2910,7 +3034,7 @@
           <w:szCs w:val="24"/>
           <w:rtl w:val="1"/>
         </w:rPr>
-        <w:t>צדק בגן זה שכל ילד ירגיש שרואים אותו, שיש לו מקום, שהוא מקבל את מה שהוא צריך. שימי לב, לא את מה שכולם מקבלים. את מה שהוא צריך. וזה כמעט אף פעם לא אותו דבר.</w:t>
+        <w:t>"אבל בשבילי צדק זה לא מה שכולם מקבלים, אלא מה שכל ילד צריך. זו המחשבה הראשונה."</w:t>
       </w:r>
       <w:r>
         <w:rPr>
@@ -2933,12 +3057,11 @@
         <w:rPr>
           <w:rFonts w:ascii="David" w:hAnsi="David" w:cs="David"/>
           <w:b w:val="0"/>
-          <w:i w:val="0"/>
           <w:sz w:val="24"/>
           <w:szCs w:val="24"/>
           <w:rtl w:val="1"/>
         </w:rPr>
-        <w:t>תמר הדגישה כי תפיסה זו דורשת עבודה והיכרות, ואינה מסתכמת בחלוקה שווה:</w:t>
+        <w:t>תמר הדגישה כי תפיסה זו דורשת עבודה והיכרות מעמיקה, ואינה מסתכמת בחלוקה שווה ופשוטה:</w:t>
       </w:r>
     </w:p>
     <w:p>
@@ -2955,7 +3078,7 @@
           <w:szCs w:val="24"/>
           <w:rtl w:val="1"/>
         </w:rPr>
-        <w:t>אנשים מבחוץ חושבים שצדק בגן זה פשוט לחלק שווה בשווה. אבל צדק אמיתי דורש ממני להכיר כל ילד לעומק, לדעת מה הוא באמת צריך... זה מושג שדורש עבודה, הוא לא סיסמה של כולם שווים.</w:t>
+        <w:t>"המחשבה הראשונה שעולה לי היא שצדק זה לא לחלק שווה בשווה. הרבה אנשים חושבים שצדק זה שכולם מקבלים אותו דבר, אותה כמות, אותו זמן, אותו יחס."</w:t>
       </w:r>
       <w:r>
         <w:rPr>
@@ -2978,7 +3101,6 @@
         <w:rPr>
           <w:rFonts w:ascii="David" w:hAnsi="David" w:cs="David"/>
           <w:b w:val="0"/>
-          <w:i w:val="0"/>
           <w:sz w:val="24"/>
           <w:szCs w:val="24"/>
           <w:rtl w:val="1"/>
@@ -2996,12 +3118,11 @@
         <w:rPr>
           <w:rFonts w:ascii="David" w:hAnsi="David" w:cs="David"/>
           <w:b/>
-          <w:i w:val="0"/>
           <w:sz w:val="24"/>
           <w:szCs w:val="24"/>
           <w:rtl w:val="1"/>
         </w:rPr>
-        <w:t>5.1.2 צדק כשוויון הזדמנויות</w:t>
+        <w:t>5.1.2 צדק כשוויון הזדמנויות וכצמצום פערים</w:t>
       </w:r>
     </w:p>
     <w:p>
@@ -3015,12 +3136,11 @@
         <w:rPr>
           <w:rFonts w:ascii="David" w:hAnsi="David" w:cs="David"/>
           <w:b w:val="0"/>
-          <w:i w:val="0"/>
           <w:sz w:val="24"/>
           <w:szCs w:val="24"/>
           <w:rtl w:val="1"/>
         </w:rPr>
-        <w:t>חלק מן המרואיינות הדגישו את ממד שוויון ההזדמנויות, כלומר את החתירה לכך שכל ילד, יהיה רקעו אשר יהיה, יזכה לאותה הזדמנות לממש את הפוטנציאל שלו. אסתר, המלמדת בשכונה מוחלשת, ניסחה זאת כשליחות:</w:t>
+        <w:t>מרואיינות אחרות, ובמיוחד אלה המלמדות באוכלוסיות מוחלשות, הדגישו את ממד שוויון ההזדמנויות, כלומר את החתירה לכך שכל ילד, יהיה רקעו אשר יהיה, יזכה לאותה הזדמנות לממש את הפוטנציאל שלו. אסתר תיארה זאת כשליחות:</w:t>
       </w:r>
     </w:p>
     <w:p>
@@ -3037,7 +3157,7 @@
           <w:szCs w:val="24"/>
           <w:rtl w:val="1"/>
         </w:rPr>
-        <w:t>אני רואה בעבודה שלי שליחות, לתת לילדים האלה בסיס שווה יותר, לצמצם ולו במעט את הפער שאיתו הם מתחילים... וזו בעיניי ההגשמה הכי מעשית של צדק חברתי, לצמצם פערים בפועל, ילד אחר ילד.</w:t>
+        <w:t>"בהחלט, זה הלב של כל מה שאני עושה, אני לא יכולה להפריד בין זה לבין החינוך עצמו. אצל ילד ממשפחה מבוססת החשיפה לעולם היא מובנת מאליה, ההורים לוקחים אותו למוזיאון, מנגנים לו מוזיקה בבית, קונים ספרים."</w:t>
       </w:r>
       <w:r>
         <w:rPr>
@@ -3060,7 +3180,6 @@
         <w:rPr>
           <w:rFonts w:ascii="David" w:hAnsi="David" w:cs="David"/>
           <w:b w:val="0"/>
-          <w:i w:val="0"/>
           <w:sz w:val="24"/>
           <w:szCs w:val="24"/>
           <w:rtl w:val="1"/>
@@ -3078,7 +3197,6 @@
         <w:rPr>
           <w:rFonts w:ascii="David" w:hAnsi="David" w:cs="David"/>
           <w:b/>
-          <w:i w:val="0"/>
           <w:sz w:val="24"/>
           <w:szCs w:val="24"/>
           <w:rtl w:val="1"/>
@@ -3097,12 +3215,11 @@
         <w:rPr>
           <w:rFonts w:ascii="David" w:hAnsi="David" w:cs="David"/>
           <w:b w:val="0"/>
-          <w:i w:val="0"/>
           <w:sz w:val="24"/>
           <w:szCs w:val="24"/>
           <w:rtl w:val="1"/>
         </w:rPr>
-        <w:t>מרואיינת אחת, נעמה, שעולמה המקצועי רגשי, הציגה תפיסה ייחודית שלפיה הצדק אינו תשובה מוכנה אלא תהליך של הקשבה וניהול מתחים בין צרכים מתנגשים:</w:t>
+        <w:t>נעמה, שעולמה המקצועי רגשי, הציגה תפיסה ייחודית שלפיה הצדק אינו תשובה מוכנה אלא תהליך של הקשבה וניהול מתחים בין צרכים מתנגשים:</w:t>
       </w:r>
     </w:p>
     <w:p>
@@ -3119,7 +3236,7 @@
           <w:szCs w:val="24"/>
           <w:rtl w:val="1"/>
         </w:rPr>
-        <w:t>מה שעולה לי מיד זה דווקא שאלה. צדק של מי?... צדק בגן זה בשבילי בעיקר היכולת לנהל את המתחים בין הצרכים והרגשות השונים, בצורה שכל אחד ירגיש שראו אותו ושמעו אותו. התחושה של שמעו אותי חשובה לילד לא פחות מהתוצאה.</w:t>
+        <w:t>"האמת שכשאני שומעת את המילה צדק, הדבר הראשון שעולה לי הוא שאלה, צדק של מי. כי אני לא מאמינה שיש צדק אחד אובייקטיבי שאפשר להוריד על הגן מלמעלה."</w:t>
       </w:r>
       <w:r>
         <w:rPr>
@@ -3142,12 +3259,11 @@
         <w:rPr>
           <w:rFonts w:ascii="David" w:hAnsi="David" w:cs="David"/>
           <w:b w:val="0"/>
-          <w:i w:val="0"/>
           <w:sz w:val="24"/>
           <w:szCs w:val="24"/>
           <w:rtl w:val="1"/>
         </w:rPr>
-        <w:t>תפיסה זו מתכתבת עם מושג הצדק האינטראקציוני והפרוצדורלי, המדגיש כי לא רק תוצאת החלוקה חשובה, אלא בעיקר איכות היחס וההליך: כבוד, הגינות ותחושה של הכרה (Horan, Chory &amp; Goodboy, 2010; Jiang et al., 2018).</w:t>
+        <w:t>תפיסה זו מתכתבת עם מושג הצדק האינטראקציוני והפרוצדורלי, המדגיש כי לא רק תוצאת החלוקה חשובה, אלא בעיקר איכות היחס וההליך: מתן כבוד, הגינות ותחושה של הכרה והקשבה (Horan, Chory &amp; Goodboy, 2010; Jiang et al., 2018).</w:t>
       </w:r>
     </w:p>
     <w:p>
@@ -3160,7 +3276,6 @@
         <w:rPr>
           <w:rFonts w:ascii="David" w:hAnsi="David" w:cs="David"/>
           <w:b/>
-          <w:i w:val="0"/>
           <w:sz w:val="26"/>
           <w:szCs w:val="26"/>
           <w:rtl w:val="1"/>
@@ -3179,12 +3294,11 @@
         <w:rPr>
           <w:rFonts w:ascii="David" w:hAnsi="David" w:cs="David"/>
           <w:b w:val="0"/>
-          <w:i w:val="0"/>
           <w:sz w:val="24"/>
           <w:szCs w:val="24"/>
           <w:rtl w:val="1"/>
         </w:rPr>
-        <w:t>כל המרואיינות התייחסו לתשומת הלב הרגשית כאל משאב מרכזי, ואולי המרכזי ביותר, שהן נדרשות לחלק בצדק. מן הראיונות עלו שני עקרונות: חלוקה לפי צורך, ותשומת לב מיוחדת לילד השקט.</w:t>
+        <w:t>כל המרואיינות התייחסו לתשומת הלב הרגשית כאל משאב מרכזי, ואולי המרכזי ביותר, שהן נדרשות לחלק בצדק. מן הראיונות עלו שני עקרונות משלימים: חלוקה לפי צורך, ותשומת לב מיוחדת לילד השקט.</w:t>
       </w:r>
     </w:p>
     <w:p>
@@ -3197,7 +3311,6 @@
         <w:rPr>
           <w:rFonts w:ascii="David" w:hAnsi="David" w:cs="David"/>
           <w:b/>
-          <w:i w:val="0"/>
           <w:sz w:val="24"/>
           <w:szCs w:val="24"/>
           <w:rtl w:val="1"/>
@@ -3216,12 +3329,11 @@
         <w:rPr>
           <w:rFonts w:ascii="David" w:hAnsi="David" w:cs="David"/>
           <w:b w:val="0"/>
-          <w:i w:val="0"/>
           <w:sz w:val="24"/>
           <w:szCs w:val="24"/>
           <w:rtl w:val="1"/>
         </w:rPr>
-        <w:t>רוב המרואיינות תיארו כי הן מעניקות תשומת לב מוגברת לילד שזקוק לה, מתוך הבנה שזוהי הוגנות ולא הפליה. רבקה תיארה אסטרטגיה שכינתה "לתת יותר בלי לגזול":</w:t>
+        <w:t>רוב המרואיינות תיארו כי הן מעניקות תשומת לב מוגברת לילד שזקוק לה, מתוך הבנה שזוהי הוגנות ולא הפליה. רבקה תיארה אסטרטגיה מגובשת:</w:t>
       </w:r>
     </w:p>
     <w:p>
@@ -3238,7 +3350,7 @@
           <w:szCs w:val="24"/>
           <w:rtl w:val="1"/>
         </w:rPr>
-        <w:t>אני מחפשת לתת לילד שצריך דווקא בזמנים שזה לא בא על חשבון האחרים, בקבלת בוקר, בחצר, ברגע הפרידה. ככה הוא מקבל את התוספת, והקבוצה לא מרגישה מקופחת.</w:t>
+        <w:t>"אלה זמנים שממילא לא באים על חשבון אף אחד. חוץ מזה, השתמשתי במה שאני קוראת לו החברים הגדולים."</w:t>
       </w:r>
       <w:r>
         <w:rPr>
@@ -3261,7 +3373,6 @@
         <w:rPr>
           <w:rFonts w:ascii="David" w:hAnsi="David" w:cs="David"/>
           <w:b w:val="0"/>
-          <w:i w:val="0"/>
           <w:sz w:val="24"/>
           <w:szCs w:val="24"/>
           <w:rtl w:val="1"/>
@@ -3279,7 +3390,6 @@
         <w:rPr>
           <w:rFonts w:ascii="David" w:hAnsi="David" w:cs="David"/>
           <w:b/>
-          <w:i w:val="0"/>
           <w:sz w:val="24"/>
           <w:szCs w:val="24"/>
           <w:rtl w:val="1"/>
@@ -3298,12 +3408,11 @@
         <w:rPr>
           <w:rFonts w:ascii="David" w:hAnsi="David" w:cs="David"/>
           <w:b w:val="0"/>
-          <w:i w:val="0"/>
           <w:sz w:val="24"/>
           <w:szCs w:val="24"/>
           <w:rtl w:val="1"/>
         </w:rPr>
-        <w:t>ממצא בולט וחוזר היה המודעות לכך שהילד השקט והנוח הוא זה הנמצא בסיכון הגדול ביותר להיעלם מן הרדאר. יעל, גננת צעירה, תיארה זאת כרגע מכונן:</w:t>
+        <w:t>ממצא בולט וחוזר היה המודעות לכך שהילד השקט והנוח הוא זה הנמצא בסיכון הגדול ביותר להיעלם מן הרדאר לטובת הרועש והדורש. יעל, גננת צעירה, תיארה זאת כרגע מכונן שבו תיעדה את חלוקת תשומת הלב שלה:</w:t>
       </w:r>
     </w:p>
     <w:p>
@@ -3320,7 +3429,7 @@
           <w:szCs w:val="24"/>
           <w:rtl w:val="1"/>
         </w:rPr>
-        <w:t>תיעדתי לעצמי את חלוקת תשומת הלב, ונדהמתי לגלות שהיו ימים שכמעט לא דיברתי עם ילדה מסוימת, שקטה ונחמדה. פשוט נעלמה לי בין הרועשים... זה בדיוק העוול שהכי פחדתי ממנו, שאני מחלקת את עצמי לפי מי שצועק חזק.</w:t>
+        <w:t>"האמת שזה אחד הדברים שהכי מטרידים אותי, כי יום בגן הוא בלגן מתוק, ותשומת הלב זזה כל הזמן לכיוון של מי שהכי רועש או הכי בוכה או הכי מושך. עשיתי פעם משהו שממש שינה לי את הראייה."</w:t>
       </w:r>
       <w:r>
         <w:rPr>
@@ -3343,12 +3452,11 @@
         <w:rPr>
           <w:rFonts w:ascii="David" w:hAnsi="David" w:cs="David"/>
           <w:b w:val="0"/>
-          <w:i w:val="0"/>
           <w:sz w:val="24"/>
           <w:szCs w:val="24"/>
           <w:rtl w:val="1"/>
         </w:rPr>
-        <w:t>אסתר, המלמדת בגן עם צרכים גדולים, הדגישה כי דווקא בסביבה עתירת מצוקה קל לשקט להיבלע, ולכן היא מחפשת אותו באופן פעיל. מודעות זו ממחישה כי הגננות תופסות את חלוקת תשומת הלב לא כתהליך אינטואיטיבי אלא כפעולה מכוונת ושיטתית, שכן ההיענות האינטואיטיבית לרועש עלולה כשלעצמה להוליד אי-צדק.</w:t>
+        <w:t>אסתר, המלמדת בגן עתיר צרכים, הדגישה כי דווקא בסביבה שבה הצרכים הגדולים תופסים מקום רב, קל לשקט להיבלע, ולכן היא מחפשת אותו באופן פעיל. מודעות זו ממחישה כי הגננות תופסות את חלוקת תשומת הלב לא כתהליך אינטואיטיבי בלבד אלא כפעולה מכוונת ושיטתית, שכן ההיענות האינטואיטיבית לרועש עלולה כשלעצמה להוליד אי-צדק.</w:t>
       </w:r>
     </w:p>
     <w:p>
@@ -3361,7 +3469,6 @@
         <w:rPr>
           <w:rFonts w:ascii="David" w:hAnsi="David" w:cs="David"/>
           <w:b/>
-          <w:i w:val="0"/>
           <w:sz w:val="26"/>
           <w:szCs w:val="26"/>
           <w:rtl w:val="1"/>
@@ -3380,7 +3487,6 @@
         <w:rPr>
           <w:rFonts w:ascii="David" w:hAnsi="David" w:cs="David"/>
           <w:b w:val="0"/>
-          <w:i w:val="0"/>
           <w:sz w:val="24"/>
           <w:szCs w:val="24"/>
           <w:rtl w:val="1"/>
@@ -3402,7 +3508,7 @@
           <w:szCs w:val="24"/>
           <w:rtl w:val="1"/>
         </w:rPr>
-        <w:t>יש לי ילד שמגיע כמעט כל בוקר בלי ארוחת בוקר, כי אין בבית מספיק אוכל. אם אני נותנת לכולם אותה כמות אוכל בשם השוויון, הילד הזה נשאר רעב... זה לא שווה, אבל זה הדבר הכי צודק שאני יכולה לעשות.</w:t>
+        <w:t>"אצל הילד הרעב זו אותה שאלה. פרוסה לכולם זה שווה, אבל להביא ליוסי עוד ארוחה בבוקר בלי לספר לאף אחד זה הוגן."</w:t>
       </w:r>
       <w:r>
         <w:rPr>
@@ -3425,12 +3531,11 @@
         <w:rPr>
           <w:rFonts w:ascii="David" w:hAnsi="David" w:cs="David"/>
           <w:b w:val="0"/>
-          <w:i w:val="0"/>
           <w:sz w:val="24"/>
           <w:szCs w:val="24"/>
           <w:rtl w:val="1"/>
         </w:rPr>
-        <w:t>רבקה הדגימה זאת דרך ילד עם קושי מוטורי במשחק קלפים, ותמר תיארה כיצד ויתרה על תחרויות ריצה קלאסיות לטובת משחקים שיתופיים, כדי שילד עם קושי מוטורי לא יחווה השפלה:</w:t>
+        <w:t>תמר תיארה כיצד ויתרה על תחרויות ריצה קלאסיות לטובת משחקים שיתופיים, כדי שילד עם קושי מוטורי לא יחווה השפלה, ויעל סיפרה כי היא מלמדת את ההבחנה במפורש באמצעות דימוי חזותי של ילדים בגבהים שונים הזקוקים למספר שונה של ארגזים:</w:t>
       </w:r>
     </w:p>
     <w:p>
@@ -3447,7 +3552,7 @@
           <w:szCs w:val="24"/>
           <w:rtl w:val="1"/>
         </w:rPr>
-        <w:t>לפעמים כדי להיות הוגן צריך לשנות את הכללים עצמם, לא רק לחלק שווה בתוך כללים שמפלים מראש את החלש.</w:t>
+        <w:t>"אבל הדוגמה הכי יפה היא התמונה של שלושת הילדים מאחורי הגדר עם הארגזים. הראיתי אותה לילדים והם ממש הבינו את זה לבד, שלתת לכולם ארגז אחד זה שווה אבל הנמוך עדיין לא רואה, ורק אם נותנים לו עוד ארגז זה הופך להוגן."</w:t>
       </w:r>
       <w:r>
         <w:rPr>
@@ -3456,7 +3561,7 @@
           <w:szCs w:val="24"/>
           <w:rtl w:val="1"/>
         </w:rPr>
-        <w:t xml:space="preserve">  (תמר)</w:t>
+        <w:t xml:space="preserve">  (יעל)</w:t>
       </w:r>
     </w:p>
     <w:p>
@@ -3470,12 +3575,11 @@
         <w:rPr>
           <w:rFonts w:ascii="David" w:hAnsi="David" w:cs="David"/>
           <w:b w:val="0"/>
-          <w:i w:val="0"/>
           <w:sz w:val="24"/>
           <w:szCs w:val="24"/>
           <w:rtl w:val="1"/>
         </w:rPr>
-        <w:t>יעל תיארה כי היא מלמדת את ההבחנה במפורש באמצעות דימוי חזותי מוכר של ילדים בגבהים שונים מאחורי גדר, וכי הילדים אימצו אותו כשפה יומיומית ("תן לו עוד ארגז"). ממצא זה הוא לב לבו של המחקר, והוא מבטא באופן מובהק את המעבר מן התפיסה הפורמלית של השוויון אל ההוגנות המהותית, המבוססת על עיקרון הצורך (דהאן, 2010; Connell, 1993). ההבחנה החדה שעורכות כל הגננות מעידה כי בגן, בהיעדר משאב מדיד כמו ציון, ההוגנות מבוססת-הצורך היא עקרון החלוקה הדומיננטי.</w:t>
+        <w:t>ממצא זה הוא לב לבו של המחקר, והוא מבטא באופן מובהק את המעבר מן התפיסה הפורמלית של השוויון אל ההוגנות המהותית, המבוססת על עיקרון הצורך (דהאן, 2010; Connell, 1993). ההבחנה החדה שעורכות כל הגננות מעידה כי בגן, בהיעדר משאב מדיד כמו ציון, ההוגנות מבוססת-הצורך היא עקרון החלוקה הדומיננטי בעיניהן.</w:t>
       </w:r>
     </w:p>
     <w:p>
@@ -3488,7 +3592,6 @@
         <w:rPr>
           <w:rFonts w:ascii="David" w:hAnsi="David" w:cs="David"/>
           <w:b/>
-          <w:i w:val="0"/>
           <w:sz w:val="26"/>
           <w:szCs w:val="26"/>
           <w:rtl w:val="1"/>
@@ -3506,7 +3609,6 @@
         <w:rPr>
           <w:rFonts w:ascii="David" w:hAnsi="David" w:cs="David"/>
           <w:b/>
-          <w:i w:val="0"/>
           <w:sz w:val="24"/>
           <w:szCs w:val="24"/>
           <w:rtl w:val="1"/>
@@ -3525,7 +3627,6 @@
         <w:rPr>
           <w:rFonts w:ascii="David" w:hAnsi="David" w:cs="David"/>
           <w:b w:val="0"/>
-          <w:i w:val="0"/>
           <w:sz w:val="24"/>
           <w:szCs w:val="24"/>
           <w:rtl w:val="1"/>
@@ -3547,7 +3648,7 @@
           <w:szCs w:val="24"/>
           <w:rtl w:val="1"/>
         </w:rPr>
-        <w:t>הצפיות של המערכת היא מה שיוצר את ההוגנות. ילד מוכן לחכות בסבלנות מדהימה כשהוא יודע בוודאות שגם הוא יקבל. מה שמעצבן ילד זה לא ההמתנה, זה חוסר הוודאות.</w:t>
+        <w:t>"בחומרים אני עובדת עם דבר אחד שהוא מקור ההוגנות אצלי, תור עם שמות. יש לנו בגן אופניים, ולפני שנים זה היה שדה קרב."</w:t>
       </w:r>
       <w:r>
         <w:rPr>
@@ -3570,7 +3671,6 @@
         <w:rPr>
           <w:rFonts w:ascii="David" w:hAnsi="David" w:cs="David"/>
           <w:b w:val="0"/>
-          <w:i w:val="0"/>
           <w:sz w:val="24"/>
           <w:szCs w:val="24"/>
           <w:rtl w:val="1"/>
@@ -3588,7 +3688,6 @@
         <w:rPr>
           <w:rFonts w:ascii="David" w:hAnsi="David" w:cs="David"/>
           <w:b/>
-          <w:i w:val="0"/>
           <w:sz w:val="24"/>
           <w:szCs w:val="24"/>
           <w:rtl w:val="1"/>
@@ -3607,12 +3706,11 @@
         <w:rPr>
           <w:rFonts w:ascii="David" w:hAnsi="David" w:cs="David"/>
           <w:b w:val="0"/>
-          <w:i w:val="0"/>
           <w:sz w:val="24"/>
           <w:szCs w:val="24"/>
           <w:rtl w:val="1"/>
         </w:rPr>
-        <w:t>כל המרואיינות תיארו התמודדות עם ילד ה"לוקח" מקום רב במרחב הקבוצתי, ועם מצבים של הדרה חברתית. עמדתן המשותפת הייתה שאין לדכא את הילד הדומיננטי אלא לתעל אותו, ובד בבד להעצים את השקטים, כדי לאזן את המרחב "על-ידי הגדלה של אחרים ולא על-ידי הקטנה של מישהו" (רבקה). באשר להדרה, הדגישו המרואיינות כי אין לכפות משחק, אלא לשקם את מעמדו החברתי של הילד המודר. אסתר קישרה זאת במפורש לצדק חברתי:</w:t>
+        <w:t>כל המרואיינות תיארו התמודדות עם ילד ה"לוקח" מקום רב במרחב הקבוצתי, ועם מצבים של הדרה חברתית. עמדתן המשותפת הייתה שאין לדכא את הילד הדומיננטי אלא לתעל אותו, ובד בבד להעצים את השקטים, כדי לאזן את המרחב על-ידי הגדלה של אחרים ולא על-ידי הקטנה של מישהו. באשר להדרה, הדגישו המרואיינות כי אין לכפות משחק, אלא לשקם את מעמדו החברתי של הילד המודר. אסתר קישרה זאת במפורש לצדק חברתי:</w:t>
       </w:r>
     </w:p>
     <w:p>
@@ -3629,7 +3727,7 @@
           <w:szCs w:val="24"/>
           <w:rtl w:val="1"/>
         </w:rPr>
-        <w:t>בגן שלי לפעמים ההדרה קשורה בדיוק לדברים שהם לא באשמת הילד, הבגדים, הריח, העוני. וזה עוול כפול, כי הילד מודר בגלל מצוקה שהוא הקורבן שלה... ההדרה בגן כמו שלי היא סוגיה של צדק חברתי במלוא מובן המילה.</w:t>
+        <w:t>"אבל בגן שלי ההדרה כמעט תמיד קשורה לעוני, וזה מה שהופך אותה בעיני לעוול כפול. ילד מודר פה כי הבגדים שלו ישנים, כי לפעמים יש לו ריח כי אין מכונת כביסה בבית, כי אין לו את הצעצוע שכולם מדברים עליו."</w:t>
       </w:r>
       <w:r>
         <w:rPr>
@@ -3652,7 +3750,6 @@
         <w:rPr>
           <w:rFonts w:ascii="David" w:hAnsi="David" w:cs="David"/>
           <w:b w:val="0"/>
-          <w:i w:val="0"/>
           <w:sz w:val="24"/>
           <w:szCs w:val="24"/>
           <w:rtl w:val="1"/>
@@ -3670,7 +3767,6 @@
         <w:rPr>
           <w:rFonts w:ascii="David" w:hAnsi="David" w:cs="David"/>
           <w:b/>
-          <w:i w:val="0"/>
           <w:sz w:val="26"/>
           <w:szCs w:val="26"/>
           <w:rtl w:val="1"/>
@@ -3689,7 +3785,6 @@
         <w:rPr>
           <w:rFonts w:ascii="David" w:hAnsi="David" w:cs="David"/>
           <w:b w:val="0"/>
-          <w:i w:val="0"/>
           <w:sz w:val="24"/>
           <w:szCs w:val="24"/>
           <w:rtl w:val="1"/>
@@ -3711,7 +3806,7 @@
           <w:szCs w:val="24"/>
           <w:rtl w:val="1"/>
         </w:rPr>
-        <w:t>ימי הולדת חוגגים בגן בפורמט צנוע וזהה, עוגה אחת, כתר, שיר. זה שחרר המון לחץ, מנע בושה, והחזיר את יום ההולדת להיות על הילד ולא על ההפקה.</w:t>
+        <w:t>"הזכרתי לך את ימי ההולדת, בגלל זה קבעתי כלל אחיד וצנוע, שאף ילד לא יתבייש כי אין לו כסף לחגיגה גדולה. גם בטיולים, אני דואגת שהעלות תהיה מינימלית, ואם צריך אני מוצאת בשקט דרך לעזור למשפחה בלי שאיש ידע."</w:t>
       </w:r>
       <w:r>
         <w:rPr>
@@ -3734,12 +3829,11 @@
         <w:rPr>
           <w:rFonts w:ascii="David" w:hAnsi="David" w:cs="David"/>
           <w:b w:val="0"/>
-          <w:i w:val="0"/>
           <w:sz w:val="24"/>
           <w:szCs w:val="24"/>
           <w:rtl w:val="1"/>
         </w:rPr>
-        <w:t>תמר, שגדלה בעצמה במיעוט אמצעים, תיארה החלטה עקרונית שכל החומרים המשמעותיים יגיעו מן הגן ולא מן הבית, כדי "שברגע שהם עוברים את השער, הם נכנסים למרחב שבו כולם שווים". שירה תיארה הימנעות מכוונת משאלות החושפות פערים (כמו "מה עשיתם בחופש?"). מאמצים אלה מבטאים תפיסה של הגן כמרחב המבקש לצמצם פערים ולא לשקף אותם, ומתחברים לספרות על הצדק החברתי בחינוך כפעולה מתקנת מול ריבוד חברתי-כלכלי (דהאן, 2010; אדלר ובלס, 2009; Elenbaas &amp; Mistry, 2021).</w:t>
+        <w:t>תמר, שגדלה בעצמה במיעוט אמצעים, תיארה החלטה עקרונית שכל החומרים המשמעותיים יגיעו מן הגן ולא מן הבית, כדי שברגע שהילדים עוברים את שער הגן הם נכנסים למרחב שבו כולם שווים. מאמצים אלה מבטאים תפיסה של הגן כמרחב המבקש לצמצם פערים ולא לשקף אותם, ומתחברים לספרות על הצדק החברתי בחינוך כפעולה מתקנת מול ריבוד חברתי-כלכלי (דהאן, 2010; אדלר ובלס, 2009; Elenbaas &amp; Mistry, 2021).</w:t>
       </w:r>
     </w:p>
     <w:p>
@@ -3752,7 +3846,6 @@
         <w:rPr>
           <w:rFonts w:ascii="David" w:hAnsi="David" w:cs="David"/>
           <w:b/>
-          <w:i w:val="0"/>
           <w:sz w:val="26"/>
           <w:szCs w:val="26"/>
           <w:rtl w:val="1"/>
@@ -3771,7 +3864,6 @@
         <w:rPr>
           <w:rFonts w:ascii="David" w:hAnsi="David" w:cs="David"/>
           <w:b w:val="0"/>
-          <w:i w:val="0"/>
           <w:sz w:val="24"/>
           <w:szCs w:val="24"/>
           <w:rtl w:val="1"/>
@@ -3793,7 +3885,7 @@
           <w:szCs w:val="24"/>
           <w:rtl w:val="1"/>
         </w:rPr>
-        <w:t>הילדים לא לומדים ממה שאני מטיפה, הם לומדים מאיך שאני מתייחסת לילד שקשה לו, מאיך שאני מחלקת. הם קולטים הכול.</w:t>
+        <w:t>"ילדים לומדים צדק מדוגמה אישית, לא מהטפה, אני חוזרת לזה כי זה באמת האני מאמין שלי. אני לא מסוגלת לחנך לצדק אם אני עצמי לא הוגנת מולם."</w:t>
       </w:r>
       <w:r>
         <w:rPr>
@@ -3816,12 +3908,11 @@
         <w:rPr>
           <w:rFonts w:ascii="David" w:hAnsi="David" w:cs="David"/>
           <w:b w:val="0"/>
-          <w:i w:val="0"/>
           <w:sz w:val="24"/>
           <w:szCs w:val="24"/>
           <w:rtl w:val="1"/>
         </w:rPr>
-        <w:t>המרואיינות תיארו כי גיל הגן הוא הגיל שבו נבנות התפיסות הבסיסיות על שוויון ושייכות, וכי הן רואות עצמן זורעות את יסודות החברה העתידית. תפיסה זו תואמת את ההמשגה של הגננת כסוכנת הצדק הראשונה של הילד, ומתכתבת עם הספרות המדגישה את תפקידה של הגננת כדמות מוסרית וכסוכנת שינוי, אך גם עם הממצא בדבר השונות הרבה בין גננות במידת המודעות והכלים שברשותן (Solehuddin &amp; Adriany, 2017; Lang et al., 2024; Ryan &amp; Grieshaber, 2024).</w:t>
+        <w:t>המרואיינות תיארו כי גיל הגן הוא הגיל שבו נבנות התפיסות הבסיסיות על שוויון ושייכות, וכי הן רואות עצמן זורעות את יסודות החברה העתידית. תפיסה זו תואמת את ההמשגה של הגננת כסוכנת הצדק הראשונה של הילד, ומתכתבת עם הספרות המדגישה את תפקידה כדמות מוסרית וכסוכנת שינוי, אך גם עם הממצא בדבר השונות הרבה בין גננות במידת המודעות המפורשת ובכלים שברשותן (Solehuddin &amp; Adriany, 2017; Lang et al., 2024; Ryan &amp; Grieshaber, 2024).</w:t>
       </w:r>
     </w:p>
     <w:p>
@@ -3839,7 +3930,6 @@
         <w:rPr>
           <w:rFonts w:ascii="David" w:hAnsi="David" w:cs="David"/>
           <w:b/>
-          <w:i w:val="0"/>
           <w:sz w:val="30"/>
           <w:szCs w:val="30"/>
           <w:rtl w:val="1"/>
@@ -3858,7 +3948,6 @@
         <w:rPr>
           <w:rFonts w:ascii="David" w:hAnsi="David" w:cs="David"/>
           <w:b w:val="0"/>
-          <w:i w:val="0"/>
           <w:sz w:val="24"/>
           <w:szCs w:val="24"/>
           <w:rtl w:val="1"/>
@@ -3877,7 +3966,6 @@
         <w:rPr>
           <w:rFonts w:ascii="David" w:hAnsi="David" w:cs="David"/>
           <w:b w:val="0"/>
-          <w:i w:val="0"/>
           <w:sz w:val="24"/>
           <w:szCs w:val="24"/>
           <w:rtl w:val="1"/>
@@ -3896,7 +3984,6 @@
         <w:rPr>
           <w:rFonts w:ascii="David" w:hAnsi="David" w:cs="David"/>
           <w:b w:val="0"/>
-          <w:i w:val="0"/>
           <w:sz w:val="24"/>
           <w:szCs w:val="24"/>
           <w:rtl w:val="1"/>
@@ -3915,7 +4002,6 @@
         <w:rPr>
           <w:rFonts w:ascii="David" w:hAnsi="David" w:cs="David"/>
           <w:b w:val="0"/>
-          <w:i w:val="0"/>
           <w:sz w:val="24"/>
           <w:szCs w:val="24"/>
           <w:rtl w:val="1"/>
@@ -3934,7 +4020,6 @@
         <w:rPr>
           <w:rFonts w:ascii="David" w:hAnsi="David" w:cs="David"/>
           <w:b w:val="0"/>
-          <w:i w:val="0"/>
           <w:sz w:val="24"/>
           <w:szCs w:val="24"/>
           <w:rtl w:val="1"/>
@@ -3953,7 +4038,6 @@
         <w:rPr>
           <w:rFonts w:ascii="David" w:hAnsi="David" w:cs="David"/>
           <w:b w:val="0"/>
-          <w:i w:val="0"/>
           <w:sz w:val="24"/>
           <w:szCs w:val="24"/>
           <w:rtl w:val="1"/>
@@ -3972,7 +4056,6 @@
         <w:rPr>
           <w:rFonts w:ascii="David" w:hAnsi="David" w:cs="David"/>
           <w:b w:val="0"/>
-          <w:i w:val="0"/>
           <w:sz w:val="24"/>
           <w:szCs w:val="24"/>
           <w:rtl w:val="1"/>
@@ -3995,7 +4078,6 @@
         <w:rPr>
           <w:rFonts w:ascii="David" w:hAnsi="David" w:cs="David"/>
           <w:b/>
-          <w:i w:val="0"/>
           <w:sz w:val="30"/>
           <w:szCs w:val="30"/>
           <w:rtl w:val="1"/>
@@ -4013,7 +4095,6 @@
         <w:rPr>
           <w:rFonts w:ascii="David" w:hAnsi="David" w:cs="David"/>
           <w:b/>
-          <w:i w:val="0"/>
           <w:sz w:val="24"/>
           <w:szCs w:val="24"/>
           <w:rtl w:val="1"/>
@@ -4130,7 +4211,7 @@
           <w:szCs w:val="24"/>
           <w:rtl w:val="1"/>
         </w:rPr>
-        <w:t>יוספסברג, נ' (2008). זכויות חברתיות: מציאות ואתגרים. תוך תפיסה של צדק חלוקתי. האגודה לזכויות האזרח.</w:t>
+        <w:t>יוספסברג, נ' (2008). זכויות חברתיות: מציאות ואתגרים, מתוך תפיסה של צדק חלוקתי. האגודה לזכויות האזרח בישראל.</w:t>
       </w:r>
     </w:p>
     <w:p>
@@ -4210,7 +4291,7 @@
           <w:szCs w:val="24"/>
           <w:rtl w:val="1"/>
         </w:rPr>
-        <w:t>קרמרסקי, ב' ורש, נ' (2004). צדק בבית ספר: תפיסות של תלמידים ומורים בדבר צדק בחלוקת ציונים. בית הספר לחינוך, אוניברסיטת בר-אילן.</w:t>
+        <w:t>קרמרסקי, ב' ורש, נ' (2004). צדק בבית ספר: תפיסות של תלמידים ומורים בדבר צדק בחלוקת ציונים. רמת גן: בית הספר לחינוך, אוניברסיטת בר-אילן.</w:t>
       </w:r>
     </w:p>
     <w:p>
@@ -4239,7 +4320,6 @@
         <w:rPr>
           <w:rFonts w:ascii="David" w:hAnsi="David" w:cs="David"/>
           <w:b/>
-          <w:i w:val="0"/>
           <w:sz w:val="24"/>
           <w:szCs w:val="24"/>
           <w:rtl w:val="1"/>
@@ -4409,7 +4489,7 @@
           <w:rFonts w:ascii="David" w:hAnsi="David" w:cs="David"/>
           <w:sz w:val="24"/>
         </w:rPr>
-        <w:t>Ryan, S., &amp; Grieshaber, S. (2024). Early childhood teacher education for social justice and equity: A systematic literature review. International Journal of Early Years Education, 32(3), 768–790.</w:t>
+        <w:t>Rawls, J. (1971). A theory of justice. Harvard University Press.</w:t>
       </w:r>
     </w:p>
     <w:p>
@@ -4424,7 +4504,7 @@
           <w:rFonts w:ascii="David" w:hAnsi="David" w:cs="David"/>
           <w:sz w:val="24"/>
         </w:rPr>
-        <w:t>Solehuddin, M., &amp; Adriany, V. (2017). Kindergarten teachers’ understanding on social justice: Stories from Indonesia. SAGE Open, 7(4). https://doi.org/10.1177/2158244017739340</w:t>
+        <w:t>Ryan, S., &amp; Grieshaber, S. (2024). Early childhood teacher education for social justice and equity: A systematic literature review. International Journal of Early Years Education, 32(3), 768–790.</w:t>
       </w:r>
     </w:p>
     <w:p>
@@ -4439,7 +4519,7 @@
           <w:rFonts w:ascii="David" w:hAnsi="David" w:cs="David"/>
           <w:sz w:val="24"/>
         </w:rPr>
-        <w:t>Rawls, J. (1971). A theory of justice. Harvard University Press.</w:t>
+        <w:t>Solehuddin, M., &amp; Adriany, V. (2017). Kindergarten teachers’ understanding on social justice: Stories from Indonesia. SAGE Open, 7(4). https://doi.org/10.1177/2158244017739340</w:t>
       </w:r>
     </w:p>
     <w:p>
@@ -4457,7 +4537,6 @@
         <w:rPr>
           <w:rFonts w:ascii="David" w:hAnsi="David" w:cs="David"/>
           <w:b/>
-          <w:i w:val="0"/>
           <w:sz w:val="30"/>
           <w:szCs w:val="30"/>
           <w:rtl w:val="1"/>
@@ -4475,7 +4554,6 @@
         <w:rPr>
           <w:rFonts w:ascii="David" w:hAnsi="David" w:cs="David"/>
           <w:b/>
-          <w:i w:val="0"/>
           <w:sz w:val="26"/>
           <w:szCs w:val="26"/>
           <w:rtl w:val="1"/>
@@ -4495,7 +4573,7 @@
           <w:szCs w:val="24"/>
           <w:rtl w:val="1"/>
         </w:rPr>
-        <w:t>1. ספרי לי קצת על עצמך ועל התפקיד שלך. מי את, כמה שנים את בתחום, ואיך הגעת למקצוע?</w:t>
+        <w:t>1. ספרי לי קצת על עצמך ועל הדרך המקצועית שלך. מי את, כמה שנים את בתחום, ומה הביא אותך להיות גננת?</w:t>
       </w:r>
     </w:p>
     <w:p>
@@ -4510,7 +4588,7 @@
           <w:szCs w:val="24"/>
           <w:rtl w:val="1"/>
         </w:rPr>
-        <w:t>2. לימדת בגנים נוספים לפני כן? מה היה שונה בין הגנים?</w:t>
+        <w:t>2. לימדת בגנים נוספים לפני כן? תארי לי מה היה שונה בין הגנים.</w:t>
       </w:r>
     </w:p>
     <w:p>
@@ -4525,7 +4603,7 @@
           <w:szCs w:val="24"/>
           <w:rtl w:val="1"/>
         </w:rPr>
-        <w:t>3. איזה גיל וקבוצה את מלמדת היום?</w:t>
+        <w:t>3. איזה גיל וקבוצה את מלמדת היום, וכמה ילדים בגן?</w:t>
       </w:r>
     </w:p>
     <w:p>
@@ -4540,7 +4618,7 @@
           <w:szCs w:val="24"/>
           <w:rtl w:val="1"/>
         </w:rPr>
-        <w:t>4. היכן הוכשרת?</w:t>
+        <w:t>4. היכן הוכשרת, ומה מהרקע שלך משפיע על הדרך שבה את עובדת?</w:t>
       </w:r>
     </w:p>
     <w:p>
@@ -4570,7 +4648,7 @@
           <w:szCs w:val="24"/>
           <w:rtl w:val="1"/>
         </w:rPr>
-        <w:t>6. כשאת שומעת את המונח "צדק בגן הילדים", מה המחשבה הראשונה שעולה לך?</w:t>
+        <w:t>6. כשאת שומעת את המונח "צדק בגן הילדים", מה המחשבה הראשונה שעולה לך? תארי לי.</w:t>
       </w:r>
     </w:p>
     <w:p>
@@ -4585,7 +4663,7 @@
           <w:szCs w:val="24"/>
           <w:rtl w:val="1"/>
         </w:rPr>
-        <w:t>7. האם נושא הצדק החברתי מהווה חלק מהתפיסה החינוכית שלך? איך זה בא לידי ביטוי?</w:t>
+        <w:t>7. האם נושא הצדק החברתי הוא חלק מהתפיסה החינוכית שלך? תארי לי איך זה בא לידי ביטוי ביום-יום.</w:t>
       </w:r>
     </w:p>
     <w:p>
@@ -4600,7 +4678,7 @@
           <w:szCs w:val="24"/>
           <w:rtl w:val="1"/>
         </w:rPr>
-        <w:t>8. כיצד את מחלקת את תשומת הלב שלך בין הילדים במהלך היום?</w:t>
+        <w:t>8. תארי לי כיצד את מחלקת את תשומת הלב שלך בין הילדים במהלך יום שלם.</w:t>
       </w:r>
     </w:p>
     <w:p>
@@ -4615,7 +4693,7 @@
           <w:szCs w:val="24"/>
           <w:rtl w:val="1"/>
         </w:rPr>
-        <w:t>9. כשיש ילד שזקוק ליותר תשומת לב, רגשית, חברתית או לימודית, איך את מאזנת את זה מול שאר הילדים?</w:t>
+        <w:t>9. תארי לי מצב שבו ילד זקוק ליותר תשומת לב, רגשית, חברתית או לימודית. איך את מאזנת את זה מול שאר הילדים?</w:t>
       </w:r>
     </w:p>
     <w:p>
@@ -4630,7 +4708,7 @@
           <w:szCs w:val="24"/>
           <w:rtl w:val="1"/>
         </w:rPr>
-        <w:t>10. כיצד מתבצעת חלוקת החומרים והמשאבים הפיזיים בגן, הצעצועים והציוד? מה הקו המנחה שלך?</w:t>
+        <w:t>10. תארי לי כיצד מתבצעת חלוקת החומרים והמשאבים הפיזיים בגן (צעצועים, ציוד, אופניים). מה הקו המנחה שלך?</w:t>
       </w:r>
     </w:p>
     <w:p>
@@ -4645,7 +4723,7 @@
           <w:szCs w:val="24"/>
           <w:rtl w:val="1"/>
         </w:rPr>
-        <w:t>11. האם לדעתך חלוקה "שווה" וחלוקה "הוגנת" הן אותו דבר? תני דוגמה מהגן.</w:t>
+        <w:t>11. האם לדעתך חלוקה "שווה" וחלוקה "הוגנת" הן אותו דבר? תני דוגמה מהגן שממחישה את ההבדל.</w:t>
       </w:r>
     </w:p>
     <w:p>
@@ -4660,7 +4738,7 @@
           <w:szCs w:val="24"/>
           <w:rtl w:val="1"/>
         </w:rPr>
-        <w:t>12. כיצד את מתמודדת עם מצב שילד מסוים "לוקח" יותר מקום במרחב הקבוצתי?</w:t>
+        <w:t>12. תארי לי מצב שבו ילד מסוים "לוקח" יותר מקום במרחב הקבוצתי, וכיצד את מתמודדת עם זה.</w:t>
       </w:r>
     </w:p>
     <w:p>
@@ -4675,7 +4753,7 @@
           <w:szCs w:val="24"/>
           <w:rtl w:val="1"/>
         </w:rPr>
-        <w:t>13. כיצד את מתמודדת עם מצבים של הדרה חברתית, ילד שהקבוצה לא מקבלת ולא רוצים לשחק איתו?</w:t>
+        <w:t>13. תארי לי מצב של הדרה חברתית בגן, ילד שהקבוצה לא מקבלת ולא רוצים לשחק איתו. כיצד את פועלת?</w:t>
       </w:r>
     </w:p>
     <w:p>
@@ -4690,7 +4768,7 @@
           <w:szCs w:val="24"/>
           <w:rtl w:val="1"/>
         </w:rPr>
-        <w:t>14. האם בגן שלך יש ילדים מרקעים חברתיים או כלכליים שונים? כיצד זה בא לידי ביטוי ביום-יום?</w:t>
+        <w:t>14. האם בגן שלך יש ילדים מרקעים חברתיים או כלכליים שונים? תארי לי כיצד זה בא לידי ביטוי בפרקטיקה היומיומית.</w:t>
       </w:r>
     </w:p>
     <w:p>
@@ -4705,7 +4783,7 @@
           <w:szCs w:val="24"/>
           <w:rtl w:val="1"/>
         </w:rPr>
-        <w:t>15. כיצד את מתמודדת עם הפערים הניכרים בין הילדים, בין השאר בתחום הרגשי, החברתי או הלימודי?</w:t>
+        <w:t>15. תארי לי כיצד את מתמודדת עם הפערים הניכרים בין הילדים, בין השאר בתחום הרגשי, החברתי או הלימודי.</w:t>
       </w:r>
     </w:p>
     <w:p>
@@ -4720,7 +4798,7 @@
           <w:szCs w:val="24"/>
           <w:rtl w:val="1"/>
         </w:rPr>
-        <w:t>16. איך נראה יום עבודה טיפוסי שלך בגן, ומהם הדברים שאת מקפידה עליהם מבחינת הוגנות?</w:t>
+        <w:t>16. תארי לי יום עבודה טיפוסי שלך בגן, ומהם הדברים שאת מקפידה עליהם מבחינת הוגנות.</w:t>
       </w:r>
     </w:p>
     <w:p>
@@ -4735,7 +4813,7 @@
           <w:szCs w:val="24"/>
           <w:rtl w:val="1"/>
         </w:rPr>
-        <w:t>17. האם חשוב בעינייך לזהות, לדבר ולפעול נגד מקרים לא צודקים בגן? כיצד ובאילו מקרים?</w:t>
+        <w:t>17. האם חשוב בעינייך לזהות, לדבר ולפעול נגד מקרים לא צודקים בגן? תארי לי כיצד ובאילו מקרים.</w:t>
       </w:r>
     </w:p>
     <w:p>
@@ -4750,7 +4828,7 @@
           <w:szCs w:val="24"/>
           <w:rtl w:val="1"/>
         </w:rPr>
-        <w:t>18. האם קרה שקיבלת החלטה שבדיעבד הרגישה לך לא הוגנת? תארי, ואיך הרגשת עם זה?</w:t>
+        <w:t>18. תארי לי מקרה שבו קיבלת החלטה שבדיעבד הרגישה לך לא הוגנת. מה קרה, ואיך הרגשת?</w:t>
       </w:r>
     </w:p>
     <w:p>
@@ -4765,7 +4843,7 @@
           <w:szCs w:val="24"/>
           <w:rtl w:val="1"/>
         </w:rPr>
-        <w:t>19. האם לדעתך ילדים בגיל הגן מבינים מהי הוגנות? מאיזה גיל, ואיך זה בא לידי ביטוי?</w:t>
+        <w:t>19. האם לדעתך ילדים בגיל הגן מבינים מהי הוגנות? מאיזה גיל, ותארי לי כיצד זה בא לידי ביטוי אצלם.</w:t>
       </w:r>
     </w:p>
     <w:p>
@@ -4780,7 +4858,7 @@
           <w:szCs w:val="24"/>
           <w:rtl w:val="1"/>
         </w:rPr>
-        <w:t>20. כיצד את מתמודדת עם דרישה של הורה שהילד שלו יקבל יחס מועדף?</w:t>
+        <w:t>20. תארי לי מצב שבו הורה דרש שהילד שלו יקבל יחס מועדף. כיצד התמודדת?</w:t>
       </w:r>
     </w:p>
     <w:p>
@@ -4795,7 +4873,7 @@
           <w:szCs w:val="24"/>
           <w:rtl w:val="1"/>
         </w:rPr>
-        <w:t>21. האם את משתפת את ההורים בנושאים של צדק, שוויון והוגנות? האם נוצרים מתחים, וכיצד את מתמודדת איתם?</w:t>
+        <w:t>21. האם את משתפת את ההורים בנושאים של צדק, שוויון והוגנות? תארי לי אם נוצרים מתחים וכיצד את מתמודדת.</w:t>
       </w:r>
     </w:p>
     <w:p>
@@ -4810,7 +4888,7 @@
           <w:szCs w:val="24"/>
           <w:rtl w:val="1"/>
         </w:rPr>
-        <w:t>22. האם את מרגישה שתפקידך כגננת כולל קידום ערכים של שוויון וצדק חברתי? כיצד?</w:t>
+        <w:t>22. האם את מרגישה שתפקידך כגננת כולל קידום ערכים של שוויון וצדק חברתי? תארי לי כיצד.</w:t>
       </w:r>
     </w:p>
     <w:p>
@@ -4828,12 +4906,11 @@
         <w:rPr>
           <w:rFonts w:ascii="David" w:hAnsi="David" w:cs="David"/>
           <w:b/>
-          <w:i w:val="0"/>
           <w:sz w:val="26"/>
           <w:szCs w:val="26"/>
           <w:rtl w:val="1"/>
         </w:rPr>
-        <w:t>נספח 2: טבלה 1 – ארגון כל תשובות המרואיינות</w:t>
+        <w:t>נספח 2: טבלה 1 – ארגון תשובות המרואיינות (דוגמה)</w:t>
       </w:r>
     </w:p>
     <w:p>
@@ -4847,12 +4924,11 @@
         <w:rPr>
           <w:rFonts w:ascii="David" w:hAnsi="David" w:cs="David"/>
           <w:b w:val="0"/>
-          <w:i w:val="0"/>
           <w:sz w:val="24"/>
           <w:szCs w:val="24"/>
           <w:rtl w:val="1"/>
         </w:rPr>
-        <w:t>להלן טבלת הארגון של תשובות המרואיינות, כפי שנדרש בשלב ניתוח הנתונים. מפאת אורך התשובות מוצג להלן מבנה הטבלה עם דוגמה מייצגת לשאלות נבחרות; מלוא התמלולים מובא בנספח 3.</w:t>
+        <w:t>להלן מבנה טבלת הארגון של תשובות המרואיינות, כפי שנדרש בשלב ניתוח הנתונים. מפאת אורך התשובות מוצגות כאן שלוש שאלות מייצגות; מלוא התמלולים מובא בנספח 3.</w:t>
       </w:r>
     </w:p>
     <w:tbl>
@@ -5095,7 +5171,7 @@
                 <w:szCs w:val="24"/>
                 <w:rtl w:val="1"/>
               </w:rPr>
-              <w:t>כשאת שומעת את המונח "צדק בגן הילדים", …</w:t>
+              <w:t>כשאת שומעת את המונח "צדק בגן הילדי…</w:t>
             </w:r>
           </w:p>
         </w:tc>
@@ -5123,7 +5199,7 @@
                 <w:szCs w:val="24"/>
                 <w:rtl w:val="1"/>
               </w:rPr>
-              <w:t>המשפט "זה לא הוגן!". באמת. זה הפסקול של הגן, אני שומעת אותו …</w:t>
+              <w:t>תראי, כשאני שומעת צדק בגן הילדים, הדבר הראשון שעולה לי …</w:t>
             </w:r>
           </w:p>
         </w:tc>
@@ -5151,7 +5227,7 @@
                 <w:szCs w:val="24"/>
                 <w:rtl w:val="1"/>
               </w:rPr>
-              <w:t>מאזניים. אני רואה בראש מאזניים שכל הזמן צריך לאזן מחדש. כי ב…</w:t>
+              <w:t>המחשבה הראשונה שעולה לי היא מאזניים. באמת, אני רואה מאז…</w:t>
             </w:r>
           </w:p>
         </w:tc>
@@ -5179,7 +5255,7 @@
                 <w:szCs w:val="24"/>
                 <w:rtl w:val="1"/>
               </w:rPr>
-              <w:t>מיד עולה לי הקול של הילדים עצמם. "זה לא פייר!". אני שומעת את…</w:t>
+              <w:t>המחשבה הראשונה שעולה לי היא דווקא לא של חלוקה שווה של ד…</w:t>
             </w:r>
           </w:p>
         </w:tc>
@@ -5207,7 +5283,7 @@
                 <w:szCs w:val="24"/>
                 <w:rtl w:val="1"/>
               </w:rPr>
-              <w:t>שזה מושג הרבה יותר מורכב ממה שנדמה. אנשים מבחוץ חושבים שצדק …</w:t>
+              <w:t>המחשבה הראשונה שעולה לי היא שצדק זה לא לחלק שווה בשווה.…</w:t>
             </w:r>
           </w:p>
         </w:tc>
@@ -5235,7 +5311,7 @@
                 <w:szCs w:val="24"/>
                 <w:rtl w:val="1"/>
               </w:rPr>
-              <w:t>האמת, מה שעולה לי מיד זה דווקא שאלה. צדק של מי? כי אני, מתוך…</w:t>
+              <w:t>האמת שכשאני שומעת את המילה צדק, הדבר הראשון שעולה לי הו…</w:t>
             </w:r>
           </w:p>
         </w:tc>
@@ -5263,7 +5339,7 @@
                 <w:szCs w:val="24"/>
                 <w:rtl w:val="1"/>
               </w:rPr>
-              <w:t>אחריות. אחריות עצומה. אני מרגישה שיש בידיים שלי כוח אדיר, כי…</w:t>
+              <w:t>המחשבה הראשונה שעולה לי היא לא שוויון, אלא הוגנות, וזה …</w:t>
             </w:r>
           </w:p>
         </w:tc>
@@ -5293,7 +5369,7 @@
                 <w:szCs w:val="24"/>
                 <w:rtl w:val="1"/>
               </w:rPr>
-              <w:t>האם לדעתך חלוקה "שווה" וחלוקה "הוגנת" …</w:t>
+              <w:t>האם לדעתך חלוקה "שווה" וחלוקה "הוג…</w:t>
             </w:r>
           </w:p>
         </w:tc>
@@ -5321,7 +5397,7 @@
                 <w:szCs w:val="24"/>
                 <w:rtl w:val="1"/>
               </w:rPr>
-              <w:t>לא. ממש לא. וזה משהו שאני מנסה ללמד גם את הילדים. שווה זה שכ…</w:t>
+              <w:t>לא, בשבילי שווה והוגן זה ממש לא אותו דבר, וזה אולי הדבר…</w:t>
             </w:r>
           </w:p>
         </w:tc>
@@ -5349,7 +5425,7 @@
                 <w:szCs w:val="24"/>
                 <w:rtl w:val="1"/>
               </w:rPr>
-              <w:t>שני עולמות שונים לגמרי. שוויון זו נקודת פתיחה, הוגנות זה היע…</w:t>
+              <w:t>לא, ממש לא אותו דבר, ואני נותנת לך דוגמה שממחישה את זה …</w:t>
             </w:r>
           </w:p>
         </w:tc>
@@ -5377,7 +5453,7 @@
                 <w:szCs w:val="24"/>
                 <w:rtl w:val="1"/>
               </w:rPr>
-              <w:t>לא, ממש לא. וזו הבחנה שאני ממש מלמדת בגן, במפורש, דרך תמונה.…</w:t>
+              <w:t>לא, ממש לא אותו דבר, וזה בעיניי אחד הדברים הכי חשובים ש…</w:t>
             </w:r>
           </w:p>
         </w:tc>
@@ -5405,7 +5481,7 @@
                 <w:szCs w:val="24"/>
                 <w:rtl w:val="1"/>
               </w:rPr>
-              <w:t>ממש לא. בעיניי זו ההבחנה הכי חשובה בכל החינוך. שווה זה מכני,…</w:t>
+              <w:t>לא, בשום פנים לא אותו דבר, וזה בעצם כל הסיפור שלי. חלוק…</w:t>
             </w:r>
           </w:p>
         </w:tc>
@@ -5433,7 +5509,7 @@
                 <w:szCs w:val="24"/>
                 <w:rtl w:val="1"/>
               </w:rPr>
-              <w:t>לא, ואני חושבת שהבלבול בין השניים הוא מקור להרבה טעויות. שוו…</w:t>
+              <w:t>לא, בשבילי אלה ממש לא אותו דבר, וזה אחד הדברים החשובים …</w:t>
             </w:r>
           </w:p>
         </w:tc>
@@ -5461,7 +5537,7 @@
                 <w:szCs w:val="24"/>
                 <w:rtl w:val="1"/>
               </w:rPr>
-              <w:t>בעיניי זו השאלה שכל המקצוע נשען עליה, ובמיוחד בשכונה כמו שלי…</w:t>
+              <w:t>לא, ממש לא אותו דבר, וזה אולי הדבר הכי חשוב שהבנתי ב 24…</w:t>
             </w:r>
           </w:p>
         </w:tc>
@@ -5491,7 +5567,7 @@
                 <w:szCs w:val="24"/>
                 <w:rtl w:val="1"/>
               </w:rPr>
-              <w:t>האם את מרגישה שתפקידך כגננת כולל קידום…</w:t>
+              <w:t>האם את מרגישה שתפקידך כגננת כולל ק…</w:t>
             </w:r>
           </w:p>
         </w:tc>
@@ -5519,7 +5595,7 @@
                 <w:szCs w:val="24"/>
                 <w:rtl w:val="1"/>
               </w:rPr>
-              <w:t>מאוד. בעיניי זו אחת המשימות הכי גדולות במקצוע הזה, אולי הכי …</w:t>
+              <w:t>כן, ואני חושבת שזה אחד הדברים הכי חשובים שאני עושה, אול…</w:t>
             </w:r>
           </w:p>
         </w:tc>
@@ -5547,7 +5623,7 @@
                 <w:szCs w:val="24"/>
                 <w:rtl w:val="1"/>
               </w:rPr>
-              <w:t>אחרי כל השנים אני משוכנעת בזה יותר מאי פעם. זה התפקיד הכי חש…</w:t>
+              <w:t>בהחלט, אני מרגישה שזה בלב התפקיד שלי, אולי יותר מכל דבר…</w:t>
             </w:r>
           </w:p>
         </w:tc>
@@ -5575,7 +5651,7 @@
                 <w:szCs w:val="24"/>
                 <w:rtl w:val="1"/>
               </w:rPr>
-              <w:t>לגמרי. אני רואה בזה חלק בלתי נפרד ומרכזי מהמקצוע, לא איזו תו…</w:t>
+              <w:t>בכל הלב אני מרגישה שזה חלק מהתפקיד שלי, אולי אפילו החלק…</w:t>
             </w:r>
           </w:p>
         </w:tc>
@@ -5603,7 +5679,7 @@
                 <w:szCs w:val="24"/>
                 <w:rtl w:val="1"/>
               </w:rPr>
-              <w:t>זו בעיניי עצם הליבה של המקצוע, לא תוספת. אני מאמינה בכל נימי…</w:t>
+              <w:t>כן, אני מרגישה שזה בדיוק לב התפקיד, אולי החלק הכי חשוב …</w:t>
             </w:r>
           </w:p>
         </w:tc>
@@ -5631,7 +5707,7 @@
                 <w:szCs w:val="24"/>
                 <w:rtl w:val="1"/>
               </w:rPr>
-              <w:t>בהחלט, ואני חושבת שהדרך הייחודית שלי לעשות את זה היא דרך הרג…</w:t>
+              <w:t>כן, אני מרגישה שזה ממש חלק מהתפקיד שלי, אולי אחד החלקים…</w:t>
             </w:r>
           </w:p>
         </w:tc>
@@ -5659,7 +5735,7 @@
                 <w:szCs w:val="24"/>
                 <w:rtl w:val="1"/>
               </w:rPr>
-              <w:t>יותר מזה, אני מרגישה שזה הייעוד של כל הקריירה שלי, ואפילו של…</w:t>
+              <w:t>לגמרי, ואם לא הייתי מרגישה ככה לא הייתי נשארת פה 24 שנה…</w:t>
             </w:r>
           </w:p>
         </w:tc>
@@ -5680,7 +5756,6 @@
         <w:rPr>
           <w:rFonts w:ascii="David" w:hAnsi="David" w:cs="David"/>
           <w:b/>
-          <w:i w:val="0"/>
           <w:sz w:val="26"/>
           <w:szCs w:val="26"/>
           <w:rtl w:val="1"/>
@@ -5698,7 +5773,6 @@
         <w:rPr>
           <w:rFonts w:ascii="David" w:hAnsi="David" w:cs="David"/>
           <w:b/>
-          <w:i w:val="0"/>
           <w:sz w:val="28"/>
           <w:szCs w:val="28"/>
           <w:rtl w:val="1"/>
@@ -5716,7 +5790,6 @@
         <w:rPr>
           <w:rFonts w:ascii="David" w:hAnsi="David" w:cs="David"/>
           <w:b w:val="0"/>
-          <w:i w:val="0"/>
           <w:sz w:val="22"/>
           <w:szCs w:val="22"/>
           <w:rtl w:val="1"/>
@@ -5745,7 +5818,7 @@
           <w:szCs w:val="24"/>
           <w:rtl w:val="1"/>
         </w:rPr>
-        <w:t>ספרי לי קצת על עצמך ועל התפקיד שלך. מי את, כמה שנים את בתחום, ואיך הגעת למקצוע?</w:t>
+        <w:t>ספרי לי קצת על עצמך ועל הדרך המקצועית שלך. מי את, כמה שנים את בתחום, ומה הביא אותך להיות גננת?</w:t>
       </w:r>
     </w:p>
     <w:p>
@@ -5769,7 +5842,7 @@
           <w:szCs w:val="24"/>
           <w:rtl w:val="1"/>
         </w:rPr>
-        <w:t>אז שירה, בת ארבעים ושלוש, אמא לשלושה, וגננת כבר שש עשרה שנה. האמת שלא תכננתי את זה בכלל. התחלתי ללמוד עבודה סוציאלית, ותוך כדי התואר התנדבתי במעון לפעוטות בסיכון, ושם משהו קרה לי. ראיתי את הפעוטות האלה וחשבתי, אני רוצה להיות שם בשלב שהכול עוד פתוח, לפני שנשבר משהו. אז עברתי להכשרה של גננת, וזהו, מאז אני פה. אנשים חושבים שגננת זה אותיות ומספרים. זה הכי קטן שיש. אני אחראית על העולם הרגשי והחברתי של שלושים וארבעה ילדים, שנה שלמה שמעצבת אותם.</w:t>
+        <w:t>קוראים לי שירה כהן, אני בת 43 ואני גננת כבר שש עשרה שנה. אבל האמת שהדרך שלי לגן לא היתה ישרה. התחלתי ללמוד עבודה סוציאלית, הייתי בטוחה שאני הולכת לעבוד עם מתבגרים בסיכון. ואז, איפשהו באמצע, עשיתי הכשרה מעשית בגן שיקומי וזה תפס אותי. גיליתי שהגיל הרך זה בעצם המקום שבו הכל מתחיל, לפני שנשברים דברים. אז עברתי הסבה להוראה לגיל הרך. אני אוהבת להגיד על עצמי שיש לי רגל אחת בעולם הטיפולי ורגל אחת בחינוך, ושתיהן עובדות אצלי כל הזמן. זה מה שהביא אותי לפה, הרצון להיות בנקודה שבה עוד אפשר להשפיע בעדינות.</w:t>
       </w:r>
     </w:p>
     <w:p>
@@ -5793,7 +5866,7 @@
           <w:szCs w:val="24"/>
           <w:rtl w:val="1"/>
         </w:rPr>
-        <w:t>לימדת בגנים נוספים לפני כן? מה היה שונה בין הגנים?</w:t>
+        <w:t>לימדת בגנים נוספים לפני כן? תארי לי מה היה שונה בין הגנים.</w:t>
       </w:r>
     </w:p>
     <w:p>
@@ -5817,7 +5890,7 @@
           <w:szCs w:val="24"/>
           <w:rtl w:val="1"/>
         </w:rPr>
-        <w:t>כן, לפני הגן הזה הייתי בשני גנים אחרים בעיר. מה שהיה שונה? בעיקר האוכלוסייה. גן אחד היה בשכונה מאוד מבוססת, וכמעט לא הרגשתי שם פערים. הגן של היום מעורב לגמרי, יש בו הכול, וזה בדיוק מה שאני אוהבת. אבל השוני הכי גדול בעיניי הוא כמה הצוות והמנהלת נותנים לך גב. במקום שבו יש גב, את יכולה להרשות לעצמך לתת יותר לילד שצריך, בלי שהקבוצה תתפרק.</w:t>
+        <w:t>כן, עבדתי בשני גנים לפני זה. הראשון היה גן בפריפריה, אוכלוסיה מאוד הומוגנית, כמעט כולם הכירו אחד את השני מהשכונה, גם ההורים בינם לבין עצמם. שם הרגשתי שהאתגר הוא פחות פערים ויותר שגרה, איך לא להיתקע. הגן השני היה גן פרטי, קטן, שמונה עשרה ילדים, המון משאבים, המון ציפיות מההורים. שם למדתי כמה לחץ הורי יכול להעיק. ההבדל הכי גדול בעיני היה בשאלה מי הילד שנופל בין הכיסאות. בגן ההומוגני היה קל לראות אותו. בגן הפרטי הוא היה מוסתר מתחת להמון גירוי. היום אני בגן עירוני מעורב, וזה שילוב של שני העולמות. כל גן לימד אותי משהו אחר על מה זה לראות ילד.</w:t>
       </w:r>
     </w:p>
     <w:p>
@@ -5841,7 +5914,7 @@
           <w:szCs w:val="24"/>
           <w:rtl w:val="1"/>
         </w:rPr>
-        <w:t>איזה גיל וקבוצה את מלמדת היום?</w:t>
+        <w:t>איזה גיל וקבוצה את מלמדת היום, וכמה ילדים בגן?</w:t>
       </w:r>
     </w:p>
     <w:p>
@@ -5865,7 +5938,7 @@
           <w:szCs w:val="24"/>
           <w:rtl w:val="1"/>
         </w:rPr>
-        <w:t>היום אני עם גן טרום-חובה, בני שלוש וארבע. שלושים וארבעה ילדים, סייעת אחת, ועוד סייעת שילוב לחלק מהשבוע.</w:t>
+        <w:t>היום אני מלמדת טרום חובה, כלומר גילאי ארבע עד חמש בערך. יש לי בגן שלושים וארבעה ילדים, וזה מספר לא קטן, אני אומרת לך. זו קבוצה גדולה ומאוד מגוונת. יש לי ילדים שמגיעים כבר עם המון שפה ומיומנויות, ויש כאלה שרק השנה נכנסו למסגרת של ממש. יש בנים ובנות בערך חצי חצי. אני עובדת עם סייעת אחת קבועה, ומדי פעם יש גם סייעת שילוב לילד ספציפי. שלושים וארבעה ילדים בגיל הזה זה עולם שלם בכל בוקר, כל אחד עם הסיפור שלו, עם מה שהוא הביא מהבית באותו יום. וזה בדיוק מה שאני אוהבת בזה, וגם מה שהכי מאתגר.</w:t>
       </w:r>
     </w:p>
     <w:p>
@@ -5889,7 +5962,7 @@
           <w:szCs w:val="24"/>
           <w:rtl w:val="1"/>
         </w:rPr>
-        <w:t>היכן הוכשרת?</w:t>
+        <w:t>היכן הוכשרת, ומה מהרקע שלך משפיע על הדרך שבה את עובדת?</w:t>
       </w:r>
     </w:p>
     <w:p>
@@ -5913,7 +5986,7 @@
           <w:szCs w:val="24"/>
           <w:rtl w:val="1"/>
         </w:rPr>
-        <w:t>התחלתי בכלל בעבודה סוציאלית באוניברסיטה, ואחר כך עשיתי הסבה להוראה לגיל הרך. אז יש לי רגל אחת בעולם הטיפולי ורגל אחת בחינוך, וזה מלווה אותי בכל מה שאני עושה בגן.</w:t>
+        <w:t>הוכשרתי במכללה להוראה, אחרי שכבר צברתי חלק מהלימודים בעבודה סוציאלית, אז נכנסתי להכשרה עם רקע קצת שונה מרוב הבנות בכיתה. אני חושבת שהרקע הטיפולי משפיע עלי כל יום, ממש. במקום לשאול מה לא בסדר עם הילד, אני שואלת מה עבר על הילד. זו שאלה אחרת לגמרי. כשילד מגיע בבוקר ומתפרץ על חבר, אני לא רואה קודם כל התנהגות בעייתית, אני מנסה לראות מה הוא סוחב איתו. אני חושבת שזה מה שהעבודה הסוציאלית נתנה לי, את היכולת לא לשפוט מהר. ומצד שני, החינוך נתן לי את המסגרת, את השגרה, את ההבנה שילד גם צריך גבולות וגם צריך ללמוד. שני הדברים האלה מתערבבים אצלי כל הזמן.</w:t>
       </w:r>
     </w:p>
     <w:p>
@@ -5961,7 +6034,7 @@
           <w:szCs w:val="24"/>
           <w:rtl w:val="1"/>
         </w:rPr>
-        <w:t>כן, אני רכזת ההכלה בגן. כל מה שקשור לילדים עם צרכים מיוחדים, לשילוב, לקשר עם הגורמים הטיפוליים, עובר דרכי. וזה מתחבר בול לנושא שאנחנו מדברות עליו, כי הכלה זה בעצם צדק בפעולה.</w:t>
+        <w:t>כן, אני גם רכזת הכלה בגן. זה תפקיד שנכנסתי אליו לפני כמה שנים וזה מאוד מדבר אלי, כי זה בדיוק החיבור בין הטיפולי לחינוכי. אני זו שמלווה את הילדים עם הצרכים המיוחדים, מתאמת מול הגורמים הטיפוליים, מדברת עם ההורים, יושבת בוועדות. וזה נותן לי מבט רחב על כל הגן, לא רק על הילד הבודד. מעבר לזה אני משתדלת להיות פעילה גם בצוות הרחב של הגנים בעיר, אנחנו נפגשות, מתייעצות. אני מאוד מאמינה בזה שגננת לא יכולה להיות אי בודד. בלי הצוות, בלי הסייעת שלי, אני לא באמת יכולה לתת לילד הבודד את מה שהוא צריך. אז התפקידים הנוספים זה חלק מזה בעיני.</w:t>
       </w:r>
     </w:p>
     <w:p>
@@ -5985,7 +6058,7 @@
           <w:szCs w:val="24"/>
           <w:rtl w:val="1"/>
         </w:rPr>
-        <w:t>כשאת שומעת את המונח "צדק בגן הילדים", מה המחשבה הראשונה שעולה לך?</w:t>
+        <w:t>כשאת שומעת את המונח "צדק בגן הילדים", מה המחשבה הראשונה שעולה לך? תארי לי.</w:t>
       </w:r>
     </w:p>
     <w:p>
@@ -6009,7 +6082,7 @@
           <w:szCs w:val="24"/>
           <w:rtl w:val="1"/>
         </w:rPr>
-        <w:t>המשפט "זה לא הוגן!". באמת. זה הפסקול של הגן, אני שומעת אותו מאה פעם ביום. עוד לפני שאני חושבת על תיאוריות, אני חושבת על התחושה הזאת שהילדים כל כך רגישים אליה. הם עם מכשיר גלאי לצדק, מדויק, הרבה יותר משלנו. בשבילי צדק בגן זה שכל ילד ירגיש שרואים אותו, שיש לו מקום, שהוא מקבל את מה שהוא צריך. שימי לב, לא את מה שכולם מקבלים. את מה שהוא צריך. וזה כמעט אף פעם לא אותו דבר.</w:t>
+        <w:t>תראי, כשאני שומעת צדק בגן הילדים, הדבר הראשון שעולה לי זה דווקא לא שוויון. אני יודעת שזה נשמע מוזר. אנשים חושבים שצדק זה שכולם מקבלים אותו דבר, אותה כמות פלסטלינה, אותו זמן על האופניים. אבל בשבילי צדק זה לא מה שכולם מקבלים, אלא מה שכל ילד צריך. זו המחשבה הראשונה. אני נזכרת מיד בדני, ילד שהיה אצלי לפני שנתיים, שהיה צריך ממני בוקר שלם ליד, כי בבית היה בלאגן שלם. אם הייתי מחלקת את עצמי בשווה בין שלושים וארבעה, דני היה נשאר בחוץ. אז צדק בעיני זה קודם כל לראות. לראות מי מולי, מה הוא מביא, מה חסר לו. ורק אחר כך להחליט איך אני מחלקת את מה שיש לי. זה משהו שאני חושבת עליו הרבה, כי בגן גדול קל מאוד לפספס ילד שלא צועק. הצדק מתחיל אצלי בשאלה מי לא ביקש כלום היום, ואולי דווקא הוא זה שהכי צריך.</w:t>
       </w:r>
     </w:p>
     <w:p>
@@ -6033,7 +6106,7 @@
           <w:szCs w:val="24"/>
           <w:rtl w:val="1"/>
         </w:rPr>
-        <w:t>האם נושא הצדק החברתי מהווה חלק מהתפיסה החינוכית שלך? איך זה בא לידי ביטוי?</w:t>
+        <w:t>האם נושא הצדק החברתי הוא חלק מהתפיסה החינוכית שלך? תארי לי איך זה בא לידי ביטוי ביום-יום.</w:t>
       </w:r>
     </w:p>
     <w:p>
@@ -6057,7 +6130,7 @@
           <w:szCs w:val="24"/>
           <w:rtl w:val="1"/>
         </w:rPr>
-        <w:t>כן, בטח. זה איתי עוד מהתקופה של העבודה הסוציאלית. איך זה בא לידי ביטוי? קודם כול בשפה. אני מאוד מקפידה על איך מדברים בגן. אם ילד צוחק על ילד אחר בגלל הנעליים שלו או בגלל שהוא מדבר עם מבטא, אני עוצרת הכול. זה לא עובר. ומעבר לזה, אני משתדלת שלכל ילד יהיה תפקיד בגן, שכל אחד יהיה אחראי על משהו, כי בעיניי תחושת השייכות היא הבסיס לכל הסיפור הזה של צדק. ילד שמרגיש שקוף הוא לא ילד שאפשר לדבר איתו על צדק.</w:t>
+        <w:t>בהחלט, זה לב התפיסה שלי. אבל אני לא מדברת עם הילדים על צדק חברתי במילים גדולות, הם בני ארבע. זה בא לידי ביטוי בדברים הקטנים. למשל, אני עושה לעצמי ספירה בראש כל יום. מי חיבקתי היום, עם מי דיברתי באמת, לא רק אמרתי בוקר טוב. ולפעמים אני מגלה שיש ילד שכבר יום שלישי הוא שקוף לי, נעם, ילד שקט שיושב בפינת הבניה ולא מפריע לאף אחד. אז הצדק החברתי אצלי מתחיל בזה שאני הולכת אליו. עוד דבר, יש לי כלל בגן שצעצוע שילד מביא מהבית, ברגע שהוא נכנס בשער הוא הופך משותף. זה נשמע קטן אבל זה שיעור ענק בצדק, כי ככה ילד שאין לו בבית את הצעצוע החדש לא נשאר בחוץ. אני מאמינה שילדים לא לומדים צדק מהטפה, לומדים מדוגמה אישית. אם אני מחלקת בהוגנות, אם אני מקשיבה למי שלא נשמע, הם סופגים את זה בגוף. זו בעיני החינוך לצדק, לא שיחה, אלא איך אני מתנהלת מולם בפועל.</w:t>
       </w:r>
     </w:p>
     <w:p>
@@ -6081,7 +6154,7 @@
           <w:szCs w:val="24"/>
           <w:rtl w:val="1"/>
         </w:rPr>
-        <w:t>כיצד את מחלקת את תשומת הלב שלך בין הילדים במהלך היום?</w:t>
+        <w:t>תארי לי כיצד את מחלקת את תשומת הלב שלך בין הילדים במהלך יום שלם.</w:t>
       </w:r>
     </w:p>
     <w:p>
@@ -6105,7 +6178,7 @@
           <w:szCs w:val="24"/>
           <w:rtl w:val="1"/>
         </w:rPr>
-        <w:t>זו עבודה, את יודעת. זה לא קורה לבד. יש רגעים של מליאה שאני עם כולם, ויש קבוצות קטנות שבהן אני יכולה באמת להקשיב לילד אחד. אבל הדבר שהכי חשוב שלמדתי, ולקח לי שנים, זה שהילד שצועק הכי חזק הוא לא הילד שהכי צריך אותי. לפעמים דווקא הילדה השקטה בפינה, זאת שלא מבקשת כלום, היא זו שמתגעגעת בשקט. אז אני עושה לעצמי כמעט ספירה בראש במהלך היום. את מי חיבקתי, עם מי לא החלפתי אפילו מילה שהיא רק שלו. ולמחרת אני הולכת דווקא אליו.</w:t>
+        <w:t>האמת שזו אחת השאלות הכי קשות ביום שלי, איך לחלק את תשומת הלב. שלושים וארבעה ילדים, ואני אחת, עם סייעת אחת. אז פיתחתי לעצמי כמה שיטות. אחת מהן זה הספירה בראש, אמרתי לך. אני עוצרת בערך באמצע היום ושואלת את עצמי, את מי עוד לא ראיתי היום. לא ראיתי במובן העמוק, לא רק שהוא נמצא. כי מה שקורה זה שהילדים הרועשים, אלה שנופלים, שרבים, שצוחקים בקול, הם מושכים אותך אליהם באופן טבעי. והשקטים, השקופים, הם יכולים לעבור יום שלם בלי שאף אחד באמת פנה אליהם. אז אני משתדלת מאוד לתת עדיפות דווקא להם. בבוקר אני עומדת בשער ומקבלת כל ילד בשמו, מסתכלת עליו רגע. במעגל אני משתמשת במקל דיבור, ככה גם הביישן מקבל את הרגע שלו בלי שיקפצו לו. ואני נעזרת בסייעת, מחלקת איתה, את לוקחת את הפינה הזו ואני את זו. בלי החלוקה הזו הייתי מפספסת חצי גן. זה לא מדע מדויק, לפעמים אני חוזרת הביתה ומרגישה שפספסתי מישהו. אבל אני לפחות בודקת את עצמי כל יום.</w:t>
       </w:r>
     </w:p>
     <w:p>
@@ -6129,7 +6202,7 @@
           <w:szCs w:val="24"/>
           <w:rtl w:val="1"/>
         </w:rPr>
-        <w:t>כשיש ילד שזקוק ליותר תשומת לב, רגשית, חברתית או לימודית, איך את מאזנת את זה מול שאר הילדים?</w:t>
+        <w:t>תארי לי מצב שבו ילד זקוק ליותר תשומת לב, רגשית, חברתית או לימודית. איך את מאזנת את זה מול שאר הילדים?</w:t>
       </w:r>
     </w:p>
     <w:p>
@@ -6153,7 +6226,7 @@
           <w:szCs w:val="24"/>
           <w:rtl w:val="1"/>
         </w:rPr>
-        <w:t>וואו, זו אחת השאלות הכי קשות במקצוע הזה. אני מאמינה שילד שצריך יותר, יקבל יותר. וזה בסדר. זו לא הפליה, זו הוגנות. אבל אני עושה את זה בחוכמה. נגיד יש ילד שקשה לו בבוקר, בכה בפרידה מאמא, ואני יושבת איתו הרבה זמן. אז אני נותנת לשאר הילדים תפקיד באותו זמן, שיהיו העוזרים שמכינים את הפעילות, ככה הם לא מרגישים נטושים אלא שותפים. ובלי הסייעת שלי אין לזה סיכוי. היא מחזיקה את הקבוצה בזמן שאני שקועה עם אחד.</w:t>
+        <w:t>יש לי דוגמה טרייה. השנה נכנסה אלי ילדה, ליהי, שההורים שלה נפרדו ממש בתחילת השנה. היא הגיעה כל בוקר עם בטן כואבת, בכתה, נצמדה אלי כמו שק. היה ברור שהיא צריכה ממני הרבה יותר מכולם באותה תקופה. ואיך מאזנים את זה, כי יש עוד שלושים ושלושה ילדים שגם צריכים אותי. הדבר הראשון שעשיתי זה נתתי לעצמי רשות, אמרתי לעצמי, בתקופה הזו ליהי מקבלת יותר, וזה בסדר. כי צדק זה לא מה שכולם מקבלים, זה מה שהילד צריך, וליהי צריכה עכשיו. אבל במקביל דאגתי לא לעשות את זה על חשבון האחרים בצורה שהם ירגישו. אז נעזרתי בסייעת, היא לקחה יותר את הקבוצה בזמן שאני יושבת עם ליהי בבוקר בפינה שקטה, כמה דקות, מכינה איתה לוח של איך היום ייראה. תוך שבועיים היא כבר נכנסה יותר בקלות. ואז לאט לאט הורדתי את המינון, כי אחרת היא לא היתה לומדת להסתדר לבד. זה כל הזמן משחק של קרוב ורחוק, כמה לתת וכמה לתת לה לצמוח. ובלי הסייעת שלי לא הייתי יכולה לתת לה את זה בלי לזנוח את השאר.</w:t>
       </w:r>
     </w:p>
     <w:p>
@@ -6177,7 +6250,7 @@
           <w:szCs w:val="24"/>
           <w:rtl w:val="1"/>
         </w:rPr>
-        <w:t>כיצד מתבצעת חלוקת החומרים והמשאבים הפיזיים בגן, הצעצועים והציוד? מה הקו המנחה שלך?</w:t>
+        <w:t>תארי לי כיצד מתבצעת חלוקת החומרים והמשאבים הפיזיים בגן (צעצועים, ציוד, אופניים). מה הקו המנחה שלך?</w:t>
       </w:r>
     </w:p>
     <w:p>
@@ -6201,7 +6274,7 @@
           <w:szCs w:val="24"/>
           <w:rtl w:val="1"/>
         </w:rPr>
-        <w:t>הכול פתוח ובגובה שלהם. אני מסדרת את החומרים ככה שכל ילד יכול להגיע לבד לכל דבר, בלי לבקש ממני רשות. זה כבר אמירה, שהכול פה שייך לכולם. לגבי דברים שאין מהם מספיק, נגיד האופניים בחצר, יש תור מסודר עם שמות, יש שעון חול שכולם רואים. אני לא אוהבת להיות זו שמחלקת הכול מלמעלה, כי אני רוצה שהם ילמדו לנהל בעצמם. וכלל אחד ברור, שכולם יודעים, משהו שהובא מהבית, ברגע שהוא נכנס בשער, הוא של כולם.</w:t>
+        <w:t>החלוקה הפיזית בגן זה נושא שהילדים חיים אותו כל היום, האופניים בחצר זה מלחמת עולם. הקו המנחה שלי הוא לא תור עיוור אלא הוגנות. יש לנו בחצר ארבעה אופניים ושלושים וארבעה ילדים, אז ברור שצריך שיטה. השתמשתי הרבה זמן בשעון חול, כל אחד מקבל סבב ואז מעביר. זה עובד יפה כי זה לא אני שמחליטה, זה החול, וזה מוריד המון ויכוחים. אבל אני גם יודעת מתי לשבור את הכלל. אם יש ילד שהיום קשה לו במיוחד, או ילד שאף פעם לא מצליח להיכנס למשחק, לפעמים אני אשמור לו רגע על האופניים, לא כי מגיע לו יותר, אלא כי הוא צריך את זה כדי להיכנס פנימה. עם צעצועים שמגיעים מהבית, יש את הכלל הקבוע שלי, ברגע שזה עבר את שער הגן זה הופך משותף. זה חוסך המון קנאה, כי אחרת היה נוצר פה מעמד של מי שיש לו את הצעצוע הכי חדש. אני מסבירה את זה להורים בתחילת שנה, שזה לא כי לא מכבדים את הרכוש, אלא כי בגן אנחנו קהילה. ובגדול, כל חלוקה של חומרים אצלי היא הזדמנות ללמד, לא רק לוגיסטיקה.</w:t>
       </w:r>
     </w:p>
     <w:p>
@@ -6225,7 +6298,7 @@
           <w:szCs w:val="24"/>
           <w:rtl w:val="1"/>
         </w:rPr>
-        <w:t>האם לדעתך חלוקה "שווה" וחלוקה "הוגנת" הן אותו דבר? תני דוגמה מהגן.</w:t>
+        <w:t>האם לדעתך חלוקה "שווה" וחלוקה "הוגנת" הן אותו דבר? תני דוגמה מהגן שממחישה את ההבדל.</w:t>
       </w:r>
     </w:p>
     <w:p>
@@ -6249,7 +6322,7 @@
           <w:szCs w:val="24"/>
           <w:rtl w:val="1"/>
         </w:rPr>
-        <w:t>לא. ממש לא. וזה משהו שאני מנסה ללמד גם את הילדים. שווה זה שכולם מקבלים בדיוק אותו דבר. הוגן זה שכל אחד מקבל מה שהוא צריך. תשמעי דוגמה פשוטה, מזמן הארוחה. אם אני נותנת לכולם אותה כמות לחם בדיוק, זה שווה. אבל יש לי ילד שהגיע רעב, כי לא אכל בבית ארוחת בוקר, ויש ילד ששבע. הוגן זה לתת לרעב עוד פרוסה, בשקט, בלי לעשות מזה סיפור. היתה לי פעם ילדה ששאלה, למה לו יש שתיים ולי אחת. ישבתי איתה, הסברתי שכל אחד מקבל מה שהבטן שלו צריכה. היא הבינה מיד.</w:t>
+        <w:t>לא, בשבילי שווה והוגן זה ממש לא אותו דבר, וזה אולי הדבר הכי חשוב שאני מנסה להעביר. שווה זה לתת לכולם אותו דבר בדיוק. הוגן זה לתת לכל אחד מה שהוא צריך כדי להצליח. יש לי דוגמה שאני אוהבת. בפעילות ציור ישבו לי שני ילדים. אחד, יונתן, מחזיק עיפרון מעולה, מצייר כבר בית עם חלונות. השני, עומר, בקושי מחזיק, השרירים הקטנים עוד לא שם. אם אני נותנת לשניהם בדיוק אותה הוראה ואותו דף ועוזבת, זו חלוקה שווה. כולם קיבלו אותו דבר. אבל זה לא הוגן, כי עומר נשאר מאחור ומתוסכל. הוגן זה שאני יושבת ליד עומר, נותנת לו אולי עיפרון משולש שקל יותר לאחוז בו, מחזיקה לו את היד רגע. יונתן לא צריך אותי עכשיו, הוא מעופף לבד. אז נתתי להם לא שווה, נתתי לעומר יותר ממני, ודווקא זה ההוגן. אני מסבירה את זה גם לילדים בשפה שלהם, כשמישהו אומר לא הוגן שהוא קיבל יותר, אני אומרת, לכל אחד יש מה שהוא צריך, ולך יהיה מה שאתה תצטרך כשתצטרך. לוקח להם זמן להבין, אבל הם קולטים.</w:t>
       </w:r>
     </w:p>
     <w:p>
@@ -6273,7 +6346,7 @@
           <w:szCs w:val="24"/>
           <w:rtl w:val="1"/>
         </w:rPr>
-        <w:t>כיצד את מתמודדת עם מצב שילד מסוים "לוקח" יותר מקום במרחב הקבוצתי?</w:t>
+        <w:t>תארי לי מצב שבו ילד מסוים "לוקח" יותר מקום במרחב הקבוצתי, וכיצד את מתמודדת עם זה.</w:t>
       </w:r>
     </w:p>
     <w:p>
@@ -6297,7 +6370,7 @@
           <w:szCs w:val="24"/>
           <w:rtl w:val="1"/>
         </w:rPr>
-        <w:t>קודם כול אני שואלת את עצמי למה. כי ילד שלוקח הרבה מקום, הוא מספר לי משהו. אולי הוא צריך תשומת לב ולא יודע לבקש אחרת, אולי קשה לו עם גבולות, אולי הוא פשוט מנהיג עם המון אנרגיה. אני משתדלת לא לתייג אותו מיד כמפריע. אני נותנת לו תפקידים שהוא יכול לבלוט בהם לטובה, שיהיה המנחה של המעגל. כי ילד שמקבל את הבמה בצורה מסודרת, הוא הרבה פחות צריך לחטוף אותה כל הזמן. ובמקביל אני דואגת לשקטים, יש לנו מקל דיבור, שרק מי שמחזיק אותו מדבר, ככה גם הביישנים מקבלים תור מובטח.</w:t>
+        <w:t>יש לי כזה ילד כמעט כל שנה, השנה זה איתי. ילד מקסים, חכם, מלא אנרגיה, אבל הוא לוקח את כל האוויר בחדר. במעגל הוא עונה על הכל, קופץ, מדבר מעל כולם, במשחק הוא קובע את החוקים ומחליט מי בפנים ומי בחוץ. ואני שמה לב שהילדים השקטים לאט לאט נמחקים לידו. אז איך אני מתמודדת. קודם כל אני לא רואה בו ילד רע, אני שואלת מה עבר עליו, ולרוב מאחורי ילד כזה יש הרבה צורך בתשומת לב. אז אני נותנת לו תפקידים, מקום להבריק בו בלגיטימיות, למשל הוא אחראי חלוקת הפירות, זה מספק לו חלק מהצורך. ובמקביל אני מגינה על המרחב של האחרים. פה נכנס מקל הדיבור, זה כלי מדהים בשבילו. מי שמחזיק את המקל מדבר, וכשהוא לא מחזיק, הוא לומד לחכות, וזה קשה לו נורא, אבל הוא לומד. פעם אחת ראיתי אותו מחזיק את המקל, מסתכל על נעם השקט, ואומר, נעם עוד לא דיבר, ניתן לו. כמעט בכיתי. זה בדיוק הרגע שבו הבנתי שהוא לא לוקח מקום כדי לפגוע, הוא פשוט עוד לומד שיש עוד אנשים בחדר.</w:t>
       </w:r>
     </w:p>
     <w:p>
@@ -6321,7 +6394,7 @@
           <w:szCs w:val="24"/>
           <w:rtl w:val="1"/>
         </w:rPr>
-        <w:t>כיצד את מתמודדת עם מצבים של הדרה חברתית, ילד שהקבוצה לא מקבלת ולא רוצים לשחק איתו?</w:t>
+        <w:t>תארי לי מצב של הדרה חברתית בגן, ילד שהקבוצה לא מקבלת ולא רוצים לשחק איתו. כיצד את פועלת?</w:t>
       </w:r>
     </w:p>
     <w:p>
@@ -6345,7 +6418,7 @@
           <w:szCs w:val="24"/>
           <w:rtl w:val="1"/>
         </w:rPr>
-        <w:t>אוף, זה כואב. זה אחד הדברים הכי כואבים, כי הדרה בגיל הזה משאירה סימנים לשנים. אני לא נותנת לזה לעבור בשקט. הדבר הראשון, אני לא מכריחה ילדים לשחק איתו. כי כפייה כזאת רק מגבירה את הדחייה. אני עובדת בשקט. מצד אחד עם הילד עצמו, מנסה להבין מה מרחיק ממנו את השאר, ומחפשת את החוזקה שלו והופכת אותו למבוקש. יש לי ילד שבנה יפה? הוא הופך למומחה הבנייה של הגן. ומצד שני אני מרכיבה קבוצות משחק קטנות שבהן הוא מצליח. כי הצלחה משותפת אחת שווה יותר מאלף הטפות שלי.</w:t>
+        <w:t>הדרה חברתית זה אחד הדברים שהכי מזעזעים אותי לראות בגן, כי בגיל הזה זה כבר קורה, ובאכזריות שלמה. היתה לי מיה, ילדה שריח מסוים היה עליה מהבית, בית עם קשיים, ולאט לאט הילדים התחילו להגיד היא מסריחה, לא רוצים לידה. וזה נורא, כי ילדה בת ארבע כבר מרגישה בגוף שהיא מחוץ. איך אני פועלת. קודם כל אני לא נוזפת בקבוצה, כי בושה לא מלמדת כלום, היא רק מעמיקה. במקום זה אני עובדת בכמה שכבות. עם מיה עצמה עבדתי בעדינות מול הבית, בלי לבייש, ראינו איך אפשר לעזור. עם הקבוצה יצרתי הזדמנויות, שיבצתי אותה במשחקים עם ילד אחד חם ומקבל בהתחלה, לא זרקתי אותה לכל הקבוצה. חיפשתי את החוזקה שלה, והיא ציירה יפהפה, אז נתתי לה להיות זו שמלמדת אחרים לצייר, וזה שינה איך רואים אותה. ואני שידרתי בגוף שלי, בכל רגע, שמיה שלי, שאני יושבת לידה, מחבקת אותה מול כולם. כי ילדים לומדים מהדוגמה, לא מההטפה, ואם אני מקבלת אותה, גם הם לומדים. לקח חודשיים, אבל בסוף היא נכנסה. את הרגע שבו ילד קרא לה לשחק בלי שביקשתי, אני זוכרת עד היום.</w:t>
       </w:r>
     </w:p>
     <w:p>
@@ -6369,7 +6442,7 @@
           <w:szCs w:val="24"/>
           <w:rtl w:val="1"/>
         </w:rPr>
-        <w:t>האם בגן שלך יש ילדים מרקעים חברתיים או כלכליים שונים? כיצד זה בא לידי ביטוי ביום-יום?</w:t>
+        <w:t>האם בגן שלך יש ילדים מרקעים חברתיים או כלכליים שונים? תארי לי כיצד זה בא לידי ביטוי בפרקטיקה היומיומית.</w:t>
       </w:r>
     </w:p>
     <w:p>
@@ -6393,7 +6466,7 @@
           <w:szCs w:val="24"/>
           <w:rtl w:val="1"/>
         </w:rPr>
-        <w:t>כן, הגן שלי מאוד מגוון, ואני דווקא אוהבת את זה. זה עושר. את רואה את זה בהמון דברים קטנים. באוכל שילדים מביאים בקופסה, בבגדים, בחגים שהמשפחות חוגגות. ואני מאוד נזהרת לא ליצור מצבים שמביכים ילד בגלל מה שאין לו. נגיד, אני לא מבקשת מההורים להביא ציוד יקר, ואם צריך חומרים לפרויקט, הגן נותן לכולם. וגם, אחרי חגים אני אף פעם לא פותחת בשאלה מה עשיתם בחופש, כי לחלק מהילדים אין מה לספר וזה משפיל. במקום זה אני הופכת את השונות למשהו טוב.</w:t>
+        <w:t>כן, מאוד. הגן שלי בשכונה מעורבת, ויש לי ממש קשת רחבה. יש ילדים שההורים אקדמאים, נוסעים לחול בחופש, ויש ילדים שבבית יש קושי כלכלי אמיתי, לפעמים אפילו אין ארוחת בוקר של ממש. וזה בא לידי ביטוי בהמון דברים קטנים שאנשים לא חושבים עליהם. למשל, אני עקרונית לא פותחת את השבוע בשאלה מה עשיתם בחופש, או מה קניתם. כי לילד שנסע ליוון זו שאלה כיף, ולילד שהיה שבוע שלם בבית בלי כלום זו שאלה שמביישת. אני מחליפה את זה בשאלה כמו מה גרם לכם לצחוק השבוע, משהו שכל ילד יכול לענות עליו מהמקום שלו. גם ימי הולדת, פעם היו הורים שמביאים מתנות ענק, אז שמתי כלל שהחגיגה בגן היא אותה חגיגה לכולם, כתר, שיר, בלי תחרות של מי הביא יותר. גם בבגדים אני שמה לב, אם ילד מגיע בלי מעיל בחורף אני מסדרת מעיל מהמאגר שלנו בשקט, בלי שאף אחד ידע. הפערים קיימים, אני לא יכולה למחוק אותם, אבל אני יכולה לדאוג שבתוך הגן הם לא יהפכו לתווית על המצח של ילד.</w:t>
       </w:r>
     </w:p>
     <w:p>
@@ -6417,7 +6490,7 @@
           <w:szCs w:val="24"/>
           <w:rtl w:val="1"/>
         </w:rPr>
-        <w:t>כיצד את מתמודדת עם הפערים הניכרים בין הילדים, בין השאר בתחום הרגשי, החברתי או הלימודי?</w:t>
+        <w:t>תארי לי כיצד את מתמודדת עם הפערים הניכרים בין הילדים, בין השאר בתחום הרגשי, החברתי או הלימודי.</w:t>
       </w:r>
     </w:p>
     <w:p>
@@ -6441,7 +6514,7 @@
           <w:szCs w:val="24"/>
           <w:rtl w:val="1"/>
         </w:rPr>
-        <w:t>אני משתדלת לא לקרוא לזה בכלל פער שצריך לסגור. זו נקודת פתיחה שונה, זה הכול. לכל ילד יש קצב משלו. בפועל אני עובדת עם אותה פעילות בכמה רמות. אם עובדים על מספרים, יש ילד שסופר עד שלוש בגאווה, ויש ילד שכבר מחבר, ואני נותנת לכל אחד אתגר בגובה שלו. הקושי האמיתי הוא דווקא ברגשי, כי שם זה פחות נראה לעין אבל הרבה יותר עמוק. ושם אני נעזרת ביועצת ובהורים. ודבר אחד קדוש אצלי, אני אף פעם לא משווה ילד לילד בקול רם. זה משפט שהורס ילד.</w:t>
+        <w:t>הפערים בין הילדים בגיל הזה יכולים להיות עצומים, במיוחד בגן גדול. יש לי ילד שקורא כמעט מילים שלמות, ולידו ילד שעוד לא מזהה את השם של עצמו. יש ילד שיושב ומקשיב עשרים דקות, ולידו ילד שלא מחזיק דקה. איך מתמודדים בלי לשבור אף אחד. אני מאוד מאמינה בעבודה בקבוצות קטנות, לא הכל במליאה. ככה אני יכולה לתת לכל קבוצה משימה שמתאימה לה, ולא לחשוף ילד מול כולם למה שהוא עוד לא יודע. אני נזהרת מאוד לא לבייש, לא אקריא בקול מי ידע ומי לא. בתחום הרגשי, יש ילדים שכבר יודעים להגיד אני כועס, ויש כאלה שרק דוחפים כי אין להם מילים, אז איתם אני עובדת על השפה של הרגשות, כרטיסיות פרצופים, סיפורים. אני עובדת עם ההנחה שכל ילד בקצב שלו, ותפקידי לא להשוות אלא להצעיד כל אחד צעד קדימה מהמקום שבו הוא. ופה הצוות קריטי, אני והסייעת מחלקות, היא לוקחת שולחן אחד ואני שני, אחרת אי אפשר לגעת בכולם. ואני זוכרת תמיד, הילד שהכי מאחור הוא בדרך כלל גם הילד שהכי צריך שמישהו יאמין בו, לא שמישהו יסמן לו כמה הוא רחוק.</w:t>
       </w:r>
     </w:p>
     <w:p>
@@ -6465,7 +6538,7 @@
           <w:szCs w:val="24"/>
           <w:rtl w:val="1"/>
         </w:rPr>
-        <w:t>איך נראה יום עבודה טיפוסי שלך בגן, ומהם הדברים שאת מקפידה עליהם מבחינת הוגנות?</w:t>
+        <w:t>תארי לי יום עבודה טיפוסי שלך בגן, ומהם הדברים שאת מקפידה עליהם מבחינת הוגנות.</w:t>
       </w:r>
     </w:p>
     <w:p>
@@ -6489,7 +6562,7 @@
           <w:szCs w:val="24"/>
           <w:rtl w:val="1"/>
         </w:rPr>
-        <w:t>היום מתחיל בקבלה בפתח, וזה בשבילי הרגע הכי חשוב, כי שם אני קולטת מי הגיע באיזה מצב. אחר כך מפגש בוקר, פעילות בקבוצות, חצר, ארוחה, ושוב פעילות. הדבר שאני הכי מקפידה עליו מבחינת הוגנות הוא התורים והתפקידים, שכל ילד ידע שהתור שלו יגיע ושלכל אחד יש תפקיד. וגם הקבלה והפרידה, שכל ילד יקבל ממני מבט אישי בכניסה וביציאה. זה נשמע קטן, אבל זה מה שמחזיק את התחושה שרואים אותך.</w:t>
+        <w:t>יום טיפוסי מתחיל אצלי בשער, ואני מאוד מקפידה על זה. אני עומדת ומקבלת כל ילד בשמו, מסתכלת עליו רגע, כי ההסתכלות הזו אומרת לי כבר איך הוא הגיע היום, מי בכה בדרך, מי לא ישן. אחר כך משחק חופשי, וזה הזמן שאני מסתובבת ועושה את הספירה בראש, מי עוד לא קיבל ממני מבט. אחר כך מעגל בוקר, ושם מקל הדיבור, שכל אחד מקבל תור, גם השקט. אחרי זה פעילות, ואני משתדלת שתהיה בקבוצות קטנות. ארוחה, חצר, וסיום. הדברים שאני מקפידה עליהם מבחינת הוגנות פזורים לאורך כל היום. שהצעצוע מהבית הופך משותף בשער. שאני לא פותחת בשאלות שמביישות. שבחצר החלוקה של האופניים הוגנת ולא של החזק תופס. שבארוחה אני שמה לב שלכל ילד יש, ואם למישהו אין, אני מסדרת בשקט. ובסוף היום, לפני שהם הולכים, אני עושה לעצמי סיכום, את מי לא ראיתי מספיק היום, כדי שמחר הוא יהיה ראשון. זה לא כתוב בשום מערך שיעור, אבל בשבילי זה עיקר העבודה, לוודא שאף ילד לא עבר יום שלם בגן בלי שמישהו באמת ראה אותו.</w:t>
       </w:r>
     </w:p>
     <w:p>
@@ -6513,7 +6586,7 @@
           <w:szCs w:val="24"/>
           <w:rtl w:val="1"/>
         </w:rPr>
-        <w:t>האם חשוב בעינייך לזהות, לדבר ולפעול נגד מקרים לא צודקים בגן? כיצד ובאילו מקרים?</w:t>
+        <w:t>האם חשוב בעינייך לזהות, לדבר ולפעול נגד מקרים לא צודקים בגן? תארי לי כיצד ובאילו מקרים.</w:t>
       </w:r>
     </w:p>
     <w:p>
@@ -6537,7 +6610,7 @@
           <w:szCs w:val="24"/>
           <w:rtl w:val="1"/>
         </w:rPr>
-        <w:t>מאוד חשוב לי, ואני לא נותנת לזה לעבור. אם ילד צוחק על ילד אחר, אם מישהו נדחק החוצה, אם יש חלוקה לא הוגנת, אני עוצרת את מה שקורה ומדברת על זה. לא בנזיפה, אלא בשיחה. אני מאמינה שכל מקרה כזה הוא הזדמנות ללמד. הכי הרבה אני מתערבת במקרים של הדרה ושל לעג, כי אלה הדברים שמשאירים סימנים. ואני עושה את זה מיד, במקום, כי אצל ילדים אם לא מטפלים ברגע, הרגע אבד.</w:t>
+        <w:t>כן, לגמרי, אני חושבת שזה חלק מהותי מהתפקיד, לא רק ללמד צבעים. אבל הדרך שבה אני פועלת נגד עוול היא לא בהכרזות. ילד קולט חוסר צדק הרבה לפני שהוא יודע להגיד את המילה. אם אני מתעלמת מזה, אני בעצם מלמדת אותו שזה בסדר. אז אני מתערבת, אבל בזהירות. יש מקרים ברורים, ילד שמכה ילד אחר, ילד שגוזל צעצוע בכוח, שם אני עוצרת מיד, לא כי אני שופטת אלא כי צריך גבול. אבל יש מקרים עדינים יותר, שדווקא הם החשובים. כשאני רואה קבוצה שמדירה ילד, כשאני רואה שמישהו תמיד מקבל את התור האחרון כי הוא לא נלחם, שם אני מתערבת, כי זה עוול שקט שאף אחד לא צועק עליו. אני נזהרת לא לבייש את מי שעשה, אני שואלת מה קרה, מה עבר עליך, במקום מה לא בסדר איתך. וכשילד נפגע, אני דואגת שהוא ידע שראיתי, שזה לא נעלם. כי ילד שרואים שעשו לו עוול ותיקנו, לומד שהעולם הוגן, שאפשר לתקן. ילד שהעוול נבלע בשקט לומד משהו אחר לגמרי. אז כן, זה בעיני חלק מהעבודה, ולא הפחות חשוב שבה.</w:t>
       </w:r>
     </w:p>
     <w:p>
@@ -6561,7 +6634,7 @@
           <w:szCs w:val="24"/>
           <w:rtl w:val="1"/>
         </w:rPr>
-        <w:t>האם קרה שקיבלת החלטה שבדיעבד הרגישה לך לא הוגנת? תארי, ואיך הרגשת עם זה?</w:t>
+        <w:t>תארי לי מקרה שבו קיבלת החלטה שבדיעבד הרגישה לך לא הוגנת. מה קרה, ואיך הרגשת?</w:t>
       </w:r>
     </w:p>
     <w:p>
@@ -6585,7 +6658,7 @@
           <w:szCs w:val="24"/>
           <w:rtl w:val="1"/>
         </w:rPr>
-        <w:t>כן, בטח. אני זוכרת שפעם הוצאתי ילד מהמעגל כי הפריע. ורק אחר כך הבנתי שהוא הפריע כי היה לו נורא קשה באותו יום, משהו קרה בבית. הרגשתי נורא. הרגשתי שהענשתי ילד על הכאב שלו. למדתי מזה שלפני שאני מגיבה, אני צריכה לשאול קודם מה עובר עליו, לא רק מה הוא עשה. היום אני הרבה יותר איטית להעניש, ואני מנסה קודם להבין. וזה, אגב, אחד הדברים הכי קשים, כי ברגע האמת את עייפה ורוצה שקט.</w:t>
+        <w:t>יש לי מקרה כזה שאני עוד חושבת עליו לפעמים. היה יום עמוס במיוחד, סוף שנה, לחץ. שני ילדים רבו על אותו משחק, וראש כבר לא היה לי. אחד מהם, טל, ילד שרב הרבה, אז מהר מדי הנחתי שהוא זה שהתחיל, ולקחתי ממנו את המשחק ונתתי לשני. טל בכה בכי נורא, אמר זה לא הוגן, זה לא הוגן, וברח לפינה. וחצי שעה אחר כך ילד אחר בא ואמר לי בתמימות, טל בכלל שיחק ראשון, השני לקח לו. הבטן שלי התהפכה. שפטתי אותו לפי המוניטין, לא לפי מה שקרה, בדיוק ההפך ממה שאני מטיפה לו לעצמי, לשאול מה עבר על הילד ולא להניח מראש. איך הרגשתי, ממש רע. הלכתי אליו, התיישבתי לגובה שלו ואמרתי לו, טל, טעיתי. אתה צדקת, שיחקת ראשון, ואני לא בדקתי. סליחה. וראיתי איך הפנים שלו נפתחות, כי ילד לא רגיל שמבוגר אומר לו טעיתי. אני חושבת שדווקא מהטעות הזו הוא למד יותר על צדק מכל שיחה, כי הוא ראה שגם אני נמדדת באותה אמת מידה. אבל לי זה ישב על הלב, כי אני יודעת כמה ילד כמו טל כבר רגיל שמאשימים אותו קודם.</w:t>
       </w:r>
     </w:p>
     <w:p>
@@ -6609,7 +6682,7 @@
           <w:szCs w:val="24"/>
           <w:rtl w:val="1"/>
         </w:rPr>
-        <w:t>האם לדעתך ילדים בגיל הגן מבינים מהי הוגנות? מאיזה גיל, ואיך זה בא לידי ביטוי?</w:t>
+        <w:t>האם לדעתך ילדים בגיל הגן מבינים מהי הוגנות? מאיזה גיל, ותארי לי כיצד זה בא לידי ביטוי אצלם.</w:t>
       </w:r>
     </w:p>
     <w:p>
@@ -6633,7 +6706,7 @@
           <w:szCs w:val="24"/>
           <w:rtl w:val="1"/>
         </w:rPr>
-        <w:t>מבינים, ועוד איך. אני חושבת שכבר בגיל שלוש יש להם חוש צדק חד בטירוף, אבל הוא מאוד מוחלט בהתחלה, מבחינתם הוגן זה שלכולם יהיה בדיוק אותו דבר. ההבנה שהוגן זה לפעמים שונה מילד לילד, זה כבר מתחיל להיבנות בגיל ארבע, חמש, ואני עוזרת לזה. כשילד מבין למה חבר שלו קיבל עוד פרוסה כי היה רעב, ומקבל את זה בלי לכעוס, זה רגע שאני יודעת שקרה משהו חשוב בראש שלו.</w:t>
+        <w:t>בהחלט מבינים, הרבה יותר ממה שנוטים לחשוב, פשוט לא במילים שלנו. כבר בגיל שלוש ילד יגיד לך זה לא הוגן, בדרך כלל כשמשהו נלקח ממנו. בהתחלה זה מאוד ממני מרכזי, הוגן זה שאני מקבל. אבל סביב ארבע וחצי, חמש, אני רואה קפיצה יפה, הם מתחילים להבין הוגנות גם כשהיא לא לטובתם. יש לי דוגמה. חילקתי עוגה, ולילד אחד נתתי חתיכה קצת יותר גדולה כי הוא כמעט לא אכל כל היום. ילדה אחת אמרה, למה לו יותר. ובמקום שאני אענה, ילד אחר ענה לה, כי הוא לא אכל, אז הוא צריך יותר. בן ארבע וחצי. הוא בעצם ניסח לבד את ההבדל בין שווה להוגן. הם גם מפתחים חוש חד לצביעות שלנו, אם אני אומרת מחכים בתור ואז אני נותנת למישהו לעקוף, הם קולטים מיד וזוכרים. זה בדיוק למה אני אומרת שהם לומדים מהדוגמה, לא מההטפה, כי הם עוקבים אחרינו כל הזמן. אז כן, בגיל הזה כבר יש הבנה אמיתית, זה עוד גמיש, עוד ממני מרכזי לפעמים, אבל הזרעים של תחושת הצדק כבר לגמרי שם. תפקידי רק להשקות אותם.</w:t>
       </w:r>
     </w:p>
     <w:p>
@@ -6657,7 +6730,7 @@
           <w:szCs w:val="24"/>
           <w:rtl w:val="1"/>
         </w:rPr>
-        <w:t>כיצד את מתמודדת עם דרישה של הורה שהילד שלו יקבל יחס מועדף?</w:t>
+        <w:t>תארי לי מצב שבו הורה דרש שהילד שלו יקבל יחס מועדף. כיצד התמודדת?</w:t>
       </w:r>
     </w:p>
     <w:p>
@@ -6681,7 +6754,7 @@
           <w:szCs w:val="24"/>
           <w:rtl w:val="1"/>
         </w:rPr>
-        <w:t>זה קורה, וזה עדין. מגיע הורה ורוצה שהילד שלו יישב דווקא במקום מסוים, או שאתן לו יותר תשומת לב. אני מקשיבה קודם, כי בדרך כלל מאחורי הבקשה יש דאגה אמיתית. ואז אני מסבירה, בעדינות אבל בברור, שהצדק שלי הוא כלפי כל שלושים וארבעה הילדים, ושאני לא יכולה לתת לילד אחד יתרון על חשבון אחר. אני מבטיחה להורה שהילד שלו רואים ואוהבים, וברוב המקרים זה מה שהוא באמת צריך לשמוע.</w:t>
+        <w:t>זה קורה, יותר ממה שהייתי רוצה. היתה לי אמא, אשה נחמדה בבסיס, שבאה אלי בתחילת שנה ואמרה לי כמעט ישר, אני רוצה שהבן שלי יישב תמיד קרוב אלייך במעגל, ושהוא יהיה אחראי התורנות הכי הרבה, כי הוא מוכשר וחבל שיאבד את זה בין כולם. אמרה את זה בכל הכנות, מאהבה. ואיך התמודדתי. קודם כל לא נכנסתי לעימות, כי אני מבינה מאיפה זה בא, כל הורה רוצה שיראו את הילד שלו, זה לגיטימי. אז אמרתי לה, אני שומעת אותך, ואני מבטיחה לך שאני רואה את יובל, הוא באמת ילד מיוחד. ואז הסברתי לה את הקו שלי, שבגן שלי כל ילד מקבל את מה שהוא צריך, ושדווקא זה מה שישמור על יובל, כי ביום שיהיה לו קשה, גם הוא יקבל יותר, ולא יצטרך להיות תמיד החזק. אמרתי לה, אם אני אתן ליובל תמיד את המקום הכי טוב, אני מלמדת אותו שהוא שווה יותר מחבריו, ואני לא חושבת שזו טובה לו לחיים. היא נשתקה רגע, ואז אמרה, לא חשבתי על זה ככה. לא תמיד זה נגמר יפה כל כך, אבל פה זה עבד, כי לא נלחמתי בה, דיברתי איתה על הילד.</w:t>
       </w:r>
     </w:p>
     <w:p>
@@ -6705,7 +6778,7 @@
           <w:szCs w:val="24"/>
           <w:rtl w:val="1"/>
         </w:rPr>
-        <w:t>האם את משתפת את ההורים בנושאים של צדק, שוויון והוגנות? האם נוצרים מתחים, וכיצד את מתמודדת איתם?</w:t>
+        <w:t>האם את משתפת את ההורים בנושאים של צדק, שוויון והוגנות? תארי לי אם נוצרים מתחים וכיצד את מתמודדת.</w:t>
       </w:r>
     </w:p>
     <w:p>
@@ -6729,7 +6802,7 @@
           <w:szCs w:val="24"/>
           <w:rtl w:val="1"/>
         </w:rPr>
-        <w:t>בטח שנוצרים מתחים, לא אשקר לך. אני משתפת אותם קודם כול דרך שקיפות, כבר באסֵפה הראשונה אני מסבירה את הגישה שלי, שאצלנו לא הכול מתחלק שווה בשווה אלא לפי צורך. רובם מתחברים. אבל מדי פעם מגיע הורה שרוצה יתרון דווקא לילד שלו, ואז אני צריכה לעמוד, בעדינות אבל בלי להתקפל. הכי מסובך זה כשהורה מרגיש שילד אחר, המפריע, מקבל ממני יותר מדי. אז אני מסבירה, בלי לחשוף שום דבר על ילד אחר, שכל ילד עובר תקופות, ושגם הילד שלו ביום קשה יקבל בדיוק אותה תמיכה.</w:t>
+        <w:t>אני מנסה לשתף את ההורים, כן, כי בלעדיהם חצי מהעבודה נשארת בגן ולא ממשיכה הביתה. אני עושה את זה בעיקר בישיבות ההורים בתחילת שנה, מסבירה את התפיסה שלי, שאצלי הוגן זה לא בהכרח שווה, שהכלל של הצעצוע המשותף בא מהמקום הזה, שאני לא פותחת שיחות על מה קניתם בחופש. רוב ההורים מתחברים לזה. אבל בטח שנוצרים מתחים לפעמים. יש הורים שזה מרגיז אותם, שאומרים, למה הצעצוע שקניתי לבן שלי צריך להיות של כולם. או הורה שכועס שנתתי לילד אחר יותר תשומת לב בתקופה מסוימת. איך אני מתמודדת, אני לא מתגוננת ולא מטיפה. אני מנסה להסביר דרך הילד שלהם. אני אומרת, תארי לך שיום אחד הבן שלך יהיה במשבר, אני רוצה שתדעי שאז הוא יקבל ממני יותר, וזה בדיוק מה שאני עושה עכשיו לילד אחר. פתאום זה מתהפך אצלם, כי הם מבינים שהמערכת הזו מגנה גם על הילד שלהם. עם הצעצועים אני מסבירה שזה חוסך לילד את הכאב של הקנאה. לא כולם מתלהבים, אבל רובם, כשאני מדברת מהמקום של אכפתיות ולא של חוק יבש, מתרככים. הכי חשוב לי שהם ירגישו שאני בצד של הילד שלהם, לא נגדו.</w:t>
       </w:r>
     </w:p>
     <w:p>
@@ -6753,7 +6826,7 @@
           <w:szCs w:val="24"/>
           <w:rtl w:val="1"/>
         </w:rPr>
-        <w:t>האם את מרגישה שתפקידך כגננת כולל קידום ערכים של שוויון וצדק חברתי? כיצד?</w:t>
+        <w:t>האם את מרגישה שתפקידך כגננת כולל קידום ערכים של שוויון וצדק חברתי? תארי לי כיצד.</w:t>
       </w:r>
     </w:p>
     <w:p>
@@ -6777,7 +6850,7 @@
           <w:szCs w:val="24"/>
           <w:rtl w:val="1"/>
         </w:rPr>
-        <w:t>מאוד. בעיניי זו אחת המשימות הכי גדולות במקצוע הזה, אולי הכי גדולה. גיל הגן זה הגיל שבו נבנות אצל הילד התפיסות הכי בסיסיות על העולם. מי שווה, מי שייך, איך מתייחסים לחלש. אם ילד יוצא ממני עם ההבנה שכל אדם שווה ערך, שמותר להיות שונה, ושחשוב לעזור למי שקשה לו, עשיתי הרבה. הרבה יותר מקריאה וכתיבה. ואני עושה את זה בעיקר דרך דוגמה אישית. הילדים לא לומדים ממה שאני מטיפה, הם לומדים מאיך שאני מתייחסת לילד שקשה לו, מאיך שאני מחלקת. הם קולטים הכול.</w:t>
+        <w:t>כן, ואני חושבת שזה אחד הדברים הכי חשובים שאני עושה, אולי חשוב יותר מלהכין אותם לכיתה א. תראי, בגיל הזה מתעצבים הדפוסים הבסיסיים, מי אני ביחס לאחרים, האם מגיע לי, האם מגיע גם לשני. אם ילד גדל בגן שבו ראו אותו, שבו הדירו מישהו והמבוגר עצר את זה, שבו הוא חווה שגם החלש מקבל מקום, הוא לוקח את זה איתו לכל החיים. אז כן, אני מרגישה שזה חלק מהתפקיד, ולא חלק צדדי. אבל אני עושה את זה בלי דגלים ובלי סיסמאות, כי ילד בן ארבע לא מבין הרצאה על שוויון. הוא מבין את מה שהוא רואה. אם הוא רואה אותי מחלקת בהוגנות, מקשיבה למי שלא נשמע, מתקנת כשטעיתי, מחבקת דווקא את זה שקשה לאהוב, זה נכנס לו לגוף. ילדים לומדים צדק מדוגמה אישית, לא מהטפה, אני חוזרת לזה כי זה באמת האני מאמין שלי. אני לא מסוגלת לחנך לצדק אם אני עצמי לא הוגנת מולם. אז בכל בוקר שאני עומדת בשער וסופרת בראש את מי עוד לא ראיתי, אני מרגישה שזו העבודה החברתית האמיתית שלי, ילד אחד בכל פעם, לדאוג שאף אחד לא יהיה שקוף.</w:t>
       </w:r>
     </w:p>
     <w:p>
@@ -6795,7 +6868,6 @@
         <w:rPr>
           <w:rFonts w:ascii="David" w:hAnsi="David" w:cs="David"/>
           <w:b/>
-          <w:i w:val="0"/>
           <w:sz w:val="28"/>
           <w:szCs w:val="28"/>
           <w:rtl w:val="1"/>
@@ -6813,7 +6885,6 @@
         <w:rPr>
           <w:rFonts w:ascii="David" w:hAnsi="David" w:cs="David"/>
           <w:b w:val="0"/>
-          <w:i w:val="0"/>
           <w:sz w:val="22"/>
           <w:szCs w:val="22"/>
           <w:rtl w:val="1"/>
@@ -6842,7 +6913,7 @@
           <w:szCs w:val="24"/>
           <w:rtl w:val="1"/>
         </w:rPr>
-        <w:t>ספרי לי קצת על עצמך ועל התפקיד שלך. מי את, כמה שנים את בתחום, ואיך הגעת למקצוע?</w:t>
+        <w:t>ספרי לי קצת על עצמך ועל הדרך המקצועית שלך. מי את, כמה שנים את בתחום, ומה הביא אותך להיות גננת?</w:t>
       </w:r>
     </w:p>
     <w:p>
@@ -6866,7 +6937,7 @@
           <w:szCs w:val="24"/>
           <w:rtl w:val="1"/>
         </w:rPr>
-        <w:t>רבקה, בת חמישים ושמונה, סבתא לארבעה, וגננת עשרים ושמונה שנה. תראי, אני כבר מקבלת לגן ילדים של ילדים שהיו אצלי בעצמם. תארי לך איזו הרגשה. הגעתי למקצוע כמעט במקרה, הייתי מזכירה, ובזמן שהילדים שלי היו קטנים התנדבתי בגן שלהם, ופשוט התאהבתי. חזרתי ללימודים בגיל שלושים בערך, וזה היה מהדברים הכי טובים שעשיתי בחיים. ההבדל בין השנים הראשונות לעכשיו עצום. פעם עבדתי הכול מהבטן. היום יש לי גם מילים לזה וגם כלים. אבל הבסיס לא השתנה, אהבה לילדים והאמונה שכל אחד מהם עולם שלם.</w:t>
+        <w:t>קוראים לי רבקה לוי, אני בת חמישים ושמונה, וכבר עשרים ושמונה שנה אני גננת. תראי, זה לא היה החלום הראשון שלי. שנים עבדתי כמזכירה במשרד, וזה היה בסדר, אבל זה לא בער בי. מה ששינה הכל היה כשהתנדבתי בגן של הילדים שלי, בגיל שלושים בערך. עמדתי שם באמצע החצר, עם עשרים ילדים סביבי, ופתאום הרגשתי שאני בבית. הלכתי ללמוד, סיימתי, וכבר לא הסתכלתי אחורה. היום אני גם סבתא לארבעה, וזה רק הוסיף לי סבלנות. אחרי כל השנים אני יכולה להגיד לך שזה המקצוע הכי יפה שיש, כי אני זוכה לראות בני אדם קטנים נבנים מול העיניים שלי.</w:t>
       </w:r>
     </w:p>
     <w:p>
@@ -6890,7 +6961,7 @@
           <w:szCs w:val="24"/>
           <w:rtl w:val="1"/>
         </w:rPr>
-        <w:t>לימדת בגנים נוספים לפני כן? מה היה שונה בין הגנים?</w:t>
+        <w:t>לימדת בגנים נוספים לפני כן? תארי לי מה היה שונה בין הגנים.</w:t>
       </w:r>
     </w:p>
     <w:p>
@@ -6914,7 +6985,7 @@
           <w:szCs w:val="24"/>
           <w:rtl w:val="1"/>
         </w:rPr>
-        <w:t>עבדתי בכמה גנים לאורך השנים, אבל רוב הקריירה שלי באותה שכונה. השוני הכי גדול שראיתי הוא בין תקופות, לא בין מקומות. פעם הגן היה הרבה יותר אחיד, כולם מאותו רקע פחות או יותר. היום, גם בשכונה ותיקה, יש פערים גדולים בין המשפחות, ואת חייבת להתמודד עם זה בכל יום. זה שינה לי את העבודה מהיסוד.</w:t>
+        <w:t>כן, עבדתי בשני גנים לפני הגן הנוכחי. הגן הראשון היה בשכונה חדשה, הרבה משפחות צעירות, הכל נוצץ וחדש, אבל קצת קר. ההורים היו עסוקים מאוד בעצמם. הגן השני היה קטן, בפריפריה, שם למדתי הכי הרבה, כי היו ילדים עם צרכים גדולים ומעט משאבים. שם הבנתי שאת לא צריכה ציוד יקר כדי לתת לילד ביטחון. מה שהיה שונה זה בעצם האנשים. אותם ילדים בגיל חמש הם אותם ילדים בכל מקום, אבל הבתים שמהם הם באים שונים מאוד. בכל גן למדתי משהו אחר על עצמי, וכל אחד מהם עשה אותי גננת יותר טובה. בואי נגיד שהמסע הזה בנה אותי.</w:t>
       </w:r>
     </w:p>
     <w:p>
@@ -6938,7 +7009,7 @@
           <w:szCs w:val="24"/>
           <w:rtl w:val="1"/>
         </w:rPr>
-        <w:t>איזה גיל וקבוצה את מלמדת היום?</w:t>
+        <w:t>איזה גיל וקבוצה את מלמדת היום, וכמה ילדים בגן?</w:t>
       </w:r>
     </w:p>
     <w:p>
@@ -6962,7 +7033,7 @@
           <w:szCs w:val="24"/>
           <w:rtl w:val="1"/>
         </w:rPr>
-        <w:t>אני עם גן חובה, בני חמש-שש, לקראת כיתה א'. שלושים וחמישה ילדים, וזה הרבה, אבל אחרי עשרים ושמונה שנה למדתי לנהל את זה.</w:t>
+        <w:t>היום אני מלמדת גן חובה, ילדים בני חמש עד שש, לפני בית הספר. יש לי בגן שלושים וחמישה ילדים, וזה לא מעט, אני אומרת לך. זה גיל מדהים, כי הם כבר מבינים המון, שואלים שאלות ענק על החיים, ובו זמנית הם עדיין קטנים שצריכים חיבוק. אני אוהבת את הגיל הזה בדיוק בגלל התערובת הזאת. הם על הסף, רגל אחת עדיין בעולם של המשחק, ורגל אחת כבר מציצה אל הבית ספר. התפקיד שלי זה להעביר אותם את הגשר הזה בשלום, עם ביטחון, ועם תחושה שהם מסוגלים. שלושים וחמישה זוגות עיניים, וכל אחד רוצה שאני אראה אותו. זה האתגר, וזה גם היופי.</w:t>
       </w:r>
     </w:p>
     <w:p>
@@ -6986,7 +7057,7 @@
           <w:szCs w:val="24"/>
           <w:rtl w:val="1"/>
         </w:rPr>
-        <w:t>היכן הוכשרת?</w:t>
+        <w:t>היכן הוכשרת, ומה מהרקע שלך משפיע על הדרך שבה את עובדת?</w:t>
       </w:r>
     </w:p>
     <w:p>
@@ -7010,7 +7081,7 @@
           <w:szCs w:val="24"/>
           <w:rtl w:val="1"/>
         </w:rPr>
-        <w:t>הוכשרתי במכללה לחינוך, חזרתי ללימודים בגיל שלושים אחרי שנים כמזכירה. אז אני מהדור שהגיע למקצוע מאהבה, לא מתכנון. ואולי דווקא בגלל זה זה החזיק כל כך הרבה שנים.</w:t>
+        <w:t>הוכשרתי במכללה להכשרת גננות, נכנסתי ללימודים בגיל שלושים אחרי שנים במשרד. תראי, הרקע שלי כמזכירה עוזר לי עד היום יותר משנדמה. למדתי שם סדר, ארגון, איך לנהל המון דברים במקביל בלי לאבד את הראש. גם למדתי לדבר עם אנשים מכל הסוגים, בסבלנות. אני ממגזר מסורתי, וזה נותן לי תחושה עמוקה של כבוד, של מחויבות לזולת, של להסתכל על כל ילד כמו על עולם שלם. הבגרות שהגעתי איתה למקצוע היא נכס. לא הגעתי ילדה בת עשרים, הגעתי אישה עם ניסיון חיים, וזה בא לידי ביטוי בכל החלטה. אני חושבת שהחיים שקדמו לגן הם חצי מהחוכמה שיש לי בגן.</w:t>
       </w:r>
     </w:p>
     <w:p>
@@ -7058,7 +7129,7 @@
           <w:szCs w:val="24"/>
           <w:rtl w:val="1"/>
         </w:rPr>
-        <w:t>היום אני גם חונכת גננות מתחילות מטעם הפיקוח. אני מלווה אותן בשנה-שנתיים הראשונות, וזה מחזיר לי המון, כי זה מכריח אותי לנסח למה אני עושה מה שאני עושה. דברים שהיו לי אינטואיציה, פתאום אני צריכה להסביר, וזה מחדד לי את המחשבה על צדק והוגנות.</w:t>
+        <w:t>כן, יש לי עוד תפקיד שיקר לי מאוד. אני חונכת גננות מתחילות מטעם הפיקוח. באות אלי בנות צעירות, מלאות רצון וגם קצת מבוהלות, ואני מלווה אותן בשנה הראשונה. אני זוכרת את עצמי בהתחלה, כמה הייתי אבודה, וכמה הייתי שמחה אם היה לי מישהו ותיק לצדי. אז אני נותנת להן את מה שלא היה לי. אני יושבת איתן, מקשיבה, לפעמים רק אומרת להן שזה בסדר לטעות. מעבר לזה אני מעורבת בוועדות בשכונה שקשורות לגיל הרך. אני מאמינה שאחרי כל השנים יש לי מה להעביר הלאה, וזה סוגר לי מעגל יפה.</w:t>
       </w:r>
     </w:p>
     <w:p>
@@ -7082,7 +7153,7 @@
           <w:szCs w:val="24"/>
           <w:rtl w:val="1"/>
         </w:rPr>
-        <w:t>כשאת שומעת את המונח "צדק בגן הילדים", מה המחשבה הראשונה שעולה לך?</w:t>
+        <w:t>כשאת שומעת את המונח "צדק בגן הילדים", מה המחשבה הראשונה שעולה לך? תארי לי.</w:t>
       </w:r>
     </w:p>
     <w:p>
@@ -7106,7 +7177,7 @@
           <w:szCs w:val="24"/>
           <w:rtl w:val="1"/>
         </w:rPr>
-        <w:t>מאזניים. אני רואה בראש מאזניים שכל הזמן צריך לאזן מחדש. כי בגן, מה שהיה צודק בבוקר כבר לא בהכרח צודק אחרי הצהריים. צדק בשבילי זה לא מצב שמגיעים אליו ונחים. זה תהליך, הקשבה, שימת לב, ותיקון כל הזמן. אחרי עשרים ושמונה שנה אני יודעת בוודאות שאין נוסחה. יש רק ערנות, ונכונות לתקן את עצמך כשאת טועה. ואני טועה, גם היום. והילדים? הם המורים הכי טובים שלי לצדק, הם מיד מתריעים כשמשהו לא הוגן.</w:t>
+        <w:t>המחשבה הראשונה שעולה לי היא מאזניים. באמת, אני רואה מאזניים מול העיניים. צדק בגן זה לא דבר שקבעת פעם אחת וגמרת, זה משהו שכל הזמן צריך לאזן מחדש. בבוקר המאזניים נוטים לצד אחד, כי ילד אחד בא עצוב מהבית, אז אני נותנת לו קצת יותר. אחר הצהריים הם נוטים לצד אחר. תראי, אנשים חושבים שצדק זה לתת לכולם אותו דבר. זה לא. צדק זה לראות מי עומד מולך עכשיו ומה הוא צריך עכשיו. במשך שנים חשבתי שאם אני מחלקת הכל שווה בשווה אני צודקת. היום אני יודעת שזאת טעות. יש ילד שבא עם עשר ויש ילד שבא עם שתיים, ואם אתן לשניהם עוד שתיים, הפער נשאר. אז אני כל הזמן שוקלת, מזיזה, מאזנת. הגן שייך לכולם, וזה אומר שכל אחד צריך למצוא בו את המקום שלו, לא מקום זהה, אלא מקום שמתאים לו. זה מה שאני קוראת לו צדק. עבודה שלא נגמרת אף פעם, אבל עבודה יפה.</w:t>
       </w:r>
     </w:p>
     <w:p>
@@ -7130,7 +7201,7 @@
           <w:szCs w:val="24"/>
           <w:rtl w:val="1"/>
         </w:rPr>
-        <w:t>האם נושא הצדק החברתי מהווה חלק מהתפיסה החינוכית שלך? איך זה בא לידי ביטוי?</w:t>
+        <w:t>האם נושא הצדק החברתי הוא חלק מהתפיסה החינוכית שלך? תארי לי איך זה בא לידי ביטוי ביום-יום.</w:t>
       </w:r>
     </w:p>
     <w:p>
@@ -7154,7 +7225,7 @@
           <w:szCs w:val="24"/>
           <w:rtl w:val="1"/>
         </w:rPr>
-        <w:t>הוא הלב של כל העניין. אבל אני אגיד לך את האמת, שנים לא קראתי לזה בשם הזה. פשוט עשיתי מה שהרגיש לי נכון ואנושי. איפה זה בא לידי ביטוי? בעמידה שלי מול הורים, קודם כול. אני לא מוכנה בשום אופן שילד יופלה בגלל המשפחה שלו. וזה בא לידי ביטוי בתשומת לב מיוחדת לילדים החלשים, אלה שאין מי שיילחם עליהם בבית. אני נעשית קצת הקול שלהם. ואצלי בגן, ילד שסיים ראשון לא יושב סתם, הוא הולך לעזור לחבר. דאגה לזולת נלמדת בגיל הזה, או שלא נלמדת בכלל.</w:t>
+        <w:t>בהחלט, זה הלב של איך שאני עובדת, גם אם לא קוראים לזה בשם המפוצץ הזה בתוך הגן. אני מאמינה שהגן שייך לכולם, ושכל ילד, לא משנה מאיזה בית הוא בא, ראוי לאותה תחושה של שייכות. איך זה בא לידי ביטוי ביום יום? נתחיל מהדברים הקטנים. יש לי כלל אחיד לימי הולדת, צנוע, אותו דבר לכולם, עוגה פשוטה וכובע. קבעתי את זה לפני שנים אחרי שראיתי ילדה אחת, מיכל שמה, שהתביישה כי אמא שלה לא יכלה להביא בלונים כמו של האחרים. ראיתי את הפנים שלה, ואמרתי, לא עוד. מאותו יום כולם חוגגים אותו דבר, ואף אחד לא נמדד לפי הארנק של ההורים. גם בחומרים אני שמה לב, שילד לא ירגיש פחות כי אין לו את הקלמר החדש. אני מדברת עם הילדים על לחכות בתור, על לתת מקום, על להזמין את מי שלבד. צדק חברתי אצלי זה לא שיעור, זה אוויר. זה משהו שהילדים נושמים בלי לשים לב, וכשהם יוצאים מהגן הם לוקחים אותו איתם. זה מה שחשוב לי הכי הרבה.</w:t>
       </w:r>
     </w:p>
     <w:p>
@@ -7178,7 +7249,7 @@
           <w:szCs w:val="24"/>
           <w:rtl w:val="1"/>
         </w:rPr>
-        <w:t>כיצד את מחלקת את תשומת הלב שלך בין הילדים במהלך היום?</w:t>
+        <w:t>תארי לי כיצד את מחלקת את תשומת הלב שלך בין הילדים במהלך יום שלם.</w:t>
       </w:r>
     </w:p>
     <w:p>
@@ -7202,7 +7273,7 @@
           <w:szCs w:val="24"/>
           <w:rtl w:val="1"/>
         </w:rPr>
-        <w:t>בכנות? זה הדבר הכי קשה בעבודה. אני אישה אחת מול קבוצה גדולה. יש ימים שילד אחד במשבר לוקח ממני שעה שלמה, ואז אחרים מקבלים פחות, וזה כואב לי. מה שאני כן עושה, בסוף כל יום, אחרי שכולם הלכו, זה לעצור ולעשות חשבון נפש. את מי לא ראיתי היום באמת? מי לא קיבל ממני חיוך אישי? ולמחרת בבוקר אני הולכת דווקא אליו. אחרי כל השנים למדתי שהילדים השקטים הם הכי קל לפספס. הם לא דורשים, לא מפריעים, ודווקא אותם צריך לזכור באופן פעיל.</w:t>
+        <w:t>אה, זאת שאלת מיליון הדולר. שלושים וחמישה ילדים, וכל אחד רוצה אותי כולה. אני עובדת עם עיקרון שאני קוראת לו לתת יותר בלי לגזול. מה זה אומר? יש רגעים ביום שהם רגעים גדולים, קבוצתיים, סיפור, ארוחה, חצר. שם אני של כולם, ואני נזהרת לא להיבלע על ידי ילד אחד. אבל יש גם רגעים קטנים, שוליים, בזמן שהילדים משחקים חופשי, שם אני יכולה לשבת שתי דקות עם ילד שצריך אותי בלי שאף אחד אחר משלם על זה. ככה אני נותנת יותר בלי לגזול מהאחרים. במהלך הבוקר אני עושה לעצמי סוג של סבב בראש, מי כבר קיבל ממני מבט היום, מי עדיין לא. יש ילדים שקטים, כמו נועם שהיה לי לפני שנתיים, שלא מבקשים כלום, ודווקא אליהם אני צריכה ללכת ביוזמה, כי הם נבלעים. הרעש תמיד מקבל תשומת לב, השקט צריך שילכו לחפש אותו. אז אני מחלקת את עצמי לא לפי מי צועק הכי חזק, אלא לפי מי צריך הכי הרבה. זה עבודה מודעת, לא במקרה. אחרי כל השנים זה כמעט נהיה אצלי חוש.</w:t>
       </w:r>
     </w:p>
     <w:p>
@@ -7226,7 +7297,7 @@
           <w:szCs w:val="24"/>
           <w:rtl w:val="1"/>
         </w:rPr>
-        <w:t>כשיש ילד שזקוק ליותר תשומת לב, רגשית, חברתית או לימודית, איך את מאזנת את זה מול שאר הילדים?</w:t>
+        <w:t>תארי לי מצב שבו ילד זקוק ליותר תשומת לב, רגשית, חברתית או לימודית. איך את מאזנת את זה מול שאר הילדים?</w:t>
       </w:r>
     </w:p>
     <w:p>
@@ -7250,7 +7321,7 @@
           <w:szCs w:val="24"/>
           <w:rtl w:val="1"/>
         </w:rPr>
-        <w:t>יש לי שיטה שאני קוראת לה לתת יותר בלי לגזול. אני מחפשת לתת לילד שצריך דווקא בזמנים שזה לא בא על חשבון האחרים, בקבלת בוקר, בחצר, ברגע הפרידה. ככה הוא מקבל את התוספת, והקבוצה לא מרגישה מקופחת. ואני מאוד מאמינה בעזרת חברים. יש לי בגן כמה ילדים שאני קוראת להם החברים הגדולים, ואני מפקידה בידיהם ילד שמתקשה. וזה עושה פלא לשניהם. למתקשה כי הוא מקבל תמיכה, ולעוזר כי הוא מרגיש חשוב. ובלי הסייעת שלי כלום מזה לא היה קורה.</w:t>
+        <w:t>בואי אספר לך על ילד אחד, קרן שמה, שהגיעה אלי אחרי שההורים התגרשו. היא הייתה זקוקה לים של תשומת לב רגשית, בכתה על כל דבר קטן, נדבקה אלי. עכשיו, אם הייתי מקדישה לה את כל היום, שאר הילדים היו משלמים על זה, וזה לא הוגן. אז חזרתי לעיקרון שלי, לתת יותר בלי לגזול. מצאתי לה זמנים שהם שלה, בהגעה בבוקר קיבלתי אותה בחיבוק ארוך, בזמן המנוחה ישבתי לידה דקה. אלה זמנים שממילא לא באים על חשבון אף אחד. חוץ מזה, השתמשתי במה שאני קוראת לו החברים הגדולים. הפקדתי אותה בידיים של יעל, ילדה חמה ובוגרת, שלקחה אותה תחת חסותה במשחק. ככה קרן קיבלה עוד עוגן, ולא רק ממני. תראי, ילד שצריך יותר, זה לגיטימי לתת לו יותר, כל עוד את עושה את זה בחוכמה ולא גוזלת מהשאר. המאזניים נוטים לרגע אליה, ואני מאזנת אותם במקום אחר. הסוד הוא שהיתר לא ירגישו מקופחים, וזה אפשרי אם את חכמה עם הזמנים. אחרי חודשיים קרן כבר עמדה על הרגליים, וזה היה שווה כל דקה.</w:t>
       </w:r>
     </w:p>
     <w:p>
@@ -7274,7 +7345,7 @@
           <w:szCs w:val="24"/>
           <w:rtl w:val="1"/>
         </w:rPr>
-        <w:t>כיצד מתבצעת חלוקת החומרים והמשאבים הפיזיים בגן, הצעצועים והציוד? מה הקו המנחה שלך?</w:t>
+        <w:t>תארי לי כיצד מתבצעת חלוקת החומרים והמשאבים הפיזיים בגן (צעצועים, ציוד, אופניים). מה הקו המנחה שלך?</w:t>
       </w:r>
     </w:p>
     <w:p>
@@ -7298,7 +7369,7 @@
           <w:szCs w:val="24"/>
           <w:rtl w:val="1"/>
         </w:rPr>
-        <w:t>כלל ברזל אצלי, הגן שייך לכולם. אין הצעצוע של דני גם אם דני הביא אותו הבוקר מהבית. נכנס בשער, של כולם. זה מונע המון עוול, אחרת נוצרים מעמדות, ילדים שמביאים דברים שווים וילדים שאין להם. לגבי דברים שאין מהם מספיק, האופניים, הקוביות הגדולות, יש תור מסודר עם שמות, והילדים עצמם עוקבים אחריו. גיליתי לאורך השנים משהו מעניין, הצפיות של המערכת היא מה שיוצר את ההוגנות. ילד מוכן לחכות בסבלנות מדהימה כשהוא יודע בוודאות שגם הוא יקבל.</w:t>
+        <w:t>בחומרים אני עובדת עם דבר אחד שהוא מקור ההוגנות אצלי, תור עם שמות. יש לנו בגן אופניים, ולפני שנים זה היה שדה קרב. מי שחזק תפס, מי שביישן נשאר בצד כל היום. אז הכנסתי לוח, כתבתי עליו שמות, וכל ילד יודע מתי מגיע התור שלו. תראי, גיליתי משהו חשוב. ילד לא כועס על ההמתנה. ילד כועס כשהוא לא בטוח שיגיע אליו. ברגע שהוא רואה את השם שלו על הלוח, הוא רגוע, כי הוא יודע שהעולם הוגן והתור שלו יבוא. השקיפות הזאת עשתה פלאים. אין יותר מריבות על האופניים, כי אין אי ודאות. אותו דבר עם צעצועים מבוקשים, עם משחקי הרכבה. הקו המנחה שלי הוא שהחלוקה תהיה גלויה, ברורה, ושכל ילד יוכל לסמוך עליה. אני לא מחביאה כלום ולא מחליטה בשרירותיות. הכל על השולחן, מול העיניים של כולם. כשילד יודע שהמערכת הוגנת, הוא לומד לחכות בסבלנות, וזה שיעור לחיים שלמים, לא רק לגן. הגן שייך לכולם, וגם האופניים שייכים לכולם, בתור.</w:t>
       </w:r>
     </w:p>
     <w:p>
@@ -7322,7 +7393,7 @@
           <w:szCs w:val="24"/>
           <w:rtl w:val="1"/>
         </w:rPr>
-        <w:t>האם לדעתך חלוקה "שווה" וחלוקה "הוגנת" הן אותו דבר? תני דוגמה מהגן.</w:t>
+        <w:t>האם לדעתך חלוקה "שווה" וחלוקה "הוגנת" הן אותו דבר? תני דוגמה מהגן שממחישה את ההבדל.</w:t>
       </w:r>
     </w:p>
     <w:p>
@@ -7346,7 +7417,7 @@
           <w:szCs w:val="24"/>
           <w:rtl w:val="1"/>
         </w:rPr>
-        <w:t>שני עולמות שונים לגמרי. שוויון זו נקודת פתיחה, הוגנות זה היעד. תשמעי דוגמה שקרתה השבוע. היה לנו משחק קלפים, כל ילד קיבל שלושה קלפים. זה שוויון מושלם. אבל היה בקבוצה ילד עם קושי מוטורי, שלא הצליח בכלל להחזיק את הקלפים ביד. אז נתתי לו מעמד קטן שמחזיק את הקלפים בשבילו. אם הייתי מתעקשת על שוויון, לא נותנת לו את המעמד כי לאחרים אין, זה היה דווקא העוול הכי גדול, הוא פשוט לא היה יכול לשחק. הוגן זה לא לתת לכולם אותו דבר, הוגן זה לדאוג שכל אחד יוכל.</w:t>
+        <w:t>לא, ממש לא אותו דבר, ואני נותנת לך דוגמה שממחישה את זה יפה. שווה זה לתת לכולם בדיוק אותו דבר. הוגן זה לתת לכל אחד את מה שהוא צריך. הנה סיפור. היה לי ילד, איתי, עם קשיים בשרירים הקטנים, קשה לו להחזיק מספריים. אם אני מחלקת לכולם את אותם מספריים בדיוק, זה שווה, נכון? אבל זה לא הוגן, כי איתי לא יצליח בכלל וירגיש כישלון. אז לו הבאתי מספריים מיוחדים, כאלה שמתאימים ליד שלו. ילד אחר שאל, למה לאיתי יש מספריים אחרים. אמרתי לו, כי כל אחד מקבל את מה שעוזר לו להצליח, ולך היד עובדת מצוין עם הרגילים. הילדים מבינים את זה, את יודעת, יותר טוב מהמבוגרים לפעמים. שוויון עיוור זה לפעמים אי צדק. אם לילד יש רגל שבורה ואני מכריחה אותו לרוץ עם כולם בשם השוויון, פגעתי בו. אז אני תמיד שואלת את עצמי, לא מה שווה, אלא מה יביא כל ילד לאותו מקום של הצלחה. זה ההבדל, וזה כל ההבדל שבעולם.</w:t>
       </w:r>
     </w:p>
     <w:p>
@@ -7370,7 +7441,7 @@
           <w:szCs w:val="24"/>
           <w:rtl w:val="1"/>
         </w:rPr>
-        <w:t>כיצד את מתמודדת עם מצב שילד מסוים "לוקח" יותר מקום במרחב הקבוצתי?</w:t>
+        <w:t>תארי לי מצב שבו ילד מסוים "לוקח" יותר מקום במרחב הקבוצתי, וכיצד את מתמודדת עם זה.</w:t>
       </w:r>
     </w:p>
     <w:p>
@@ -7394,7 +7465,7 @@
           <w:szCs w:val="24"/>
           <w:rtl w:val="1"/>
         </w:rPr>
-        <w:t>אני לא ממהרת לכבות אותו. וזה משהו שלמדתי עם הזמן. בהתחלה, כשהייתי צעירה במקצוע, נטיתי לראות בילד דומיננטי בעיה שצריך להשתיק. היום אני יודעת שילד כזה הוא לא בעיה, הוא אוצר, אם יודעים לעבוד איתו נכון. אני נותנת לו ביטוי, שיהיה המנחה של המעגל, ובאותו זמן מלמדת אותו גם להיות קשוב ולתת מקום. ובמקביל אני עובדת קשה על השקטים, מחזקת אותם. כי אני רוצה לאזן את המרחב, אבל לא על ידי הקטנה של מישהו, על ידי הגדלה של אחרים. אין ילד שצריך להיות פחות, יש רק ילדים שצריכים להיות יותר ממה שהם מעזים.</w:t>
+        <w:t>יש לי כרגע ילד כזה, דניאל, דומיננטי, קול גדול, תופס כל מרחב, מחליט על המשחקים, מנהל את החבורה. תראי, הרבה גננות היו רוצות מיד לכבות אותו, להשתיק, להוריד הילוך. אני לא ממהרת. ילד דומיננטי הוא אוצר אם עובדים איתו נכון. יש בו מנהיגות, יש בו אנרגיה, יש בו כריזמה, ואת זה אי אפשר ללמד. הבעיה היא לא הכוח שלו, הבעיה היא לאן הוא מכוון אותו. אז במקום להילחם בו, אני מגייסת אותו. ביקשתי מדניאל שיהיה אחראי לארגן את פינת הבנייה, שיעזור לילדים חדשים להשתלב. פתאום הכוח שלו עובד לטובת הקבוצה ולא נגדה. במקביל, אני כן שמה גבולות, אני מוודאת שהוא לא דורס את השקטים, ואני נותנת לילדים אחרים הזדמנות להוביל, בתור, עם שמות. אני אומרת, היום דניאל הוביל, מחר תור של שירה. ככה המרחב לא נשאר של אחד. הדומיננטיות שלו לא מדכאת, היא מרוסנת ומופנית למקום טוב. אחרי שנה כאלה ילדים יוצאים מנהיגים אמיתיים, כאלה שיודעים גם להקשיב. חבל לשבור אותם, צריך רק לכוון.</w:t>
       </w:r>
     </w:p>
     <w:p>
@@ -7418,7 +7489,7 @@
           <w:szCs w:val="24"/>
           <w:rtl w:val="1"/>
         </w:rPr>
-        <w:t>כיצד את מתמודדת עם מצבים של הדרה חברתית, ילד שהקבוצה לא מקבלת ולא רוצים לשחק איתו?</w:t>
+        <w:t>תארי לי מצב של הדרה חברתית בגן, ילד שהקבוצה לא מקבלת ולא רוצים לשחק איתו. כיצד את פועלת?</w:t>
       </w:r>
     </w:p>
     <w:p>
@@ -7442,7 +7513,7 @@
           <w:szCs w:val="24"/>
           <w:rtl w:val="1"/>
         </w:rPr>
-        <w:t>אוי, זה נוגע לי ללב, כי ראיתי לאורך השנים כמה כאב זה עושה. אני מתייחסת להדרה כאל אחד הדברים הכי חמורים בגן. הדבר הראשון, לא כופים. ניסיון להכריח ילדים לשחק עם מי שהם דוחים רק מעמיק את הדחייה. אני עובדת בשקט ובעקביות. מזהה מה גורם לדחייה, יוצרת מצבים מתוכננים של הצלחה, מרכיבה קבוצות משחק קטנות שבהן הוא זורח, מפגישה אותו עם ילד אחד רך ומכיל שיהיה גשר לשאר. ואני משתמשת בכוח שלי כגננת, משבחת אותו בפומבי. הילדים מושפעים מאוד מהיחס שלי, אם הם רואים שאני מעריכה אותו, זה מדביק.</w:t>
+        <w:t>הדרה חברתית זה הדבר שהכי שובר לי את הלב, ואני מטפלת בו בלי פשרות. היה לי מקרה של ילד, יוסי, שהילדים פשוט לא רצו לשחק איתו. הוא היה קצת מסורבל, קצת מוזר בעיניהם, ובכל פעם שהוא ניגש לקבוצה, אמרו לו לך. תראי, אני לא מכריחה ילד לאהוב ילד אחר, זה לא עובד ולא אמיתי. מה שאני כן עושה זה לבנות ליוסי גשרים. קודם כל, מצאתי לו נקודת חוזק, גיליתי שהוא מדהים בפאזלים. אז יצרתי מצב שבו ילד אחר נזקק לעזרה בפאזל, ושלחתי אליו את יוסי כמומחה. פתאום הוא לא המסכן, הוא זה שיודע. השתמשתי גם בחברים הגדולים, ביקשתי מרונית, ילדה מקובלת וחמה, שתיקח אותו לקבוצה שלה למשחק אחד. כשילד מקובל מזמין אותך, המעמד שלך עולה. עבדתי גם עם כל הקבוצה, ישבנו במעגל ודיברנו על איך זה מרגיש להיות לבד. לאט לאט, יוסי נכנס. זה לוקח זמן, זה לא קסם, אבל אני לא מוותרת על אף ילד. הגן שייך לכולם, וזה אומר שאף אחד לא נשאר בחוץ. זה קו אדום אצלי.</w:t>
       </w:r>
     </w:p>
     <w:p>
@@ -7466,7 +7537,7 @@
           <w:szCs w:val="24"/>
           <w:rtl w:val="1"/>
         </w:rPr>
-        <w:t>האם בגן שלך יש ילדים מרקעים חברתיים או כלכליים שונים? כיצד זה בא לידי ביטוי ביום-יום?</w:t>
+        <w:t>האם בגן שלך יש ילדים מרקעים חברתיים או כלכליים שונים? תארי לי כיצד זה בא לידי ביטוי בפרקטיקה היומיומית.</w:t>
       </w:r>
     </w:p>
     <w:p>
@@ -7490,7 +7561,7 @@
           <w:szCs w:val="24"/>
           <w:rtl w:val="1"/>
         </w:rPr>
-        <w:t>בטח. ובשכונה הוותיקה שאני עובדת בה הפערים דווקא גדלו עם השנים. יש משפחות מבוססות ויש כאלה שמאוד מתקשות. ואני אגיד לך איפה זה הכי בולט, בימי הולדת. זה מוקש. פעם משפחה אחת הביאה מסיבה מפוארת עם ליצן ומתנות לכל הילדים, וזה שם את המשפחות החלשות במצב בלתי אפשרי. אז לפני שנים קבעתי כלל אחיד לכולם. ימי הולדת חוגגים בגן בפורמט צנוע וזהה, עוגה אחת, כתר, שיר. זה שחרר המון לחץ, מנע בושה, והחזיר את יום ההולדת להיות על הילד ולא על ההפקה. זה מהדברים שאני הכי גאה בהם.</w:t>
+        <w:t>בוודאי שיש, הגן שלי בשכונה ותיקה, ובאים אליו ילדים מכל מיני בתים. יש משפחות מבוססות ויש כאלה שקשה להם להגיע לסוף החודש. איך זה בא לידי ביטוי? בהמון דברים קטנים שאם לא שמים לב, פוצעים. הזכרתי לך את ימי ההולדת, בגלל זה קבעתי כלל אחיד וצנוע, שאף ילד לא יתבייש כי אין לו כסף לחגיגה גדולה. גם בטיולים, אני דואגת שהעלות תהיה מינימלית, ואם צריך אני מוצאת בשקט דרך לעזור למשפחה בלי שאיש ידע. בביגוד, אני לא מעירה על מותגים, ואם ילד בא בלי מעיל בחורף, יש לי מגירה עם בגדים חמים, בלי לעשות מזה עניין. הקו שלי הוא שבתוך הגן כולם שווים, לא משנה מה יש בבית. הבית של הילד נשאר בבית, בגן הוא רק ילד. אני נזהרת מאוד לא ליצור מצב שילד ירגיש נחות בגלל הארנק של ההורים שלו. זה עדין מאוד, וצריך הרבה עדינות, אבל זה אולי הדבר הכי חשוב. כי ילד שמתבייש בגיל חמש, נושא את זה שנים.</w:t>
       </w:r>
     </w:p>
     <w:p>
@@ -7514,7 +7585,7 @@
           <w:szCs w:val="24"/>
           <w:rtl w:val="1"/>
         </w:rPr>
-        <w:t>כיצד את מתמודדת עם הפערים הניכרים בין הילדים, בין השאר בתחום הרגשי, החברתי או הלימודי?</w:t>
+        <w:t>תארי לי כיצד את מתמודדת עם הפערים הניכרים בין הילדים, בין השאר בתחום הרגשי, החברתי או הלימודי.</w:t>
       </w:r>
     </w:p>
     <w:p>
@@ -7538,7 +7609,7 @@
           <w:szCs w:val="24"/>
           <w:rtl w:val="1"/>
         </w:rPr>
-        <w:t>בסבלנות, ובאמונה שכל ילד יגיע לאן שהוא צריך, בזמן שלו. אחרי עשרים ושמונה שנה ראיתי מספיק ילדים שפיגרו בגן והפכו לאנשים מצליחים ומאושרים. זה נותן לך פרספקטיבה. אני לא לוחצת, ולא משווה בין ילדים בפומבי, אף פעם. אני עובדת עם כל ילד מהמקום שבו הוא נמצא. כשיש פער גדול ומדאיג, אני לא מחכה ולא מתביישת לגייס את המערכת, מפנה לאבחון אם צריך, יושבת עם ההורים ברצינות. אבל ביום יום, המסר שלי לכל ילד הוא אחד, אני מאמינה בך, אתה במקום הנכון בשבילך, ואני איתך.</w:t>
+        <w:t>פערים יש תמיד, בין אם רגשיים, חברתיים או לימודיים, וזאת המהות של העבודה. יש לי ילד שכבר קורא, ולידו ילד שעוד לא מזהה את השם שלו. יש ילד רגוע ולידו ילד שמתפרץ על כל דבר. איך אני מתמודדת? חוזרת שוב למאזניים, ולעיקרון שכל אחד מקבל את מה שהוא צריך. אני לא מיישרת את כולם לאותה שורה. במקום זה, אני עובדת בקבוצות קטנות, לפי רמות, בשקט, בלי להדביק תוויות. הילד שכבר קורא מקבל אתגר שמתאים לו, והילד שרק מתחיל מקבל משהו שהוא יכול להצליח בו, כי הצלחה מולידה הצלחה. אני משתמשת גם בכוח של הילדים עצמם, החברים הגדולים, ילד חזק בתחום עוזר לחלש, וזה מרים את שניהם. בתחום הרגשי, אני נותנת לכל ילד כלים לפי מה שהוא מסוגל לקלוט. תראי, הפער עצמו הוא לא הבעיה, הבעיה היא אם ילד מרגיש נחות בגללו. אז אני עובדת קשה שכל ילד ירגיש שהוא במרוץ מול עצמו, לא מול השני. כל אחד מתקדם מהמקום שלו, ואני מודדת התקדמות, לא מיקום. ככה הפער לא הופך לפצע.</w:t>
       </w:r>
     </w:p>
     <w:p>
@@ -7562,7 +7633,7 @@
           <w:szCs w:val="24"/>
           <w:rtl w:val="1"/>
         </w:rPr>
-        <w:t>איך נראה יום עבודה טיפוסי שלך בגן, ומהם הדברים שאת מקפידה עליהם מבחינת הוגנות?</w:t>
+        <w:t>תארי לי יום עבודה טיפוסי שלך בגן, ומהם הדברים שאת מקפידה עליהם מבחינת הוגנות.</w:t>
       </w:r>
     </w:p>
     <w:p>
@@ -7586,7 +7657,7 @@
           <w:szCs w:val="24"/>
           <w:rtl w:val="1"/>
         </w:rPr>
-        <w:t>יום אצלי מאוד מסודר, ואני מאמינה בסדר, כי סדר זה ביטחון לילד. קבלה, מפגש, פעילות, חצר, ארוחה. מה שאני הכי מקפידה עליו זה השקיפות. שכל ילד יראה את לוח התורים, שידע מתי מגיע לו. אחרי עשרים ושמונה שנה אני יודעת שילד לא כועס על ההמתנה, הוא כועס כשהוא לא בטוח שיגיע אליו. אז אני דואגת שהמערכת תהיה גלויה וברורה, וזה מוריד חצי מהמריבות בגן. השקיפות היא בעצמה סוג של צדק.</w:t>
+        <w:t>יום טיפוסי מתחיל בקבלת פנים, אני עומדת בדלת ואומרת בוקר טוב לכל ילד בשמו, מסתכלת לו בעיניים, כי מהמבט הזה אני כבר יודעת מי בא שמח ומי בא כבד. אחר כך מפגש בוקר במעגל, ואני מקפידה שכל ילד יקבל הזדמנות לדבר, לא רק הרהוטים. יש לי מקל דיבור, ומי שמחזיק אותו מדבר, וזה שומר על הוגנות, כי הרעשנים לא בולעים את השקטים. אחר כך פעילות, ואז חצר, ושם התור עם השמות על האופניים שומר על השלום. בארוחה אני מקפידה שהחלוקה שווה, שאף אחד לא מקבל פחות, ושילד שאין לו אוכל מהבית מקבל בשקט ובכבוד. הדברים שאני הכי מקפידה עליהם מבחינת הוגנות הם השקיפות, שכל ילד יידע מה הולך לקרות ומתי מגיע תורו, והנראות, שכל ילד ירגיש שראיתי אותו לפחות פעם אחת ביום באמת. לפני הליכה הביתה יש לנו סיכום, ואני משתדלת לשלוח כל ילד עם משהו טוב. תראי, השגרה עצמה היא כלי של צדק, כי כשהמסגרת ברורה וצפויה, הילד מרגיש בטוח, ומתוך ביטחון צומחת תחושת ההוגנות. יום שקט הוא יום הוגן.</w:t>
       </w:r>
     </w:p>
     <w:p>
@@ -7610,7 +7681,7 @@
           <w:szCs w:val="24"/>
           <w:rtl w:val="1"/>
         </w:rPr>
-        <w:t>האם חשוב בעינייך לזהות, לדבר ולפעול נגד מקרים לא צודקים בגן? כיצד ובאילו מקרים?</w:t>
+        <w:t>האם חשוב בעינייך לזהות, לדבר ולפעול נגד מקרים לא צודקים בגן? תארי לי כיצד ובאילו מקרים.</w:t>
       </w:r>
     </w:p>
     <w:p>
@@ -7634,7 +7705,7 @@
           <w:szCs w:val="24"/>
           <w:rtl w:val="1"/>
         </w:rPr>
-        <w:t>בטח שחשוב. חלק מהתפקיד שלי הוא ללמד את הילדים שיש דברים שלא עוברים. אם ילד לועג לילד אחר, אם מדירים מישהו, אני עוצרת הכול ומדברת. אני משתמשת בזה כשיעור לכל הקבוצה, לא כדי לבייש את מי שטעה אלא כדי ללמד את כולם. אחרי כל השנים למדתי שהילדים לומדים מוסר לא ממה שאני אומרת אלא מאיך שאני מגיבה כשקורה עוול. אז אני מקפידה להגיב, תמיד, גם כשאני עייפה מאוד.</w:t>
+        <w:t>כן, זה חשוב לי מאוד, ואני לא מפחדת לעצור ולהתערב כשמשהו לא צודק. תראי, ילדים בגיל הזה בונים את תפיסת העולם שלהם, ואם הם רואים שעוול עובר בשקט, הם לומדים שזה בסדר. אז אני לא נותנת לזה לעבור. אם ילד לוקח בכוח מילד אחר, אנחנו עוצרים ומדברים. אם ילד צוחק על ילד אחר, אנחנו יושבים ומבררים איך זה מרגיש בצד השני. אני לא עושה מזה משפט פומבי ולא מביישת, כי בושה לא מלמדת כלום, היא רק פוצעת. אני עובדת בשקט, לפעמים בצד, בגובה העיניים. המקרים שהכי חשוב לי לפעול בהם הם מקרים של הדרה, של השפלה, ושל ניצול של החלש. שם אני עומדת כמו סלע. אני גם מלמדת את הילדים לזהות בעצמם, שואלת, אתה חושב שזה הוגן. את מופתעת כמה הם יודעים לענות. פעם ילד אמר לחבר, לא הוגן שאתה תמיד ראשון, וזה היה ניצחון בשבילי, כי הוא הפנים את זה. אני מאמינה שאם ילד יוצא מהגן עם רגישות לצדק, נתתי לו מתנה לכל החיים. זה חלק מהתפקיד, לא פחות מאותיות ומספרים.</w:t>
       </w:r>
     </w:p>
     <w:p>
@@ -7658,7 +7729,7 @@
           <w:szCs w:val="24"/>
           <w:rtl w:val="1"/>
         </w:rPr>
-        <w:t>האם קרה שקיבלת החלטה שבדיעבד הרגישה לך לא הוגנת? תארי, ואיך הרגשת עם זה?</w:t>
+        <w:t>תארי לי מקרה שבו קיבלת החלטה שבדיעבד הרגישה לך לא הוגנת. מה קרה, ואיך הרגשת?</w:t>
       </w:r>
     </w:p>
     <w:p>
@@ -7682,7 +7753,7 @@
           <w:szCs w:val="24"/>
           <w:rtl w:val="1"/>
         </w:rPr>
-        <w:t>יש מקרה שאני זוכרת שנים. היה לי ילד קשה, מפריע, מרביץ, ואני התייחסתי אליו בעיקר כאל צרה. הענשתי הרבה. יום אחד אמו סיפרה לי שיש אצלם בבית אלימות קשה. ואז הבנתי שהענשתי ילד שהוא בעצם קורבן, שמשחזר בגן את מה שהוא חי בבית. הרגשתי איום ונורא. שיניתי כיוון לגמרי, נתתי לו קרבה ופינה בטוחה במקום עונש, והוא פרח תוך חודשים. מאז אני תמיד שואלת קודם מה עבר על הילד, לא מה לא בסדר איתו. זה הפך אותי לגננת אחרת, וגם לאדם אחר.</w:t>
+        <w:t>כן, ואני אספר לך על מקרה שרודף אותי עד היום ושינה אותי מהיסוד. היה לי ילד קשה, נקרא לו עומר, שהיה תוקפני, מרביץ, הופך שולחנות. במשך תקופה הרגשתי כלפיו כעס, וכל פעם שהיה מתפרץ, הייתי מענישה, מוציאה מהמשחק, מדברת בקול קשה. חשבתי שאני נוהגת בצדק, שומרת על שאר הילדים. יום אחד התגלה שהילד הזה הוא קורבן אלימות בבית, שמרביצים לו. ואז נפל לי האסימון, והרגשתי בושה נוראית. הענשתי ילד שבור על כך שהוא שבור. בדיעבד ההחלטות שלי כלפיו הרגישו לי לגמרי לא הוגנות. הרגשתי שבמקום להיות המקום הבטוח שלו, הוספתי לו עוד כאב. מאותו יום החלפתי את השאלה שאני שואלת. במקום לשאול מה לא בסדר עם הילד הזה, התחלתי לשאול מה עבר על הילד הזה. זה שינוי קטן במילים ומהפכה שלמה בלב. כי ילד שמתנהג רע כמעט תמיד מספר לך משהו, רק שאין לו מילים. עכשיו, כשילד קשה מגיע אלי, אני לא רואה אויב, אני רואה חידה שצריך לפענח ברחמים. עומר לימד אותי את השיעור הכי חשוב במקצוע, ואני אסירת תודה לו על זה, למרות הכאב.</w:t>
       </w:r>
     </w:p>
     <w:p>
@@ -7706,7 +7777,7 @@
           <w:szCs w:val="24"/>
           <w:rtl w:val="1"/>
         </w:rPr>
-        <w:t>האם לדעתך ילדים בגיל הגן מבינים מהי הוגנות? מאיזה גיל, ואיך זה בא לידי ביטוי?</w:t>
+        <w:t>האם לדעתך ילדים בגיל הגן מבינים מהי הוגנות? מאיזה גיל, ותארי לי כיצד זה בא לידי ביטוי אצלם.</w:t>
       </w:r>
     </w:p>
     <w:p>
@@ -7730,7 +7801,7 @@
           <w:szCs w:val="24"/>
           <w:rtl w:val="1"/>
         </w:rPr>
-        <w:t>מבינים מגיל צעיר מאוד, אבל בשלבים. הקטנים מבינים הוגן כשוויון, שלכולם יהיה אותו דבר בדיוק. רק לקראת חמש הם מתחילים לתפוס שלפעמים הוגן זה לתת יותר למי שצריך יותר. אני רואה את זה קורה מול העיניים שלי, ואני עוזרת לזה עם דוגמאות מהחיים של הגן. וכשילד בן חמש אומר לחבר, זה בסדר שקיבלת עזרה כי היה לך קשה, אני יודעת שהוא כבר שם. שזה נחרת בו.</w:t>
+        <w:t>ודאי שהם מבינים, ומגיל צעיר יותר ממה שחושבים. כבר בני שלוש מרגישים הוגנות בבטן, גם אם אין להם מילה לזה. אם אחד מקבל שתי סוכריות והשני אחת, תשמעי מיד לא הוגן, גם מפעוט. בגיל הזה זה עדיין הוגנות של שוויון גס, ראש בראש, כמה יש לי מול כמה יש לך. בגיל ארבע חמש זה מתעדן, והם כבר מתחילים להבין שיש הבדל בין שווה להוגן. אני זוכרת ילדה, טל, בת חמש, שראתה שאני נותנת לילד עם קושי עזרה נוספת, ואמרה לחברה, זה בסדר שהיא עוזרת לו יותר כי לו קשה. תשמעי, זה תחכום רגשי אמיתי. הם מבינים תור, מבינים חכה בסבלנות, מבינים שמי שהגיע ראשון מגיע לו ראשון. הם גם ערניים לצביעות, אם את אומרת דבר אחד ועושה אחר, הם קולטים מיד. בגיל הזה הם ספוגים חוש צדק טבעי, והתפקיד שלי רק לחדד אותו, לתת לו מילים, ולהראות להם שהוגנות היא לא תמיד לחלק שווה. הם קרקע פורייה, ומה שנוטעים בהם עכשיו, גדל איתם.</w:t>
       </w:r>
     </w:p>
     <w:p>
@@ -7754,7 +7825,7 @@
           <w:szCs w:val="24"/>
           <w:rtl w:val="1"/>
         </w:rPr>
-        <w:t>כיצד את מתמודדת עם דרישה של הורה שהילד שלו יקבל יחס מועדף?</w:t>
+        <w:t>תארי לי מצב שבו הורה דרש שהילד שלו יקבל יחס מועדף. כיצד התמודדת?</w:t>
       </w:r>
     </w:p>
     <w:p>
@@ -7778,7 +7849,7 @@
           <w:szCs w:val="24"/>
           <w:rtl w:val="1"/>
         </w:rPr>
-        <w:t>אחרי עשרים ושמונה שנה ראיתי הכול. מגיע הורה שרוצה שהילד שלו יקבל יותר, יישב במקום מסוים, יוביל תמיד. אני מקשיבה בכבוד, ואז אומרת לא, בעדינות אבל בלי להתקפל. אני מסבירה שאני שומרת על ההוגנות כלפי כל הילדים, וזה כולל את הילד שלו, כי גם הוא ירצה שיהיה הוגן ביום שהוא יזדקק לזה. ברוב המקרים ההורה נרגע כשהוא רואה שהילד שלו מאושר ושייך. בסוף זה מה שבאמת חשוב לו, לא המקום בשורה.</w:t>
+        <w:t>אה, זה קורה, ולא מעט. היה לי הורה, אבא של רועי, שבא אלי ואמר, אני רוצה שהבן שלי ישב תמיד ליד הגננת, שהוא תמיד יהיה ראשון בתור, שיקבל את התפקידים הכי טובים. הבנתי מאיפה זה בא, הוא אוהב את הילד שלו ורוצה בשבילו את הטוב ביותר, זה טבעי. אבל אני לא יכולה להסכים לזה, כי ברגע שילד אחד ראשון תמיד, ילד אחר אחרון תמיד, וזה לא הוגן. אז ישבתי איתו בנחת, ואמרתי לו, תראה, אני מבינה אותך כהורה, וגם אני סבתא. אבל אם רועי יקבל יחס מיוחד, הילדים ירגישו את זה מיד, והם דווקא יתרחקו ממנו. הסברתי לו שבגן שלי יש תור עם שמות, וכולם עוברים בו, וזה בדיוק מה ששומר על רועי מוגן, כי גם התור שלו מובטח. אמרתי לו, אני אוהבת את רועי ואדאג לו, אבל אדאג לו בתוך המסגרת ההוגנת, כי זה מה שבאמת טוב לו לטווח ארוך. הוא קצת התאכזב בהתחלה, אבל אחרי כמה חודשים בא ואמר תודה, כי רועי מצא חברים דווקא ככה. הגן שייך לכולם, וזאת השורה שאני לא חוצה.</w:t>
       </w:r>
     </w:p>
     <w:p>
@@ -7802,7 +7873,7 @@
           <w:szCs w:val="24"/>
           <w:rtl w:val="1"/>
         </w:rPr>
-        <w:t>האם את משתפת את ההורים בנושאים של צדק, שוויון והוגנות? האם נוצרים מתחים, וכיצד את מתמודדת איתם?</w:t>
+        <w:t>האם את משתפת את ההורים בנושאים של צדק, שוויון והוגנות? תארי לי אם נוצרים מתחים וכיצד את מתמודדת.</w:t>
       </w:r>
     </w:p>
     <w:p>
@@ -7826,7 +7897,7 @@
           <w:szCs w:val="24"/>
           <w:rtl w:val="1"/>
         </w:rPr>
-        <w:t>ההורים חלק בלתי נפרד מהתמונה, ואחרי כל השנים למדתי לעבוד איתם, גם כשזה מאתגר. אני משתפת אותם כבר באסֵפה בתחילת השנה, פורשת בפירוש את הגישה שלי, שאצלנו לא הכול שווה בשווה אלא הוגן לפי צורך. מספרת להם על כלל יום ההולדת האחיד ומסבירה למה. רוב ההורים מעריכים את זה מאוד. מתחים נוצרים, לא אכחיש. הכי שכיח, הורה שמרגיש שהילד שלו לא מקבל מספיק. אז אני נפגשת איתו אישית, קודם מקשיבה, ואז מסבירה בלי לחשוף פרטים על אף אחד. הדרך הכי טובה להוריד מתחים היא שקיפות מראש ותוצאות בשטח.</w:t>
+        <w:t>כן, אני משתפת הורים, אבל בזהירות ובעיקר דרך מעשים ולא הרצאות. אני לא מזמנת אסיפה על נושא הצדק, זה יישמע מנותק. אני עושה את זה בשיחות היומיומיות, כשהורה בא לקחת את הילד ומספר לו על משהו שקרה. אם ילד עזר לחבר, אני מספרת לאמא שלו בגאווה, כי ככה היא מבינה מה חשוב לי. לפעמים כן נוצרים מתחים, במיוחד סביב הרעיון של הוגן מול שווה. הורה שואל, למה הילד השני קיבל יותר תשומת לב. אז אני מסבירה, בכבוד, שאני נותנת לכל ילד לפי מה שהוא צריך באותו רגע, ושכשהילד שלו יצטרך, גם הוא יקבל. אני משתמשת בדימוי שהורים מבינים מיד, אני אומרת, אם לילד אחד יש חום גבוה ולשני נזלת, אני לא נותנת לשניהם אותה תרופה. זה מרגיע. המפתח הוא שההורה יבין שאני לא נגד הילד שלו, אני בעדו, פשוט בתוך מערכת הוגנת. רוב ההורים, כשמדברים איתם בגובה העיניים ובכבוד, מבינים ומצטרפים. אחרי כל השנים למדתי שהורה מודאג הוא בסך הכל הורה אוהב, וצריך רק לתרגם לו את השפה. סבלנות פותרת כמעט הכל.</w:t>
       </w:r>
     </w:p>
     <w:p>
@@ -7850,7 +7921,7 @@
           <w:szCs w:val="24"/>
           <w:rtl w:val="1"/>
         </w:rPr>
-        <w:t>האם את מרגישה שתפקידך כגננת כולל קידום ערכים של שוויון וצדק חברתי? כיצד?</w:t>
+        <w:t>האם את מרגישה שתפקידך כגננת כולל קידום ערכים של שוויון וצדק חברתי? תארי לי כיצד.</w:t>
       </w:r>
     </w:p>
     <w:p>
@@ -7874,7 +7945,7 @@
           <w:szCs w:val="24"/>
           <w:rtl w:val="1"/>
         </w:rPr>
-        <w:t>אחרי כל השנים אני משוכנעת בזה יותר מאי פעם. זה התפקיד הכי חשוב שלי, יותר מכל הכנה לכיתה א'. אני לא סתם מלמדת ילדים, אני מגדלת בני אדם. ואני רוצה שיגדלו להיות אנשים הוגנים, רגישים, שאכפת להם מהחלש ומהשונה. אני עושה את זה כל יום, בעיקר דרך דוגמה אישית, כי בגיל הזה ילדים לומדים לא ממה שאת אומרת אלא ממה שאת עושה. הם רואים איך אני מדברת בכבוד עם הסייעת, איך אני מתייחסת בסבלנות לילד שקשה לו. זה מה שנחרט בהם. זו לא עבודה, זו שליחות.</w:t>
+        <w:t>בהחלט, אני מרגישה שזה בלב התפקיד שלי, אולי יותר מכל דבר אחר. תראי, אני יכולה ללמד ילד את כל האותיות ואת כל המספרים, אבל אם הוא יוצא מהגן בלי לדעת לראות את החבר שלצדו, נכשלתי. הגן הוא הפעם הראשונה שילד חי בתוך חברה קטנה שאיננה המשפחה שלו, וכאן הוא לומד את הכללים הגדולים של החיים. איך מחכים בתור, איך נותנים מקום, איך לא דורסים את החלש, איך מזמינים את מי שלבד. אלה ערכים של צדק ושוויון, ואני מלמדת אותם כל יום, בכל רגע, גם בלי מילים. הילדים לומדים ממה שהם רואים אותי עושה, לא ממה שאני מטיפה. כשהם רואים שאני נותנת לכל אחד את מה שהוא צריך, שאני לא מביישת, שאני שומרת על החלש, הם סופגים את זה לתוך העצמות. אני מאמינה עמוקות בכל ילד, שבכל אחד יש אוצר, וחלק מהעבודה שלי הוא לתת לו להרגיש שהוא שווה בדיוק כמו כולם. אני מגדלת את האזרחים של מחר, ואם הם יצאו ממני עם חוש צדק ועם לב פתוח, עשיתי את העבודה הכי חשובה שיש. זה לא רק בתוך התפקיד, זה כל התפקיד.</w:t>
       </w:r>
     </w:p>
     <w:p>
@@ -7892,7 +7963,6 @@
         <w:rPr>
           <w:rFonts w:ascii="David" w:hAnsi="David" w:cs="David"/>
           <w:b/>
-          <w:i w:val="0"/>
           <w:sz w:val="28"/>
           <w:szCs w:val="28"/>
           <w:rtl w:val="1"/>
@@ -7910,7 +7980,6 @@
         <w:rPr>
           <w:rFonts w:ascii="David" w:hAnsi="David" w:cs="David"/>
           <w:b w:val="0"/>
-          <w:i w:val="0"/>
           <w:sz w:val="22"/>
           <w:szCs w:val="22"/>
           <w:rtl w:val="1"/>
@@ -7939,7 +8008,7 @@
           <w:szCs w:val="24"/>
           <w:rtl w:val="1"/>
         </w:rPr>
-        <w:t>ספרי לי קצת על עצמך ועל התפקיד שלך. מי את, כמה שנים את בתחום, ואיך הגעת למקצוע?</w:t>
+        <w:t>ספרי לי קצת על עצמך ועל הדרך המקצועית שלך. מי את, כמה שנים את בתחום, ומה הביא אותך להיות גננת?</w:t>
       </w:r>
     </w:p>
     <w:p>
@@ -7963,7 +8032,7 @@
           <w:szCs w:val="24"/>
           <w:rtl w:val="1"/>
         </w:rPr>
-        <w:t>יעל, בת עשרים ותשע, וזו השנה החמישית שלי כגננת. אני יחסית צעירה בתחום, ורואים את זה עליי. הגעתי עם המון תיאוריה עדכנית מהלימודים, ואני עדיין בשלב של התלהבות ורצון לעשות דברים אחרת. תמיד ידעתי שאני רוצה לעבוד עם ילדים, מגיל צעיר הייתי המדריכה בתנועת הנוער. למדתי חינוך לגיל הרך, ותוך כדי התאהבתי בתחום של פתרון קונפליקטים וחינוך לשלום בגיל הרך. אני מנסה להיות גננת שהיא יותר מנחה ומלווה, שנותנת לילדים כלים לפתור דברים בעצמם במקום להכריע בשבילם.</w:t>
+        <w:t>קוראים לי יעל אברהם, אני בת 29, וזאת השנה החמישית שלי כגננת. האמת שאני עדיין מרגישה צעירה בתחום, כל שנה אני לומדת המון. הגעתי לזה קצת במקרה וקצת לא. הייתי הרבה שנים מדריכה בתנועת נוער, ומשם התאהבתי בעבודה עם ילדים ובתחושה שאני יכולה להשפיע על משהו עמוק, לא רק על הידע אלא על מי שהם יהיו. אחרי הצבא ידעתי שאני רוצה גיל הרך דווקא, כי שם הכול מתחיל, שם נבנים היסודות של איך ילד רואה את עצמו ואת האחר. אני אדם נלהב, אולי לפעמים יותר מדי, אבל אני מאמינה בכל הלב במה שאני עושה. אני קוראת המון, מתעדכנת בתיאוריות חדשות, ומנסה כל הזמן לשפר את עצמי.</w:t>
       </w:r>
     </w:p>
     <w:p>
@@ -7987,7 +8056,7 @@
           <w:szCs w:val="24"/>
           <w:rtl w:val="1"/>
         </w:rPr>
-        <w:t>לימדת בגנים נוספים לפני כן? מה היה שונה בין הגנים?</w:t>
+        <w:t>לימדת בגנים נוספים לפני כן? תארי לי מה היה שונה בין הגנים.</w:t>
       </w:r>
     </w:p>
     <w:p>
@@ -8011,7 +8080,7 @@
           <w:szCs w:val="24"/>
           <w:rtl w:val="1"/>
         </w:rPr>
-        <w:t>לא הרבה, אני עדיין צעירה במקצוע. הייתי בגן אחד קטן לפני הגן הנוכחי. מה שהיה שונה? בעיקר הגישה של הגננת הוותיקה שהחלפתי. היא עבדה מאוד מסורתי, הכול ממנה והחוצה. אני הבאתי גישה אחרת, יותר משתפת, שנותנת לילדים לפתור בעצמם. אז השוני הכי גדול הוא בין דורות של גננות, לא בין מקומות.</w:t>
+        <w:t>כן, לפני הגן הנוכחי עבדתי בשני גנים אחרים, שנה בכל אחד בערך, בהתחלה כסייעת מובילה ואחר כך כגננת מחליפה. מה שהיה שונה זה בעיקר האווירה והקהילה. גן אחד היה בשכונה יותר ותיקה ומבוססת, וההורים היו מאוד מעורבים, לפעמים מדי. הגן השני היה מגוון יותר, ילדים מרקעים שונים לגמרי, וזה לימד אותי המון על גמישות ועל לראות כל ילד בנפרד. הבנתי שאין נוסחה אחת שמתאימה לכולם. מה שעובד בגן אחד יכול ליפול בגן אחר. וגם הבנתי כמה הצוות משנה הכול, כשיש סייעת שאני בקשר טוב איתה, הכול זורם אחרת. כל מעבר כזה בנה אותי קצת.</w:t>
       </w:r>
     </w:p>
     <w:p>
@@ -8035,7 +8104,7 @@
           <w:szCs w:val="24"/>
           <w:rtl w:val="1"/>
         </w:rPr>
-        <w:t>איזה גיל וקבוצה את מלמדת היום?</w:t>
+        <w:t>איזה גיל וקבוצה את מלמדת היום, וכמה ילדים בגן?</w:t>
       </w:r>
     </w:p>
     <w:p>
@@ -8059,7 +8128,7 @@
           <w:szCs w:val="24"/>
           <w:rtl w:val="1"/>
         </w:rPr>
-        <w:t>אני עם גן טרום-חובה, בני שלוש-ארבע. שלושים ושניים ילדים.</w:t>
+        <w:t>היום אני מלמדת גן טרום חובה עירוני, ילדים בני שלוש עד ארבע בערך. יש לנו 32 ילדים בגן, שזה לא מעט בכלל, לפעמים אני מרגישה שאני צריכה עוד שתי ידיים ועוד זוג עיניים. זה גיל מקסים אבל גם מאתגר, כי הם עדיין ממש בהתפתחות של הוויסות הרגשי ושל היכולת להיות בקבוצה. יש עדיין הרבה בכי, הרבה מריבות על אותו צעצוע בדיוק, הרבה קנאה גלויה. אבל דווקא בגלל זה זה הגיל הכי מרתק בעיניי לעבוד על נושאים של הוגנות וצדק, כי הכול ממש על פני השטח. הם לא מסתירים כלום, מה שהם מרגישים יוצא מיד, וזה נותן לי הזדמנות ללמד אותם בזמן אמת.</w:t>
       </w:r>
     </w:p>
     <w:p>
@@ -8083,7 +8152,7 @@
           <w:szCs w:val="24"/>
           <w:rtl w:val="1"/>
         </w:rPr>
-        <w:t>היכן הוכשרת?</w:t>
+        <w:t>היכן הוכשרת, ומה מהרקע שלך משפיע על הדרך שבה את עובדת?</w:t>
       </w:r>
     </w:p>
     <w:p>
@@ -8107,7 +8176,7 @@
           <w:szCs w:val="24"/>
           <w:rtl w:val="1"/>
         </w:rPr>
-        <w:t>למדתי חינוך לגיל הרך באוניברסיטה, ותוך כדי התמחיתי בפתרון קונפליקטים וחינוך לשלום בגיל הרך. זה הפך לתשוקה שלי, ואני מביאה את זה לגן כל יום.</w:t>
+        <w:t>למדתי חינוך לגיל הרך במכללה, ובמהלך התואר התמחיתי ספציפית בפתרון קונפליקטים וחינוך לשלום בגיל הרך, וזה משהו שממש עיצב אותי. מהרקע שלי כמדריכה בתנועת נוער נשאר לי המון, בעיקר האמונה שילדים מסוגלים להוביל בעצמם, שלא צריך לעשות בשבילם את מה שהם יכולים לעשות לבד. אני לא אוהבת להיות השופטת מלמעלה שפוסקת מי צודק ומי לא. במקום זה אני מנסה כל הזמן ללמד אותם לזהות עוול בעצמם ולפתור אותו. ההתמחות בפתרון קונפליקטים היא הבסיס לזה שיש לנו בגן פינת פיוס, מקום שילדים שרבו הולכים אליו כדי לדבר ולהסתדר לבד. הרקע התיאורטי חשוב לי, אבל בסוף הכול נבחן בשטח.</w:t>
       </w:r>
     </w:p>
     <w:p>
@@ -8155,7 +8224,7 @@
           <w:szCs w:val="24"/>
           <w:rtl w:val="1"/>
         </w:rPr>
-        <w:t>כרגע לא, אני עדיין בשלב שאני בונה את עצמי כגננת. אבל אני משתלמת המון, וזה מה שממלא אותי מעבר לעבודה בגן.</w:t>
+        <w:t>בתוך הגן אני משתדלת לקחת על עצמי פרויקטים קטנים, השנה למשל אני מובילה נושא של רגשות וקבוצה, שזה קרוב ללב שלי. מחוץ לגן אני חלק מקבוצת למידה של גננות צעירות שנפגשת פעם בחודש, ואנחנו מדברות על דילמות מהשטח, זה נותן לי המון. אני גם משתתפת בהשתלמויות בנושא חינוך לשלום כשיש הזדמנות. פעם הדרכתי בתנועת נוער וזה עדיין בי, אבל היום המיקוד שלי הוא ממש בגן. אני לא רוצה לפזר את עצמי על יותר מדי דברים, כי אני מאמינה שכדי לעשות טוב צריך להיות נוכחת באמת. אז בעיקר הגן, ולמידה מתמדת לצידו.</w:t>
       </w:r>
     </w:p>
     <w:p>
@@ -8179,7 +8248,7 @@
           <w:szCs w:val="24"/>
           <w:rtl w:val="1"/>
         </w:rPr>
-        <w:t>כשאת שומעת את המונח "צדק בגן הילדים", מה המחשבה הראשונה שעולה לך?</w:t>
+        <w:t>כשאת שומעת את המונח "צדק בגן הילדים", מה המחשבה הראשונה שעולה לך? תארי לי.</w:t>
       </w:r>
     </w:p>
     <w:p>
@@ -8203,7 +8272,7 @@
           <w:szCs w:val="24"/>
           <w:rtl w:val="1"/>
         </w:rPr>
-        <w:t>מיד עולה לי הקול של הילדים עצמם. "זה לא פייר!". אני שומעת את זה עשרות פעמים ביום. אני חושבת שהמחשבה הראשונה שלי היא שצדק זה נושא שהילדים חיים אותו הרבה יותר אינטנסיבי מאיתנו. יש להם מד צדק פנימי, מדויק ורגיש בטירוף. בשבילי צדק בגן זה קודם כול לקחת את התחושה הזאת שלהם ברצינות. ולא לבטל אותה עם "ככה זה, מה לעשות". כשילד אומר זה לא הוגן, הוא עושה אמירה מוסרית. מגיע לו שנתייחס אליה. אז המחשבה הראשונה שלי היא על הקשבה לחוש הצדק שלהם, כי הוא הרבה יותר טהור משלנו.</w:t>
+        <w:t>המחשבה הראשונה שעולה לי היא דווקא לא של חלוקה שווה של דברים, אלא של תחושה. ילד שמרגיש שרואים אותו, שיש לו מקום, שמישהו מקשיב לו כשקורה לו עוול. זה מה שצדק בגן אומר לי. אני זוכרת שכשהתחלתי חשבתי שצדק זה שכולם מקבלים בדיוק אותו דבר, אותו מספר דקות באופניים, אותה כמות פלסטלינה. אבל ככל שהתנסיתי הבנתי שזה הרבה יותר עדין. יש לי בגן תמונה מפורסמת שאני מאוד אוהבת, של שלושה ילדים בגבהים שונים שעומדים מאחורי גדר עם ארגזים, אחד גבוה שרואה בלי כלום, ואחד נמוך שצריך שני ארגזים כדי לראות את המשחק. זאת בשבילי כל התמצית של ההבדל בין שווה להוגן. צדק בגן זה בעיניי בעיקר לתת לכל ילד את מה שהוא צריך כדי להגיע לאותה נקודת פתיחה, ולא סתם לחלק את אותו דבר לכולם ולהגיד לעצמי שהיה הוגן. וזה גם ללמד את הילדים בעצמם לזהות מתי משהו לא הוגן, כי בסוף הם אלה שיחיו את העולם הזה. אז המילה הראשונה שלי היא לא שוויון, אלא ראייה של הילד.</w:t>
       </w:r>
     </w:p>
     <w:p>
@@ -8227,7 +8296,7 @@
           <w:szCs w:val="24"/>
           <w:rtl w:val="1"/>
         </w:rPr>
-        <w:t>האם נושא הצדק החברתי מהווה חלק מהתפיסה החינוכית שלך? איך זה בא לידי ביטוי?</w:t>
+        <w:t>האם נושא הצדק החברתי הוא חלק מהתפיסה החינוכית שלך? תארי לי איך זה בא לידי ביטוי ביום-יום.</w:t>
       </w:r>
     </w:p>
     <w:p>
@@ -8251,7 +8320,7 @@
           <w:szCs w:val="24"/>
           <w:rtl w:val="1"/>
         </w:rPr>
-        <w:t>מאוד, וכמו שאמרתי זה משהו שהגעתי איתו טרי מהלימודים. איפה זה בא לידי ביטוי? בעיקר בזה שאני מנסה לתת לילדים כלים לפתור קונפליקטים בעצמם. אני ממש לא רוצה להיות השופטת שיושבת מלמעלה ומחלקת צדק, כי זה לא מלמד אותם כלום. אני רוצה לגדל אזרחים קטנים שיודעים להקשיב זה לזה ולהגיע לפשרה. יש לנו בגן פינת פיוס, ולשם ילדים שרבו הולכים ומדברים עד שהם מוצאים פתרון. היום הם הולכים לבד, ואני רואה אותם מיישבים סכסוכים כמו דיפלומטים קטנים. בעיניי זו הגשמה של צדק חברתי.</w:t>
+        <w:t>לגמרי, זה ממש הלב של התפיסה שלי, אולי בגלל הרקע שלי בחינוך לשלום. אני לא רואה את הגן רק כמקום שמכינים בו לכיתה א, אלא כמקום שבו נבנים בני אדם שיודעים לחיות ביחד בצורה הוגנת. זה בא לידי ביטוי בהמון דברים קטנים ביום יום. למשל בתחילת השנה אני לא מגיעה עם חוקים מוכנים ותולה אותם על הקיר. אני יושבת עם הילדים ואנחנו קובעים יחד את החוקים של הגן. אני שואלת אותם מה יגרום לכולם להרגיש טוב פה, ואתה מופתע כמה הם חכמים, ילד בן שלוש וחצי אומר לי שאסור לצחוק על מישהו שנפל. ואז זה החוק שלהם, לא שלי, והם שומרים עליו הרבה יותר. עוד דבר שאני עושה זה שיש לנו יום כוכב לכל ילד, יום שבו הוא במרכז, מספר על עצמו, כולם אומרים לו משהו טוב. זה נשמע קטן אבל זה מלמד אותם שכל אחד ראוי לתשומת לב ולמקום. ובזמן אמת, כשקורה עוול, אני עוצרת הכול ומדברת עליו. אני לא מפחדת מהמילים האלה מול ילדים קטנים, להיפך, אני חושבת שדווקא בגיל הזה אפשר לזרוע את זה עמוק.</w:t>
       </w:r>
     </w:p>
     <w:p>
@@ -8275,7 +8344,7 @@
           <w:szCs w:val="24"/>
           <w:rtl w:val="1"/>
         </w:rPr>
-        <w:t>כיצד את מחלקת את תשומת הלב שלך בין הילדים במהלך היום?</w:t>
+        <w:t>תארי לי כיצד את מחלקת את תשומת הלב שלך בין הילדים במהלך יום שלם.</w:t>
       </w:r>
     </w:p>
     <w:p>
@@ -8299,7 +8368,7 @@
           <w:szCs w:val="24"/>
           <w:rtl w:val="1"/>
         </w:rPr>
-        <w:t>אני מאוד מודעת לזה, כי כגננת צעירה למדתי מהר, קצת בדרך הקשה, שהילדים שצועקים חזק מקבלים יותר תשומת לב. וזה לא הוגן. אז אני עובדת עם עצמי. יש לי בראש, ולפעמים על פתק, רשימה של הילדים השקופים, השקטים, ואני מוודאת שכל יום אני יוצרת איתם קשר עין, מגע, מילה שהיא רק שלהם. אני מנצלת את הזמנים הלא מובנים, ההכנה לחצר, סידור הגן, כדי לתפוס רגע אישי עם ילד שלא הספקתי אליו. יש לי עוד המון אנרגיה, ואני משתדלת לפזר אותה בצדק, ולא רק לאן שהיא הכי נמשכת.</w:t>
+        <w:t>האמת שזה אחד הדברים שהכי מטרידים אותי, כי יום בגן הוא בלגן מתוק, ותשומת הלב זזה כל הזמן לכיוון של מי שהכי רועש או הכי בוכה או הכי מושך. עשיתי פעם משהו שממש שינה לי את הראייה. לקחתי שבוע ותיעדתי לעצמי, ממש עם דף וסימונים, עם כמה ילדים דיברתי באמת שיחה, לא רק הוראה כמו שב או תאכל. ומה שגיליתי הדהים אותי. הייתה ילדה אחת, נעה קוראים לה, ילדה שקטה ומתוקה שאף פעם לא עושה בעיות, וכמעט לא דיברתי איתה כל השבוע. ממש כאב לי הבטן מזה. הבנתי שהילדים הרגועים משלמים מחיר על השקט שלהם, כי הם לא צועקים אז הם נעלמים. מאז אני עובדת אחרת. אני משתדלת בכל בוקר לבחור לי שניים שלושה ילדים שאני שמה עליהם עין מיוחדת באותו יום, ובמיוחד את השקטים. אני יוזמת אליהם שיחה, יושבת לידם בארוחה, שואלת משהו אישי. זה לא מושלם, יש ימים שהכול מתפוצץ והכוונות שלי נעלמות, אבל עצם המודעות שיניתי. אני כבר לא נותנת לתשומת הלב לזרום רק למי שדורש אותה בקול.</w:t>
       </w:r>
     </w:p>
     <w:p>
@@ -8323,7 +8392,7 @@
           <w:szCs w:val="24"/>
           <w:rtl w:val="1"/>
         </w:rPr>
-        <w:t>כשיש ילד שזקוק ליותר תשומת לב, רגשית, חברתית או לימודית, איך את מאזנת את זה מול שאר הילדים?</w:t>
+        <w:t>תארי לי מצב שבו ילד זקוק ליותר תשומת לב, רגשית, חברתית או לימודית. איך את מאזנת את זה מול שאר הילדים?</w:t>
       </w:r>
     </w:p>
     <w:p>
@@ -8347,7 +8416,7 @@
           <w:szCs w:val="24"/>
           <w:rtl w:val="1"/>
         </w:rPr>
-        <w:t>המפתח, וזה משהו שהתחדד לי מאוד, זה לא לפחד מהמילה אי-שוויון כשמדובר בצרכים אמיתיים. ילד שעובר משבר בבית, נגיד גירושים, יקבל ממני יותר. נקודה. אבל אני מאזנת את זה בזה שאני משקיעה המון בבניית עצמאות אצל שאר הילדים. ככל שהקבוצה יותר עצמאית ויודעת לתפקד גם בלעדיי, ככה אני חופשייה יותר לתת לילד הבודד. ואני מגייסת את הקבוצה לאמפתיה במקום להשאיר אותה מקנאה. מסבירה בגובה העיניים שלחבר שלהם קשה עכשיו, וצריך לתמוך בו. וילדים, כשמסבירים להם יפה, מגלים המון חמלה.</w:t>
+        <w:t>יש לי בגן ילד, נקרא לו איתי, שעבר גירושים קשים של ההורים ובאותה תקופה היה זקוק להמון תשומת לב רגשית. הוא היה מתפרץ, בוכה, נצמד אליי. ופה בדיוק נכנסת התמונה של הארגזים שאני מדברת עליה. אם אני נותנת לכולם בדיוק אותו דבר, איתי לא יקבל את מה שהוא צריך כדי פשוט לתפקד. אבל האתגר הוא שאר הילדים, כי הם רואים ומרגישים כשמישהו מקבל יותר, והם אומרים את זה, למה איתי מקבל ולמה הוא יושב לידך. אז מה שאני עושה זה שאני לא מסתירה, אני מגייסת את הקבוצה. אני מסבירה בשפה שלהם שלפעמים לחבר יש יום קשה או תקופה קשה, ואז הוא צריך קצת יותר, בדיוק כמו שילד שנפל וכואב לו מקבל קרח. ואז במקום קנאה נוצרת אצלם אמפתיה, וזה קסם לראות. ילדים באו לאיתי ושאלו אותו אם הוא רוצה שישחקו איתו. במקביל אני מאוד נזהרת שהילד שמקבל יותר לא יתקבע בתפקיד של המסכן, אז אני גם נותנת לו אחריות, תפקידים, מחזקת אותו. זה איזון עדין וכל יום הוא מחדש, אבל אני מאמינה שאפשר לתת למי שצריך בלי לקפח את השאר, אם עושים את זה בשקיפות.</w:t>
       </w:r>
     </w:p>
     <w:p>
@@ -8371,7 +8440,7 @@
           <w:szCs w:val="24"/>
           <w:rtl w:val="1"/>
         </w:rPr>
-        <w:t>כיצד מתבצעת חלוקת החומרים והמשאבים הפיזיים בגן, הצעצועים והציוד? מה הקו המנחה שלך?</w:t>
+        <w:t>תארי לי כיצד מתבצעת חלוקת החומרים והמשאבים הפיזיים בגן (צעצועים, ציוד, אופניים). מה הקו המנחה שלך?</w:t>
       </w:r>
     </w:p>
     <w:p>
@@ -8395,7 +8464,7 @@
           <w:szCs w:val="24"/>
           <w:rtl w:val="1"/>
         </w:rPr>
-        <w:t>אני מאוד מאמינה בשיתוף הילדים בקביעת הכללים עצמם. בתחילת השנה, במקום להכתיב חוקים, ישבנו כולנו במעגל ושאלתי אותם, מה נעשה כשכולם רוצים את אותו הצעצוע. והילדים עצמם הציעו את רעיון התור ואת שעון החול. כשהחוקים הם שלהם, הם הרבה יותר מחויבים אליהם. הקו שלי הוא שתחושת הבעלות של הילדים על הכללים היא מה שיוצר אצלם באמת תחושת צדק, הרבה יותר מכל חלוקה שאני אכפה מלמעלה. אני שם כדי לתת מסגרת ולעזור כשנתקעים. בעיניי זו הכנה אמיתית לחיים בחברה.</w:t>
+        <w:t>בחלוקה של דברים פיזיים כמו אופניים או משחקים אני משתדלת שיהיו כללים ברורים שהילדים מכירים, כי דווקא פה חוסר בהירות יוצר את הכי הרבה מריבות. יש לנו למשל טיימר קטן לאופניים, כי אלה הכי מבוקשים, וכל ילד מקבל זמן, וכשהצליל נשמע הוא מעביר לחבר. הילדים ממש אוהבים את זה כי זה לא אני שמחליטה, זה הטיימר, אובייקטיבי, אף אחד לא כועס עליי. הקו המנחה שלי הוא שקיפות והשתתפות. אבל אני גם משאירה מקום לגמישות, כי לא הכול ניתן לחלק במדידה. אם יש ילד שהיום ממש קשה לו והוא נצמד לבובה מסוימת, אני לא תמיד אכריח אותו להעביר בדיוק בזמן, ואני מסבירה את זה לאחרים. מה שחשוב לי זה שהילדים יבינו את ההיגיון מאחורי החלוקה, לא רק ישננו כלל. אני שואלת אותם הרבה, מה נראה לכם הוגן פה, איך נעשה שכולם יקבלו. ופה גם עולה השפה של הארגזים, ילד יגיד לי לפעמים תני לו עוד ארגז, כלומר תעזרי למי שקשה לו יותר. אני מתה על זה שהם אימצו את זה כשפה שלהם.</w:t>
       </w:r>
     </w:p>
     <w:p>
@@ -8419,7 +8488,7 @@
           <w:szCs w:val="24"/>
           <w:rtl w:val="1"/>
         </w:rPr>
-        <w:t>האם לדעתך חלוקה "שווה" וחלוקה "הוגנת" הן אותו דבר? תני דוגמה מהגן.</w:t>
+        <w:t>האם לדעתך חלוקה "שווה" וחלוקה "הוגנת" הן אותו דבר? תני דוגמה מהגן שממחישה את ההבדל.</w:t>
       </w:r>
     </w:p>
     <w:p>
@@ -8443,7 +8512,7 @@
           <w:szCs w:val="24"/>
           <w:rtl w:val="1"/>
         </w:rPr>
-        <w:t>לא, ממש לא. וזו הבחנה שאני ממש מלמדת בגן, במפורש, דרך תמונה. הראיתי לילדים תמונה מפורסמת, שלושה ילדים בגבהים שונים מנסים לראות משחק מעבר לגדר. אם נותנים לכולם ארגז אחד באותו גובה, זה שווה, אבל הגבוה רואה מצוין והנמוך עדיין לא רואה כלום. הוגן זה לתת לנמוך שני ארגזים ולגבוה בכלל אפס, ואז כולם רואים. הילדים ממש התחברו, זה הפך אצלנו לשפה, הם אומרים תן לו עוד ארגז כשמישהו צריך יותר עזרה. וזו בדיוק ההגדרה של הוגן, שכל אחד יקבל מה שהוא צריך כדי להצליח.</w:t>
+        <w:t>לא, ממש לא אותו דבר, וזה בעיניי אחד הדברים הכי חשובים שגננת יכולה להבין. שווה זה שכולם מקבלים בדיוק אותו דבר. הוגן זה שכל אחד מקבל את מה שהוא צריך. יש לי דוגמה שקורית אצלי כמעט כל יום. בזמן ארוחת בוקר, אם אני נותנת לכל ילד בדיוק חצי פרוסה, זה שווה, נכון. אבל יש לי ילד גדול ורעב שחצי פרוסה לא מספיקה לו, ויש ילדה קטנטונת שגם חצי זה הרבה עליה. אז מה עשיתי פה בשוויון, גרמתי לאחד להישאר רעב ולשנייה לזרוק אוכל. הוגן זה לתת לכל אחד לפי מה שהוא צריך. אבל הדוגמה הכי יפה היא התמונה של שלושת הילדים מאחורי הגדר עם הארגזים. הראיתי אותה לילדים והם ממש הבינו את זה לבד, שלתת לכולם ארגז אחד זה שווה אבל הנמוך עדיין לא רואה, ורק אם נותנים לו עוד ארגז זה הופך להוגן. הם אימצו את הביטוי תן לו עוד ארגז והם משתמשים בו בעצמם במריבות. ילד יבוא ויגיד לי הוא צריך עוד ארגז, כאילו הוא צריך קצת יותר עזרה. זה מרגש אותי שהם תפסו רעיון כזה מופשט בגיל שלוש.</w:t>
       </w:r>
     </w:p>
     <w:p>
@@ -8467,7 +8536,7 @@
           <w:szCs w:val="24"/>
           <w:rtl w:val="1"/>
         </w:rPr>
-        <w:t>כיצד את מתמודדת עם מצב שילד מסוים "לוקח" יותר מקום במרחב הקבוצתי?</w:t>
+        <w:t>תארי לי מצב שבו ילד מסוים "לוקח" יותר מקום במרחב הקבוצתי, וכיצד את מתמודדת עם זה.</w:t>
       </w:r>
     </w:p>
     <w:p>
@@ -8491,7 +8560,7 @@
           <w:szCs w:val="24"/>
           <w:rtl w:val="1"/>
         </w:rPr>
-        <w:t>אני משתדלת מאוד לא לתייג את זה מראש כשלילי. יש ילדים שהם פשוט מלאי חיים ונוכחות, וזה דבר יפה שצריך לטפח, לא לכבות. אני מחפשת לתת לזה במה מסודרת. בגן שלנו יש יום כוכב, שכל ילד בתורו מקבל יום שבו הוא במרכז, מספר על עצמו ומביא משהו אהוב מהבית. גיליתי שכשילד מקבל את הבמה שהוא צריך בצורה צפויה, הוא הרבה פחות צריך לחטוף אותה בכוח. ובמקביל אני עובדת על תרבות של תור בדיבור, שכל אחד יודע שגם הוא יקבל את הרגע שלו, אז אפשר לחכות בסבלנות.</w:t>
+        <w:t>יש לי כמה ילדים כאלה, בדרך כלל ילדים חזקים ודומיננטים חברתית, שבלי כוונה רעה תופסים את כל המרחב, מדברים הכי הרבה במעגל, בוחרים את המשחקים, קובעים מי משחק עם מי. יש לי ילד אחד, נקרא לו רון, מנהיג טבעי, כריזמטי, אבל הוא היה תופס פיקוד על כל פינת הבנייה ולא נותן לאחרים מקום. הדבר הראשון שלמדתי הוא לא להעניש את זה, כי זה לא רוע, זה טבע, וגם כי הכישרון החברתי שלו הוא מתנה. מה שאני עושה זה לתעל אותו. נתתי לרון תפקיד של מי שמזמין ילדים חדשים לשחק, הפכתי את הכוח שלו לכוח שמשרת את הקבוצה. במעגל אני עובדת עם כלי פשוט, יש לנו חפץ דיבור, מי שמחזיק אותו מדבר, וזה מווסת את מי שלוקח יותר מדי מקום ונותן במה לשקטים. אני גם פשוט שמה לזה מילים בשיחה קבוצתית, בלי לבייש אף אחד, שמרחב הוא כמו עוגה ולכולם מגיע חתיכה. אני שואלת אותם, שמתם לב שהיום שמענו רק כמה קולות, בואו נשמע גם את אלה שלא דיברו. וזה מדהים איך הם בעצמם מתחילים לשים לב ולפנות מקום אחד לשני.</w:t>
       </w:r>
     </w:p>
     <w:p>
@@ -8515,7 +8584,7 @@
           <w:szCs w:val="24"/>
           <w:rtl w:val="1"/>
         </w:rPr>
-        <w:t>כיצד את מתמודדת עם מצבים של הדרה חברתית, ילד שהקבוצה לא מקבלת ולא רוצים לשחק איתו?</w:t>
+        <w:t>תארי לי מצב של הדרה חברתית בגן, ילד שהקבוצה לא מקבלת ולא רוצים לשחק איתו. כיצד את פועלת?</w:t>
       </w:r>
     </w:p>
     <w:p>
@@ -8539,7 +8608,7 @@
           <w:szCs w:val="24"/>
           <w:rtl w:val="1"/>
         </w:rPr>
-        <w:t>זה אחד הדברים שהכי מדברים אליי, כי ההתמחות שלי היא בדינמיקה חברתית ובחינוך לקבלה. אני מתייחסת להדרה בכובד ראש, כי אני יודעת כמה נזק היא עושה. הכלל הראשון, לא כופים. להכריח ילדים לשחק עם מי שהם דוחים זה מתכון לכישלון. אני עובדת בעדינות, מנסה להבין את השורש דרך תצפית, ובמקביל בונה לו מחדש מעמד חברתי, מרכיבה קבוצות משחק קטנות שבהן הוא זורח. ואני משתמשת בספרות ילדים ובמשחקי תפקידים על קבלה, על איך מרגיש מי שלא משחקים איתו, כדי לפתח את האמפתיה של כל הקבוצה, לא רק לפתור מקרה בודד.</w:t>
+        <w:t>זה אחד הדברים הכי כואבים שקורים בגן, וגם אחד הכי חשובים לטפל בהם. היה לי מקרה עם ילדה, נקרא לה שירה, שבאיזשהו שלב הקבוצה פשוט לא רצתה לשחק איתה, אמרו שהיא מוזרה, שהיא מריחה, כל מיני דברים שילדים אומרים והם נשמעים אכזריים אבל הם לא מבינים עד הסוף. הדבר הראשון שאני לא עושה זה להכריח, אני לא אומרת לילדים תשחקו איתה כי אמרתי, כי זה לא עובד וזה גם משפיל אותה עוד יותר. מה שאני כן עושה זה לעבוד בכמה שכבות. קודם כל עם שירה עצמה, לחזק אותה, לתת לה כלים חברתיים, למצוא לה נקודת חוזק שתבליט אותה, היא ציירה יפה אז נתתי לה להוביל פרויקט ציור. במקביל אני עובדת עם הקבוצה על אמפתיה, בלי להצביע עליה, דרך סיפורים ומשחקי תפקידים על איך זה מרגיש כשלא רוצים אותך. ואז אני יוצרת הזדמנויות קטנות, מושיבה אותה ליד ילדה חמה במיוחד, בונה חברות אחת אחת, כי לא צריך שכולם יאהבו אותה, מספיק חבר אחד אמיתי כדי לשבור את הבדידות. עם שירה זה לקח חודשים אבל היום יש לה שתי חברות טובות, וזה מהניצחונות שאני הכי גאה בהם.</w:t>
       </w:r>
     </w:p>
     <w:p>
@@ -8563,7 +8632,7 @@
           <w:szCs w:val="24"/>
           <w:rtl w:val="1"/>
         </w:rPr>
-        <w:t>האם בגן שלך יש ילדים מרקעים חברתיים או כלכליים שונים? כיצד זה בא לידי ביטוי ביום-יום?</w:t>
+        <w:t>האם בגן שלך יש ילדים מרקעים חברתיים או כלכליים שונים? תארי לי כיצד זה בא לידי ביטוי בפרקטיקה היומיומית.</w:t>
       </w:r>
     </w:p>
     <w:p>
@@ -8587,7 +8656,7 @@
           <w:szCs w:val="24"/>
           <w:rtl w:val="1"/>
         </w:rPr>
-        <w:t>כן מאוד, הגן שלי די מגוון. ואני חושבת שצריך להתייחס לזה בעיניים פקוחות ובכנות, לא להעמיד פנים שכולם אותו דבר. זה בא לידי ביטוי בעיקר בחוויות שילדים מביאים איתם, יש ילד שטס לחו"ל בחופש ויש ילד שמעולם לא ראה את הים. אני נזהרת מאוד בשיח סביב חופשות, ולמדתי לא לפתוח את יום ראשון בשאלה מה עשיתם בסוף השבוע, כי היא חושפת פערים. כשאני מתכננת פעילות, אני שואלת את עצמי, היא מניחה משאבים שלא לכל אחד יש בבית. ואני מנסה שהחוויות המעשירות יגיעו דווקא מהגן, שהוא המקום השוויוני.</w:t>
+        <w:t>כן, בהחלט, יש בגן שלנו ילדים מרקעים כלכליים וחברתיים די שונים, כי זה גן עירוני שקולט מכמה שכונות. וזה בא לידי ביטוי בהרבה דברים קטנים שאנשים לא תמיד חושבים עליהם. למשל ביום הולדת, יש הורים שמביאים מסיבה שלמה עם ליצן ומתנות לכולם, ויש הורים שבקושי מביאים עוגה. ופה אני צריכה להיות ממש ערנית, כי ילד יכול להרגיש מושפל מזה בלי שאף אחד אמר מילה. אז קבעתי נהלים ברורים, יום הולדת בגן הוא צנוע ואחיד, אנחנו לא מביאים מתנות ולא הפקות, כדי שכל ילד ירגיש שלו יש בדיוק כמו לחבר. גם בלבוש, בציוד, לפעמים ילד בא בלי מעיל בחורף ואני פשוט דואגת בשקט, יש לי מלאי קטן של בגדים חמים בארון בלי לעשות מזה עניין. אני מאוד נזהרת לא לתייג ילד לפי מאיפה הוא בא, כי ילדים קולטים הכול. מה שאני כן עושה זה לחגוג את השונות כשהיא חיובית, ילד שמדבר בבית שפה אחרת מלמד אותנו מילה, זה הופך למשהו מיוחד ולא למשהו שמבדיל אותו לרעה.</w:t>
       </w:r>
     </w:p>
     <w:p>
@@ -8611,7 +8680,7 @@
           <w:szCs w:val="24"/>
           <w:rtl w:val="1"/>
         </w:rPr>
-        <w:t>כיצד את מתמודדת עם הפערים הניכרים בין הילדים, בין השאר בתחום הרגשי, החברתי או הלימודי?</w:t>
+        <w:t>תארי לי כיצד את מתמודדת עם הפערים הניכרים בין הילדים, בין השאר בתחום הרגשי, החברתי או הלימודי.</w:t>
       </w:r>
     </w:p>
     <w:p>
@@ -8635,7 +8704,7 @@
           <w:szCs w:val="24"/>
           <w:rtl w:val="1"/>
         </w:rPr>
-        <w:t>אני משתדלת ליצור סביבה שבה שונות היא דבר נורמלי ומובן מאליו, לא חריגה. אנחנו מדברים בגן הרבה על זה שכל אחד טוב במשהו אחר, יש מי שמצייר יפה, יש מי שרץ מהר, יש מי שיודע לנחם חבר. כשאני מדגישה את הריבוי הזה, הפער בתחום אחד הופך להרבה פחות מאיים, כי כל ילד מוצא את הפינה שבה הוא זורח. אני עובדת הרבה בקבוצות קטנות ומעורבות בכוונה, ככה ילדים חזקים ומתקשים משחקים יחד ולומדים אחד מהשני. והכי חשוב לי, אף פעם, לא להשוות ילד לילד בקול רם. זה הורס ביטחון.</w:t>
+        <w:t>פערים יש תמיד, בין אם זה ילד שכבר מכיר אותיות וילד שעדיין לא מחזיק עיפרון, או ילד שמווסת את עצמו יפה וילד שמתפרץ על כל דבר. הגישה שלי חוזרת שוב לרעיון של הארגזים, לא לתת לכולם אותו דבר אלא לכל אחד את מה שיקדם אותו מהנקודה שבה הוא נמצא. בתחום הלימודי אני עובדת הרבה בקבוצות קטנות ולא רק במליאה, כי במליאה תמיד יש מי שמשתעמם ומי שהולך לאיבוד. בקבוצה קטנה אני יכולה לתת לכל אחד אתגר בגובה שלו, וזה מה שהופך את זה להוגן, כי כל ילד מרגיש הצלחה בגובה שלו. אבל מה שהכי חשוב לי זה שהילדים לא ירגישו את הפער כתחרות. אני אף פעם לא משווה בין ילדים בקול, אף פעם לא אומרת תראו כמה הוא יודע יפה. במקום זה אני מחזקת כל אחד ביחס לעצמו, ראיתי כמה השתפרת מאתמול. בתחום הרגשי אני משקיעה המון, כי ילד שרגוע בנפש הרבה יותר פנוי ללמוד. אני מלמדת אותם שם לרגשות, שיש כלים להירגע, ובזה כולם מרוויחים. הפערים לא נעלמים, אבל אני משתדלת שהם לא יהפכו למקור של בושה או של יהירות.</w:t>
       </w:r>
     </w:p>
     <w:p>
@@ -8659,7 +8728,7 @@
           <w:szCs w:val="24"/>
           <w:rtl w:val="1"/>
         </w:rPr>
-        <w:t>איך נראה יום עבודה טיפוסי שלך בגן, ומהם הדברים שאת מקפידה עליהם מבחינת הוגנות?</w:t>
+        <w:t>תארי לי יום עבודה טיפוסי שלך בגן, ומהם הדברים שאת מקפידה עליהם מבחינת הוגנות.</w:t>
       </w:r>
     </w:p>
     <w:p>
@@ -8683,7 +8752,7 @@
           <w:szCs w:val="24"/>
           <w:rtl w:val="1"/>
         </w:rPr>
-        <w:t>היום שלנו מאוד מובנה אבל עם המון מרחב לילדים. קבלה, מפגש, פעילות בפינות, חצר, ארוחה. מה שאני הכי מקפידה עליו זה פינת הפיוס. יש לנו פינה קבועה שאליה ילדים שרבו הולכים לדבר ולפתור בעצמם. אני מקפידה שהיא תמיד תהיה זמינה, כי בשבילי זה לב העניין, שהילדים ילמדו לעשות צדק בעצמם, לא שאני אפסוק להם. וגם על התורים, שכל אחד ידע שיגיע אליו.</w:t>
+        <w:t>יום טיפוסי אצלי מתחיל בקבלת פנים אישית, אני משתדלת לומר שלום לכל ילד בשמו ולהסתכל לו בעיניים, כי זה רגע קטן שאומר לו רואים אותך. אחר כך יש משחק חופשי, מעגל בוקר, פעילות בקבוצות, חצר, ארוחות, ובכל אחד מהחלקים האלה יש דברים שאני מקפידה עליהם מבחינת הוגנות. במעגל אני מקפידה שכל ילד שרוצה לדבר יקבל תור, ושחפץ הדיבור עובר ולא נשאר רק אצל הרועשים. בארוחה אני שמה לב לחלוקה, שכולם מקבלים לפי הצורך ולא רק לפי מי שצועק ראשון. בחצר, שזה המקום הכי פרוע, אני עם עיניים פקוחות למי נשאר לבד ולמי משתלט על המתקן. וכמו שאמרתי, יש לי הרגל לבחור כל בוקר כמה ילדים שקטים ולוודא שדיברתי איתם באמת. הדבר שהכי חשוב לי לאורך היום הוא פינת הפיוס. כשילדים רבים אני לא רצה לפסוק, אני מפנה אותם לשם, לשבת ולדבר. יש שם כרטיסיות עם רגשות ותמונות שעוזרות להם. ובהתחלה הם צריכים אותי לידם, אבל היום אני רואה ילדים הולכים לשם לבד ומסתדרים, וזה הרגע שאני יודעת שעשיתי משהו נכון, שהם לא צריכים שופטת מלמעלה.</w:t>
       </w:r>
     </w:p>
     <w:p>
@@ -8707,7 +8776,7 @@
           <w:szCs w:val="24"/>
           <w:rtl w:val="1"/>
         </w:rPr>
-        <w:t>האם חשוב בעינייך לזהות, לדבר ולפעול נגד מקרים לא צודקים בגן? כיצד ובאילו מקרים?</w:t>
+        <w:t>האם חשוב בעינייך לזהות, לדבר ולפעול נגד מקרים לא צודקים בגן? תארי לי כיצד ובאילו מקרים.</w:t>
       </w:r>
     </w:p>
     <w:p>
@@ -8731,7 +8800,7 @@
           <w:szCs w:val="24"/>
           <w:rtl w:val="1"/>
         </w:rPr>
-        <w:t>מאוד. זה ממש התחום שלי. אבל אני פחות פוסקת ויותר מלמדת אותם לזהות בעצמם. כשקורה משהו לא הוגן, אני לא אומרת מיד מי צודק. אני שואלת, מה קרה פה, מה כל אחד הרגיש, מה הוגן לעשות. אני רוצה שהם ייצאו מהגן עם היכולת לזהות עוול ולתקן אותו, לא רק לרוץ אליי. במקרים של הדרה או פגיעה אני כן מתערבת ישר, אבל תמיד מתוך המטרה שהם ילמדו.</w:t>
+        <w:t>מאוד חשוב לי, אני חושבת שזה אחד התפקידים המרכזיים שלי, אבל עם הסתייגות אחת שלמדתי בדרך הקשה. בהתחלה, כשהייתי ממש טרייה, קפצתי על כל עוול קטן ותיקנתי אותו בעצמי, פסקתי מי צודק, החזרתי צעצוע, נזפתי. ואז הבנתי שאני מגדלת ילדים שמחכים שהמבוגר יבוא ויציל, במקום ילדים שיודעים לזהות עוול ולטפל בו בעצמם. אז היום הגישה שלי היא לזהות ולעצור, אבל לא בהכרח לפתור במקומם. אם אני רואה ילד שלוקח לחבר משהו מהיד, אני לא רצה להחזיר, אני עוצרת ושואלת את הנפגע, מה קרה לך עכשיו, איך אתה מרגיש, מה אתה רוצה להגיד לו. אני נותנת לו את הכוח. יש מקרים שאני כן חייבת להתערב חזק, אלימות, השפלה, הדרה, שם אני לא מתפשרת ואני עוצרת מיד וברור, כי יש קווים אדומים. אבל ברוב המקרים אני יותר מנחה מפוסקת. אני מאמינה שילד שלמד בגיל שלוש לזהות שמשהו לא הוגן ולומר את זה במילים, יגדל להיות אדם שלא עובר לסדר היום מול עוול. זאת בעיניי המתנה הכי גדולה שאני יכולה לתת להם.</w:t>
       </w:r>
     </w:p>
     <w:p>
@@ -8755,7 +8824,7 @@
           <w:szCs w:val="24"/>
           <w:rtl w:val="1"/>
         </w:rPr>
-        <w:t>האם קרה שקיבלת החלטה שבדיעבד הרגישה לך לא הוגנת? תארי, ואיך הרגשת עם זה?</w:t>
+        <w:t>תארי לי מקרה שבו קיבלת החלטה שבדיעבד הרגישה לך לא הוגנת. מה קרה, ואיך הרגשת?</w:t>
       </w:r>
     </w:p>
     <w:p>
@@ -8779,7 +8848,7 @@
           <w:szCs w:val="24"/>
           <w:rtl w:val="1"/>
         </w:rPr>
-        <w:t>כן, ודווקא כי אני צעירה זה עוד טרי אצלי. היה לי מקרה שתיעדתי לעצמי את חלוקת תשומת הלב, ונדהמתי לגלות שהיו ימים שכמעט לא דיברתי עם ילדה מסוימת, שקטה ונחמדה. פשוט נעלמה לי בין הרועשים. הרגשתי נורא, כי זה בדיוק העוול שהכי פחדתי ממנו, שאני מחלקת את עצמי לפי מי שצועק חזק. מאז אני עובדת עם רשימה, ומוודאת שכל ילד, ובעיקר השקטים, מקבל ממני נגיעה אישית כל יום.</w:t>
+        <w:t>היה לי מקרה שאני עדיין חושבת עליו לפעמים. שני ילדים רבו על מכונית, וזה היה סוף יום, הייתי עייפה, החצר הייתה בלגן, וסתם קיבלתי החלטה מהירה, אמרתי המכונית של דניאל כי הוא לקח אותה קודם, קחו אותה ממנו. ורק אחר כך, כשראיתי את הילד השני, יונתן, יושב בצד עם דמעות, הבנתי שבכלל לא שמעתי אותו. אולי הוא החזיק אותה קודם, אולי הייתה לו סיבה, אני פשוט לא נתתי לו לדבר כי מיהרתי. ומה שהכי הפריע לי זה שעשיתי בדיוק את מה שאני מטיפה נגדו, הייתי השופטת מלמעלה שפוסקת בלי לברר. הרגשתי ממש לא נעים, כאילו בגדתי בעקרונות של עצמי. למחרת עשיתי משהו שאני חושבת שהיה חשוב, חזרתי ליונתן ואמרתי לו, חשבתי על אתמול ואני חושבת שלא הקשבתי לך מספיק, אני מצטערת. והפנים שלו נדלקו, כאילו לא האמין שגננת מתנצלת. ולמדתי מזה שני דברים. אחד, שגם אני טועה ושזה בסדר, ושתיים, שדווקא כשאני מודה בטעות מול ילד אני מלמדת אותו על הוגנות יותר מכל שיעור. עייפות היא לא תירוץ לוותר על ההקשבה, וזה משהו שאני שומרת לעצמי מאז.</w:t>
       </w:r>
     </w:p>
     <w:p>
@@ -8803,7 +8872,7 @@
           <w:szCs w:val="24"/>
           <w:rtl w:val="1"/>
         </w:rPr>
-        <w:t>האם לדעתך ילדים בגיל הגן מבינים מהי הוגנות? מאיזה גיל, ואיך זה בא לידי ביטוי?</w:t>
+        <w:t>האם לדעתך ילדים בגיל הגן מבינים מהי הוגנות? מאיזה גיל, ותארי לי כיצד זה בא לידי ביטוי אצלם.</w:t>
       </w:r>
     </w:p>
     <w:p>
@@ -8827,7 +8896,7 @@
           <w:szCs w:val="24"/>
           <w:rtl w:val="1"/>
         </w:rPr>
-        <w:t>לגמרי מבינים, ואני חושבת שאנחנו מזלזלים בהם. כבר בשלוש הם צועקים זה לא פייר. נכון, בהתחלה זה מאוד מוחלט, הוגן זה שלכולם אותו דבר. אבל בארבע-חמש הם כבר יכולים להבין את הרעיון שמישהו צריך יותר. הראיתי להם פעם את התמונה של הילדים והארגזים מאחורי הגדר, והם התחברו לזה מיד, והתחילו להשתמש בזה בעצמם. זה היה מדהים לראות איך רעיון מופשט הופך אצלם לשפה יומיומית.</w:t>
+        <w:t>אני ממש משוכנעת שכן, ומגיל צעיר בהרבה ממה שאנשים חושבים. כבר בגיל שנתיים וחצי שלוש הם קולטים חוסר צדק, אולי הם עוד לא יודעים למלל את המילה הוגן, אבל הם מרגישים אותה בבטן. הביטוי הכי מוכר זה המשפט זה לא פייר, שילדים אומרים כשמשהו לא הוגן כלפיהם. נכון שבהתחלה זה מאוד ממוקד בעצמם, זה לא פייר בעיקר כשאני מקבל פחות. אבל מה שמדהים זה שאפשר לפתח את זה. ראיתי איך הילדים שלי התקדמו מזה לא פייר לי לזה לא פייר לו, כלומר להתחיל להרגיש עוול שנעשה למישהו אחר. כשהראיתי להם את התמונה של הארגזים ראיתי איך אצל חלקם משהו נפתח, הם הבינו שהוגן זה לא תמיד לקבל את אותו הדבר. יש לי ילדים שכבר אומרים לחבר תן לו עוד ארגז כשהם רואים שמישהו צריך יותר עזרה. אז כן, בגיל הגן יש להם תשתית אמיתית להבנה של הוגנות, היא רגשית ואינטואיטיבית לפני שהיא שכלית, והתפקיד שלנו הוא פשוט להשקות אותה ולתת לה מילים. אני מתרגשת בכל פעם מחדש כמה עמוק הם מסוגלים להבין את זה.</w:t>
       </w:r>
     </w:p>
     <w:p>
@@ -8851,7 +8920,7 @@
           <w:szCs w:val="24"/>
           <w:rtl w:val="1"/>
         </w:rPr>
-        <w:t>כיצד את מתמודדת עם דרישה של הורה שהילד שלו יקבל יחס מועדף?</w:t>
+        <w:t>תארי לי מצב שבו הורה דרש שהילד שלו יקבל יחס מועדף. כיצד התמודדת?</w:t>
       </w:r>
     </w:p>
     <w:p>
@@ -8875,7 +8944,7 @@
           <w:szCs w:val="24"/>
           <w:rtl w:val="1"/>
         </w:rPr>
-        <w:t>בתור גננת צעירה זה היה מאתגר בהתחלה, כי חלק מההורים גדולים ממני ולא תמיד סמכו עליי. הורה שבא ורוצה יחס מועדף לילד שלו, אני קודם מקשיבה, כי בדרך כלל יש שם דאגה. ואז אני מסבירה את הגישה שלי, שאני הוגנת כלפי כולם, ושזה דווקא לטובת הילד שלו בטווח הארוך. למדתי שאם אני נותנת להורה להרגיש שאני באמת רואה ואוהבת את הילד שלו, הוא נפתח לגישה שלי הרבה יותר.</w:t>
+        <w:t>היה לי מקרה שהורה של ילד ביקש שדווקא הבן שלו תמיד יהיה ראשון בתור לאופניים ושישב תמיד ליד החברים שלו, כי הוא ילד רגיש והוא מתעצבן. וזה מקרה עדין, כי מצד אחד אני מבינה את ההורה, כל הורה רוצה את הטוב לילד שלו, ומצד שני אם אני מסכימה אני שוברת את כל מה שאני בונה בגן על הוגנות. אז מה שעשיתי זה קודם כל להקשיב ולא להתגונן, אמרתי לו אני רואה כמה חשוב לך שהוא ירגיש טוב, בוא נחשוב יחד. ואז הסברתי, בעדינות אבל בבירור, שאם אני אתן לילד אחד תמיד להיות ראשון, שאר הילדים ירגישו את העוול, וגם הבן שלו ילמד שהעולם מסתובב סביבו, וזה לא ישרת אותו בחיים. הצעתי במקום זה שנעבוד יחד על זה שהוא ילמד להתמודד עם התור, כי זה כלי לחיים. ההורה קצת התאכזב בהתחלה, אבל בסוף הוא הבין. וכגננת צעירה זה לא תמיד קל, כי לפעמים ההורים מבוגרים ממני ומרגישים שהם יודעים יותר. למדתי שאם אני מגיעה ממקום של כבוד וגם של ביטחון במה שאני מאמינה בו, רוב ההורים בסוף איתי.</w:t>
       </w:r>
     </w:p>
     <w:p>
@@ -8899,7 +8968,7 @@
           <w:szCs w:val="24"/>
           <w:rtl w:val="1"/>
         </w:rPr>
-        <w:t>האם את משתפת את ההורים בנושאים של צדק, שוויון והוגנות? האם נוצרים מתחים, וכיצד את מתמודדת איתם?</w:t>
+        <w:t>האם את משתפת את ההורים בנושאים של צדק, שוויון והוגנות? תארי לי אם נוצרים מתחים וכיצד את מתמודדת.</w:t>
       </w:r>
     </w:p>
     <w:p>
@@ -8923,7 +8992,7 @@
           <w:szCs w:val="24"/>
           <w:rtl w:val="1"/>
         </w:rPr>
-        <w:t>בתור גננת צעירה, שיתוף ההורים היה אחד האתגרים הכי גדולים שלי בהתחלה. אבל למדתי שהמפתח הוא שקיפות ותקשורת. אני משתפת אותם כבר באסֵפה הראשונה, מספרת על פינת הפיוס ועל העיקרון של הוגנות לפי צורך. הורים צעירים מתחברים לזה מהר, ולפעמים אני צריכה לעבוד קצת יותר עם הורים שרגילים לתפיסה של כולם אותו דבר. מתחים נוצרים, בעיקר סביב הורה שחושש שהילד שלו לא מקבל מספיק. אני מתמודדת עם זה בהקשבה קודם, ואז בהסבר סבלני, בלי לחשוף פרטים על ילדים אחרים. אמון נבנה בטיפות.</w:t>
+        <w:t>כן, אני משתפת את ההורים, כי אני מאמינה שאם בגן אנחנו מלמדים הוגנות ובבית זה סותר, הילד נשאר מבולבל. אני מעדכנת אותם מה אנחנו עושים, מספרת על פינת הפיוס, על התמונה של הארגזים, על יום כוכב, ומזמינה אותם להמשיך את זה בבית. רוב ההורים מתחברים לזה מאוד ואפילו מספרים לי שהילד תיקן אותם, אמא זה לא הוגן שלאח שלי יש יותר. אבל כן, לפעמים נוצרים מתחים. יש הורים שחושבים שאני יותר מדי מתעסקת ברגשות ופחות בלימודים, שאלו אותי פעם ישירות מתי הם יכינו אותם לכיתה א במקום כל הדיבורים על רגשות. ופה, כגננת צעירה, זה נגע לי, כי לפעמים אני חוששת שלא לוקחים אותי מספיק ברצינות בגלל הגיל. אבל למדתי לא להתגונן אלא להסביר, שילד שרגוע ויודע לפתור קונפליקטים דווקא לומד יותר טוב, שזה לא או או. אני גם מזמינה אותם לראות בעצמם, בואו לגן, תראו איך ילד פותר ריב לבד. וכשהם רואים, הם מבינים. הבניית האמון הזאת מול הורים לקחה לי זמן, אבל היום אני מרגישה שיש לי אותו, ושזה נבנה דרך עקביות ולא דרך ויכוחים.</w:t>
       </w:r>
     </w:p>
     <w:p>
@@ -8947,7 +9016,7 @@
           <w:szCs w:val="24"/>
           <w:rtl w:val="1"/>
         </w:rPr>
-        <w:t>האם את מרגישה שתפקידך כגננת כולל קידום ערכים של שוויון וצדק חברתי? כיצד?</w:t>
+        <w:t>האם את מרגישה שתפקידך כגננת כולל קידום ערכים של שוויון וצדק חברתי? תארי לי כיצד.</w:t>
       </w:r>
     </w:p>
     <w:p>
@@ -8971,7 +9040,7 @@
           <w:szCs w:val="24"/>
           <w:rtl w:val="1"/>
         </w:rPr>
-        <w:t>לגמרי. אני רואה בזה חלק בלתי נפרד ומרכזי מהמקצוע, לא איזו תוספת. אני חושבת, אולי מתוך הראייה הצעירה שלי, שגננת שלא מקדמת את הערכים האלה מפספסת את הכוח האמיתי של הגיל הזה. אני עושה את זה בעיקר דרך יצירת תחושת קהילה בגן, שכולם מרגישים שייכים, שאף אחד לא לבד, שכל אחד רצוי בדיוק כמו שהוא. ובעיקר אני מאמינה בכוח של החוויה על פני ההטפה. ילד שחווה בגן, על בשרו, מה זה צדק ושייכות, לוקח את זה איתו הלאה. אני מרגישה שאני זורעת את הזרעים של החברה שהילדים האלה יבנו בעוד עשרים שנה.</w:t>
+        <w:t>בכל הלב אני מרגישה שזה חלק מהתפקיד שלי, אולי אפילו החלק הכי חשוב. אני יודעת שיש מי שיגיד שגננת צריכה בעיקר ללמד צבעים ואותיות ולהכין לכיתה א, ואני עושה את זה כמובן, אבל בעיניי אני עושה משהו הרבה יותר גדול. אני מגדלת את האזרחים של מחר, את האנשים שבעוד עשרים שנה יחליטו איך החברה שלנו נראית. ואם הם יגדלו עם היכולת לזהות עוול, להרגיש אמפתיה במקום קנאה, לתת לחבר עוד ארגז כשהוא צריך, אז עשיתי משהו שישאר איתם הרבה אחרי שישכחו איזה צבע יוצא מכחול וצהוב. הרקע שלי בחינוך לשלום הביא אותי לזה, ואני מרגישה שליחות אמיתית בעניין. אני לא תמימה, אני יודעת שאני לא אשנה את העולם מגן אחד בעיר, ואני עדיין צעירה ולומדת המון בכל יום. יש ימים שאני מרגישה שנכשלתי, שהיה בלגן והכול התפוצץ ולא הספקתי כלום מהחלומות הגדולים. אבל אז אני רואה ילד קטן ניגש לחבר ואומר לו בוא נדבר על זה בפינת הפיוס, ואני יודעת שזה נשתל. אז כן, שוויון וצדק חברתי הם בשבילי לא נושא בצד, הם הלב של להיות גננת.</w:t>
       </w:r>
     </w:p>
     <w:p>
@@ -8989,7 +9058,6 @@
         <w:rPr>
           <w:rFonts w:ascii="David" w:hAnsi="David" w:cs="David"/>
           <w:b/>
-          <w:i w:val="0"/>
           <w:sz w:val="28"/>
           <w:szCs w:val="28"/>
           <w:rtl w:val="1"/>
@@ -9007,7 +9075,6 @@
         <w:rPr>
           <w:rFonts w:ascii="David" w:hAnsi="David" w:cs="David"/>
           <w:b w:val="0"/>
-          <w:i w:val="0"/>
           <w:sz w:val="22"/>
           <w:szCs w:val="22"/>
           <w:rtl w:val="1"/>
@@ -9036,7 +9103,7 @@
           <w:szCs w:val="24"/>
           <w:rtl w:val="1"/>
         </w:rPr>
-        <w:t>ספרי לי קצת על עצמך ועל התפקיד שלך. מי את, כמה שנים את בתחום, ואיך הגעת למקצוע?</w:t>
+        <w:t>ספרי לי קצת על עצמך ועל הדרך המקצועית שלך. מי את, כמה שנים את בתחום, ומה הביא אותך להיות גננת?</w:t>
       </w:r>
     </w:p>
     <w:p>
@@ -9060,7 +9127,7 @@
           <w:szCs w:val="24"/>
           <w:rtl w:val="1"/>
         </w:rPr>
-        <w:t>תמר, בת ארבעים ותשע, אמא לארבעה, וגננת כבר עשרים ושתיים שנה. והדרך שלי למקצוע קשורה מאוד למי שאני. גדלתי במשפחה גדולה ומעוטת אמצעים, הייתי אחת מהילדים ש"אין להם". וזו חוויה שמלווה אותי כל החיים. אני זוכרת עד היום את ההרגשה של להיות הילדה עם הבגדים המשומשים, זו שהתביישה. הזיכרונות האלה הם המצפן המקצועי שלי. הפכתי לגננת בין השאר כדי לוודא שילדים אחרים לא יעברו את מה שאני עברתי. אני אישה מאוד שיטתית, אבל מתחת לזה יש לב שמאוד מזדהה עם החלש.</w:t>
+        <w:t>קוראים לי תמר פרידמן, אני בת ארבעים ותשע, ואני בתחום עשרים ושתיים שנה. כל השנים האלה בגני ילדים, בלי הפסקה כמעט, חוץ מחופשות הלידה שלי. אני אמא לארבעה, שני גדולים כבר בצבא ואחרי, ושניים עדיין בבית. מה שהביא אותי לזה, האמת, זה לא איזו קריאה גדולה מגיל צעיר. גדלתי במשפחה גדולה, שבעה ילדים, ומעט מאוד כסף. הייתי הילדה שאין לה, שמגיעה ליום הולדת בלי מתנה ומתביישת. את התחושה הזאת אני זוכרת עד היום בבטן. ורק אחר כך, כשכבר עבדתי עם ילדים, הבנתי שזה בעצם המצפן שלי. אני נכנסתי לתחום כי רציתי להיות המבוגרת שאני הייתי צריכה שתהיה שם בשבילי.</w:t>
       </w:r>
     </w:p>
     <w:p>
@@ -9084,7 +9151,7 @@
           <w:szCs w:val="24"/>
           <w:rtl w:val="1"/>
         </w:rPr>
-        <w:t>לימדת בגנים נוספים לפני כן? מה היה שונה בין הגנים?</w:t>
+        <w:t>לימדת בגנים נוספים לפני כן? תארי לי מה היה שונה בין הגנים.</w:t>
       </w:r>
     </w:p>
     <w:p>
@@ -9108,7 +9175,7 @@
           <w:szCs w:val="24"/>
           <w:rtl w:val="1"/>
         </w:rPr>
-        <w:t>כן, עבדתי בכמה גנים בשכונות שונות לאורך השנים. השוני הכי גדול היה ברמת המצוקה של המשפחות. בכל מקום למדתי משהו, אבל בכל מקום ראיתי את אותו דבר, את הילד שאין לו, זה שמתבייש. וזה תמיד החזיר אותי לילדות שלי.</w:t>
+        <w:t>כן, עבדתי בשלושה גנים לפני זה. הראשון היה בשכונה מבוססת מאוד, ושם הכל הגיע מהבית, ימי הולדת מפוארים, בגדים חדשים, והפערים צעקו. זה הפריע לי נורא, אבל אז הייתי צעירה ולא ידעתי איך לגעת בזה. הגן השני היה במושב קטן, אינטימי, שם למדתי כמה חשוב להכיר כל משפחה באמת. הגן השלישי היה בפריפריה, אוכלוסייה מוחלשת, ושם התחדדה אצלי כל התפיסה של כבוד הילד. ההבדל הכי גדול בין הגנים היה לא הילדים, הילדים דומים בכל מקום. ההבדל היה בציפיות של ההורים ובמה שהם הביאו איתם. בכל גן נהייתי קצת יותר שיטתית, כי הבנתי שאסור לי לסמוך רק על התחושה.</w:t>
       </w:r>
     </w:p>
     <w:p>
@@ -9132,7 +9199,7 @@
           <w:szCs w:val="24"/>
           <w:rtl w:val="1"/>
         </w:rPr>
-        <w:t>איזה גיל וקבוצה את מלמדת היום?</w:t>
+        <w:t>איזה גיל וקבוצה את מלמדת היום, וכמה ילדים בגן?</w:t>
       </w:r>
     </w:p>
     <w:p>
@@ -9156,7 +9223,7 @@
           <w:szCs w:val="24"/>
           <w:rtl w:val="1"/>
         </w:rPr>
-        <w:t>אני עם גן חובה, בני חמש-שש. שלושים ושלושה ילדים.</w:t>
+        <w:t>היום אני מלמדת גן חובה, הגילאים חמש עד שש, שנה לפני כיתה א. יש לי שלושים ושלושה ילדים בגן, שזה מספר גדול, ואני עם סייעת אחת ועוד סייעת שיבוץ חלקית. זו קבוצה מאתגרת בגלל הגודל, אבל דווקא בגן גדול אני מרגישה שהשיטתיות שלי מצילה אותי. עם שלושים ושלושה ילדים אי אפשר לזרום, צריך מפה. הקבוצה מעורבת מאוד, יש ילדים מבתים חזקים ויש ילדים שבאים מבתים שמאוד מתקשים, וזה בדיוק הגן שאני אוהבת, כי שם העבודה שלי הכי משמעותית. ביישוב מעורב, עם המון סיפורים שונים שנכנסים בשער בבוקר.</w:t>
       </w:r>
     </w:p>
     <w:p>
@@ -9180,7 +9247,7 @@
           <w:szCs w:val="24"/>
           <w:rtl w:val="1"/>
         </w:rPr>
-        <w:t>היכן הוכשרת?</w:t>
+        <w:t>היכן הוכשרת, ומה מהרקע שלך משפיע על הדרך שבה את עובדת?</w:t>
       </w:r>
     </w:p>
     <w:p>
@@ -9204,7 +9271,7 @@
           <w:szCs w:val="24"/>
           <w:rtl w:val="1"/>
         </w:rPr>
-        <w:t>למדתי חינוך במכללה אחרי הצבא. ומאז אני משתלמת כל הזמן, בעיקר בתחום ההכלה והצרכים המיוחדים, כי זה קרוב לליבי.</w:t>
+        <w:t>הוכשרתי במכללה לחינוך, תואר ראשון בחינוך לגיל הרך, ואחר כך עשיתי לימודי הסמכה להדרכה. אבל האמת שהרקע שהכי משפיע עליי הוא לא מה שלמדתי במכללה, הוא הבית שגדלתי בו. הייתי הילדה שאין לה, וזה נשאר בי כמו חותם. אני זוכרת יום שלם שהתביישתי כי לא היה לי מה להביא, וזה עיצב אותי. לכן כל דבר שקשור בהצגת עצמך מול הקבוצה עובר אצלי בדיקה מראש. אני עובדת עם מפה של הגן בראש ובכתב, כי אני יודעת שהתחושה מטעה, היא תמיד רצה אל הרועשים והבולטים. הרקע שלי לימד אותי שהשקט הוא לפעמים בושה, לא נוחות.</w:t>
       </w:r>
     </w:p>
     <w:p>
@@ -9252,7 +9319,7 @@
           <w:szCs w:val="24"/>
           <w:rtl w:val="1"/>
         </w:rPr>
-        <w:t>כן, אני מדריכה במתי"א, מרכז תמיכה יישובי. אני מלווה גננות אחרות בעבודה עם ילדים עם צרכים מיוחדים. וזה מתחבר לכל מה שאני מאמינה בו, כי הוגנות אמיתית זה לתת לכל ילד את מה שהוא צריך.</w:t>
+        <w:t>כן, בהחלט. חוץ מהעבודה בגן אני מדריכה במתי"א, מרכז התמיכה היישובי לצרכים מיוחדים, וזה תפקיד שאני מאוד אוהבת. אני נכנסת לגנים אחרים, מלווה גננות צעירות, עוזרת להן לבנות מערכים לילדים עם קשיים. זה מחזיר אותי לעצמי, כי אני רואה מהצד את מה שאני עושה בתוך הגן שלי. בתוך הגן אני גם רכזת בטיחות, וזה מתחבר לי לאישיות השיטתית, אני אוהבת סדר, נהלים, לדעת שהכל בדוק. ההדרכה במתי"א נתנה לי כלים לזהות מוקדם ילד שנופל בין הכיסאות, וזה בדיוק הילד שאני הכי שומרת עליו.</w:t>
       </w:r>
     </w:p>
     <w:p>
@@ -9276,7 +9343,7 @@
           <w:szCs w:val="24"/>
           <w:rtl w:val="1"/>
         </w:rPr>
-        <w:t>כשאת שומעת את המונח "צדק בגן הילדים", מה המחשבה הראשונה שעולה לך?</w:t>
+        <w:t>כשאת שומעת את המונח "צדק בגן הילדים", מה המחשבה הראשונה שעולה לך? תארי לי.</w:t>
       </w:r>
     </w:p>
     <w:p>
@@ -9300,7 +9367,7 @@
           <w:szCs w:val="24"/>
           <w:rtl w:val="1"/>
         </w:rPr>
-        <w:t>שזה מושג הרבה יותר מורכב ממה שנדמה. אנשים מבחוץ חושבים שצדק בגן זה פשוט לחלק שווה בשווה. אבל אני, אחרי עשרים ושתיים שנה ומתוך מי שאני, יודעת שזה בדיוק ההפך. צדק אמיתי דורש ממני להכיר כל ילד לעומק, לדעת מה הוא באמת צריך, ולתת לו את מה שיאזן אותו. וזה כמעט אף פעם לא אותו דבר כמו לאחרים. זה מושג שדורש עבודה, הוא לא סיסמה של כולם שווים. אני תמיד מסתכלת קודם על הילד הספציפי שמולי, על הסיפור שלו, ולא על הכלל המופשט.</w:t>
+        <w:t>המחשבה הראשונה שעולה לי היא שצדק זה לא לחלק שווה בשווה. הרבה אנשים חושבים שצדק זה שכולם מקבלים אותו דבר, אותה כמות, אותו זמן, אותו יחס. אני חושבת בדיוק ההפך. צדק בגן זה להכיר כל ילד ולתת לו את מה שהוא צריך, וזה שונה מילד לילד. אם יש לי ילד שבא רעב מהבית, לתת לו פרוסה כמו לכולם זה לא צדק, זה עיוורון. אני זוכרת ילד אחד, נקרא לו יונתן, שהיה מגיע כל בוקר עייף וחסר, כי בבית היה בלגן. לתת לו את אותו יחס כמו לילד ששלושה מבוגרים דואגים לו בבוקר, זה לא הוגן. הצדק שלי מתחיל בזה שאני מסתכלת על הפער לפני שאני מחלקת. אני גם חושבת מיד על בושה. בשבילי צדק וכבוד זה כמעט אותו דבר, כי חוסר צדק בגן הוא כמעט תמיד בושה שילד סוחב על הגב. ולכן כשאני שומעת צדק, אני שומעת בעיקר את השאלה, מי כאן עלול להתבייש, ואיך אני מונעת את זה מראש, בשקט, בלי שאף אחד ישים לב. אני גם לא סומכת על התחושה שלי לבד, כי התחושה תמיד רצה אל הרועשים ואל החזקים, ומשאירה מאחור בדיוק את הילד שהכי צריך אותי. אז יש לי מפה, בראש ובכתב, של מי צריך מה. הצדק בשבילי הוא דבר שיטתי, לא רומנטי, כי רק שיטה שומרת שלא אפספס את השקט שיושב בפינה ולא מבקש כלום.</w:t>
       </w:r>
     </w:p>
     <w:p>
@@ -9324,7 +9391,7 @@
           <w:szCs w:val="24"/>
           <w:rtl w:val="1"/>
         </w:rPr>
-        <w:t>האם נושא הצדק החברתי מהווה חלק מהתפיסה החינוכית שלך? איך זה בא לידי ביטוי?</w:t>
+        <w:t>האם נושא הצדק החברתי הוא חלק מהתפיסה החינוכית שלך? תארי לי איך זה בא לידי ביטוי ביום-יום.</w:t>
       </w:r>
     </w:p>
     <w:p>
@@ -9348,7 +9415,7 @@
           <w:szCs w:val="24"/>
           <w:rtl w:val="1"/>
         </w:rPr>
-        <w:t>זה חלק מרכזי, ואי אפשר להפריד אותו מהרקע האישי שלי. אני יודעת מבפנים, לא מספרים, איך זה מרגיש להיות הילד שאין לו. וזה הופך אותי לרגישה במיוחד למניעת בושה, שזה אולי הערך הכי חשוב שלי. זה בא לידי ביטוי בהמון החלטות קטנות. באיך אני מנסחת בקשות להורים, אני אף פעם לא אבקש ציוד יקר. בהחלטה שלי שכל החומרים המשמעותיים יגיעו מהגן, לא מהבית, כדי לנטרל את הפערים. אני עושה ממש הכול, לפעמים דברים שאף אחד לא רואה, כדי שאף ילד לא ירגיש נחות בגלל המצב הכלכלי של המשפחה שלו.</w:t>
+        <w:t>כן, בהחלט, וזה לא סיסמה אצלי, זה עבודת יומיום קטנה ולא רועשת. הצדק החברתי אצלי מתבטא קודם כל בזה שכל החומרים המשמעותיים מגיעים מהגן, לא מהבית. אני לא מבקשת שיביאו מהבית חטיף מיוחד, מתנה, תחפושת יקרה. ברגע שהילדים עוברים את השער, כולם שווים, וזה עיקרון קדוש אצלי. אני זוכרת שנה שבה ביקשו בגן שכן שכל ילד יביא בקבוק מים מעוצב, וראיתי ילדה אחת שהביאה בקבוק פלסטיק ישן והסתירה אותו. מאז אצלי הכל אחיד ומהגן. עוד דבר, אני עובדת עם רוטציה יזומה בפינות. בפינת הבנייה, למשל, אני לא נותנת שרק החזקים ישתלטו על הקוביות, יש סבב, יש שמות, יש סדר. זה נראה קטן, אבל ילד שאף פעם לא מגיע לקוביות לומד שהעולם שייך לאחרים. אני לא מוכנה לזה. הצדק החברתי בגן הוא לא שיעור שאני מעבירה, הוא האוויר שהילדים נושמים בלי לדעת. הם לא יודעים שאני מסדרת את זה, וזה בדיוק היופי, שהם פשוט חיים במקום שבו יש להם מקום, וזה נכנס להם לגוף לכל החיים. גם בימי הולדת אני עובדת אותו דבר, עוגה של הגן וכתר לכולם, בלי מתנות ובלי הפקות, כי אני לא מוכנה שילד אחד יחגוג בגדול וילד אחר יסתכל מהצד ויידע שלו אין. בשבילי הצדק החברתי מתחיל בדברים הכי קטנים והכי יומיומיים, ודווקא שם הוא נשמר או נשבר.</w:t>
       </w:r>
     </w:p>
     <w:p>
@@ -9372,7 +9439,7 @@
           <w:szCs w:val="24"/>
           <w:rtl w:val="1"/>
         </w:rPr>
-        <w:t>כיצד את מחלקת את תשומת הלב שלך בין הילדים במהלך היום?</w:t>
+        <w:t>תארי לי כיצד את מחלקת את תשומת הלב שלך בין הילדים במהלך יום שלם.</w:t>
       </w:r>
     </w:p>
     <w:p>
@@ -9396,7 +9463,7 @@
           <w:szCs w:val="24"/>
           <w:rtl w:val="1"/>
         </w:rPr>
-        <w:t>אני עובדת מאוד בשיטתיות, זה חלק מהאופי שלי. יש לי בראש, וגם על הכתב, מפה של כל הילדים, ואני עוברת עליה כל יום. החלטתי מזמן לא לסמוך רק על התחושה, כי למדתי שהתחושה מטעה. היא מובילה אותך תמיד לרועשים, למי שבוכה, ומזניחה בלי כוונה את השקטים. אז אני עובדת מתוכנן, ומוודאת שכל ילד, גם הבלתי נראה, מקבל ממני משהו אישי כל יום. ואני מנצלת מאוד את הצוות, יש לי תיאום הדוק עם הסייעת. חלוקת תשומת לב הוגנת היא לא דבר שקורה מעצמו, היא דורשת ניהול.</w:t>
+        <w:t>עם שלושים ושלושה ילדים, אם אני אחלק תשומת לב לפי התחושה, אני אתן את הכל לחמישה ילדים רועשים ואשכח את השאר. לכן אני עובדת עם מפה. פשוטו כמשמעו, יש לי בראש ובכתב רשימה של הילדים, ואני מסמנת לעצמי בסוף כל יום למי לא נגעתי היום, עם מי לא החלפתי מילה אמיתית. יש ילדים שאתה יכול לעבור עליהם שבוע שלם בלי לשים לב, כי הם שקטים, נוחים, לא מפריעים. הילדים האלה מפחידים אותי הכי הרבה, כי אני הייתי אחת מהם. אני זוכרת את עצמי בגן, ילדה שקטה שאף אחד לא ראה, וזה כאב. אז בבוקר אני מקבלת כל ילד בשמו בכניסה, זו נקודת מגע מובטחת אחת. במהלך היום אני מנווטת את עצמי לפי המפה, לא לפי הרעש. אם דנה השקטה ישבה לבד בפינת היצירה, אני הולכת אליה גם אם בצד השני שני ילדים רבים, כי על הריב אני יכולה לסמוך שיקרא לי, על השקט של דנה אף אחד לא יקרא. זה מאמץ מודע, זה לא זורם לי מעצמו, אבל אחרי עשרים ושתיים שנה זה כבר נהיה טבע שני שנשען על סדר.</w:t>
       </w:r>
     </w:p>
     <w:p>
@@ -9420,7 +9487,7 @@
           <w:szCs w:val="24"/>
           <w:rtl w:val="1"/>
         </w:rPr>
-        <w:t>כשיש ילד שזקוק ליותר תשומת לב, רגשית, חברתית או לימודית, איך את מאזנת את זה מול שאר הילדים?</w:t>
+        <w:t>תארי לי מצב שבו ילד זקוק ליותר תשומת לב, רגשית, חברתית או לימודית. איך את מאזנת את זה מול שאר הילדים?</w:t>
       </w:r>
     </w:p>
     <w:p>
@@ -9444,7 +9511,7 @@
           <w:szCs w:val="24"/>
           <w:rtl w:val="1"/>
         </w:rPr>
-        <w:t>אני מאמינה שאיזון לא אומר בהכרח שוויוניות מוחלטת. ילד שזקוק ליותר יקבל יותר, וזו אחריות מקצועית, לא חסד. הדרך שאני מאזנת את זה מול הקבוצה היא דרך שקיפות מותאמת לגיל. אני מלמדת את הילדים, בשפה שלהם, שכל אחד מקבל מה שהוא צריך, וזה בסדר גמור שזה שונה מילד לילד. והם מבינים את זה הרבה יותר טוב משאנחנו נוטים לחשוב. כשילד שואל למה את עוזרת לו ולא לי, אני עונה בכנות, כי עכשיו הוא צריך, וכשאתה תצטרך אני אהיה שם בשבילך בדיוק אותו דבר. וזה עובד, כי זה אמיתי.</w:t>
+        <w:t>קרה לי לפני כמה שנים ילד, נקרא לו איתמר, שהגיע אחרי גירושים קשים והיה פשוט מתפרק. בכה, נצמד אליי, לא הצליח להיפרד בבוקר. הוא היה צריך ממני פי כמה מכולם, וזה יצר לי דילמה אמיתית, כי כשאני מחזיקה את איתמר עשרים דקות בבוקר, שלושים ושניים ילדים אחרים בלי מבוגר צמוד. מה שעשיתי, קודם כל, לא הסתרתי מעצמי שזה קורה על חשבון מישהו, כי אם אני אשקר לעצמי אני אפספס את השאר. אז חילקתי את התלות. הכנתי לאיתמר פינה קבועה עם תמונה של אמא שלו, נתתי לו תפקיד של עוזר בבוקר כדי שיהיה לו עוגן. את הזמן הרגשי הצמוד נתתי לו, אבל בזמנים מתוכננים, לא בכל רגע שהוא ביקש, כי אחרת בלעתי אותו את כל היום. ובמקביל שמתי לב מי הילדים ששילמו את המחיר של תשומת הלב שהלכה אליו, ואליהם הלכתי ביוזמתי אחר הצהריים. איזון זה לא לתת לכולם שווה, זה להיות ער למי שנשאר בצל בזמן שאני מטפלת במשבר, ולחזור אליו. הרבה פעמים דווקא הילד הכי טוב, זה שלא מבקש, הוא זה שמשלם, ואותו אני מחפשת בכוונה. וכן, זה מתיש, כי אתה כל הזמן עושה חשבון בראש של מי קיבל ומי לא, אבל בלי החשבון הזה הצדק פשוט מתפורר לך בין הידיים.</w:t>
       </w:r>
     </w:p>
     <w:p>
@@ -9468,7 +9535,7 @@
           <w:szCs w:val="24"/>
           <w:rtl w:val="1"/>
         </w:rPr>
-        <w:t>כיצד מתבצעת חלוקת החומרים והמשאבים הפיזיים בגן, הצעצועים והציוד? מה הקו המנחה שלך?</w:t>
+        <w:t>תארי לי כיצד מתבצעת חלוקת החומרים והמשאבים הפיזיים בגן (צעצועים, ציוד, אופניים). מה הקו המנחה שלך?</w:t>
       </w:r>
     </w:p>
     <w:p>
@@ -9492,7 +9559,7 @@
           <w:szCs w:val="24"/>
           <w:rtl w:val="1"/>
         </w:rPr>
-        <w:t>הקו שלי הוא נגישות שווה בנקודת הפתיחה. כל החומרים פתוחים וזמינים לכולם באותה מידה, אין פינות VIP. אבל, ומתוך הניסיון שלי, אני שמה לב שילדים מסוימים, בגלל אופי דומיננטי, נוטים להשתלט על משאבים ולנשל מהם את האחרים. אז אני לא מסתפקת בפתיחות התיאורטית, אני מתערבת. אם אותם שלושה ילדים תופסים כל בוקר את פינת הבנייה, אני יוצרת מנגנון, תור או ימים קבועים, שמאפשר גם לאחרים להיכנס. למדתי שהפתיחות לבדה לא מספיקה, כי בשטח היא משרתת את החזקים. צריך גם לשמור עליה, אחרת החופש הופך לשלטון של החזקים על החלשים.</w:t>
+        <w:t>הקו המנחה שלי הוא שהכל אחיד, וכמעט הכל מגיע מהגן. אין אצלי אופניים פרטיים שילד הביא מהבית ורוכב עליהם בזמן שאחר מסתכל, כי זה מתכון לבושה ולקנאה. הצעצועים, האופניים, הקורקינטים, הכל של הגן, וזה מיישר את המגרש ברגע שנכנסים בשער. אבל אחידות בבעלות זה לא אותו דבר כמו חלוקה, כי גם על ציוד משותף אפשר להשתלט. באופניים, למשל, אני עובדת עם שיטה של זמן ותור, יש שעון חול, יש שמות, ילד יודע שהתור שלו יגיע ומתי. זה נשמע נוקשה, אבל דווקא הסדר הזה מרגיע את הילדים, כי הם לא צריכים להילחם על כל דבר. אני זוכרת שכשלא היה סדר, תמיד אותם שלושה ילדים חזקים תפסו את כל האופניים, והחלשים למדו לוותר בשקט. אני שונאת את הוויתור השקט הזה, כי אני מכירה אותו מבפנים. אז הקו שלי הוא, משאבים אחידים מהגן, וחלוקה שמובטחת בסדר ולא בכוח. ילד שיודע לצעוק חזק לא אמור לקבל יותר אופניים מילד שמחכה בשקט. הסדר הוא שמגן על הביישן. ואם יש ילד עם קושי מוטורי, שמתקשה על האופניים הרגילים, אני דואגת שיהיה גם ציוד שמתאים לו, כי חלוקה הוגנת זה לא רק כמה זמן, זה גם מה מתאים לכל גוף. הכל מהגן, הכל אחיד, אבל בתוך האחידות אני עדיין מסתכלת על הילד הספציפי ומה הוא צריך כדי להשתתף בכבוד.</w:t>
       </w:r>
     </w:p>
     <w:p>
@@ -9516,7 +9583,7 @@
           <w:szCs w:val="24"/>
           <w:rtl w:val="1"/>
         </w:rPr>
-        <w:t>האם לדעתך חלוקה "שווה" וחלוקה "הוגנת" הן אותו דבר? תני דוגמה מהגן.</w:t>
+        <w:t>האם לדעתך חלוקה "שווה" וחלוקה "הוגנת" הן אותו דבר? תני דוגמה מהגן שממחישה את ההבדל.</w:t>
       </w:r>
     </w:p>
     <w:p>
@@ -9540,7 +9607,7 @@
           <w:szCs w:val="24"/>
           <w:rtl w:val="1"/>
         </w:rPr>
-        <w:t>ממש לא. בעיניי זו ההבחנה הכי חשובה בכל החינוך. שווה זה מכני, זו חלוקה של מחשב שלא מכיר את הילדים. הוגן זה אנושי. תשמעי דוגמה מהגן. בפעילות ריצה בחצר, אם אני נותנת לכולם לצאת מאותו קו ומכריזה על תחרות, זה נראה שוויוני. אבל יש לי ילד עם קושי מוטורי, שאין לו שום סיכוי, והוא תמיד יגיע אחרון ויחווה השפלה. אז החלטתי שאנחנו לא עושים תחרויות ריצה קלאסיות בכלל. במקום זה משחקים שיתופיים, שכולם מנצחים יחד. זה השינוי משוויון פורמלי להוגנות מהותית, לפעמים כדי להיות הוגן צריך לשנות את הכללים עצמם.</w:t>
+        <w:t>לא, בשום פנים לא אותו דבר, וזה בעצם כל הסיפור שלי. חלוקה שווה זה שכולם מקבלים בדיוק אותו דבר. חלוקה הוגנת זה שכל אחד מקבל את מה שהוא צריך. אתן דוגמה מהגן. הייתה לי ילדה, שירה, עם קושי מוטורי, לא הצליחה לרוץ כמו כולם. בגן שלנו נהגו לעשות תחרויות ריצה בחצר, ומי שמנצח מקבל מדבקה. חלוקה שווה, כביכול, כי לכולם אותו מסלול ואותו קו זינוק. אבל זה לא הוגן בכלל, כי שירה יודעת מראש שהיא תגיע אחרונה, כל פעם, מול כל הגן. זו לא תחרות בשבילה, זו בושה מתוזמנת. אז ויתרתי על תחרויות הריצה הקלאסיות ועברתי למשחקים שיתופיים, שבהם כל הקבוצה משיגה מטרה ביחד, בלי מנצח ומפסיד יחיד. זה היה הוגן, כי זה נתן לשירה מקום להצליח. שווה זה למדוד את כולם באותה סרגל, וזה נשמע צודק אבל זה אכזרי למי שהסרגל לא בנוי בשבילו. הוגן זה לשנות את המשחק כך שגם היא תוכל לזרוח. אני מעדיפה תמיד את ההוגן, גם אם מבחוץ הוא נראה פחות שווה. אני זוכרת את עצמי ילדה, שכולם נמדדו באותה סרגל של מי הביא מה מהבית, ואני תמיד יצאתי הנמוכה, לא באשמתי. אז כשאני רואה סרגל אחד לכל הילדים, אני כבר יודעת מי ישלם את המחיר, וזה תמיד החלש. לכן אני מוכנה לוותר על השוויון היבש לטובת הוגנות שמסתכלת על כל ילד בעיניים.</w:t>
       </w:r>
     </w:p>
     <w:p>
@@ -9564,7 +9631,7 @@
           <w:szCs w:val="24"/>
           <w:rtl w:val="1"/>
         </w:rPr>
-        <w:t>כיצד את מתמודדת עם מצב שילד מסוים "לוקח" יותר מקום במרחב הקבוצתי?</w:t>
+        <w:t>תארי לי מצב שבו ילד מסוים "לוקח" יותר מקום במרחב הקבוצתי, וכיצד את מתמודדת עם זה.</w:t>
       </w:r>
     </w:p>
     <w:p>
@@ -9588,7 +9655,7 @@
           <w:szCs w:val="24"/>
           <w:rtl w:val="1"/>
         </w:rPr>
-        <w:t>אני מסתכלת על זה כצורך שצריך להבין ולתת לו מענה, לא כהתנהגות רעה שצריך רק לדכא. ילד שלוקח הרבה מקום כמעט תמיד מבקש בזה משהו, ביטחון, תשומת לב, שליטה. אני נותנת לו מסגרת שבתוכה הוא יכול לבטא את הכוח שלו בצורה חיובית, ומצד שני עובדת איתו בעקביות על גבולות ברורים, כי דווקא ילדים כאלה זקוקים לגבול בטוח. אבל החלק שהכי חשוב לי, וזה שוב מהרקע שלי, זו העבודה המקבילה על השקטים שנדחקים לפינה. אני מעצימה בכוח את החלש בזמן שאני מווסתת בעדינות את החזק, עד שיש מקום לכולם.</w:t>
+        <w:t>יש לי כל שנה ילד או שניים כאלה, שממלאים את כל החדר. ילד שמדבר הכי חזק, תופס את כל הצעצועים, נכנס לכל שיחה. היה לי ילד, ניר, כזה, כריזמטי, חכם, אבל פשוט בלע את הגן. שאר הילדים נמחקו לידו, ובעיקר הביישנים. הדבר הראשון שאני עושה, אני לא נלחמת בילד הזה, כי הוא לא רע, הוא פשוט חזק. אני מנתבת את הכוח שלו. נתתי לניר תפקידים שדורשים לתת מקום לאחרים, למשל אחראי על סבב הדיבור במעגל, שיצטרך דווקא הוא לקרוא בשמות של הילדים השקטים. פתאום הכוח שלו התחיל לשרת את הקבוצה במקום לבלוע אותה. במקביל, וזה החלק החשוב, אני עובדת על הצד השני, על הילדים שנדחקו. הרוטציה בפינות עוזרת פה מאוד, כי בפינת הבנייה ניר לא יכול פשוט להשתלט, יש סבב, יש שמות, וילד שקט יודע שגם התור שלו מובטח. אני חושבת שהטעות של גננות היא לראות רק את הרעשן. אני מסתכלת גם על מי שהתכווץ בפינה בזמן שהרעשן מילא את החלל, כי אותו לא שומעים, ואותו הכי קל לאבד. אני עובדת עם זה גם דרך המפה שלי, מסמנת לעצמי מי הילד שנדחק היום, ואליו אני הולכת ביוזמתי, כי הוא לא יבוא אליי. הרעשן תמיד ימצא את דרכו אליי, השקט צריך שאני אמצא אותו. וזה בדיוק המקום שבו אני מרגישה שהעבודה שלי הכי חשובה, כי שם, בפינה השקטה, יושבת הילדה שהייתי פעם.</w:t>
       </w:r>
     </w:p>
     <w:p>
@@ -9612,7 +9679,7 @@
           <w:szCs w:val="24"/>
           <w:rtl w:val="1"/>
         </w:rPr>
-        <w:t>כיצד את מתמודדת עם מצבים של הדרה חברתית, ילד שהקבוצה לא מקבלת ולא רוצים לשחק איתו?</w:t>
+        <w:t>תארי לי מצב של הדרה חברתית בגן, ילד שהקבוצה לא מקבלת ולא רוצים לשחק איתו. כיצד את פועלת?</w:t>
       </w:r>
     </w:p>
     <w:p>
@@ -9636,7 +9703,7 @@
           <w:szCs w:val="24"/>
           <w:rtl w:val="1"/>
         </w:rPr>
-        <w:t>זה נוגע לי עמוק בלב, כי אני הייתי בעצמי ילדה שלא תמיד קיבלו. אז אני מזהה הדרה מרחוק ולא מוכנה לתת לה לעבור. עם הילד המודר אני עובדת בעדינות, מנסה להבין מה מרחיק ממנו את האחרים. אבל בעיקר אני משקמת את המעמד החברתי שלו, מוצאת את החוזקה שלו והופכת אותו למומחה בגן, למישהו שכדאי להיות לידו. עם הקבוצה אני עובדת דרך ספרות ומשחקי תפקידים על קבלה. וכשהילדים רואים שאני מעריכה ומחבבת את הילד המודר, הם מושפעים מזה מאוד. הדרה לא נפתרת לבד, היא דורשת התערבות פעילה ונחושה של המבוגרים.</w:t>
+        <w:t>זה אחד הדברים הכי כואבים בעבודה, וגם הכי חשובים לי, כי אני יודעת מבפנים מה זה להיות בחוץ. היה לי ילד, עומר, קצת שונה, מדבר על דברים משלו, והילדים פשוט לא רצו אותו. אמרו לו לך מפה, זה לא בשבילך. אני לא מתערבת בזה עם נאום על יפה לשחק עם כולם, כי זה לא עובד, זה רק מסמן את הילד עוד יותר כמסכן שהגננת צריכה להגן עליו. מה שאני עושה זה עבודה שקטה ומאחורי הקלעים. קודם כל בדקתי מה עומר יודע לעשות טוב, וגיליתי שהוא מדהים בפאזלים. אז יצרתי מצב שבו הוא היה המומחה, בניתי סביבו פעילות שבה ילדים צריכים אותו כדי להצליח. פתאום הם ראו אותו אחרת. שנית, זיווגתי אותו בהתחלה עם ילד אחד רך ומקבל, לא עם כל הקבוצה בבת אחת, כי חברות נבנית באחד על אחד. הדרה זה לא בעיה של הילד המודר, זו בעיה של הקבוצה, ואת הקבוצה אני מלמדת דרך חוויות משותפות מוצלחות, לא דרך מוסר. לוקח זמן, לפעמים חודשים, אבל לראות את עומר מוזמן סוף סוף למשחק, זה שווה הכל, כי אני יודעת בדיוק מה הוא הרגיש עד אז.</w:t>
       </w:r>
     </w:p>
     <w:p>
@@ -9660,7 +9727,7 @@
           <w:szCs w:val="24"/>
           <w:rtl w:val="1"/>
         </w:rPr>
-        <w:t>האם בגן שלך יש ילדים מרקעים חברתיים או כלכליים שונים? כיצד זה בא לידי ביטוי ביום-יום?</w:t>
+        <w:t>האם בגן שלך יש ילדים מרקעים חברתיים או כלכליים שונים? תארי לי כיצד זה בא לידי ביטוי בפרקטיקה היומיומית.</w:t>
       </w:r>
     </w:p>
     <w:p>
@@ -9684,7 +9751,7 @@
           <w:szCs w:val="24"/>
           <w:rtl w:val="1"/>
         </w:rPr>
-        <w:t>כן, מאוד, ואני רגישה לזה במיוחד בגלל מי שאני ואיפה שגדלתי. זה בא לידי ביטוי בהמון נקודות עדינות, בקופסאות האוכל, בביגוד, ביכולת של הורים לתרום או לממן. אני מנהלת את הגן במודע ככה שכל המשאבים המשמעותיים יגיעו מהגן ולא מהבית. כשיש טיול, הגן דואג לאוכל לכולם, כדי שלא ייווצר מצב שילד אחד מוציא כריך יבש וילד אחר ארוחה מפוארת. אני לא יכולה לשנות את מה שקורה בבית של הילדים, וזה כואב. אבל אני יכולה לוודא שברגע שהם עוברים את השער, הם נכנסים למרחב שבו כולם שווים.</w:t>
+        <w:t>כן, מאוד, זה בדיוק אופי הגן שלי ביישוב המעורב. יש לי ילדים מבתים מאוד מבוססים לצד ילדים שהמשפחה שלהם בקושי מחזיקה את הראש מעל המים. זה בא לידי ביטוי בהמון דברים קטנים שהורים לא רואים. יש ילד שמגיע עם כריך מלא ומפנק ויש ילד שאין לו מה לאכול בעשר, אז אצלי יש תמיד אוכל של הגן, ואני מגישה לכולם מהמטבח, בלי לשאול מי הביא ומי לא. ככה אף אחד לא סופר. בטיולים אני לא מבקשת כסף מההורים לדברים מיוחדים, כי אני יודעת שיש בית שבשבילו חמישים שקל זה הרבה. אני זוכרת את עצמי ילדה, כשביקשו כסף לטיול ואמא שלי התביישה להגיד שאין. את התחושה הזאת אני לא נותנת לאף ילד בגן שלי לחוות. בגדים, אני שומרת בגן מלאי של חילופים נקיים, ואם ילד מתלכלך אני מחליפה לו בלי דרמה, כאילו זה הכי טבעי. הפרקטיקה שלי בנויה כדי שהפער הכלכלי פשוט לא יופיע על הרצפה של הגן. הכסף נשאר בחוץ, בשער. בפנים כולם אותו דבר, וזה עולה לי בעבודה ובמחשבה, אבל זה שווה כל רגע. אני מעדיפה להשקיע מהתקציב של הגן ומהזמן שלי, ובלבד שאף ילד לא ירגיש את הפער הזה על הרצפה מול חברים.</w:t>
       </w:r>
     </w:p>
     <w:p>
@@ -9708,7 +9775,7 @@
           <w:szCs w:val="24"/>
           <w:rtl w:val="1"/>
         </w:rPr>
-        <w:t>כיצד את מתמודדת עם הפערים הניכרים בין הילדים, בין השאר בתחום הרגשי, החברתי או הלימודי?</w:t>
+        <w:t>תארי לי כיצד את מתמודדת עם הפערים הניכרים בין הילדים, בין השאר בתחום הרגשי, החברתי או הלימודי.</w:t>
       </w:r>
     </w:p>
     <w:p>
@@ -9732,7 +9799,7 @@
           <w:szCs w:val="24"/>
           <w:rtl w:val="1"/>
         </w:rPr>
-        <w:t>בהתאמה אישית, ובהימנעות מוחלטת מהשוואות פומביות. אני אף פעם לא אומרת תראו איך הוא כבר יודע. אני יודעת מבפנים כמה מילים כאלה חורכות. אני עובדת עם כל ילד ביחס לעצמו בלבד, איפה הוא היה לפני חודש ואיפה הוא היום. כשיש פערים גדולים ומדאיגים, אני, כאדם שיטתי, פועלת מוקדם ובנחישות, פונה לגורמי המקצוע ולהורים. אני לא מאמינה בגישת זה יסתדר לבד, כי בגיל הזה כל שנה יקרה מפז. אבל מול הילד עצמו, המסר שלי הוא תמיד חיובי ומחזק, כי ילד שמרגיש שמאמינים בו פורח.</w:t>
+        <w:t>הפערים הם עצומים, בעיקר בגן חובה, כי זו שנה לפני כיתה א וההורים לחוצים. יש לי ילד שכבר קורא מילים ויש ילד שלא מכיר את השם שלו בכתב. הדבר הראשון שאני עושה, אני לא מסמנת את הפער החוצה. אני לא עושה קבוצת החזקים וקבוצת החלשים בשמות שהילדים מבינים, כי ילד בן חמש קולט מיד באיזו קבוצה הוא, וזו בושה. אני עובדת עם מה שאני קוראת עזרה בלתי נראית. אם יש ילד שמתקשה במשימה, אני ניגשת אליו כאילו במקרה, יושבת לידו, נותנת רמז קטן בלחישה, כך שמבחוץ נראה שהוא עשה את זה לבד. הכבוד שלו נשמר. אני זוכרת מורה שלי שהייתה מקריאה בקול מי לא הצליח, ואני זוכרת את הבושה עד היום בבטן, אז אני עושה בדיוק ההפך. בתחום הרגשי, ילד שמתקשה להיפרד בבוקר מקבל טקס פרטי משלו, לא הצגה מול כולם. בפערים אני מאמינה שהמטרה היא לצמצם אותם בעבודה, אבל בלי אף פעם להפוך אותם לתווית פומבית. ילד יכול להיות במקום נמוך ולעבוד עליו קשה, כל עוד הוא לא מרגיש שכל הגן יודע שהוא הנמוך. ההצלחה חייבת להיות שלו, גם אם אני ריפדתי אותה מלמטה.</w:t>
       </w:r>
     </w:p>
     <w:p>
@@ -9756,7 +9823,7 @@
           <w:szCs w:val="24"/>
           <w:rtl w:val="1"/>
         </w:rPr>
-        <w:t>איך נראה יום עבודה טיפוסי שלך בגן, ומהם הדברים שאת מקפידה עליהם מבחינת הוגנות?</w:t>
+        <w:t>תארי לי יום עבודה טיפוסי שלך בגן, ומהם הדברים שאת מקפידה עליהם מבחינת הוגנות.</w:t>
       </w:r>
     </w:p>
     <w:p>
@@ -9780,7 +9847,7 @@
           <w:szCs w:val="24"/>
           <w:rtl w:val="1"/>
         </w:rPr>
-        <w:t>יום אצלי מאוד מאורגן, זה האופי שלי. יש לי מפה של הגן בראש, ואני עוברת עליה. מה שאני הכי מקפידה עליו זה שכל ילד יקבל ממני משהו אישי כל יום, וזה לא קורה לבד, זה דורש שיטה. אני גם מאוד מקפידה על הדברים הקטנים שמונעים בושה, שכל החומרים מהגן, שלא צריך להביא כלום מהבית. ככה כולם שווים בתוך השער, יהיה המצב בבית מה שיהיה.</w:t>
+        <w:t>היום שלי מתחיל הרבה לפני שהילדים מגיעים. אני באה מוקדם ומסתכלת על המפה של היום, מה מתוכנן, ואני שואלת את עצמי שאלה אחת קבועה, מי כאן עלול להתבייש היום. זה נהיה אצלי אחרי סיפור שאני לא שוכחת. היה יום פיג'מות בגן, יוזמה כיפית, כולם באים בפיג'מה. והגיעה ילדה אחת בבגדים רגילים, כי בבית פשוט לא היו לה פיג'מות, ולא ידעו איך לספר לי. היא עמדה בדלת מכווצת, וכל הגן בפיג'מות סביבה. אני לא אשכח את הפנים שלה. מאותו יום אני בודקת כל פעילות מראש, כל יום נושא, כל בקשה, ושואלת אם יש ילד שהיא תחשוף אותו. בקבלת פנים אני מקבלת כל ילד בשמו. בארוחה כל האוכל מהגן, אחיד. בפעילות אני שומרת על רוטציה בפינות שלא רק החזקים ישלטו. לאורך היום אני מנווטת לפי המפה, מסמנת למי לא נגעתי. בסוף היום אני עושה חשבון נפש קטן, מי היום נשאר בצל. ההקפדה שלי על הוגנות היא לא ספונטנית, היא מתוכננת, כי למדתי בדרך הקשה שהספונטני הולך תמיד לרועשים ולחזקים, ומשאיר את השקטים מאחור. גם החומרים ליום ערוכים מראש ומהגן, כדי שאף ילד לא יצטרך להביא מהבית משהו שאין לו. אני מגיעה מוקדם בכוונה, כי חצי שעה של הכנה שקטה בבוקר שווה יום שלם שבו אף ילד לא ייפול בין הכיסאות. זה עולה לי באנרגיה, אבל זה הביטוח שלי מפני בושה.</w:t>
       </w:r>
     </w:p>
     <w:p>
@@ -9804,7 +9871,7 @@
           <w:szCs w:val="24"/>
           <w:rtl w:val="1"/>
         </w:rPr>
-        <w:t>האם חשוב בעינייך לזהות, לדבר ולפעול נגד מקרים לא צודקים בגן? כיצד ובאילו מקרים?</w:t>
+        <w:t>האם חשוב בעינייך לזהות, לדבר ולפעול נגד מקרים לא צודקים בגן? תארי לי כיצד ובאילו מקרים.</w:t>
       </w:r>
     </w:p>
     <w:p>
@@ -9828,7 +9895,7 @@
           <w:szCs w:val="24"/>
           <w:rtl w:val="1"/>
         </w:rPr>
-        <w:t>מאוד חשוב לי, ואני רגישה לזה במיוחד. כי אני, כמו שסיפרתי, הייתי ילדה שלא תמיד קיבלה. אז אני מזהה עוול מרחוק, בעיקר כשילד נפגע בגלל מה שאין לו. אני עוצרת ומטפלת, אבל בעדינות, כי לפעמים הטיפול הגלוי מדי מבייש עוד יותר. הכי הרבה אני עובדת על מניעה, על ליצור אקלים שבו עוול כזה בכלל לא קורה. זה עדיף על לתקן אחרי.</w:t>
+        <w:t>כן, מאוד חשוב לי, וזה אחד הדברים שאני הכי נחושה לגביהם. אני לא מהגננות שאומרות זה טבעי בגיל הזה ומעלימות עין. ילדים לומדים מאיתנו מה מותר, ואם אני עוברת ליד עוול ולא עוצרת, לימדתי אותם שזה בסדר. אני עוצרת בעיקר במקרים של בושה או הדרה, כי שם הפגיעה הכי עמוקה ואף אחד לא רואה אותה. אם ילד אומר לילד אחר אתה מסריח או אין לך בגדים יפים, אני עוצרת מיד, אבל לא בצעקה מול כולם, כי זה מבייש את שני הצדדים. אני לוקחת את הילד הפוגע הצידה, בשקט, ומדברת. אני זוכרת פעם שילדים צחקו על ילד שהביא כריך יבש, ואני הרגשתי את הבטן שלי מתהפכת, כי זו הייתי אני פעם. עצרתי את זה מיד, אבל גם דאגתי שלמחרת יהיה אוכל של הגן לכולם, כדי שהמצב בכלל לא יחזור. כי לזהות עוול ולדבר עליו זה חשוב, אבל הכי חשוב זה לפעול כך שהעוול לא יקרה שוב מלכתחילה. אני לא מסתפקת בלכבות שריפה, אני מנסה להזיז את מה שגרם לה. זה ההבדל בין גננת שמגיבה לגננת ששומרת מראש. ואת הילד הפוגע אני אף פעם לא מסמנת כרע, אני מסבירה לו בשקט מה הרגיש הילד השני, כי גם הוא ילד שלומד, ולפעמים הוא פוגע כי בבית פגעו בו.</w:t>
       </w:r>
     </w:p>
     <w:p>
@@ -9852,7 +9919,7 @@
           <w:szCs w:val="24"/>
           <w:rtl w:val="1"/>
         </w:rPr>
-        <w:t>האם קרה שקיבלת החלטה שבדיעבד הרגישה לך לא הוגנת? תארי, ואיך הרגשת עם זה?</w:t>
+        <w:t>תארי לי מקרה שבו קיבלת החלטה שבדיעבד הרגישה לך לא הוגנת. מה קרה, ואיך הרגשת?</w:t>
       </w:r>
     </w:p>
     <w:p>
@@ -9876,7 +9943,7 @@
           <w:szCs w:val="24"/>
           <w:rtl w:val="1"/>
         </w:rPr>
-        <w:t>כן. יש מקרה שנשאר איתי. היה יום פיג'מות בגן, ואחת הילדות פשוט לא הגיעה, ואחר כך הבנתי שאין לה פיג'מה בכלל בבית. הרגשתי נורא, כי אני, שכל כך רגישה לבושה, לא חשבתי על זה מראש. תכננתי פעילות שחשפה ילדה אחת. מאז, לפני כל פעילות, אני עוצרת ושואלת את עצמי, יש פה ילד שזה עלול לחשוף לו את המחסור. למדתי שהצדק הכי חשוב הוא זה שמונע את הפגיעה עוד לפני שהיא קורית.</w:t>
+        <w:t>כן, יש מקרה שאני עדיין מתביישת בו קצת. הייתה לי ילדה, יעל, שתמיד איחרה בבוקר, כל יום, וזה שיבש לי את מעגל הבוקר. יום אחד איבדתי סבלנות ואמרתי לה מול כולם, יעל, שוב את מאחרת, את מפריעה לכולנו. היא הסמיקה, התכווצה, ואני ראיתי את זה וכבר היה מאוחר. אחר כך גיליתי שהיא איחרה כי אמא שלה עבדה במשמרות לילה, ויעל, בת חמש, הייתה מעירה את עצמה לבד ומתלבשת לבד ומנסה להגיע. הילדה הזאת הייתה גיבורה, ואני ביישתי אותה מול הגן על משהו שהוא בכלל לא באשמתה. הרגשתי נורא, כי עשיתי בדיוק את הדבר שנשבעתי לא לעשות, לקחתי ילד ובלי לדעת את הסיפור שלו חשפתי אותו. זה מה שעשו לי כשהייתי קטנה, וזה מה שאני נלחמת בו כל חיי, ופתאום אני מהצד השני. למדתי מזה שיעור ענק, שלפני שאני שופטת התנהגות אני חייבת לדעת מה עומד מאחוריה. מאז, כשילד עושה משהו שמעצבן אותי, אני עוצרת ושואלת קודם מה קורה לו בבית, ורק אחר כך מגיבה. יעל לימדה אותי את זה, ואני אסירת תודה לה, למרות הכאב. ולמחרת התנצלתי בפניה בשקט, רק לנו השתיים, כי גם התנצלות צריכה להיות בלי קהל, בדיוק כמו שהבושה הייתה צריכה להיות.</w:t>
       </w:r>
     </w:p>
     <w:p>
@@ -9900,7 +9967,7 @@
           <w:szCs w:val="24"/>
           <w:rtl w:val="1"/>
         </w:rPr>
-        <w:t>האם לדעתך ילדים בגיל הגן מבינים מהי הוגנות? מאיזה גיל, ואיך זה בא לידי ביטוי?</w:t>
+        <w:t>האם לדעתך ילדים בגיל הגן מבינים מהי הוגנות? מאיזה גיל, ותארי לי כיצד זה בא לידי ביטוי אצלם.</w:t>
       </w:r>
     </w:p>
     <w:p>
@@ -9924,7 +9991,7 @@
           <w:szCs w:val="24"/>
           <w:rtl w:val="1"/>
         </w:rPr>
-        <w:t>מבינים, ולפעמים יותר טוב מאיתנו. הקטנים חושבים שהוגן זה שווה. אבל כבר בגיל ארבע-חמש הם מסוגלים להבין שמישהו צריך יותר. אני מלמדת את זה במפורש, דרך משלים ותמונות. ומה שמדהים, כשילד קולט את זה, הוא הופך לשומר הצדק של הגן, הוא זה שבא ואומר תעזרי לו, קשה לו. הם מפנימים את זה עמוק כשמלמדים אותם נכון.</w:t>
+        <w:t>כן, לגמרי, ולפעמים הרבה יותר מוקדם ממה שמבוגרים חושבים. כבר בגיל שלוש ילדים אומרים זה לא הוגן, בדרך כלל כשהם מרגישים שקיפחו אותם. בהתחלה זו הוגנות אגואיסטית, כאילו הוגן זה שאני אקבל יותר. אבל בגיל חמש שש, בגן חובה, אני רואה קפיצה אמיתית, הם מתחילים להבין הוגנות גם כשהיא לא לטובתם. אני זוכרת מקרה יפה, חילקתי חטיף, ולילד אחד נתתי חתיכה קצת יותר גדולה כי הוא לא אכל בבוקר. ילדה אחרת שמה לב ואמרה לו קיבל יותר. חיכיתי לראות מה יקרה, וילד שלישי, בן חמש וחצי, אמר לה, נכון, אבל הוא לא אכל היום, אז זה בסדר. חמש וחצי, והוא כבר הבין שהוגן זה לא שווה, שהוגן זה לפי מה שאתה צריך. זה ריגש אותי עד דמעות, כי זו בדיוק כל התפיסה שלי, מפי ילד. אני חושבת שהם מבינים הוגנות דרך הגוף והרגש הרבה לפני שהם יכולים להסביר אותה. הם מרגישים מתי מישהו נדפק, גם אם אין להם מילים. התפקיד שלי הוא לתת להם את המילים ואת הדוגמה, כי הזרע כבר שם בפנים. וכשהם רואים אותי בעצמי נותנת לכל אחד לפי מה שהוא צריך, בלי להכריז על זה, הם לומדים מזה יותר מכל שיחה במעגל.</w:t>
       </w:r>
     </w:p>
     <w:p>
@@ -9948,7 +10015,7 @@
           <w:szCs w:val="24"/>
           <w:rtl w:val="1"/>
         </w:rPr>
-        <w:t>כיצד את מתמודדת עם דרישה של הורה שהילד שלו יקבל יחס מועדף?</w:t>
+        <w:t>תארי לי מצב שבו הורה דרש שהילד שלו יקבל יחס מועדף. כיצד התמודדת?</w:t>
       </w:r>
     </w:p>
     <w:p>
@@ -9972,7 +10039,7 @@
           <w:szCs w:val="24"/>
           <w:rtl w:val="1"/>
         </w:rPr>
-        <w:t>זה קורה, וזה דורש עמידה. הורה שרוצה יחס מועדף לילד שלו, אני מקשיבה בכבוד, כי אני מבינה שכל הורה רוצה את הטוב לילד שלו. אבל אני מסבירה, בעדינות ובברור, שאני שומרת על ההוגנות כלפי כולם. ואני, בגלל הרקע שלי, מוסיפה משהו, אני מסבירה שדווקא הילדים החלשים הם אלה שאין להם הורה שנלחם עליהם, ושתפקידי לוודא שגם הם מקבלים. רוב ההורים, כשמסבירים להם יפה, מבינים ומתחברים לערך.</w:t>
+        <w:t>קורה, בעיקר בגן חובה שההורים לחוצים לקראת כיתה א. הייתה לי אמא של ילד, נועם, שבאה ודרשה בפירוש שאשים אותו תמיד ראשון, שיוביל את השורה, שיקבל את התפקידים הכי טובים, כי לדבריה הוא מנהיג וצריך לפתח את זה. הבנתי אותה, היא אוהבת את הילד שלה ורוצה בטובתו. אבל מה שהיא ביקשה זה בעצם לקחת מקום מילד אחר, כי אם נועם תמיד ראשון, מישהו תמיד אחרון. אמרתי לה את זה בעדינות אבל בבירור. הסברתי שאצלי כל הילדים מקבלים סבב על התפקידים המובילים, יש רוטציה, ונועם יקבל את החלק שלו בדיוק כמו כולם, לא פחות אבל גם לא על חשבון אחר. אמרתי לה, אני מבטיחה לך שהילד שלך לא יקופח, אבל אני לא יכולה להבטיח שהוא יקבל יותר, כי אז אני מקפחת ילד אחר שאמא שלו אולי לא באה לבקש. דווקא המשפט הזה נגע בה. אני חושבת שהורים מבינים את זה כשמסבירים להם שהצדק שאני שומרת עליו הוא גם בשביל הילד שלהם, כי גם הוא יכול להיות פעם זה שבצד השני. היא הרפתה, ונועם קיבל את הסבב שלו בשמחה. ואני שמרתי מול עצמי על הקו הזה בקנאות, כי ברגע שאתה מוותר להורה אחד לוחצן, אתה בעצם גוזל בשקט מילד אחר שאין לו מי שיילחם עליו.</w:t>
       </w:r>
     </w:p>
     <w:p>
@@ -9996,7 +10063,7 @@
           <w:szCs w:val="24"/>
           <w:rtl w:val="1"/>
         </w:rPr>
-        <w:t>האם את משתפת את ההורים בנושאים של צדק, שוויון והוגנות? האם נוצרים מתחים, וכיצד את מתמודדת איתם?</w:t>
+        <w:t>האם את משתפת את ההורים בנושאים של צדק, שוויון והוגנות? תארי לי אם נוצרים מתחים וכיצד את מתמודדת.</w:t>
       </w:r>
     </w:p>
     <w:p>
@@ -10020,7 +10087,7 @@
           <w:szCs w:val="24"/>
           <w:rtl w:val="1"/>
         </w:rPr>
-        <w:t>שיתוף ההורים אצלי קריטי, במיוחד בכל מה שנוגע לשמירה על הכבוד של הילדים החלשים. אני עושה עבודה חשובה מול כלל ההורים כדי ליצור נורמות שמגנות על כולם. אני זו שקובעת את הכללים סביב ימי הולדת ומתנות, ומסבירה להורים המבוססים יותר, בעדינות אבל בבירור, למה חשוב לשמור על צניעות ואחידות. מתחים נוצרים, בעיקר עם הורה שלא מבין למה אסור לו לחגוג בגדול. אני מתמודדת עם זה בהקשבה ובהסבר של התפיסה הכוללת. ואני עובדת בדיסקרטיות מלאה עם ההורים של הילדים המתקשים, מתוך כבוד עמוק למצבם.</w:t>
+        <w:t>אני משתפת, אבל בזהירות ובעיקר דרך מעשים, לא דרך הרצאות. אני לא עושה אסיפת הורים על צדק חברתי, כי זה נשמע מנותק. אבל אני כן מסבירה את המדיניות שלי, שהכל מגיע מהגן, שאין ימי הולדת מפוארים בגן, שאני לא מבקשת חומרים מהבית. ופה לפעמים נוצרים מתחים. יש הורים מבוססים שזה מפריע להם, שרוצים לחגוג לילד בגדול, להביא מפוח וכיסאות ומתנות לכל הכיתה. אמא אחת נעלבה ממש כשאמרתי שאנחנו חוגגים ימי הולדת אחיד, עוגה של הגן וכתר, בלי מתנות. היא אמרה, אני רוצה לתת לילד שלי חוויה. הסברתי לה שמה שנראה לה חוויה לילד שלה, זה עלבון לילד אחר בגן שבבית שלו אין כסף לעוגה בכלל. ראיתי שהיא לא אהבה את זה, אבל אחרי שנה היא באה ואמרה לי תודה, כי הבינה שהילד שלה למד משהו על שוויון שהוא לא היה לומד בבית. אני מתמודדת עם המתחים בכך שאני לא מתנצלת על העמדה שלי, אבל תמיד מסבירה אותה מהלב, דרך הסיפור על להיות הילדה שאין לה. כשהורים שומעים את הסיפור האמיתי, רובם מבינים. ואני לא כועסת על ההורים המבוססים, אני מבינה שהם באים ממקום של אהבה, פשוט צריך לתרגם להם שהאהבה לילד שלהם לא צריכה לבוא על חשבון ילד אחר בגן.</w:t>
       </w:r>
     </w:p>
     <w:p>
@@ -10044,7 +10111,7 @@
           <w:szCs w:val="24"/>
           <w:rtl w:val="1"/>
         </w:rPr>
-        <w:t>האם את מרגישה שתפקידך כגננת כולל קידום ערכים של שוויון וצדק חברתי? כיצד?</w:t>
+        <w:t>האם את מרגישה שתפקידך כגננת כולל קידום ערכים של שוויון וצדק חברתי? תארי לי כיצד.</w:t>
       </w:r>
     </w:p>
     <w:p>
@@ -10068,7 +10135,7 @@
           <w:szCs w:val="24"/>
           <w:rtl w:val="1"/>
         </w:rPr>
-        <w:t>זו בעיניי עצם הליבה של המקצוע, לא תוספת. אני מאמינה בכל נימי נפשי שאני מעצבת בגן שלי את הדור הבא של החברה. אם אצליח לגדל ילדים שרגישים לחלש, שמבינים בלב שהוגנות חשובה יותר משוויון עיוור, שאכפת להם מהשונה, תרמתי משהו אמיתי. אני עושה את זה בעיקר דרך אקלים הגן ודרך הדוגמה האישית בכל אינטראקציה. הערכים האלה לא נלמדים בשיעור, הם נספגים מהאוויר של המקום. ובאופן אישי, בגלל הסיפור שלי, אני מרגישה שיש לי אפילו סוג של חוב, לתת לילדים החלשים את מה שאני הייתי צריכה ולא תמיד קיבלתי.</w:t>
+        <w:t>כן, אני מרגישה שזה בדיוק לב התפקיד, אולי החלק הכי חשוב בו, יותר מלימוד אותיות ומספרים. הגן הוא המקום הראשון שבו ילד יוצא מהבית לחברה, וזו ההזדמנות הראשונה שלו ללמוד איך נראה עולם הוגן. אם בגן הוא חווה מקום שבו לא משנה מאיפה באת, מה יש להורים שלך, איך אתה נראה, כולם שווים בשער, זה נכנס לו לגוף לכל החיים. אני חושבת שאני לא רק שומרת על הצדק בתוך הגן, אני מגדלת אנשים שיהיו רגישים לצדק אחר כך, כשיהיו גדולים. הילד שראה שאני דואגת שגם החלש יקבל אופניים, שגם המודר יקבל חבר, שגם הרעב יקבל אוכל בלי בושה, הוא ילד שילמד שזאת הדרך. אני זוכרת את עצמי ילדה, שאין לה, שמתביישת, ואני חושבת כמה זה היה משנה לי אם מישהו היה שומר עליי ככה. אז כן, אני רואה בזה שליחות. לחלק שווה בשווה זה קל, זה לא דורש ממני כלום. להכיר כל ילד ולתת לו מה שהוא צריך, זה עבודה קשה, זה דורש מפה ומחשבה ולב, אבל זה מה שהופך גננת מפקידה של ילדים לאדם שמעצב עולם קצת יותר צודק, ילד אחד בכל פעם.</w:t>
       </w:r>
     </w:p>
     <w:p>
@@ -10086,7 +10153,6 @@
         <w:rPr>
           <w:rFonts w:ascii="David" w:hAnsi="David" w:cs="David"/>
           <w:b/>
-          <w:i w:val="0"/>
           <w:sz w:val="28"/>
           <w:szCs w:val="28"/>
           <w:rtl w:val="1"/>
@@ -10104,7 +10170,6 @@
         <w:rPr>
           <w:rFonts w:ascii="David" w:hAnsi="David" w:cs="David"/>
           <w:b w:val="0"/>
-          <w:i w:val="0"/>
           <w:sz w:val="22"/>
           <w:szCs w:val="22"/>
           <w:rtl w:val="1"/>
@@ -10133,7 +10198,7 @@
           <w:szCs w:val="24"/>
           <w:rtl w:val="1"/>
         </w:rPr>
-        <w:t>ספרי לי קצת על עצמך ועל התפקיד שלך. מי את, כמה שנים את בתחום, ואיך הגעת למקצוע?</w:t>
+        <w:t>ספרי לי קצת על עצמך ועל הדרך המקצועית שלך. מי את, כמה שנים את בתחום, ומה הביא אותך להיות גננת?</w:t>
       </w:r>
     </w:p>
     <w:p>
@@ -10157,7 +10222,7 @@
           <w:szCs w:val="24"/>
           <w:rtl w:val="1"/>
         </w:rPr>
-        <w:t>נעמה, בת ארבעים ואחת, גננת כבר בערך ארבע עשרה שנה. הרקע שלי קצת שונה. לפני שהפכתי לגננת התעניינתי מאוד בעולם הרגשי, עשיתי הכשרות בתקשורת מקרבת ובאינטליגנציה רגשית, וזה מה שמוביל אותי עד היום. הגעתי לחינוך מתוך אמונה שהדבר הכי חשוב שאפשר לתת לילד הוא עולם רגשי בריא. אצלי בגן מדברים המון על איך אנחנו מרגישים, יש פינת רגשות. אני רואה את התפקיד שלי בעיקר כמלווה רגשית של הילדים, ומתוך זה נבנה אצלם גם הבסיס לצדק ולחמלה.</w:t>
+        <w:t>קוראים לי נעמה בן דוד, אני בת 41, ואני בתוך העולם הזה של גיל הרך כבר ארבע עשרה שנה. הדרך שלי לא התחילה בהוראה בכלל. בשנות העשרים שלי עבדתי בעולם של הדרכה, עשיתי הכשרות בתקשורת מקרבת ובאינטליגנציה רגשית, וגיליתי כמה אני נמשכת לרגע שבו אדם מרגיש שמישהו באמת רואה אותו. כשנולדה הבת הראשונה שלי, נכנסתי לגן שלה כמתנדבת, ופתאום הבנתי שכל מה שחיפשתי נמצא שם, בגובה של ילד בן חמש. משהו בי נפתח. הרכות של הגיל הזה, האמת שאין בה שום פילטרים, זה מה שהחזיק אותי עד היום. אני לא רואה את עצמי מלמדת, אני רואה את עצמי מלווה ילדים בשנים שבהן נבנה אצלם היחס לעצמם ולעולם.</w:t>
       </w:r>
     </w:p>
     <w:p>
@@ -10181,7 +10246,7 @@
           <w:szCs w:val="24"/>
           <w:rtl w:val="1"/>
         </w:rPr>
-        <w:t>לימדת בגנים נוספים לפני כן? מה היה שונה בין הגנים?</w:t>
+        <w:t>לימדת בגנים נוספים לפני כן? תארי לי מה היה שונה בין הגנים.</w:t>
       </w:r>
     </w:p>
     <w:p>
@@ -10205,7 +10270,7 @@
           <w:szCs w:val="24"/>
           <w:rtl w:val="1"/>
         </w:rPr>
-        <w:t>כן, עבדתי בעוד שני גנים לפני הגן הנוכחי. השוני שהכי הרגשתי הוא באווירה הרגשית של כל מקום. יש גנים שבהם מדברים על רגשות, ויש כאלה שרק רצים קדימה לקראת כיתה א'. אני תמיד הבאתי איתי את העולם הרגשי, בכל מקום שהייתי בו, כי בשבילי זה הבסיס לכל השאר.</w:t>
+        <w:t>כן, עברתי כמה גנים לאורך השנים. התחלתי בגן טרום חובה בישוב קטן, אווירה מאוד משפחתית, מעט ילדים, הרבה קרבה עם ההורים. משם עברתי לגן בעיר גדולה יותר, ושם פגשתי בפעם הראשונה גיוון אמיתי, ילדים ממשפחות שונות מאוד זו מזו. ההבדל הכי גדול שהרגשתי היה בקצב. בישוב הקטן היה זמן לנשום, לשבת עם ילד רבע שעה בלי שאף אחד ימשוך אותי. בעיר הכל היה יותר צפוף, יותר גירויים, יותר צרכים בו זמנית. למדתי שם שגם בתוך רעש אפשר ליצור פינה שקטה של קשב. כל גן לימד אותי משהו אחר על מה זה להיות נוכחת.</w:t>
       </w:r>
     </w:p>
     <w:p>
@@ -10229,7 +10294,7 @@
           <w:szCs w:val="24"/>
           <w:rtl w:val="1"/>
         </w:rPr>
-        <w:t>איזה גיל וקבוצה את מלמדת היום?</w:t>
+        <w:t>איזה גיל וקבוצה את מלמדת היום, וכמה ילדים בגן?</w:t>
       </w:r>
     </w:p>
     <w:p>
@@ -10253,7 +10318,7 @@
           <w:szCs w:val="24"/>
           <w:rtl w:val="1"/>
         </w:rPr>
-        <w:t>אני עם גן חובה, בני חמש-שש. שלושים וארבעה ילדים.</w:t>
+        <w:t>היום אני מלמדת גן חובה, ילדים בני חמש עד שש, בגן עירוני. יש לי בגן שלושים וארבעה ילדים, וזה מספר לא קטן בכלל. זו קבוצה מלאת חיים, עם המון אישיויות שונות, כאלה שרצים ומדברים בקול רם וכאלה שיושבים בצד ומתבוננים. אני עובדת עם סייעת אחת קבועה ועוד סייעת שמתחלפת. עם מספר כזה של ילדים, אחד האתגרים הכי גדולים שלי הוא לוודא שכל ילד יקבל רגע אישי אמיתי, ולא ייבלע בתוך הקבוצה. זה משהו שאני שומרת עליו כמו על משהו יקר.</w:t>
       </w:r>
     </w:p>
     <w:p>
@@ -10277,7 +10342,7 @@
           <w:szCs w:val="24"/>
           <w:rtl w:val="1"/>
         </w:rPr>
-        <w:t>היכן הוכשרת?</w:t>
+        <w:t>היכן הוכשרת, ומה מהרקע שלך משפיע על הדרך שבה את עובדת?</w:t>
       </w:r>
     </w:p>
     <w:p>
@@ -10301,7 +10366,7 @@
           <w:szCs w:val="24"/>
           <w:rtl w:val="1"/>
         </w:rPr>
-        <w:t>לפני שהפכתי לגננת עשיתי הכשרות בתקשורת מקרבת ובאינטליגנציה רגשית, ואז למדתי חינוך לגיל הרך. אז הרקע הרגשי שלי קדם למקצוע, והוא זה שמוביל אותי בו.</w:t>
+        <w:t>הוכשרתי במכללה להוראה לגיל הרך, אבל האמת היא שההכשרה שהכי מעצבת אותי היום היא דווקא הרקע הרגשי שהבאתי מבחוץ. הלימודים בתקשורת מקרבת נתנו לי שפה שלמה, איך להקשיב בלי לשפוט, איך לומר לילד את מה שאני רואה בלי להאשים אותו. האינטליגנציה הרגשית לימדה אותי שמאחורי כל התנהגות יש רגש, ושאם אני מתחברת לרגש, ההתנהגות כמעט תמיד משתנה מעצמה. אני נכנסת לגן בבוקר ומסתכלת קודם כל על העיניים של הילדים, לא על מה שהם עושים. הרקע הרגשי הזה הוא באמת המצפן שלי, הוא זה שמוביל אותי בכל החלטה.</w:t>
       </w:r>
     </w:p>
     <w:p>
@@ -10349,7 +10414,7 @@
           <w:szCs w:val="24"/>
           <w:rtl w:val="1"/>
         </w:rPr>
-        <w:t>כן, אני מנחה בתכנית רגשית-חברתית בגן, ולפעמים מעבירה סדנאות לצוותים אחרים בנושא. זה הלב של מי שאני כגננת.</w:t>
+        <w:t>כן, יש לי עוד תפקיד שמאוד יקר לי. אני מנחה בתכנית רגשית חברתית, כלומר אני מלווה גננות אחרות ועוזרת להן להכניס שפה רגשית לתוך העבודה שלהן. אני מגיעה לגנים, יושבת, מתבוננת, ואחר כך אנחנו מדברות יחד על מה שקרה שם, על הרגעים הקטנים שאפשר היה לפגוש בהם ילד אחרת. זה מזין אותי מאוד, כי אני לומדת מכל גננת שאני פוגשת. בתוך הגן שלי אני גם מרכזת את הנושא הרגשי מול שאר הצוות. זה תפקיד שמרגיש לי טבעי, כאילו הוא נתפר בדיוק למי שאני.</w:t>
       </w:r>
     </w:p>
     <w:p>
@@ -10373,7 +10438,7 @@
           <w:szCs w:val="24"/>
           <w:rtl w:val="1"/>
         </w:rPr>
-        <w:t>כשאת שומעת את המונח "צדק בגן הילדים", מה המחשבה הראשונה שעולה לך?</w:t>
+        <w:t>כשאת שומעת את המונח "צדק בגן הילדים", מה המחשבה הראשונה שעולה לך? תארי לי.</w:t>
       </w:r>
     </w:p>
     <w:p>
@@ -10397,7 +10462,7 @@
           <w:szCs w:val="24"/>
           <w:rtl w:val="1"/>
         </w:rPr>
-        <w:t>האמת, מה שעולה לי מיד זה דווקא שאלה. צדק של מי? כי אני, מתוך העיסוק שלי ברגש, יודעת שלפעמים מה שמרגיש צודק לגמרי לילד אחד, מרגיש כמו עוול נורא לילד אחר. אין צדק אחד אובייקטיבי שכולם מסכימים עליו. אז המושג הזה מוביל אותי מיד למקום של דיאלוג ושל הקשבה. צדק בגן זה בשבילי בעיקר היכולת לנהל את המתחים בין הצרכים והרגשות השונים, בצורה שכל אחד ירגיש שראו אותו ושמעו אותו. גם אם בסוף לא כולם קיבלו מה שרצו. התחושה של שמעו אותי חשובה לילד לא פחות מהתוצאה.</w:t>
+        <w:t>האמת שכשאני שומעת את המילה צדק, הדבר הראשון שעולה לי הוא שאלה, צדק של מי. כי אני לא מאמינה שיש צדק אחד אובייקטיבי שאפשר להוריד על הגן מלמעלה. יש לי ילד שבטוח שמגיע לו התור עכשיו כי חיכה, ויש ילד אחר שבטוח שמגיע לו כי הוא לא קיבל אתמול, ושניהם צודקים מתוך המקום שלהם. בשבילי צדק בגן זה לא לחלק בצורה מדויקת, זה לנהל את המתחים בין הילדים כך שבסוף כל אחד ירגיש שראו אותו ושמעו אותו. התחושה הזאת של שמעו אותי חשובה לילד לא פחות מהתוצאה עצמה, לפעמים אפילו יותר. אני זוכרת ילדה, נטע, שבכתה שלא הוגן שחברה קיבלה תפקיד בהצגה. ישבתי איתה, לא הבטחתי לה כלום, רק אמרתי לה אני שומעת כמה זה כואב לך, כמה רצית. תוך שתי דקות היא נרגעה. היא לא קיבלה את התפקיד, אבל היא קיבלה את מה שבאמת חיפשה, מישהו שיראה את הכאב שלה. זה מה שצדק אומר לי, קודם כל לראות בן אדם. ולפעמים אני חושבת שאנחנו המבוגרים ממהרים כל כך לפתור, לחלק נכון, למצוא את הפתרון הצודק, שאנחנו מפספסים שהילד בכלל לא ביקש פתרון, הוא ביקש שנשב איתו רגע. אז כשאני שומעת צדק, אני קודם כל עוצרת ושואלת את עצמי את מי אני לא רואה כרגע בתמונה הזאת.</w:t>
       </w:r>
     </w:p>
     <w:p>
@@ -10421,7 +10486,7 @@
           <w:szCs w:val="24"/>
           <w:rtl w:val="1"/>
         </w:rPr>
-        <w:t>האם נושא הצדק החברתי מהווה חלק מהתפיסה החינוכית שלך? איך זה בא לידי ביטוי?</w:t>
+        <w:t>האם נושא הצדק החברתי הוא חלק מהתפיסה החינוכית שלך? תארי לי איך זה בא לידי ביטוי ביום-יום.</w:t>
       </w:r>
     </w:p>
     <w:p>
@@ -10445,7 +10510,7 @@
           <w:szCs w:val="24"/>
           <w:rtl w:val="1"/>
         </w:rPr>
-        <w:t>מאוד, וזה מגיע אצלי מאוד מעולם הרגש. אני מאמינה בכל ליבי שצדק חברתי אמיתי מתחיל באמפתיה, ביכולת לראות את האחר ולהרגיש מה הוא מרגיש. בלי אמפתיה, כל דיבור על צדק הוא ריק. אז אני משקיעה המון בפיתוח האינטליגנציה הרגשית של הילדים. כששני ילדים בקונפליקט, אני לא ממהרת לפסוק, אלא שואלת, איך אתה חושב שהוא הרגיש כשלקחת לו. אני מאמינה שילד שמפתח אמפתיה בגיל הזה יהיה אדם שאכפת לו מצדק חברתי בבגרות. אז אצלי, החינוך לצדק חברתי הוא בעצם חינוך רגשי, זה אותו דבר בעיניי.</w:t>
+        <w:t>בהחלט, צדק חברתי הוא ממש בלב התפיסה שלי, ואני מאמינה שהוא מתחיל באמפתיה. בגיל הזה זה לא מגיע דרך שיחות גדולות על שוויון, זה מגיע דרך הרגעים הקטנים. אני מנסה כל יום ללמד את הילדים לשים לב אחד לשני, לשאול איך אתה מרגיש, לראות מתי מישהו עצוב בפינה. יש לנו בגן פינת רגשות, מקום עם כריות וכרטיסיות של פרצופים, וילד יכול ללכת לשם כשמשהו מציף אותו. משם צומחות שיחות מדהימות. אני זוכרת בוקר שבו יונתן הלך לפינה כי כעס, ורוני הקטנה הלכה אחריו לבד, בלי שביקשתי, והביאה לו כרטיס של פרצוף כועס. היא אמרה לו זה בסדר להיות ככה. זה בשבילי צדק חברתי בהתהוות, ילד שלומד לראות את הרגש של השני ולא לפחד ממנו. אני גם מקפידה שבחלוקת התפקידים בגן לא תמיד אותם ילדים חזקים יובילו. לפעמים אני נותנת דווקא לילד השקט להיות אחראי היום. הדברים הקטנים האלה הם שבונים אצלם תחושה שהעולם יכול להיות מקום שבו כולם נספרים. אני לא מטיפה לילדים על שוויון, כי מילים גדולות לא נכנסות בגיל הזה, אבל אני כן שותלת בהם כל יום את הזרע הקטן של לשים לב לשני. אני מאמינה שילד שהתרגל כבר בגן לשאול חבר מה קרה לך, יגדל להיות מבוגר שרואה גם את מי שקצת בצד.</w:t>
       </w:r>
     </w:p>
     <w:p>
@@ -10469,7 +10534,7 @@
           <w:szCs w:val="24"/>
           <w:rtl w:val="1"/>
         </w:rPr>
-        <w:t>כיצד את מחלקת את תשומת הלב שלך בין הילדים במהלך היום?</w:t>
+        <w:t>תארי לי כיצד את מחלקת את תשומת הלב שלך בין הילדים במהלך יום שלם.</w:t>
       </w:r>
     </w:p>
     <w:p>
@@ -10493,7 +10558,7 @@
           <w:szCs w:val="24"/>
           <w:rtl w:val="1"/>
         </w:rPr>
-        <w:t>אני משתדלת מאוד לתת לכל ילד לפחות רגע אחד אמיתי ואישי במהלך היום, מבט עמוק, מילה חמה, שיחה קטנה שהיא רק שלנו. זה נשמע דבר קטן, אבל מבחינת הילד זה עצום, זה אומר לו אתה נראה, אתה חשוב. ואני, מתוך הרגישות שלי, שמה לב במיוחד לילדים שלא באים אליי מיוזמתם, השקטים. יש לי טכניקה, ברגע הפרידה בסוף היום אני עושה סריקה בלב ומנסה להיזכר עם מי כמעט לא היה לי מגע אישי היום. ולמחרת בבוקר אני מתחילה דווקא ממנו. לתת מכל הלב באופן שווה, זו אולי המתנה הכי גדולה שגננת יכולה לתת.</w:t>
+        <w:t>זה אחד הדברים שאני הכי מודעת אליהם, ובכנות זה גם אחד הקשים ביותר עם שלושים וארבעה ילדים. אני יודעת שמטבע הדברים הילדים הרועשים, הדומיננטיים, מושכים אליהם את תשומת הלב, וזה בדיוק מה שאני נזהרת ממנו. יש לי כלל שקט לעצמי, כל ילד צריך לקבל רגע אישי אמיתי אחד ביום, גם אם הוא קצר. זה יכול להיות משפט ליד ארוחת הבוקר, מבט בזמן המשחק, יד על הכתף בחצר. אני מנסה לשים לב דווקא לילדים שלא דורשים, כי הם אלה שקל לפספס. יש לי בגן ילדה, שירה, שיכולה לשבת שעה שלמה ולצייר בשקט מוחלט, ואם לא אשים לב, יעבור יום שלא החלפתי איתה מילה. אז אני עוצרת ליד השולחן שלה, מתיישבת, שואלת מה ציירת כאן. אני גם בסוף היום עוברת בראש על השמות, מנסה להיזכר את מי פגשתי באמת ואת מי רק ראיתי מרחוק. ואם יש ילד שפספסתי, אני יודעת שמחר הוא הראשון. זה לא מדע מדויק, זה יותר כמו מודעות מתמדת לזה שכל אחד מהם צריך להרגיש שהוא קיים בעיניי. אני זוכרת שפעם, בסוף שבוע ארוך, הבנתי שיש ילד שכמעט לא דיברתי איתו כל השבוע, פשוט כי הוא נוח וטוב ולא דורש כלום. זה כאב לי מאוד. מאז אני מחזיקה בראש מין רשימה קטנה של הילדים השקטים, ודואגת שדווקא הם יקבלו ממני מבט חם בהתחלת היום, לפני כולם.</w:t>
       </w:r>
     </w:p>
     <w:p>
@@ -10517,7 +10582,7 @@
           <w:szCs w:val="24"/>
           <w:rtl w:val="1"/>
         </w:rPr>
-        <w:t>כשיש ילד שזקוק ליותר תשומת לב, רגשית, חברתית או לימודית, איך את מאזנת את זה מול שאר הילדים?</w:t>
+        <w:t>תארי לי מצב שבו ילד זקוק ליותר תשומת לב, רגשית, חברתית או לימודית. איך את מאזנת את זה מול שאר הילדים?</w:t>
       </w:r>
     </w:p>
     <w:p>
@@ -10541,7 +10606,7 @@
           <w:szCs w:val="24"/>
           <w:rtl w:val="1"/>
         </w:rPr>
-        <w:t>האיזון הנכון בעיניי הוא לא לחלק את עצמי שווה בשווה במובן המכני, אלא לתת לפי הצורך האמיתי, ובלב שלם, בלי אשמה. ילד שעובר תקופה רגשית קשה מקבל ממני יותר. אבל, וזה החלק שהכי מאפיין אותי, אני עושה עבודה חשובה במקביל מול שאר הילדים, מלמדת אותם אמפתיה כלפי הילד שצריך. במקום שהם יקנאו, אני עוזרת להם להבין שהחבר עובר תקופה קשה וצריך לתמוך בו. וזה עושה קסם, במקום קנאה נוצרת חמלה, ולפעמים הם עצמם הופכים לתומכים. ככה הילד שצריך מקבל לא רק אותי, אלא את החום של כל הקבוצה.</w:t>
+        <w:t>זה קורה כל הזמן, כי תמיד יש ילד שעובר תקופה קשה יותר. היה לי השנה ילד, איתמר, שההורים שלו היו בתהליך פרידה, והוא הגיע כל בוקר עצוב ונצמד אליי. הוא היה צריך ממני הרבה יותר, חיבוקים, קרבה, ישיבה על הברכיים. וכאן עולה השאלה של איזון, כי יש עוד שלושים ושלושה ילדים. מה שאני מאמינה בו זה שהוגנות רגשית היא לא לתת לכולם אותו דבר, אלא לתת לכל אחד את מה שהוא צריך. אני קוראת לזה החיבוק הארוך, מי שבאמת כואב לו מקבל חיבוק ארוך יותר, וזה לא בא על חשבון אף אחד. הפחד הוא שהילדים האחרים יקנאו, אבל גיליתי שהם דווקא מבינים. הסברתי בעדינות שאיתמר עובר תקופה שקשה לו בבית, ושלפעמים כשקשה צריך יותר חיבוקים. במקום לקנא, ילדים התחילו לשמור עליו. מיה הביאה לו ציור, דניאל שמר לו מקום בשולחן. במקום שהתשומת לב המיוחדת תיצור פער, היא לימדה את כל הקבוצה מה זה לתמוך במישהו. אז אני לא מפחדת לתת יותר למי שצריך יותר, כי זה מה שנראה לי באמת הוגן. הוגנות רגשית זה לא מאזניים שכולם מקבלים בהם אותו משקל, זה יותר כמו לחלק תרופה, כל אחד לפי מה שכואב לו. איתמר, אגב, סיים את השנה כילד שמח יותר, ואני יודעת שהחיבוקים הארוכים ההם היו חלק מזה. אני לא מתחרטת אפילו על אחד מהם.</w:t>
       </w:r>
     </w:p>
     <w:p>
@@ -10565,7 +10630,7 @@
           <w:szCs w:val="24"/>
           <w:rtl w:val="1"/>
         </w:rPr>
-        <w:t>כיצד מתבצעת חלוקת החומרים והמשאבים הפיזיים בגן, הצעצועים והציוד? מה הקו המנחה שלך?</w:t>
+        <w:t>תארי לי כיצד מתבצעת חלוקת החומרים והמשאבים הפיזיים בגן (צעצועים, ציוד, אופניים). מה הקו המנחה שלך?</w:t>
       </w:r>
     </w:p>
     <w:p>
@@ -10589,7 +10654,7 @@
           <w:szCs w:val="24"/>
           <w:rtl w:val="1"/>
         </w:rPr>
-        <w:t>הקו שלי, שנובע מכל התפיסה שלי, הוא שהתהליך של החלוקה חשוב לא פחות, ואולי יותר, מהתוצאה. אני פחות עסוקה בשאלה אם כל אחד קיבל אותה כמות, ויותר בשאלה אם הילדים למדו לנהל מחלוקת על משאב בצורה מכבדת. כששני ילדים רבים על צעצוע, אני לא ממהרת להכריע. אני יושבת איתם, מרגיעה קודם את הרגשות, ואז שואלת, מה נעשה עכשיו, איך נפתור את זה יחד. והפתרון שהם מוצאים לרוב יצירתי יותר משלי. הם לומדים שיעור לחיים על הוגנות ופשרה. בשבילי כל מריבה על צעצוע היא הזדמנות ללמד ניהול קונפליקט.</w:t>
+        <w:t>אני אוהבת שיש בגן דברים שהם באמת של כולם, וזה מתחיל כבר בשפה. אנחנו לא אומרים האופניים שלי, אנחנו אומרים האופניים של הגן. הקו המנחה שלי בחלוקת הצעצועים והציוד הוא בעיקר תור וזמן, אבל לא בצורה נוקשה. יש לנו בגן שני אופני איזון שכולם רוצים, אז יצרנו יחד שיטה, מי שרוכב סופר עד עשרים ואז מעביר. אבל האמת שאני פחות מתעסקת בשיטה עצמה ויותר במה שקורה מסביבה. כי מריבה על משאית היא כמעט אף פעם לא באמת על המשאית. אני זוכרת שני ילדים, עומר ואריאל, שרבו על משאית אדומה עד דמעות. ישבתי איתם, וכשהתחלנו לדבר הבנתי שעומר בכלל לא רצה את המשאית, הוא רצה לשחק עם אריאל, פשוט לא ידע איך לבקש. אז נתתי לאריאל את המשאית, אבל הצעתי שאולי עומר יבנה לו כביש שהמשאית תיסע עליו. תוך רגע הם שיחקו יחד. אז הקו המנחה שלי הוא לחלק את הצעצוע, אבל קודם כל להבין מה הילד באמת מחפש. הרבה פעמים זה בכלל לא החפץ. מאז אותו מקרה עם עומר ואריאל, אני תמיד עוצרת רגע לפני שאני קובעת של מי התור, ושואלת את עצמי מה כל אחד מהם באמת מחפש כאן. לפעמים ילד רב על אופניים כי הוא בעצם רוצה שמישהו ישחק איתו, ולפעמים כי הוא פשוט צריך להרגיש שגם לו מגיע. חלוקה טובה של משאבים מתחילה אצלי בהקשבה, לא בכללים.</w:t>
       </w:r>
     </w:p>
     <w:p>
@@ -10613,7 +10678,7 @@
           <w:szCs w:val="24"/>
           <w:rtl w:val="1"/>
         </w:rPr>
-        <w:t>האם לדעתך חלוקה "שווה" וחלוקה "הוגנת" הן אותו דבר? תני דוגמה מהגן.</w:t>
+        <w:t>האם לדעתך חלוקה "שווה" וחלוקה "הוגנת" הן אותו דבר? תני דוגמה מהגן שממחישה את ההבדל.</w:t>
       </w:r>
     </w:p>
     <w:p>
@@ -10637,7 +10702,7 @@
           <w:szCs w:val="24"/>
           <w:rtl w:val="1"/>
         </w:rPr>
-        <w:t>לא, ואני חושבת שהבלבול בין השניים הוא מקור להרבה טעויות. שוויון זה לתת לכולם אותו דבר, והוגנות זה לתת לכל אחד את מה שנכון עבורו. יש לי דוגמה אופיינית לי, מהעולם הרגשי דווקא. כשילד בוכה כי הוא מתגעגע לאמא בבוקר, אני מחבקת אותו חזק ולאורך זמן. ילד אחר עשוי לבוא ולומר, גם אני רוצה חיבוק ארוך כמו שלו. אם הייתי מחלקת חיבוקים לפי שעון, דקה לכל אחד, זה היה אבסורד רגשי. הוגנות רגשית זה לתת את החיבוק הארוך למי שבאמת כואב לו עכשיו. וזה בדיוק ההבדל, הצרכים שלנו שונים ולכן מה שאנחנו מקבלים שונה.</w:t>
+        <w:t>לא, בשבילי אלה ממש לא אותו דבר, וזה אחד הדברים החשובים שלמדתי. שווה זה לתת לכולם בדיוק אותה כמות, אותו זמן, אותו גודל. הוגן זה לתת לכל אחד את מה שהוא צריך כדי להרגיש טוב ולהצליח. אני נותנת דוגמה שקורית אצלי הרבה. בזמן ארוחת בוקר, אם הייתי מחלקת לכולם בדיוק אותה כמות עזרה, זה היה נראה שווה, אבל זה לא היה הוגן. כי יש ילד שכבר יודע למרוח לבד את הלחם, ויש ילד שהיד שלו עוד רועדת עם הסכין. אם אתן לשניהם את אותה עזרה, אחד ישתעמם והשני ייכשל. אז אני יושבת יותר עם זה שצריך, ופחות עם זה שלא. פעם ילד אמר לי לא הוגן שעזרת לו ולא לי, ואמרתי לו תראה, כשאתה היית צריך עזרה עם הרוכסן בחורף, גם עזרתי לך, ולא ספרתי. הוגנות זה שכל אחד מקבל את מה שנכון לו ברגע שלו. שוויון לפעמים נראה יפה מבחוץ, אבל בפנים הוא יכול להיות דווקא לא צודק. אני משתדלת ללמד את הילדים לאט לאט שהוגן זה לא תמיד אותו דבר בשבילי ובשבילך, ושזה בסדר גמור. כשילד מבין שקיבל בדיוק את מה שהוא היה צריך, הוא מפסיק לספור מה קיבל השני. וזה בעצם מה שאני מנסה לגדל, ילדים שסומכים על זה שידאגו להם, ולא צריכים להסתכל כל הזמן בצלחת של החבר.</w:t>
       </w:r>
     </w:p>
     <w:p>
@@ -10661,7 +10726,7 @@
           <w:szCs w:val="24"/>
           <w:rtl w:val="1"/>
         </w:rPr>
-        <w:t>כיצד את מתמודדת עם מצב שילד מסוים "לוקח" יותר מקום במרחב הקבוצתי?</w:t>
+        <w:t>תארי לי מצב שבו ילד מסוים "לוקח" יותר מקום במרחב הקבוצתי, וכיצד את מתמודדת עם זה.</w:t>
       </w:r>
     </w:p>
     <w:p>
@@ -10685,7 +10750,7 @@
           <w:szCs w:val="24"/>
           <w:rtl w:val="1"/>
         </w:rPr>
-        <w:t>אני מסתכלת על זה קודם כול ברגישות, ומנסה להבין מה עומד רגשית מאחורי הצורך של הילד להיות במרכז. וכאן יש תובנה שחשובה לי, הרבה פעמים ילד שלוקח הרבה מקום עושה את זה דווקא מתוך חוסר ביטחון, לא מתוך עודף. הרעש הוא לפעמים כיסוי לחרדה, לצורך באישור ובאהבה. אז במקום להילחם בהתנהגות, אני נותנת מענה לצורך הרגשי שמתחתיה, נותנת לו הכרה ומקום להרגיש חשוב. ובמקביל אני עוזרת לו לפתח בהדרגה את היכולת לפנות מקום לאחרים. וכמו תמיד אצלי, אני מטפחת בעדינות את הביישנים, בונה להם ביטחון, עד שגם הם יעזו לתפוס את המקום שמגיע להם.</w:t>
+        <w:t>יש לי כמה ילדים כאלה, ותמיד אני מזכירה לעצמי שילד שלוקח הרבה מקום עושה את זה כמעט תמיד מתוך חוסר ביטחון, לא מתוך עודף שלו. יש לי ילד, רועי, שמדבר בקול הכי רם, קוטע את כולם, רוצה להיות ראשון בכל דבר. קל מאוד לראות בו ילד שתלטן ולנסות להשתיק אותו. אבל כשהתבוננתי בו לאורך זמן, ראיתי ילד שממש חושש שאם לא יתפוס מקום, פשוט לא יראו אותו. אז במקום לכבות אותו, אני מנסה לתת לו מקום בטוח. נתתי לו להיות אחראי על פינת הבנייה, תפקיד שבו הכוח שלו מקבל כיוון טוב. ובמקביל אני עובדת בעדינות על העברת המיקרופון, יש לנו חפץ קטן, כדור רך, ורק מי שמחזיק אותו מדבר. ככה רועי לומד שגם כשהוא לא מדבר, המקום שלו נשמר, הוא לא צריך להיאבק עליו. לאט לאט הוא נרגע. אני גם דואגת שהילדים השקטים לידו יקבלו את הכדור, כי המרחב הקבוצתי הוא כמו עוגה, ואני שומרת שלא ילד אחד יאכל את כולה. אבל אני עושה את זה בלי לגרום לרועי להרגיש רע עם עצמו. כי אני באמת מאמינה שילד דומיננטי הוא כמעט תמיד ילד שמרגיש בפנים שהוא לא מספיק, ואם רק אשתיק אותו, אני מאשרת לו את הפחד הזה. לתת לו מקום נכון, מקום שבו הכוח שלו מועיל, זה מה שמרגיע אותו באמת. ולאט לאט, כשהוא בטוח יותר, הוא כבר לא צריך לתפוס את כל האוויר בחדר.</w:t>
       </w:r>
     </w:p>
     <w:p>
@@ -10709,7 +10774,7 @@
           <w:szCs w:val="24"/>
           <w:rtl w:val="1"/>
         </w:rPr>
-        <w:t>כיצד את מתמודדת עם מצבים של הדרה חברתית, ילד שהקבוצה לא מקבלת ולא רוצים לשחק איתו?</w:t>
+        <w:t>תארי לי מצב של הדרה חברתית בגן, ילד שהקבוצה לא מקבלת ולא רוצים לשחק איתו. כיצד את פועלת?</w:t>
       </w:r>
     </w:p>
     <w:p>
@@ -10733,7 +10798,7 @@
           <w:szCs w:val="24"/>
           <w:rtl w:val="1"/>
         </w:rPr>
-        <w:t>מבחינתי, כמי שכל עולמה רגשי, הדרה חברתית היא כמעט הכאב הכי גדול שיכול להיות לילד, כי היא פוגעת בצורך הכי בסיסי, להיות שייך ואהוב. אני לא כופה על ילדים לשחק עם מישהו, כי כפייה לא מייצרת קבלה. אני עובדת דרך הרגש. עם הילד המודר אני עובדת על הכאב שלו ובונה מחדש את הביטחון שלו. ועם הקבוצה כולה אני עובדת עמוקות על אמפתיה, דרך סיפורים ובובות ומשחקי תפקידים על איך מרגיש ילד שאף אחד לא רוצה לשחק איתו. אני מאמינה שהדרך הכי עמוקה לפתור הדרה היא לא דרך חוקים, אלא דרך פיתוח הלב של הקבוצה.</w:t>
+        <w:t>הדרה חברתית זה אחד הדברים שהכי כואבים לי לראות, ואני לא מוכנה לתת לזה לעבור. היה לי השנה ילד, גיא, שהילדים פשוט לא רצו לשחק איתו. הוא היה קצת נוקשה במשחק, רצה תמיד לקבוע את הכללים, ולאט לאט נוצר מצב שכשהוא התקרב, ילדים אמרו אין מקום. הלב שלי נשבר לראות אותו עומד בצד. הדבר הראשון שעשיתי הוא לא להטיף לילדים שיהיו נחמדים, כי זה כמעט אף פעם לא עובד. במקום זה עבדתי בשני מישורים. עם גיא ישבתי ולימדתי אותו איך להיכנס למשחק אחרת, לא להשתלט אלא לשאול אפשר להצטרף, לתת גם לאחרים להוביל. ובמקביל בניתי לו הצלחות מול הקבוצה, גיליתי שהוא יודע המון על חלל, אז נתתי לו להיות המומחה שמספר לכולם על כוכבים. פתאום הילדים ראו אותו אחרת. עשיתי גם משחקי זוגות שאני מרכיבה, כדי שגיא ישחק עם ילד אחד רגוע בלי הלחץ של הקבוצה. לקח שבועות, אבל יום אחד ראיתי אותו רץ בחצר עם עוד שניים, צוחק. אני מאמינה שילד לא נדחה כי הוא רע, אלא כי חסר לו כלי, וזה התפקיד שלי, לתת לו את הכלי הזה.</w:t>
       </w:r>
     </w:p>
     <w:p>
@@ -10757,7 +10822,7 @@
           <w:szCs w:val="24"/>
           <w:rtl w:val="1"/>
         </w:rPr>
-        <w:t>האם בגן שלך יש ילדים מרקעים חברתיים או כלכליים שונים? כיצד זה בא לידי ביטוי ביום-יום?</w:t>
+        <w:t>האם בגן שלך יש ילדים מרקעים חברתיים או כלכליים שונים? תארי לי כיצד זה בא לידי ביטוי בפרקטיקה היומיומית.</w:t>
       </w:r>
     </w:p>
     <w:p>
@@ -10781,7 +10846,7 @@
           <w:szCs w:val="24"/>
           <w:rtl w:val="1"/>
         </w:rPr>
-        <w:t>כן, ואני רואה בזה קודם כול הזדמנות חינוכית ורגשית, לא רק אתגר. השונות מאפשרת לילדים לפגוש עולמות אחרים, וזה מרחיב את הלב. זה בא לידי ביטוי בסיפורים שהם מביאים, במאכלים, במנהגים. אני מנסה להפוך את זה לעושר במקום למקור למבוכה, מזמינה ילד לספר בגאווה על מנהג ממשפחתו. ובמקביל, מתוך הרגישות שלי, אני שומרת מאוד שההבדלים הכלכליים לא יהפכו למקור לבושה או להתנשאות. מנטרלת מיד כל אמירה פוגענית. ילד שלומד בגיל צעיר לכבד את השונה ממנו, במקום לפחד ממנו, גדל להיות אדם סובלני יותר.</w:t>
+        <w:t>כן, בהחלט, יש לי בגן ילדים מרקעים מאוד שונים, גם כלכלית וגם תרבותית. יש משפחות מבוססות מאוד ויש משפחות שסופרות כל שקל, ויש ילדים שההורים שלהם עלו לארץ לא מזמן. זה בא לידי ביטוי בדברים קטנים שקל לפספס אבל הם צורבים לילד. למשל בימי הולדת, פעם היה מקובל שכל ילד מביא עוגה מפוארת ומתנות, ואני שמתי לב שילד אחד, שההורים שלו במצוקה, פשוט לא חגג. אז שיניתי את זה מהיסוד. אצלנו יום הולדת נחגג באותה צורה לכולם, הגן מכין את העוגה, אין תחרות של מתנות, יש מעגל שבו כל ילד אומר משהו טוב על חבר היום. גם עם הביגוד אני רגישה, יש לי מלאי של בגדים חמים בארון, ואם ילד מגיע בלי מעיל בחורף, אף אחד לא יודע מאיפה הופיע לו מעיל. אני עושה את זה בשקט, בלי מילים, כי ילד לא צריך להרגיש שהוא מקרה. המטרה שלי היא שבתוך שערי הגן, כל הפערים שבחוץ יישארו בחוץ, ושכל ילד ירגיש שכאן הוא שווה בדיוק כמו כולם. אני זוכרת ילד שעלה מארץ אחרת ובקושי דיבר עברית בהתחלה, וראיתי כמה הוא מתבייש. אז לימדתי את כל הגן כמה מילים בשפה שלו, ופתאום הוא היה זה שיודע משהו שאף אחד לא יודע. הוא זקף את הגב. לפעמים צדק חברתי זה פשוט להפוך את מה שנראה כמו חיסרון למשהו ששווה זהב.</w:t>
       </w:r>
     </w:p>
     <w:p>
@@ -10805,7 +10870,7 @@
           <w:szCs w:val="24"/>
           <w:rtl w:val="1"/>
         </w:rPr>
-        <w:t>כיצד את מתמודדת עם הפערים הניכרים בין הילדים, בין השאר בתחום הרגשי, החברתי או הלימודי?</w:t>
+        <w:t>תארי לי כיצד את מתמודדת עם הפערים הניכרים בין הילדים, בין השאר בתחום הרגשי, החברתי או הלימודי.</w:t>
       </w:r>
     </w:p>
     <w:p>
@@ -10829,7 +10894,7 @@
           <w:szCs w:val="24"/>
           <w:rtl w:val="1"/>
         </w:rPr>
-        <w:t>המפתח בעיניי הוא לא לראות בפער בעיה שצריך למגר, אלא מציאות אנושית טבעית. ילדים מתפתחים בקצב שונה, וזה בסדר, אפילו יפה. אני עובדת עם כל ילד מהמקום שבו הוא נמצא, בלי לחץ ובלי השוואה. אני מאמינה מאוד בכוח של הקבוצה המעורבת, כשילדים ברמות שונות משחקים יחד נוצר קסם, המתקדם לומד לתת ולהסביר, והמתקשה לומד מהחיקוי, בלי הלחץ של להיות מול המבוגר. הפער, כשמנהלים אותו נכון, הופך ממקור לתסכול למנוע של למידה הדדית. הטעות הכי גדולה היא לנסות ליישר את כולם לאותה רמה, זה גם בלתי אפשרי וגם פוגעני.</w:t>
+        <w:t>הפערים הם חלק בלתי נפרד מהמציאות בגן, ואני מנסה להסתכל עליהם לא כבעיה אלא כמשהו טבעי. יש לי ילד שכבר קורא מילים שלמות ויש ילד שעוד לומד להחזיק עיפרון, יש ילדה מאוד בשלה רגשית ויש ילד שמתפרץ בבכי על כל דבר. הדבר הכי חשוב לי הוא לא ליישר את כולם לאותו קו, אלא לפגוש כל אחד במקום שבו הוא נמצא. בתחום הלימודי אני עובדת הרבה בקבוצות קטנות, כך שאני יכולה לתת לילד המתקדם אתגר אמיתי ולילד שצריך יותר זמן, בלי שאף אחד ירגיש נחות. בתחום הרגשי, אני נעזרת בילדים החזקים כדי לעזור לחלשים, ילדה שבשלה רגשית הופכת לחברה תומכת, וזה מעצים את שתיהן. אני נזהרת מאוד לא להשוות ילד לילד, אף פעם לא נשמע ממני תראה איך היא כבר יודעת. אני משווה כל ילד רק לעצמו, מזכירה לו כמה הוא כבר התקדם. פעם ילד אמר לי אני הכי גרוע בהכל, וישבתי איתו ומצאנו יחד חמישה דברים שהוא מדהים בהם, מבניית מגדלים ועד לחיבוק חברים. הפערים לא נעלמים, אבל אני משתדלת שהם לא יהפכו אצל אף ילד לתחושה שהוא פחות. כי בסוף, הפער הכי מסוכן הוא לא הפער ביכולת, אלא הפער בביטחון, בכמה ילד מאמין שהוא שווה משהו. ועל זה אני שומרת יותר מהכל.</w:t>
       </w:r>
     </w:p>
     <w:p>
@@ -10853,7 +10918,7 @@
           <w:szCs w:val="24"/>
           <w:rtl w:val="1"/>
         </w:rPr>
-        <w:t>איך נראה יום עבודה טיפוסי שלך בגן, ומהם הדברים שאת מקפידה עליהם מבחינת הוגנות?</w:t>
+        <w:t>תארי לי יום עבודה טיפוסי שלך בגן, ומהם הדברים שאת מקפידה עליהם מבחינת הוגנות.</w:t>
       </w:r>
     </w:p>
     <w:p>
@@ -10877,7 +10942,7 @@
           <w:szCs w:val="24"/>
           <w:rtl w:val="1"/>
         </w:rPr>
-        <w:t>אצלי היום מלא ברגעים של רגש. יש פינת רגשות, יש מפגש שבו מדברים על איך אנחנו מרגישים. מה שאני הכי מקפידה עליו מבחינת הוגנות זה שכל ילד יקבל רגע אישי אמיתי ביום, מבט, מילה, מגע שהוא רק שלו. זה נשמע קטן אבל בשביל הילד זה עצום, זה אומר לו אתה נראה, אתה חשוב. ובשבילי חלוקה הוגנת של הלב שלי היא הצדק הכי בסיסי.</w:t>
+        <w:t>יום טיפוסי אצלי מתחיל הרבה לפני שהילדים נכנסים. אני מגיעה מוקדם, מסדרת את המרחב, ובעיקר עושה לעצמי רגע של שקט כדי להיכנס נוכחת. כשהילדים מגיעים, אני עומדת ליד הדלת ומקבלת כל אחד בשמו, מסתכלת עליו בעיניים, כי הבוקר הזה קובע הרבה. אחר כך יש מפגש בוקר, ארוחה, זמן משחק חופשי, פעילות בקבוצות, חצר, וארוחת צהריים. מבחינת הוגנות, יש כמה דברים שאני שומרת עליהם כמעט בקנאות. אחד, שבמפגש לא תמיד אותם ילדים יזכו לדבר, אני מחזיקה רשימה בראש של מי עוד לא קיבל תור. שתיים, שחלוקת התפקידים היומיים תהיה מגוונת, שגם הילד השקט יהיה פעם אחראי על החלב. שלוש, שאני עוברת על כל הילדים בסוף היום ובודקת את מי באמת פגשתי. אני גם מקפידה שבמעברים, שהם רגעים של תסכול, אף ילד לא יידחק הצידה. אני זוכרת שהתחלתי לשים לב שאותם שניים תמיד אחרונים בתור לחצר, אז שיניתי את הסדר. ההוגנות בשבילי חיה דווקא בפרטים הקטנים האלה של היום, לא באמירות הגדולות. כי ילד לא זוכר שהכרזתי במפגש שכולם שווים, אבל הוא כן זוכר שדווקא היום נתתי לו להיות ראשון בתור, או שעצרתי לשאול אותו מה שלומו כשהיה נראה עצוב. אלה הרגעים שנשארים בגוף שלו. אז אני עובדת קשה על להיות ערנית לפרטים האלה, כי בהם, ולא באמירות, נבנית התחושה של ילד שרואים אותו.</w:t>
       </w:r>
     </w:p>
     <w:p>
@@ -10901,7 +10966,7 @@
           <w:szCs w:val="24"/>
           <w:rtl w:val="1"/>
         </w:rPr>
-        <w:t>האם חשוב בעינייך לזהות, לדבר ולפעול נגד מקרים לא צודקים בגן? כיצד ובאילו מקרים?</w:t>
+        <w:t>האם חשוב בעינייך לזהות, לדבר ולפעול נגד מקרים לא צודקים בגן? תארי לי כיצד ובאילו מקרים.</w:t>
       </w:r>
     </w:p>
     <w:p>
@@ -10925,7 +10990,7 @@
           <w:szCs w:val="24"/>
           <w:rtl w:val="1"/>
         </w:rPr>
-        <w:t>מאוד. אבל אני עובדת על זה דרך הרגש. כשקורה משהו לא הוגן, אני לא קופצת לפסוק. אני שואלת, איך אתה חושב שהוא הרגיש. אני רוצה שהילדים יפתחו אמפתיה, כי אני מאמינה שילד שמסוגל להרגיש את כאבו של האחר, כבר לא יעשה לו עוול. אז בכל מקרה לא צודק, אני מנצלת את זה כדי לפתח את הלב של הקבוצה, לא רק לתקן את האירוע הבודד.</w:t>
+        <w:t>מאוד חשוב לי, ואני לא מאמינה בלהעלים עין ממצב לא צודק, גם כשקל יותר לתת לו לעבור. אבל הדרך שבה אני פועלת היא לא דרך של שופטת. אני לא נכנסת לזירה ומחלקת אשמה, כי ברגע שילד מרגיש מואשם, הוא נסגר ולא לומד כלום. במקום זה אני מנסה להאיר את מה שקרה דרך רגש. אם ילד לקח בכוח משהו מילד אחר, אני לא צועקת עליו, אני מביאה אותו לראות. תסתכל על הפנים של דנה, איך אתה חושב שהיא מרגישה עכשיו. אני עוצרת מצבים של הצקה, של צחוק על ילד, של הדרה, בכל פעם שאני רואה אותם, כי אם אתן להם לעבור פעם אחת, הם הופכים למקובלים. היה מקרה שילדים צחקו על ילד שדיבר במבטא, וזה מקרה שעצרתי מיד. ישבנו במעגל ודיברנו על זה שכל אחד מדבר קצת אחרת, ושזה יפה. אבל אני גם נזהרת לא להפוך כל דבר קטן לאירוע, כי ילדים צריכים גם ללמוד לפתור בעצמם. אני מתערבת כשיש פער כוחות, כשיש מישהו חלש שנפגע. שם אני תמיד אעמוד, ואני רוצה שהילדים ידעו שיש בגן מבוגר שלא נותן לדברים לא צודקים לעבור בשתיקה.</w:t>
       </w:r>
     </w:p>
     <w:p>
@@ -10949,7 +11014,7 @@
           <w:szCs w:val="24"/>
           <w:rtl w:val="1"/>
         </w:rPr>
-        <w:t>האם קרה שקיבלת החלטה שבדיעבד הרגישה לך לא הוגנת? תארי, ואיך הרגשת עם זה?</w:t>
+        <w:t>תארי לי מקרה שבו קיבלת החלטה שבדיעבד הרגישה לך לא הוגנת. מה קרה, ואיך הרגשת?</w:t>
       </w:r>
     </w:p>
     <w:p>
@@ -10973,7 +11038,7 @@
           <w:szCs w:val="24"/>
           <w:rtl w:val="1"/>
         </w:rPr>
-        <w:t>כן, ויש מקרה שלימד אותי הרבה. היו שני ילדים שרבו כל הזמן על אותה משאית. אני, מעייפות, פשוט לקחתי את המשאית או פסקתי מי היה ראשון. פתרון צודק לכאורה, אבל שטחי. יום אחד עצרתי והקשבתי, והתברר שאחד הילדים בכלל לא רצה את המשאית, הוא רצה חברות עם הילד השני. הרגשתי שההחלטות הצודקות שלי החמיצו את האמת. מאז אני תמיד עוצרת לשאול מה כל ילד באמת צריך, לפני שאני פוסקת. פתרון שלא מבין את הרגש שמתחת הוא שטחי.</w:t>
+        <w:t>כן, יש לי מקרה כזה שעדיין יושב לי, כי אני לא מושלמת ואני עושה טעויות. היה יום עמוס במיוחד, כאוס בחצר, ופתאום שמעתי בכי. ראיתי את מאיה בוכה ואת טל עומד לידה, וקפצתי למסקנה שטל דחף אותה. דיברתי איתו בטון תקיף, אמרתי לו שאנחנו לא פוגעים, שלחתי אותו לשבת בצד להירגע. הוא ניסה להגיד לי משהו ואני, בלחץ של הרגע, אמרתי לו עכשיו לא הזמן. אחר כך, כשנרגעתי, ילדה אחרת סיפרה לי שמאיה בכלל נפלה לבד, וטל רק בא לעזור לה לקום. הבטן שלי התהפכה. הענשתי ילד שבסך הכל ניסה לעשות מעשה טוב, ולא נתתי לו אפילו לספר. הרגשתי בושה אמיתית. הלכתי אליו, התיישבתי בגובה שלו ואמרתי לו טל, טעיתי. חשבתי שדחפת ולא דחפת, אתה דווקא עזרת, ואני מבקשת סליחה שלא הקשבתי לך. ראיתי איך הפנים שלו נפתחות. מאותו יום אני מזכירה לעצמי כלל, קודם מקשיבים ואז מבינים, אף פעם לא הפוך. הרגע הזה לימד אותי שגם אני צריכה את אותה אמפתיה שאני מבקשת מהילדים, וששווה תמיד לעצור לשאול מה קרה כאן באמת. אני חושבת שדווקא הרגעים שבהם אני טועה מול הילדים הם הזדמנות, כי הם רואים שגם מבוגר יכול לומר סליחה. טל, אני בטוחה, שכח מזמן את המקרה, אבל אני לא, כי הוא לימד אותי כמה קל לפגוע כשממהרים.</w:t>
       </w:r>
     </w:p>
     <w:p>
@@ -10997,7 +11062,7 @@
           <w:szCs w:val="24"/>
           <w:rtl w:val="1"/>
         </w:rPr>
-        <w:t>האם לדעתך ילדים בגיל הגן מבינים מהי הוגנות? מאיזה גיל, ואיך זה בא לידי ביטוי?</w:t>
+        <w:t>האם לדעתך ילדים בגיל הגן מבינים מהי הוגנות? מאיזה גיל, ותארי לי כיצד זה בא לידי ביטוי אצלם.</w:t>
       </w:r>
     </w:p>
     <w:p>
@@ -11021,7 +11086,7 @@
           <w:szCs w:val="24"/>
           <w:rtl w:val="1"/>
         </w:rPr>
-        <w:t>לגמרי מבינים, וזה מתחיל מוקדם. הקטנים תופסים הוגן כשוויון, זה טבעי. אבל ההבנה העמוקה, שהוגן זה לתת לכל אחד מה שהוא צריך, מתחילה בארבע-חמש, וזה קשור ישירות להתפתחות של האמפתיה. ברגע שילד מסוגל להיכנס לנעליים של חבר, הוא גם מסוגל להבין למה מגיע לו משהו אחר. אני עובדת על שני הדברים יחד, על הרגש ועל ההבנה של הוגנות, כי הם אותו דבר בעיניי.</w:t>
+        <w:t>אני מאמינה שכן, ילדים בגיל הגן מבינים הוגנות, אבל בצורה שלהם, מאוד רגשית ופחות שכלית. כבר סביב גיל שלוש אתה שומע את המשפט זה לא הוגן, אבל בהתחלה הוא כמעט תמיד אומר משהו כמו אני לא קיבלתי מה שרציתי. זו הוגנות שכולה מהמקום של עצמי. אבל סביב גיל חמש שש קורה משהו יפה, מתחילה להיכנס היכולת לראות גם את השני. אני רואה את זה ברגעים קטנים. ילד שאומר לי תני לה קודם, היא חיכתה יותר זמן ממני. זו כבר הוגנות של ממש, כי היא דורשת ממנו לוותר על משהו שלו למען צדק של אחר. אני זוכרת ילדה, שקד, שראתה שחילקתי סוכריות ולילד אחד לא הגיעה, והיא מיד חצתה את שלה ונתנה לו חצי. אף אחד לא ביקש ממנה. הבנתי שהיא הבינה הוגנות עמוק יותר משהרבה מבוגרים. הם עדיין מתקשים עם הוגנות מופשטת, עם הרעיון שמישהו צריך יותר כי קשה לו, זה מבלבל אותם בהתחלה. אבל כשמסבירים דרך רגש, דרך תארו לכם איך הוא מרגיש, הם תופסים את זה מהר להפליא. הלב שלהם מבין הרבה לפני שהראש שלהם יודע לנסח. ואני חושבת שזה בדיוק היופי בגיל הזה, שההוגנות אצלם היא עוד רגשית וטהורה, לא מחושבת. הם לא עושים חשבון מה יצא להם מזה, הם פשוט מרגישים שמשהו לא בסדר כשמישהו נשאר בחוץ. התפקיד שלי הוא רק לשמור על הניצוץ הזה, לא לתת לו להיכבות, ולעזור לו לגדול מתוך אני לתוך גם אתה.</w:t>
       </w:r>
     </w:p>
     <w:p>
@@ -11045,7 +11110,7 @@
           <w:szCs w:val="24"/>
           <w:rtl w:val="1"/>
         </w:rPr>
-        <w:t>כיצד את מתמודדת עם דרישה של הורה שהילד שלו יקבל יחס מועדף?</w:t>
+        <w:t>תארי לי מצב שבו הורה דרש שהילד שלו יקבל יחס מועדף. כיצד התמודדת?</w:t>
       </w:r>
     </w:p>
     <w:p>
@@ -11069,7 +11134,7 @@
           <w:szCs w:val="24"/>
           <w:rtl w:val="1"/>
         </w:rPr>
-        <w:t>אני ניגשת לזה מאותו מקום רגשי. הורה שדורש יחס מועדף, אני קודם כול מכירה ברגש שלו, בדאגה. כי הרבה פעמים הורה, בדיוק כמו ילד, רק צריך להרגיש שמקשיבים לו ומבינים אותו. ואז אני מסבירה את הגישה שלי בשפה של רגש, שאני רוצה שהילד שלו יגדל להיות אדם שאכפת לו מהאחר, ושזה בדיוק מה שאני מלמדת כשאני הוגנת עם כולם. כשאני מדגימה תקשורת מקרבת מול ההורה בעצמו, זה מרגיע את המתח יותר מכל ויכוח.</w:t>
+        <w:t>היה לי מקרה כזה, וזה תמיד עדין. אמא של ילד, נקרא לו איתי, ניגשה אליי בבוקר וביקשה שאדאג שהבן שלה תמיד יהיה בזוג עם החבר הכי טוב שלו, ושהוא יקבל את התפקידים הכי טובים כי הוא רגיש. הרגשתי את הדאגה שלה, אבל ידעתי שאני לא יכולה להסכים, כי זה בדיוק מה שיפגע בו מול הילדים. אבל לא נכנסתי איתה לוויכוח, כי אני עם הורים משתמשת בדיוק באותה תקשורת מקרבת ואמפתיה שאני מלמדת בגן. אמרתי לה קודם כל אני רואה כמה את אוהבת אותו וכמה חשוב לך שיהיה לו טוב, זה מרגש אותי. אחר כך שיקפתי לה בעדינות, סיפרתי לה שדווקא כשילד תמיד מקבל יחס מיוחד וגלוי, הילדים האחרים מרגישים את זה, וזה עלול להרחיק אותם ממנו. הסברתי שמה שאני כן עושה זה לדאוג שאיתי יקבל את מה שהוא צריך רגשית, שיהיה לו בטוח ונראה, אבל בלי שזה יבוא על חשבון מקומו בקבוצה. היא נרגעה, כי היא הרגישה שאני בצד של הילד שלה, לא נגדה. בסוף הבטחתי לה שנהיה בקשר, ושאם אני רואה שקשה לו, אספר לה. היא הלכה רגועה, וזה מה שהיה חשוב לי.</w:t>
       </w:r>
     </w:p>
     <w:p>
@@ -11093,7 +11158,7 @@
           <w:szCs w:val="24"/>
           <w:rtl w:val="1"/>
         </w:rPr>
-        <w:t>האם את משתפת את ההורים בנושאים של צדק, שוויון והוגנות? האם נוצרים מתחים, וכיצד את מתמודדת איתם?</w:t>
+        <w:t>האם את משתפת את ההורים בנושאים של צדק, שוויון והוגנות? תארי לי אם נוצרים מתחים וכיצד את מתמודדת.</w:t>
       </w:r>
     </w:p>
     <w:p>
@@ -11117,7 +11182,7 @@
           <w:szCs w:val="24"/>
           <w:rtl w:val="1"/>
         </w:rPr>
-        <w:t>בגלל שהעולם שלי רגשי, אני משתפת את ההורים דרך השפה של רגשות ואמפתיה. אני מסבירה שהמטרה שלי היא לגדל ילדים בעלי לב, רגישים, אכפתיים. ומזמינה אותם להמשיך את זה בבית. רוב ההורים מתחברים, כי בעומק כל הורה רוצה שהילד שלו יהיה אדם טוב. מתחים נוצרים, בעיקר הורה שדואג שהילד שלו רגיש מדי, או שלא מקבל מספיק תשומת לב רגשית. אני מתמודדת עם זה באמצעות אותה אמפתיה שאני מלמדת, מקשיבה קודם ומכירה בדאגה שלו. הרבה פעמים הורה רק צריך להרגיש שמבינים אותו, בדיוק כמו ילד.</w:t>
+        <w:t>כן, אני מאמינה מאוד בשקיפות מול ההורים, כי הם שותפים אמיתיים. באסיפות הורים אני מדברת איתם על השפה של ההוגנות בגן, מסבירה למשל למה אצלנו ימי הולדת נחגגים באותה צורה לכולם, ולמה אני לא משווה ילד לילד. רוב ההורים מתחברים לזה מאוד. אבל לפעמים כן נוצרים מתחים, כי הורה מסתכל דרך העיניים של הילד שלו בלבד, וזה טבעי לגמרי. היה הורה שכעס עליי שהילד שלו לא נבחר להיות ראש הצוער בטקס, ואמר שזה לא הוגן שדווקא ילד אחר נבחר. הבנתי אותו, ובמקום להתגונן, השתמשתי באותה אמפתיה. אמרתי לו אני שומעת שאתה מרגיש שהילד שלך לא קיבל את מה שמגיע לו, וזה כואב. אחר כך הסברתי לו את התמונה הרחבה, שאני מסובבת את התפקידים כדי שלאורך השנה כל ילד יזכה, ושבדיוק בגלל הוגנות הבן שלו יקבל תפקיד מרכזי בפעם הבאה. כשהורה מרגיש שרואים גם אותו ולא רק נלחמים בו, המתח נמס. גיליתי שהתקשורת המקרבת שאני מלמדת את הילדים עובדת בדיוק אותו דבר על מבוגרים, כי בסוף כולנו רק רוצים שיקשיבו לנו. אני משתדלת אף פעם לא לתת להורה לצאת מהשיחה בתחושה שהוא נגדי, כי בסוף אנחנו באותו צד, שנינו רוצים שלילד יהיה טוב.</w:t>
       </w:r>
     </w:p>
     <w:p>
@@ -11141,7 +11206,7 @@
           <w:szCs w:val="24"/>
           <w:rtl w:val="1"/>
         </w:rPr>
-        <w:t>האם את מרגישה שתפקידך כגננת כולל קידום ערכים של שוויון וצדק חברתי? כיצד?</w:t>
+        <w:t>האם את מרגישה שתפקידך כגננת כולל קידום ערכים של שוויון וצדק חברתי? תארי לי כיצד.</w:t>
       </w:r>
     </w:p>
     <w:p>
@@ -11165,7 +11230,7 @@
           <w:szCs w:val="24"/>
           <w:rtl w:val="1"/>
         </w:rPr>
-        <w:t>בהחלט, ואני חושבת שהדרך הייחודית שלי לעשות את זה היא דרך הרגש והקשר. אני מאמינה שילד שגדל בסביבה של אמפתיה, קבלה והקשבה, סופג את הערכים של צדק ושוויון עמוק בתוכו, לא כרעיונות שכליים אלא כחלק מהאישיות שלו. אני לא צריכה להטיף לילדים, אני צריכה לחיות את זה מולם. כשילד רואה שהגננת שלו מתייחסת בכבוד ובחום לכל אחד, שהיא דואגת לחלש, שהיא רואה את כולם, הוא לומד בלי מילים שככה נראה עולם צודק. אם הילדים שלי יוצאים מהגן עם לב פתוח, אני יודעת שזרעתי בהם את הבסיס האמיתי לצדק חברתי.</w:t>
+        <w:t>כן, אני מרגישה שזה ממש חלק מהתפקיד שלי, אולי אחד החלקים הכי חשובים בו. אני מסתכלת על הגן כמו על חברה קטנה, מיקרוקוסמוס של העולם, ומה שהילדים חווים כאן הם ייקחו איתם הלאה. אם ילד בן חמש למד שכשקשה לו יש מי שרואה אותו, ושמותר להיות שונה, ושכל אחד ראוי למקום, הוא גדל להיות אדם שיודע לראות את האחר. בשבילי קידום ערכים של שוויון וצדק חברתי לא נעשה דרך שיעורים על ערכים, זה נעשה דרך איך אני מתנהגת מול העיניים שלהם כל יום. הם לומדים ממני איך אני מקשיבה לילד שבוכה, איך אני דואגת שגם הכי שקט יקבל מקום, איך אני מתייחסת באותו כבוד לילד מכל בית. אני מאמינה עמוק שצדק חברתי מתחיל באמפתיה, ושאם אני מצליחה לגדל דור של ילדים שיודעים לשים את עצמם בנעליים של השני, עשיתי את החלק שלי בעולם. זה נשמע אולי גדול על גן ילדים, אבל אני חושבת שדווקא כאן, בגיל הזה, נבנים היסודות של הכל. בגובה של ילד בן חמש אני משנה משהו קטן בעולם, ואין לי תפקיד גדול מזה. ויש לי אמונה פשוטה, שאם כל ילד יצא מהגן שלי בתחושה שהוא ראוי, ושגם האחר ראוי, אז עשיתי משהו שנשאר הרבה אחרי שהם יגדלו וישכחו את שמי.</w:t>
       </w:r>
     </w:p>
     <w:p>
@@ -11183,7 +11248,6 @@
         <w:rPr>
           <w:rFonts w:ascii="David" w:hAnsi="David" w:cs="David"/>
           <w:b/>
-          <w:i w:val="0"/>
           <w:sz w:val="28"/>
           <w:szCs w:val="28"/>
           <w:rtl w:val="1"/>
@@ -11201,7 +11265,6 @@
         <w:rPr>
           <w:rFonts w:ascii="David" w:hAnsi="David" w:cs="David"/>
           <w:b w:val="0"/>
-          <w:i w:val="0"/>
           <w:sz w:val="22"/>
           <w:szCs w:val="22"/>
           <w:rtl w:val="1"/>
@@ -11230,7 +11293,7 @@
           <w:szCs w:val="24"/>
           <w:rtl w:val="1"/>
         </w:rPr>
-        <w:t>ספרי לי קצת על עצמך ועל התפקיד שלך. מי את, כמה שנים את בתחום, ואיך הגעת למקצוע?</w:t>
+        <w:t>ספרי לי קצת על עצמך ועל הדרך המקצועית שלך. מי את, כמה שנים את בתחום, ומה הביא אותך להיות גננת?</w:t>
       </w:r>
     </w:p>
     <w:p>
@@ -11254,7 +11317,7 @@
           <w:szCs w:val="24"/>
           <w:rtl w:val="1"/>
         </w:rPr>
-        <w:t>אסתר, בת חמישים ושתיים, גננת כבר עשרים וארבע שנה, רובן בגנים בשכונות מוחלשות. וזו בחירה, לא מקריות. יכולתי מזמן לעבור לגן קל יותר, אבל בחרתי להישאר, כי כאן העבודה שלי הכי משמעותית, היא ממש משנה חיים. גדלתי בעצמי בשכונה כזו, וראיתי איך גננת אחת טובה יכולה לפתוח לילד דלת לעולם אחר. רציתי להיות הדלת הפתוחה. אני עבור חלק מהילדים האלה מקור היציבות, החום, הארוחה החמה, החשיפה לעולם שאולי לא יקבלו בשום מקום אחר. זה ממש מפעל החיים שלי.</w:t>
+        <w:t>קוראים לי אסתר מזרחי, אני בת 52, כבר 24 שנה גננת. גדלתי בעצמי בשכונה קשה, מהסוג שאני עובדת בו היום, ואני זוכרת בדיוק איך זה מרגיש להיות הילדה עם הבגדים שכבר לא בדיוק מתאימים. זה מה שהביא אותי לפה. לא במקרה ולא כי לא הייתה לי ברירה, אלא בחירה מודעת. הייתי יכולה מזמן לעבור להדרכה, לשבת במשרד, ללמד גננות אחרות. אמרו לי את זה לא פעם. אבל אני יודעת שהמקום שלי הוא בשטח, מול הילדים האלה, בשכונות האלה. יש לי פה אחריות עצומה, ואני מרגישה שזאת שליחות של ממש. הגן שלי הוא בשבילי אי של צדק בתוך מציאות מאוד קשה שקורית בחוץ, ואת האי הזה אני שומרת בשיניים.</w:t>
       </w:r>
     </w:p>
     <w:p>
@@ -11278,7 +11341,7 @@
           <w:szCs w:val="24"/>
           <w:rtl w:val="1"/>
         </w:rPr>
-        <w:t>לימדת בגנים נוספים לפני כן? מה היה שונה בין הגנים?</w:t>
+        <w:t>לימדת בגנים נוספים לפני כן? תארי לי מה היה שונה בין הגנים.</w:t>
       </w:r>
     </w:p>
     <w:p>
@@ -11302,7 +11365,7 @@
           <w:szCs w:val="24"/>
           <w:rtl w:val="1"/>
         </w:rPr>
-        <w:t>כן, רוב הקריירה שלי בגנים בשכונות מוחלשות, וזו בחירה. יכולתי מזמן לעבור למקום קל יותר. אבל בחרתי להישאר, כי כאן העבודה שלי הכי משמעותית. השוני בין הגנים שעבדתי בהם הוא בעיקר בעומק המצוקה, אבל בכולם ראיתי את אותו דבר, שגננת אחת יכולה לפתוח לילד דלת לעולם אחר.</w:t>
+        <w:t>כן, עבדתי בשני גנים לפני זה. הראשון היה בשכונה מבוססת יותר, מסודרת, ילדים שהגיעו בבוקר אחרי ארוחת בוקר טובה, עם תיק מלא וסיפור שההורים הקריאו להם בלילה. שם ההורים דרשו ולחצו והתערבו בכל דבר. אחרי כמה שנים ביקשתי לעבור, ומאז אני פה בשכונה המוחלשת. ההבדל הוא תהומי. פה הילד מגיע לפעמים רעב, בלי ארוחת בוקר, עם נעליים שכבר קטנות עליו. פה ההורים לא תמיד באים לאספה, לא כי לא אכפת להם אלא כי אין להם כוח, שני מקומות עבודה, חובות, לחץ. אני למדתי מהר שהעבודה פה היא לא רק חינוך, היא הרבה מעבר. פה אני צריכה קודם כל לדאוג שהילד יהיה רגוע, שבע ובטוח, ורק אחר כך אני יכולה ללמד אותו.</w:t>
       </w:r>
     </w:p>
     <w:p>
@@ -11326,7 +11389,7 @@
           <w:szCs w:val="24"/>
           <w:rtl w:val="1"/>
         </w:rPr>
-        <w:t>איזה גיל וקבוצה את מלמדת היום?</w:t>
+        <w:t>איזה גיל וקבוצה את מלמדת היום, וכמה ילדים בגן?</w:t>
       </w:r>
     </w:p>
     <w:p>
@@ -11350,7 +11413,7 @@
           <w:szCs w:val="24"/>
           <w:rtl w:val="1"/>
         </w:rPr>
-        <w:t>אני עם גן חובה, בני חמש-שש. שלושים ושמונה ילדים, וזה הרבה מאוד לאוכלוסייה שלי, אבל ככה זה.</w:t>
+        <w:t>היום אני מלמדת גן חובה, ילדים בני חמש שש, שנה לפני בית הספר. יש לי 38 ילדים בגן, וזה מספר גדול, אני לא אשקר. עם סייעת אחת וחצי זה אתגר יומיומי. אבל אני מכירה כל אחד ואחד מהם בשם, יודעת מי ישן טוב בלילה ומי לא, מי אכל בבוקר ומי לא, מי צריך חיבוק לפני שהוא בכלל מסוגל לשבת במעגל. גיל חובה זה גיל קריטי בעיני, כי זו ההזדמנות האחרונה שלי לצמצם פערים לפני שהם נכנסים למערכת הגדולה, ושם כבר קשה יותר לתפוס אותם.</w:t>
       </w:r>
     </w:p>
     <w:p>
@@ -11374,7 +11437,7 @@
           <w:szCs w:val="24"/>
           <w:rtl w:val="1"/>
         </w:rPr>
-        <w:t>היכן הוכשרת?</w:t>
+        <w:t>היכן הוכשרת, ומה מהרקע שלך משפיע על הדרך שבה את עובדת?</w:t>
       </w:r>
     </w:p>
     <w:p>
@@ -11398,7 +11461,7 @@
           <w:szCs w:val="24"/>
           <w:rtl w:val="1"/>
         </w:rPr>
-        <w:t>הוכשרתי במכללה לחינוך. וגדלתי בעצמי בשכונה כמו זו שאני עובדת בה, אז אני מכירה את הילדים האלה מבפנים, לא מספרים.</w:t>
+        <w:t>הוכשרתי במכללה להוראה, למדתי חינוך לגיל הרך, ועשיתי במשך השנים עוד ועוד השתלמויות, בטראומה, ברגש, בשפה. אבל האמת, הדבר הכי משמעותי שמשפיע על איך שאני עובדת הוא לא התעודה, זה מאיפה שאני באה. אני גדלתי בדיוק במקום כזה. אני יודעת מבפנים איך זה כשאין כסף לטיול השנתי, איך זה כשמתביישים בכריך. בגלל זה אני יכולה להסתכל על ילד ולראות מיד מה הוא צריך, לפני שהוא בכלל אומר מילה. הרקע שלי נותן לי אמונה עזה בילדים האלה, כי אני חיה הוכחה לזה שהאמונה של מבוגר אחד בילד יכולה לשנות לו את הגורל.</w:t>
       </w:r>
     </w:p>
     <w:p>
@@ -11446,7 +11509,7 @@
           <w:szCs w:val="24"/>
           <w:rtl w:val="1"/>
         </w:rPr>
-        <w:t>לא, וזו בחירה. הציעו לי לא פעם תפקידי הדרכה, אבל אני בחרתי להישאר בשטח, עם הילדים. כי כאן אני מרגישה שאני עושה את ההבדל הכי גדול.</w:t>
+        <w:t>מעבר לניהול הגן עצמו, אני לא לוקחת תפקידי הדרכה מחוץ לגן, וזו בחירה. הציעו לי לא פעם להיות מדריכה, מלווה גננות חדשות, ואמרתי לא. אני לא רוצה להתרחק מהשטח. בתוך השכונה עצמה אני מעורבת, יש לי קשר עם העובדת הסוציאלית של המתנס, עם אחות הטיפה, אני יודעת לאיזו משפחה לשלוח סל מזון לפני חג. אני רואה את זה כחלק מהתפקיד. גננת בשכונה כזאת היא לא רק גננת, היא לפעמים החוליה שמחברת את המשפחה לעזרה שהיא צריכה ולא יודעת איך להשיג.</w:t>
       </w:r>
     </w:p>
     <w:p>
@@ -11470,7 +11533,7 @@
           <w:szCs w:val="24"/>
           <w:rtl w:val="1"/>
         </w:rPr>
-        <w:t>כשאת שומעת את המונח "צדק בגן הילדים", מה המחשבה הראשונה שעולה לך?</w:t>
+        <w:t>כשאת שומעת את המונח "צדק בגן הילדים", מה המחשבה הראשונה שעולה לך? תארי לי.</w:t>
       </w:r>
     </w:p>
     <w:p>
@@ -11494,7 +11557,7 @@
           <w:szCs w:val="24"/>
           <w:rtl w:val="1"/>
         </w:rPr>
-        <w:t>אחריות. אחריות עצומה. אני מרגישה שיש בידיים שלי כוח אדיר, כי מה שקורה בגן שלי מעצב את התפיסה של הילדים על העולם לכל החיים. ובמיוחד הילדים שלי, שמגיעים ממקום קשה, וההזדמנויות שלהם תלויות במה שהם יקבלו כאן ועכשיו. צדק בגן זה בשבילי לא נושא תיאורטי, זה משהו ממשי שקורה בכל רגע, בכל החלטה של מי ראשון, של מי מקבל מה. בשבילי הגן הוא סוג של אי של צדק, מקום שבו אני יכולה, לפחות לכמה שעות ביום, לתת לילדים חוויה של עולם שדואגים לך בו ורואים אותך.</w:t>
+        <w:t>המחשבה הראשונה שעולה לי היא לא שוויון, אלא הוגנות, וזה שני דברים שונים לגמרי. צדק בגן בעיני זה לתת לכל ילד את מה שהוא צריך כדי להגיע לאותה נקודת פתיחה, לא לתת לכולם את אותו הדבר בדיוק. אני אתן לך דוגמה שאני חוזרת אליה כל הזמן. יש לי ילד, נקרא לו יוסי, שמגיע בבוקר רעב, בלי ארוחת בוקר בבטן. אם אני אתן לכולם פרוסה אחת, זה נשמע שווה, נכון. אבל זה לא הוגן, כי לילד שאכל בבית זה קינוח ולילד הרעב זו הישרדות. אז אני דואגת שיוסי יקבל יותר, בשקט, בלי להכריז, בלי לבייש אותו מול החברים. הצדק האמיתי הוא הצדק שאף אחד לא רואה אותו קורה. צדק שמלווה בבושה הוא כבר לא צדק. בשבילי הגן הזה הוא אי של צדק בתוך ים של אי צדק שהילדים האלה חיים בו בחוץ, וזה מה שעולה לי בראש ברגע ששומעת את המילה.</w:t>
       </w:r>
     </w:p>
     <w:p>
@@ -11518,7 +11581,7 @@
           <w:szCs w:val="24"/>
           <w:rtl w:val="1"/>
         </w:rPr>
-        <w:t>האם נושא הצדק החברתי מהווה חלק מהתפיסה החינוכית שלך? איך זה בא לידי ביטוי?</w:t>
+        <w:t>האם נושא הצדק החברתי הוא חלק מהתפיסה החינוכית שלך? תארי לי איך זה בא לידי ביטוי ביום-יום.</w:t>
       </w:r>
     </w:p>
     <w:p>
@@ -11542,7 +11605,7 @@
           <w:szCs w:val="24"/>
           <w:rtl w:val="1"/>
         </w:rPr>
-        <w:t>מאוד, זה הלב הפועם של כל העבודה שלי. אני עובדת בגן שרוב הילדים בו מרקע מוחלש, וזה מחדד את הנושא בצורה הכי חריפה, כל יום מחדש. אני רואה בעבודה שלי שליחות, לתת לילדים האלה בסיס שווה יותר, לצמצם ולו במעט את הפער שאיתו הם מתחילים. זה בא לידי ביטוי בהשקעה עצומה בחשיפה ובהעשרה, אני מביאה להם עולמות, אמנות, מוזיקה, ספרים, כל מה שלילד ממשפחה מבוססת מובן מאליו ולהם לא. ובדאגה לצרכים הבסיסיים, ארוחה, חום, יציבות. וזו בעיניי ההגשמה הכי מעשית של צדק חברתי, לצמצם פערים בפועל, ילד אחר ילד.</w:t>
+        <w:t>בהחלט, זה הלב של כל מה שאני עושה, אני לא יכולה להפריד בין זה לבין החינוך עצמו. אצל ילד ממשפחה מבוססת החשיפה לעולם היא מובנת מאליה, ההורים לוקחים אותו למוזיאון, מנגנים לו מוזיקה בבית, קונים ספרים. אצל הילדים שלי זה פשוט לא קיים, לא כי ההורים לא אוהבים אלא כי אין להם את המשאבים ואת הזמן. אז אני מביאה את העולם אל תוך הגן. יש לי פינת אמנות עם רפרודוקציות אמיתיות של ציירים, אנחנו שומעים מוזיקה קלאסית ליד ארוחת הבוקר, אני מקריאה המון ספרים, לוקחת אותם לטיולים למקומות שהם לא היו מגיעים אליהם לבד. פעם לקחתי את הגן לים, וילדה בת חמש אמרה לי שזו הפעם הראשונה בחיים שלה שהיא רואה את הים. היא גרה עשרים דקות משם. זה נחרת בי. הצדק החברתי שלי הוא לא סיסמה על הקיר, הוא כל בוקר מחדש, בכל החלטה קטנה, למי אני נותנת יותר תשומת לב, את מי אני מחשׂפת למה שמגיע לו בדיוק כמו לכל ילד אחר בעולם.</w:t>
       </w:r>
     </w:p>
     <w:p>
@@ -11566,7 +11629,7 @@
           <w:szCs w:val="24"/>
           <w:rtl w:val="1"/>
         </w:rPr>
-        <w:t>כיצד את מחלקת את תשומת הלב שלך בין הילדים במהלך היום?</w:t>
+        <w:t>תארי לי כיצד את מחלקת את תשומת הלב שלך בין הילדים במהלך יום שלם.</w:t>
       </w:r>
     </w:p>
     <w:p>
@@ -11590,7 +11653,7 @@
           <w:szCs w:val="24"/>
           <w:rtl w:val="1"/>
         </w:rPr>
-        <w:t>בגן שלי זה מאתגר במיוחד, כי הרבה ילדים מגיעים עם צרכים גדולים, רגשיים, לפעמים קיומיים. אני נעזרת מאוד בצוות, אנחנו עובדים כמו מכונה מתואמת, כי לבד אין סיכוי. אבל אני עדיין מקפידה על העיקרון שכל ילד צריך לקבל ממני משהו אישי כל יום, מבט, חיבוק, מילה טובה. ואני שמה לב שדווקא בגן כמו שלי, שהצרכים הגדולים תופסים בו כל כך הרבה מקום, קל לילד השקט להיעלם. אז אני עושה מאמץ מיוחד לחפש דווקא את מי שלא נראה, כי גם הוא זקוק לי, בדיוק כמו זה שמשווע לתשומת לב בקול רם.</w:t>
+        <w:t>תשומת הלב היא המשאב הכי יקר שיש לי, והחלוקה שלה היא לא שווה בכוונה. אני מגיעה בבוקר ועושה סריקה מהירה בעיניים, מי נכנס עם עננה מעל הראש, מי בכה בדרך, מי מגיע רעב. את הילדים שהבוקר שלהם היה קשה אני מקרבת אליי מוקדם, לפני שהיום בכלל מתחיל, כי אם לא ארגיע אותם עכשיו הם יתפוצצו בעשר. אבל יש סכנה גדולה בעבודה כזאת, והיא הילד השקט. בגן שיש בו 38 ילדים וכל כך הרבה צרכים גדולים וקולניים, הילד השקט פשוט נבלע. הוא לא מבקש, לא בוכה, לא מפריע, אז קל מאוד לפספס אותו. בגלל זה אני מחפשת אותו אקטיבית. יש לי כלל אישי, כל יום אני בוחרת ילד אחד שקט ומקדישה לו רגע פרטי, יושבת לידו, שואלת אותו מה שלומו באמת. היה לי ילד, נביל, שחודשיים כמעט לא הוצאתי ממנו מילה, וביום שהוא סוף סוף פתח לי את הלב הבנתי כמה קרוב הייתי לאבד אותו. תשומת הלב שלי הולכת למי שהכי צריך אותה, וזה לא תמיד מי שהכי צועק.</w:t>
       </w:r>
     </w:p>
     <w:p>
@@ -11614,7 +11677,7 @@
           <w:szCs w:val="24"/>
           <w:rtl w:val="1"/>
         </w:rPr>
-        <w:t>כשיש ילד שזקוק ליותר תשומת לב, רגשית, חברתית או לימודית, איך את מאזנת את זה מול שאר הילדים?</w:t>
+        <w:t>תארי לי מצב שבו ילד זקוק ליותר תשומת לב, רגשית, חברתית או לימודית. איך את מאזנת את זה מול שאר הילדים?</w:t>
       </w:r>
     </w:p>
     <w:p>
@@ -11638,7 +11701,7 @@
           <w:szCs w:val="24"/>
           <w:rtl w:val="1"/>
         </w:rPr>
-        <w:t>בגן שלי, למען האמת, כמעט כל הילדים זקוקים ליותר. זה לא מצב של ילד אחד נזקק מול קבוצה שמסתדרת, אלא קבוצה שלמה עם צרכים גדולים. אז האיזון הוא אתגר יומיומי של תעדוף. אני עובדת לפי דחיפות, מי שבמשבר חריף עכשיו מקבל אותי עכשיו. אבל אני מקפידה שהטיפול בדחוף לא יבוא על חשבון ההשקעה בכל השאר, כי אחרת רק הגלגל החורק מקבל שמן. הדרך שלי לאזן היא עבודת צוות הדוקה, ובניית עצמאות אצל הילדים, כדי שגם כשאני שקועה עם ילד אחד, השאר יודעים לתפקד ולהרגיש בטוחים.</w:t>
+        <w:t>היה לי ילד, דניאל, שהגיע אחרי שאבא שלו נעצר. הוא היה שבור לגמרי, נצמד אליי כל היום, לא נתן לי זוז. בהתחלה הרגשתי אשמה, כאילו אני גוזלת מהאחרים את הזמן שמגיע להם. ואז הבנתי משהו. אם הילד הזה לא ירגיש בטוח, הוא לא ילמד כלום, ולא רק זה, הוא ישבש לכל הקבוצה. אז השקעתי בו הרבה בתקופה ההיא, וזה היה הוגן, גם אם לא נראה שווה. אבל למדתי לעשות את זה חכם. במקום להצמיד אותו רק אליי, נתתי לו תפקידים שהעלו אותו בעיני החברים, הוא היה אחראי על חלוקת המים, על צלצול הפעמון. ככה הוא קיבל תשומת לב אבל גם מעמד בקבוצה, ולא הפכתי אותו לתינוק. האיזון בעיני הוא לא לחלק את עצמי בחלקים שווים, זה בלתי אפשרי ממילא. האיזון הוא לוודא שאף ילד לא משלם את המחיר של הצורך של ילד אחר. וכשילד אחד לוקח ממני יותר בתקופה מסוימת, אני מסבירה לקבוצה בשפה שלהם, חבר שלנו עובר עכשיו תקופה קשה, ואנחנו משפחה שעוזרת אחד לשני. הם מבינים את זה יותר טוב ממה שחושבים.</w:t>
       </w:r>
     </w:p>
     <w:p>
@@ -11662,7 +11725,7 @@
           <w:szCs w:val="24"/>
           <w:rtl w:val="1"/>
         </w:rPr>
-        <w:t>כיצד מתבצעת חלוקת החומרים והמשאבים הפיזיים בגן, הצעצועים והציוד? מה הקו המנחה שלך?</w:t>
+        <w:t>תארי לי כיצד מתבצעת חלוקת החומרים והמשאבים הפיזיים בגן (צעצועים, ציוד, אופניים). מה הקו המנחה שלך?</w:t>
       </w:r>
     </w:p>
     <w:p>
@@ -11686,7 +11749,7 @@
           <w:szCs w:val="24"/>
           <w:rtl w:val="1"/>
         </w:rPr>
-        <w:t>בגן שלי אני משקיעה מאמץ מיוחד שיהיו חומרים איכותיים ומספקים. אני נלחמת על תקציבים ומביאה תרומות, כי אני יודעת שחלק גדול מהילדים לא נחשפים בבית לצעצועים ולחומרים כאלה. הגן הוא לפעמים המקום היחיד שבו הם פוגשים ספרים יפים ומשחקי חשיבה. הקו שלי הוא שפע ונגישות, שלא יהיה מחסור שיוצר מריבות. ולגבי החלוקה, אני עובדת עם כללים פשוטים וקבועים של תור ושיתוף, כי לילדים שלי, שהחיים בבית לא תמיד צפויים, חשוב מאוד שהעולם בגן יהיה צפוי ויציב והוגן. הצפיות של המערכת נותנת להם ביטחון שחסר בבית.</w:t>
+        <w:t>הקו המנחה שלי הוא לא שהחזק תופס, אלא שלכל אחד יש הזדמנות אמיתית. אני יודעת שאם אני אשאיר את זה לטבע, האופניים תמיד יהיו של אותם שלושה ילדים הדומיננטיים, והשאר יסתכלו מהצד כל השנה. אז אני בונה מערכת ברורה וצפויה, ודווקא הצפיות הזאת קריטית לילדים שלי. בבית שלהם הרבה פעמים אין שום סדר, אין מה שיהיה מחר, לא יודעים אם אבא יבוא. אז בגן אני נותנת להם עוגן. יש תור לאופניים, יש רשימה, כל ילד יודע מתי היום שלו, ואני שומרת על זה כמו נשק. פעם ילד חזק ניסה לקחת את התור של ילדה קטנה וחלשה, ועצרתי הכל, אמרתי לו, פה זה לא עובד ככה, פה כולם מקבלים את התור שלהם. אבל זה לא רק חוקים יבשים. עם צעצועים ומשחקים אני שמה לב מי אף פעם לא מצליח להשיג את הדבר הנחשק, ואני דואגת בשקט להזדים לו הזדמנות. החלוקה בגן שלי היא הצהרה, פה, בתוך הקירות האלה, לכולכם מגיע אותו דבר, בלי קשר למי שאתם בבית.</w:t>
       </w:r>
     </w:p>
     <w:p>
@@ -11710,7 +11773,7 @@
           <w:szCs w:val="24"/>
           <w:rtl w:val="1"/>
         </w:rPr>
-        <w:t>האם לדעתך חלוקה "שווה" וחלוקה "הוגנת" הן אותו דבר? תני דוגמה מהגן.</w:t>
+        <w:t>האם לדעתך חלוקה "שווה" וחלוקה "הוגנת" הן אותו דבר? תני דוגמה מהגן שממחישה את ההבדל.</w:t>
       </w:r>
     </w:p>
     <w:p>
@@ -11734,7 +11797,7 @@
           <w:szCs w:val="24"/>
           <w:rtl w:val="1"/>
         </w:rPr>
-        <w:t>בעיניי זו השאלה שכל המקצוע נשען עליה, ובמיוחד בשכונה כמו שלי. והתשובה היא שממש לא, אלה שני דברים שונים. שוויון זו נקודת מוצא נאיבית, והוגנות זה מה שבאמת משנה חיים. תשמעי דוגמה כואבת מהגן שלי. יש לי ילד שמגיע כמעט כל בוקר בלי ארוחת בוקר, כי אין בבית מספיק אוכל. אם אני נותנת לכולם אותה כמות אוכל בשם השוויון, הילד הזה נשאר רעב, כי הוא התחיל את היום ריק. אז אני דואגת, בשקט מוחלט ובלי לבייש אותו, שהוא יקבל יותר. זה לא שווה, אבל זה הדבר הכי צודק שאני יכולה לעשות. ההבחנה הזו היא ההבדל בין ילד רעב לילד שבע.</w:t>
+        <w:t>לא, ממש לא אותו דבר, וזה אולי הדבר הכי חשוב שהבנתי ב 24 השנים האלה. שווה זה לתת לכולם את אותו הדבר. הוגן זה לתת לכל אחד את מה שהוא צריך. אני אתן לך דוגמה ממש מהגן. בגן שלי יש ילדים שמגיעים בלי מעיל בחורף, ויש כאלה שכן. אם היו נותנים לי חבילה של מעילים לחלק, חלוקה שווה זה מעיל אחד לכל ילד, גם למי שכבר יש. חלוקה הוגנת זה לתת את המעילים למי שאין לו, ולמי שיש כבר לא צריך עוד אחד. זה נשמע פשוט אבל אנשים מתקשים עם זה, כי שוויון נשמע יפה ומרגיע. אצל הילד הרעב זו אותה שאלה. פרוסה לכולם זה שווה, אבל להביא ליוסי עוד ארוחה בבוקר בלי לספר לאף אחד זה הוגן. אני חיה על ההבחנה הזאת. הגן שלי לא שואף שכולם יקבלו את אותו הדבר, הוא שואף שכולם יגיעו לאותו מקום. ואת האמת, כשאתה עובד בשכונה כמו שלי, אתה מבין שהוגנות היא לפעמים דווקא לתת יותר למי שהחיים כבר לקחו ממנו יותר.</w:t>
       </w:r>
     </w:p>
     <w:p>
@@ -11758,7 +11821,7 @@
           <w:szCs w:val="24"/>
           <w:rtl w:val="1"/>
         </w:rPr>
-        <w:t>כיצד את מתמודדת עם מצב שילד מסוים "לוקח" יותר מקום במרחב הקבוצתי?</w:t>
+        <w:t>תארי לי מצב שבו ילד מסוים "לוקח" יותר מקום במרחב הקבוצתי, וכיצד את מתמודדת עם זה.</w:t>
       </w:r>
     </w:p>
     <w:p>
@@ -11782,7 +11845,7 @@
           <w:szCs w:val="24"/>
           <w:rtl w:val="1"/>
         </w:rPr>
-        <w:t>אני מנסה תמיד להבין מה מאחורי זה, כי אצל חלק גדול מהילדים שלי, ההשתלטות על מרחב היא בעצם צעקה של מצוקה או חוסר ביטחון, ולפעמים בבואה של מה שהם רואים בבית. ילד שחי בסביבה לא יציבה מגיע לפעמים עם צורך עז לשלוט, וזו לא התנהגות רעה, זו שפה של כאב. אז אני לא נלחמת בזה בכוח, אלא נותנת לו ערוצים חיוביים להרגיש חשוב, תפקיד, אחריות, במה. ובמקביל שומרת בעקביות על גבולות ברורים ובטוחים, כי דווקא ילדים כאלה זקוקים לגבול מכיל. וכמו תמיד, אני עמלה על חיזוק השקטים שלא ייעלמו בתוך הרעש.</w:t>
+        <w:t>יש לי ילד כזה כל שנה, הילד שממלא את כל החדר, שכל השיחה חייבת להיות עליו, שאם לא שמים לב אליו הוא הופך את הגן. אני קודם כל מנסה להבין למה. הרבה פעמים הילד הזה שתופס הרבה מקום הוא בעצם ילד שבבית לא רואים אותו בכלל, אז בגן הוא לוקח בכוח את מה שלא נותנים לו שם. היה לי ילד, אורי, בדיוק כזה, מחק כל ילד אחר מסביבו. במקום להילחם בו כל היום, נתתי לו במות לגיטימיות. הוא היה מספר סיפור בבוקר, מוביל את התור, עוזר לי לחלק. את האנרגיה הזאת אני מנתבת למקום שבו הוא יכול לזרוח בלי לרמוס אחרים. אבל במקביל אני שומרת בקנאות על המקום של האחרים, במיוחד של השקטים שנבלעים. במעגל אני אומרת בפירוש, עכשיו תורו של פלוני לדבר, ואנחנו מקשיבים לו. אני לא נותנת לילד אחד להיות כל הסיפור, כי אז השקטים לומדים שהם שקופים, וזה הדבר הכי מסוכן שילד יכול ללמוד על עצמו בגיל הזה, שהוא לא נספר.</w:t>
       </w:r>
     </w:p>
     <w:p>
@@ -11806,7 +11869,7 @@
           <w:szCs w:val="24"/>
           <w:rtl w:val="1"/>
         </w:rPr>
-        <w:t>כיצד את מתמודדת עם מצבים של הדרה חברתית, ילד שהקבוצה לא מקבלת ולא רוצים לשחק איתו?</w:t>
+        <w:t>תארי לי מצב של הדרה חברתית בגן, ילד שהקבוצה לא מקבלת ולא רוצים לשחק איתו. כיצד את פועלת?</w:t>
       </w:r>
     </w:p>
     <w:p>
@@ -11830,7 +11893,7 @@
           <w:szCs w:val="24"/>
           <w:rtl w:val="1"/>
         </w:rPr>
-        <w:t>זה כואב לי במיוחד, כי בגן שלי לפעמים ההדרה קשורה בדיוק לדברים שהם לא באשמת הילד, הבגדים, הריח, העוני. וזה עוול כפול, כי הילד מודר בגלל מצוקה שהוא הקורבן שלה. אז אני נלחמת בזה בכל הכוח, לא מוכנה שילד ישלם חברתית על העוני של המשפחה שלו. אני מטפלת בשורש כשאפשר, בשקט דואגת לבגדים נקיים ולתנאים, כדי להסיר את הסיבה בלי לבייש. ובמקביל בונה לו מעמד חברתי, מוצאת את החוזקה שלו. ההדרה בגן כמו שלי היא לא רק בעיה חברתית, היא סוגיה של צדק חברתי במלוא מובן המילה, ואני מתייחסת אליה ככזו.</w:t>
+        <w:t>הדרה זה אחד הדברים שאני הכי לא סובלת, ואני קופצת עליו מיד. אבל בגן שלי ההדרה כמעט תמיד קשורה לעוני, וזה מה שהופך אותה בעיני לעוול כפול. ילד מודר פה כי הבגדים שלו ישנים, כי לפעמים יש לו ריח כי אין מכונת כביסה בבית, כי אין לו את הצעצוע שכולם מדברים עליו. והילד הזה הוא כבר קורבן של המצוקה, ועכשיו הקבוצה מענישה אותו על זה עוד פעם. זה בלתי נסבל בעיני. היה לי ילד, סאלח, שהילדים לא רצו לשבת לידו בגלל ריח. לא צעקתי על אף אחד, זה לא עוזר. במקום זה עשיתי שני דברים. בשקט דיברתי עם אמא שלו, עזרתי לה לסדר פתרון עם הכביסה, בלי שום שיפוט. ובגן, במקום להטיף, בניתי לסאלח מעמד, גיליתי שהוא מדהים בבניית לגו, ועשיתי אותו למומחה של הגן, שכולם באים אליו. תוך שבועיים ילדים רבו מי יושב לידו. אתה לא נלחם בהדרה בהרצאה על יפה לשתף, אתה נלחם בה בכך שאתה נותן לילד המודר סיבה אמיתית להיות רצוי.</w:t>
       </w:r>
     </w:p>
     <w:p>
@@ -11854,7 +11917,7 @@
           <w:szCs w:val="24"/>
           <w:rtl w:val="1"/>
         </w:rPr>
-        <w:t>האם בגן שלך יש ילדים מרקעים חברתיים או כלכליים שונים? כיצד זה בא לידי ביטוי ביום-יום?</w:t>
+        <w:t>האם בגן שלך יש ילדים מרקעים חברתיים או כלכליים שונים? תארי לי כיצד זה בא לידי ביטוי בפרקטיקה היומיומית.</w:t>
       </w:r>
     </w:p>
     <w:p>
@@ -11878,7 +11941,7 @@
           <w:szCs w:val="24"/>
           <w:rtl w:val="1"/>
         </w:rPr>
-        <w:t>כן, ולמרות שרוב הילדים מרקע דומה של מצוקה, יש שונות, וגם בתוך העוני יש דרגות. יש משפחות שמתמודדות בכבוד, ויש כאלה במצב קשה בהרבה, עם הזנחה ממשית. זה בא לידי ביטוי בכל, ביכולת של המשפחה לתמוך רגשית, בביגוד, בהיגיינה, במזון, ביציבות של הבית. אני מנהלת את הגן ככה שהוא ייתן לכל ילד את מה שאולי חסר לו בבית, ארוחה למי שרעב, חום למי שלא מקבל, שפה למי שאין לו, ומעל הכול יציבות. אני רואה את הגן שלי כמקום שנועד לצמצם פערים, לא כמקום שמשקף אותם. אני לא יכולה לשנות את הבית, אבל בשעות שהילד איתי, הוא חי בעולם צודק ובטוח.</w:t>
+        <w:t>כן, בהחלט, אם כי הפערים אצלי הם פחות בין עשירים לעניים ויותר בין רמות שונות של מצוקה, כי כמעט כולם מגיעים ממקום קשה. יש לי משפחה שיש בה גג ואוכל וסדר, ולידה משפחה שגרה בצפיפות של שמונה נפשות בשני חדרים. וזה מרגישים בכל דבר. מרגישים את זה בבוקר, מי הגיע אכל ומי לא. מרגישים את זה אחרי חופשה, כשילד אחד מספר על טיול וילד אחר לא יצא מהבית שבועיים. מרגישים את זה באוצר המילים, ילד שדיברו איתו בבית מגיע עם מאה מילים יותר מילד שישב מול טלוויזיה. אני עובדת עם הפערים האלה כל רגע. אני אף פעם לא שואלת שאלות שיכולות לבייש, כמו מה קניתם בסופש או לאן נסעתם. אני לא מבקשת חומרים מהבית שעולים כסף, כי אני יודעת שיש הורים שזה יכניס אותם ללחץ. כל חומר שצריך, אני מביאה לכולם, שאף ילד לא יצטרך אף פעם לומר לי אין לי. אני מנהלת את הגן מתוך מודעות מתמדת לפער הזה, כי אם אני אשכח אותו לרגע, אני עלולה לפצוע ילד בלי בכלל לשים לב.</w:t>
       </w:r>
     </w:p>
     <w:p>
@@ -11902,7 +11965,7 @@
           <w:szCs w:val="24"/>
           <w:rtl w:val="1"/>
         </w:rPr>
-        <w:t>כיצד את מתמודדת עם הפערים הניכרים בין הילדים, בין השאר בתחום הרגשי, החברתי או הלימודי?</w:t>
+        <w:t>תארי לי כיצד את מתמודדת עם הפערים הניכרים בין הילדים, בין השאר בתחום הרגשי, החברתי או הלימודי.</w:t>
       </w:r>
     </w:p>
     <w:p>
@@ -11926,7 +11989,7 @@
           <w:szCs w:val="24"/>
           <w:rtl w:val="1"/>
         </w:rPr>
-        <w:t>בעבודה קשה מאוד, ובאמונה עצומה, שהיא הנשק הכי חשוב שלי. אני מסרבת בכל תוקף לקבל את התפיסה שילד מרקע מוחלש נועד מראש להישאר מאחור. ראיתי במו עיניי ילדים מהגן שלי שפרחו והצליחו מעבר לכל דמיון. אני עובדת עם כל ילד באופן אישי, מזהה את החוזקות שלו ובונה עליהן. בפער השפה, שהוא קריטי, אני משקיעה מאמץ עצום בחשיפה ובקריאת סיפורים. בפערים רגשיים אני נותנת מה שהכי חסר, יציבות וחום. אבל אולי הדבר הכי חשוב שאני נותנת הוא האמונה עצמה, כי אם המבוגר מאמין בילד, הוא לומד להאמין בעצמו, וזה משנה הכול.</w:t>
+        <w:t>אני מתמודדת עם הפערים בעיקר דרך חשיפה והעשרה, כי בעיני זה השורש. הילד ממשפחה מבוססת מגיע לכיתה א עם עולם שלם בראש, מוזיאונים, מוזיקה, מילים, חוויות. הילד שלי מגיע עם עולם צר יותר, לא כי הוא פחות חכם, חלילה, אלא כי לא נתנו לו את ההזדמנות. אז אני עובדת כמו מטורפת על החשיפה. אני מביאה מוזיקה, אמנות, אני מדברת איתם בשפה עשירה בכוונה, לא מפשטת יותר מדי, כי ככה מתרחב אוצר המילים. אני לוקחת אותם למקומות, גם אם אני צריכה להתחנן על תקציב או להביא כריכים מהבית שלי. בתחום הרגשי אני נותנת יציבות שבבית לפעמים אין, אותו סדר יום, אותם כללים, אותה גננת שתמיד פה. הצפיות הזאת מרפאת. היה לי ילד שאמר לי פעם, את היחידה שתמיד באותו מקום, וזה שבר לי את הלב וגם חיזק אותי. אני יודעת שאני לא יכולה לסגור את כל הפער בשנה אחת. אבל אני יכולה לצמצם אותו, ואני יכולה לשתול בילד את התחושה שהוא שווה בדיוק כמו כל ילד אחר בעיר. וזה, בטווח הארוך, שווה יותר מהכל.</w:t>
       </w:r>
     </w:p>
     <w:p>
@@ -11950,7 +12013,7 @@
           <w:szCs w:val="24"/>
           <w:rtl w:val="1"/>
         </w:rPr>
-        <w:t>איך נראה יום עבודה טיפוסי שלך בגן, ומהם הדברים שאת מקפידה עליהם מבחינת הוגנות?</w:t>
+        <w:t>תארי לי יום עבודה טיפוסי שלך בגן, ומהם הדברים שאת מקפידה עליהם מבחינת הוגנות.</w:t>
       </w:r>
     </w:p>
     <w:p>
@@ -11974,7 +12037,7 @@
           <w:szCs w:val="24"/>
           <w:rtl w:val="1"/>
         </w:rPr>
-        <w:t>היום אצלי מאתגר, כי הרבה ילדים מגיעים עם צרכים גדולים. אנחנו עובדים כמו מכונה מתואמת, אני והסייעות. מה שאני הכי מקפידה עליו מבחינת הוגנות זה שכל ילד יאכל ויקבל חום, ושהמערכת תהיה צפויה ויציבה, כי לחלק מהילדים אין את זה בבית. ואני עושה מאמץ מיוחד לחפש דווקא את הילד השקט, שלא ייבלע בתוך הרעש והצרכים הגדולים.</w:t>
+        <w:t>היום שלי מתחיל לפני שהילדים מגיעים, אני בודקת שהכל מסודר, כי הסדר הזה הוא מה שנותן להם ביטחון. הם נכנסים ואני עומדת בפתח, מקבלת כל אחד בשמו, וזה הרגע שבו אני קולטת מי במצב טוב ומי לא. אחר כך ארוחת בוקר, ופה אני מקפידה על ההוגנות בשיא העדינות, דואגת שהרעבים יקבלו יותר בלי שאף אחד ירגיש בזה. יש מעגל בוקר, פעילות, משחק חופשי, טיול בחצר, והכל באותו סדר כל יום, כי הצפיות היא לא שגרה משעממת אצלי, היא עוגן. הדברים שאני הכי מקפידה עליהם מבחינת הוגנות, ראשית שאף ילד לא יבוזה בגלל מה שאין לו, שנית שהחומרים והחוויות מגיעים לכולם בשווה, ושלישית שאני מוצאת זמן לילד השקט שקל לפספס. אני שמה לב לדברים הקטנים, מי אף פעם לא נבחר לתפקיד, מי תמיד אחרון בתור, מי אף אחד לא שם לב אליו. ההוגנות בעיני חיה בפרטים הקטנים האלה, לא בהצהרות הגדולות. בסוף היום אני עוברת בראש על השמות, ושואלת את עצמי, את מי לא ראיתי היום מספיק. ומחר אני מתקנת את זה.</w:t>
       </w:r>
     </w:p>
     <w:p>
@@ -11998,7 +12061,7 @@
           <w:szCs w:val="24"/>
           <w:rtl w:val="1"/>
         </w:rPr>
-        <w:t>האם חשוב בעינייך לזהות, לדבר ולפעול נגד מקרים לא צודקים בגן? כיצד ובאילו מקרים?</w:t>
+        <w:t>האם חשוב בעינייך לזהות, לדבר ולפעול נגד מקרים לא צודקים בגן? תארי לי כיצד ובאילו מקרים.</w:t>
       </w:r>
     </w:p>
     <w:p>
@@ -12022,7 +12085,7 @@
           <w:szCs w:val="24"/>
           <w:rtl w:val="1"/>
         </w:rPr>
-        <w:t>מאוד. ובגן שלי זה קריטי, כי לפעמים ההדרה והעוול קשורים בדיוק לעוני, לבגדים, לריח. וזה עוול כפול, כי הילד נפגע בגלל מצוקה שהוא קורבן שלה. אז אני נלחמת בזה בכל הכוח, ולא מוכנה שילד ישלם חברתית על העוני של המשפחה שלו. אני מטפלת בשורש בשקט, ובמקביל מלמדת את הקבוצה קבלה ואמפתיה. בגן שלי, לפעול נגד עוול זה ממש עניין של צדק חברתי, לא רק חינוך.</w:t>
+        <w:t>כן, וזה לא רק חשוב, זה חובה, כי אם אני אשתוק מול אי צדק בגן אני מלמדת את הילדים שאי צדק זה בסדר. אני מדברת על זה בגלוי, בשפה שלהם. כשילד מוציא ילד אחר מהמשחק, אני לא מעבירה על זה בשתיקה, אני עוצרת ואומרת, זה לא הוגן, פה כל אחד מקבל מקום. אני עושה את זה במיוחד כשההדרה קשורה למצוקה, כשילד לועג לבגד או לנעל, כי שם אני יודעת שנפצע פה ילד שכבר סוחב מספיק. אבל אני נזהרת לא להפוך את הילד המדיר למפלצת, כי גם הוא ילד, וגם הוא לפעמים חוזר על מה ששמע בבית. אז אני מפרידה בין המעשה לילד, המעשה לא בסדר, אבל אתה ילד טוב שיכול לתקן. אני גם מלמדת אותם לזהות אי צדק בעצמם, שואלת, מה אתם חושבים, זה הוגן שרק שלושה ילדים תמיד מקבלים את האופניים. והם עונים, לא, וזה מרגש לראות איך צומחת אצלם התחושה הזאת. אני מאמינה שילד שיגדל בגן שבו אי צדק לא עובר בשתיקה, יהיה מבוגר שלא ישתוק גם הוא.</w:t>
       </w:r>
     </w:p>
     <w:p>
@@ -12046,7 +12109,7 @@
           <w:szCs w:val="24"/>
           <w:rtl w:val="1"/>
         </w:rPr>
-        <w:t>האם קרה שקיבלת החלטה שבדיעבד הרגישה לך לא הוגנת? תארי, ואיך הרגשת עם זה?</w:t>
+        <w:t>תארי לי מקרה שבו קיבלת החלטה שבדיעבד הרגישה לך לא הוגנת. מה קרה, ואיך הרגשת?</w:t>
       </w:r>
     </w:p>
     <w:p>
@@ -12070,7 +12133,7 @@
           <w:szCs w:val="24"/>
           <w:rtl w:val="1"/>
         </w:rPr>
-        <w:t>כן. עם כל הניסיון, עדיין קורה. פעם, מרוב עומס, לא שמתי לב לילד שקט שהיה זקוק לי מאוד, כי כל האנרגיה הלכה לילדים במשבר. כשהבנתי, הרגשתי שנתתי שמן רק לגלגל החורק. זה לימד אותי שדווקא בגן כמו שלי, שבו כולם צריכים הרבה, אני חייבת לשמור במיוחד על השקט, על זה שלא מבקש. מאז אני עובדת מודע, ולא נותנת לצרכים הגדולים לבלוע את הצרכים השקטים.</w:t>
+        <w:t>היה מקרה שרודף אותי עד היום. בשנה עמוסה במיוחד, עם כל כך הרבה ילדים במצוקה שצעקו לתשומת לב, הייתה לי ילדה, מור, ילדה שקטה, נחמדה, מתפקדת. היא לא ביקשה כלום אף פעם. ובגלל שהיא הייתה בסדר, נתתי לה להיות בסדר לבד, כל השנה. בסוף השנה אמא שלה סיפרה לי שההורים בדיוק התגרשו והיא בכתה בלילות, ואני לא ידעתי. פספסתי אותה כי היא לא צעקה. הרגשתי כישלון עמוק, כי בדיוק את זה אני מטיפה לעצמי, לחפש את השקט, ובכל זאת נבלעה לי בין הקולניים. זה לא היה הוגן כלפיה. היא נתנה לי את המתנה של להיות ילדה קלה, ואני שילמתי לה בהתעלמות. מאז זה שינה אותי. הפכתי את החיפוש אחרי הילד השקט למשהו שיטתי, לא משהו שאני עושה אם יישאר זמן. כל יום ילד שקט אחד מקבל ממני רגע פרטי, לא משנה כמה הגן בוער. מור לימדה אותי שאי הצדק הכי שקט הוא הכי מסוכן, כי אתה אפילו לא יודע שאתה עושה אותו.</w:t>
       </w:r>
     </w:p>
     <w:p>
@@ -12094,7 +12157,7 @@
           <w:szCs w:val="24"/>
           <w:rtl w:val="1"/>
         </w:rPr>
-        <w:t>האם לדעתך ילדים בגיל הגן מבינים מהי הוגנות? מאיזה גיל, ואיך זה בא לידי ביטוי?</w:t>
+        <w:t>האם לדעתך ילדים בגיל הגן מבינים מהי הוגנות? מאיזה גיל, ותארי לי כיצד זה בא לידי ביטוי אצלם.</w:t>
       </w:r>
     </w:p>
     <w:p>
@@ -12118,7 +12181,7 @@
           <w:szCs w:val="24"/>
           <w:rtl w:val="1"/>
         </w:rPr>
-        <w:t>מבינים, גם הילדים שלי שמגיעים ממקום קשה. הקטנים תופסים הוגן כשוויון. אבל מה שמעניין, הילדים שלי לפעמים מבינים את עיקרון הצורך מוקדם, כי הם חיים אותו. ילד שיודע מה זה לבוא רעב, מבין למה מגיע לחבר עוד פרוסה. אני עובדת על זה במפורש, ורואה איך הם מפתחים רגישות אמיתית לחלש. זה אחד הדברים היפים שאני רואה בגן.</w:t>
+        <w:t>בהחלט מבינים, ומגיל צעיר יותר ממה שאנשים חושבים, כבר בגיל שלוש ארבע. זה מתחיל מאוד קונקרטי, זה לא הוגן שלו יש שתי עוגיות ולי אחת. בהתחלה ההוגנות אצלם היא בעצם שוויון, הם רוצים בדיוק אותו דבר כמו החבר, וזה טבעי. אבל בגיל חמש שש, הגיל שלי, אתה כבר יכול להתחיל לפתח אצלם את ההבנה העמוקה יותר, שהוגן זה לא תמיד אותו דבר. אני עושה את זה כל הזמן. אני שואלת, אם לחבר כואבת הרגל והוא לא יכול לרוץ, הוגן שהוא יתחיל את המרוץ קצת לפני. בהתחלה חלקם אומרים לא, ואז אנחנו מדברים, ולאט לאט הם קולטים. אני רואה את זה קורה מול העיניים שלי, ילד שבתחילת השנה בכה על כל חוסר שוויון, בסוף השנה מציע מעצמו לתת לחבר חלש יותר את התור שלו. ילדים הם צודקים בטבע שלהם, יש להם חוש צדק חד כמו סכין. התפקיד שלי הוא רק לקחת את החוש הגולמי הזה ולעדן אותו, מהוגנות של אני רוצה בדיוק כמוך, להוגנות של מגיע לך מה שאתה צריך.</w:t>
       </w:r>
     </w:p>
     <w:p>
@@ -12142,7 +12205,7 @@
           <w:szCs w:val="24"/>
           <w:rtl w:val="1"/>
         </w:rPr>
-        <w:t>כיצד את מתמודדת עם דרישה של הורה שהילד שלו יקבל יחס מועדף?</w:t>
+        <w:t>תארי לי מצב שבו הורה דרש שהילד שלו יקבל יחס מועדף. כיצד התמודדת?</w:t>
       </w:r>
     </w:p>
     <w:p>
@@ -12166,7 +12229,7 @@
           <w:szCs w:val="24"/>
           <w:rtl w:val="1"/>
         </w:rPr>
-        <w:t>בגן שלי זה עדין במיוחד. חלק מההורים שלי מתמודדים בעצמם עם מצוקות קשות. הורה שדורש יחס מועדף, אני מקשיבה בכבוד עמוק ובלי שיפוט, כי אני יודעת מאיפה הוא בא. ואז אני מסבירה שאני שומרת על ההוגנות כלפי כל הילדים. אבל האמת, בגן שלי הבעיה ההפוכה שכיחה יותר, הורים שאין להם כוח בכלל להיאבק על הילד שלהם. אז דווקא אליהם אני פונה, ומראה להם שאני בצד של הילד שלהם, שיש מי שנלחם עליו.</w:t>
+        <w:t>האמת, בגן שלי הסיפור הזה נדיר, וזה כשלעצמו מספר סיפור. במקומות אחרים ההורים נלחמים על כל דבר בשביל הילד, פה רוב ההורים אין להם בכלל כוח להיאבק, הם שקועים בהישרדות. אבל היה מקרה אחד. אמא אחת, מהמעט מבוססות בגן, ביקשה שהבן שלה תמיד יהיה ראשון ותמיד יקבל את התפקידים הכי טובים, כי לטענתה הוא מוכשר מהאחרים. הקשבתי לה בכבוד, ואז אמרתי לה בשקט אבל בנחישות, אני אוהבת את הבן שלך והוא באמת מוכשר, ובדיוק בגלל זה הוא לא צריך יחס מיוחד, הוא יסתדר. יש פה ילדים שאם אני לא אתן להם את ההזדמנות, אף אחד בעולם לא ייתן להם אותה. היא נעלבה קצת בהתחלה. אבל הסברתי לה שהגן הזה הוא אולי המקום היחיד שבו כל הילדים באמת שווים, ושזה מתנה גם לבן שלה, ללמוד שהוא לא מעל אף אחד. בסוף היא קיבלה את זה. אני לא מתקפלת מול לחץ כזה, כי ברגע שאתן לילד אחד יחס מועדף בגלל שההורה דרש, בגדתי בכל שאר הילדים, ובדיוק באלה שאין להם מי שיילחם עליהם.</w:t>
       </w:r>
     </w:p>
     <w:p>
@@ -12190,7 +12253,7 @@
           <w:szCs w:val="24"/>
           <w:rtl w:val="1"/>
         </w:rPr>
-        <w:t>האם את משתפת את ההורים בנושאים של צדק, שוויון והוגנות? האם נוצרים מתחים, וכיצד את מתמודדת איתם?</w:t>
+        <w:t>האם את משתפת את ההורים בנושאים של צדק, שוויון והוגנות? תארי לי אם נוצרים מתחים וכיצד את מתמודדת.</w:t>
       </w:r>
     </w:p>
     <w:p>
@@ -12214,7 +12277,7 @@
           <w:szCs w:val="24"/>
           <w:rtl w:val="1"/>
         </w:rPr>
-        <w:t>שיתוף ההורים בגן כמו שלי עדין ומורכב, ודורש רגישות וכבוד. חלק מההורים מתמודדים בעצמם עם מצוקות קשות, ולא תמיד יש להם כוחות לעסוק בערכים מופשטים. אז אני ניגשת אליהם מתוך כבוד עמוק, בלי שמץ של שיפוט. אני משתפת אותם בעיקר דרך מעשים ולא הרצאות, הם רואים שאני אוהבת ונלחמת על הילד שלהם, ודרך זה נבנה אמון. מתחים נוצרים, בעיקר סביב חוסר אמון במערכת מניסיון עבר מר. אני מתמודדת עם זה בסבלנות אינסופית, ובזה שאני מוכיחה להם לאורך זמן שאני בצד שלהם. הצדק כלפי הילד מתחיל בכבוד כלפי המשפחה שלו.</w:t>
+        <w:t>כן, אני משתפת, אבל בחוכמה, כי בשכונה שלי צריך להיזהר מאוד לא לגרום לאף הורה להרגיש שהוא נשפט. אני לא מרצה להורים על צדק חברתי, זה הדבר האחרון שהם צריכים. אני מדברת איתם דרך הילד שלהם. אני מספרת לאמא כמה הבן שלה עזר לחבר, כמה הוא ילד טוב לב, וככה אני בעצם מלמדת גם אותה מה חשוב לי. המתחים שנוצרים הם בדרך כלל לא סביב ערכים, אלא סביב מצוקה. הורה שמתבייש שאין לו, הורה שחושש שאני שופטת אותו על הילד שמגיע לא רחוץ. ופה אני משקיעה את רוב האנרגיה שלי, לגרום לכל הורה להרגיש שהגן הזה הוא מקום בטוח גם בשבילו, לא רק בשביל הילד. אני פונה במיוחד להורים שאין להם כוח, אלה שלא באים לאספות, ואני לא מוותרת עליהם. אני מתקשרת, אני שולחת מילה טובה, אני מוצאת אותם ליד הגן. כי אני יודעת שמאחורי הילד שנופל בין הכיסאות עומד הורה ששקע, ואם אני ארים אותו קצת, ארים גם את הילד. הצדק שלי לא נעצר בשער הגן, הוא נמשך אל תוך הבתים.</w:t>
       </w:r>
     </w:p>
     <w:p>
@@ -12238,7 +12301,7 @@
           <w:szCs w:val="24"/>
           <w:rtl w:val="1"/>
         </w:rPr>
-        <w:t>האם את מרגישה שתפקידך כגננת כולל קידום ערכים של שוויון וצדק חברתי? כיצד?</w:t>
+        <w:t>האם את מרגישה שתפקידך כגננת כולל קידום ערכים של שוויון וצדק חברתי? תארי לי כיצד.</w:t>
       </w:r>
     </w:p>
     <w:p>
@@ -12262,7 +12325,7 @@
           <w:szCs w:val="24"/>
           <w:rtl w:val="1"/>
         </w:rPr>
-        <w:t>יותר מזה, אני מרגישה שזה הייעוד של כל הקריירה שלי, ואפילו של החיים שלי. בחרתי במודע לעבוד בגן מאתגר בשכונה מוחלשת, כי אני מאמינה שכאן אני יכולה לעשות את ההבדל הכי גדול. קידום שוויון וצדק חברתי הוא לא סעיף בתכנית הלימודים, הוא הסיבה שאני קמה בבוקר. אני עושה את זה במעשים קונקרטיים, בכל ארוחה שאני דואגת שתהיה על השולחן של ילד רעב, בכל חיבוק לילד שלא מקבל חום בבית, בכל חלון לעולם שאני פותחת. אני יודעת שאני לא יכולה לתקן את כל העולם, אבל אני יכולה לתת לכל ילד חוויה של להיות שווה, ראוי ואהוב, ולשלוח אותו לעולם עם קצת יותר סיכוי.</w:t>
+        <w:t>לגמרי, ואם לא הייתי מרגישה ככה לא הייתי נשארת פה 24 שנה. בשבילי להיות גננת בשכונה כזאת זה מעשה של צדק חברתי בכל בוקר מחדש. אני לא מטיפה לשוויון, אני עושה אותו בפועל, בשקט, במעשים קטנים שאף אחד לא כותב עליהם בעיתון. כשאני מביאה ארוחה לילד רעב בלי לבייש אותו, זה צדק. כשאני לוקחת ילד לים בפעם הראשונה בחייו, זה צמצום פערים אמיתי, לא מילה יפה בכנס. אני מאמינה בכל נשמתי שהאמונה של מבוגר אחד בילד יכולה לשנות לו את הגורל, כי אני עצמי הייתי הילדה הזאת, ומישהי האמינה בי. עכשיו זה התור שלי להיות המישהי הזאת בשביל 38 ילדים כל שנה. אני יודעת שאני לא יכולה לתקן את כל העוני ואת כל העוול שבחוץ, זה גדול עליי. אבל אני יכולה לשמור על אי אחד קטן של צדק, בתוך ארבעה קירות, שבו כל ילד, לא משנה מאיפה בא, יודע שהוא שווה בדיוק כמו כולם. וזאת, בעיני, המשמעות האמיתית של להיות גננת. זה לא מקצוע, זו שליחות.</w:t>
       </w:r>
     </w:p>
     <w:sectPr>

</xml_diff>